<commit_message>
Bilder via Modal hochladen in DB funktioniert
</commit_message>
<xml_diff>
--- a/docs/PA_Fotostudio_Doku.docx
+++ b/docs/PA_Fotostudio_Doku.docx
@@ -2,7 +2,11 @@
 <file path=word/document.xml><?xml version="1.0" encoding="utf-8"?>
 <w:document xmlns:wpc="http://schemas.microsoft.com/office/word/2010/wordprocessingCanvas" xmlns:cx="http://schemas.microsoft.com/office/drawing/2014/chartex" xmlns:cx1="http://schemas.microsoft.com/office/drawing/2015/9/8/chartex" xmlns:cx2="http://schemas.microsoft.com/office/drawing/2015/10/21/chartex" xmlns:cx3="http://schemas.microsoft.com/office/drawing/2016/5/9/chartex" xmlns:cx4="http://schemas.microsoft.com/office/drawing/2016/5/10/chartex" xmlns:cx5="http://schemas.microsoft.com/office/drawing/2016/5/11/chartex" xmlns:cx6="http://schemas.microsoft.com/office/drawing/2016/5/12/chartex" xmlns:cx7="http://schemas.microsoft.com/office/drawing/2016/5/13/chartex" xmlns:cx8="http://schemas.microsoft.com/office/drawing/2016/5/14/chartex" xmlns:mc="http://schemas.openxmlformats.org/markup-compatibility/2006" xmlns:aink="http://schemas.microsoft.com/office/drawing/2016/ink" xmlns:am3d="http://schemas.microsoft.com/office/drawing/2017/model3d" xmlns:o="urn:schemas-microsoft-com:office:office" xmlns:r="http://schemas.openxmlformats.org/officeDocument/2006/relationships" xmlns:m="http://schemas.openxmlformats.org/officeDocument/2006/math" xmlns:v="urn:schemas-microsoft-com:vml" xmlns:wp14="http://schemas.microsoft.com/office/word/2010/wordprocessingDrawing" xmlns:wp="http://schemas.openxmlformats.org/drawingml/2006/wordprocessingDrawing" xmlns:w10="urn:schemas-microsoft-com:office:word" xmlns:w="http://schemas.openxmlformats.org/wordprocessingml/2006/main" xmlns:w14="http://schemas.microsoft.com/office/word/2010/wordml" xmlns:w15="http://schemas.microsoft.com/office/word/2012/wordml" xmlns:w16cex="http://schemas.microsoft.com/office/word/2018/wordml/cex" xmlns:w16cid="http://schemas.microsoft.com/office/word/2016/wordml/cid" xmlns:w16="http://schemas.microsoft.com/office/word/2018/wordml" xmlns:w16sdtdh="http://schemas.microsoft.com/office/word/2020/wordml/sdtdatahash" xmlns:w16se="http://schemas.microsoft.com/office/word/2015/wordml/symex" xmlns:wpg="http://schemas.microsoft.com/office/word/2010/wordprocessingGroup" xmlns:wpi="http://schemas.microsoft.com/office/word/2010/wordprocessingInk" xmlns:wne="http://schemas.microsoft.com/office/word/2006/wordml" xmlns:wps="http://schemas.microsoft.com/office/word/2010/wordprocessingShape" mc:Ignorable="w14 w15 w16se w16cid w16 w16cex w16sdtdh wp14">
   <w:body>
-    <w:p/>
+    <w:p>
+      <w:pPr>
+        <w:pStyle w:val="K-EinzugmitAbstand"/>
+      </w:pPr>
+    </w:p>
     <w:p/>
     <w:p>
       <w:r>
@@ -6023,24 +6027,14 @@
             </w:r>
           </w:p>
           <w:p>
-            <w:proofErr w:type="spellStart"/>
-            <w:r>
-              <w:t>Luzernstrasse</w:t>
-            </w:r>
-            <w:proofErr w:type="spellEnd"/>
-            <w:r>
-              <w:t xml:space="preserve"> 18</w:t>
-            </w:r>
-          </w:p>
-          <w:p>
-            <w:r>
-              <w:t xml:space="preserve">6275 </w:t>
-            </w:r>
-            <w:proofErr w:type="spellStart"/>
-            <w:r>
-              <w:t>Ballwil</w:t>
-            </w:r>
-            <w:proofErr w:type="spellEnd"/>
+            <w:r>
+              <w:t>Luzernstrasse 18</w:t>
+            </w:r>
+          </w:p>
+          <w:p>
+            <w:r>
+              <w:t>6275 Ballwil</w:t>
+            </w:r>
           </w:p>
           <w:p>
             <w:r>
@@ -6162,19 +6156,11 @@
               </w:sdtPr>
               <w:sdtEndPr/>
               <w:sdtContent>
-                <w:proofErr w:type="spellStart"/>
                 <w:r>
                   <w:rPr>
                     <w:color w:val="FF0000"/>
                   </w:rPr>
-                  <w:t>Luzernstrasse</w:t>
-                </w:r>
-                <w:proofErr w:type="spellEnd"/>
-                <w:r>
-                  <w:rPr>
-                    <w:color w:val="FF0000"/>
-                  </w:rPr>
-                  <w:t xml:space="preserve"> 18</w:t>
+                  <w:t>Luzernstrasse 18</w:t>
                 </w:r>
               </w:sdtContent>
             </w:sdt>
@@ -6246,14 +6232,12 @@
             <w:sdtEndPr/>
             <w:sdtContent>
               <w:p>
-                <w:proofErr w:type="gramStart"/>
                 <w:r>
                   <w:rPr>
                     <w:color w:val="FF0000"/>
                   </w:rPr>
                   <w:t>Email</w:t>
                 </w:r>
-                <w:proofErr w:type="gramEnd"/>
               </w:p>
             </w:sdtContent>
           </w:sdt>
@@ -6303,69 +6287,49 @@
               <w:rPr>
                 <w:color w:val="FF0000"/>
               </w:rPr>
-              <w:t xml:space="preserve">Ruggiero </w:t>
-            </w:r>
-            <w:proofErr w:type="spellStart"/>
-            <w:r>
+              <w:t>Ruggiero Pelliccione</w:t>
+            </w:r>
+          </w:p>
+          <w:p>
+            <w:r>
+              <w:t>Kauz Informatik Medien AG</w:t>
+            </w:r>
+          </w:p>
+          <w:p>
+            <w:r>
+              <w:t>Luzernstrasse 18</w:t>
+            </w:r>
+          </w:p>
+          <w:p>
+            <w:r>
+              <w:t>6275 Ballwil</w:t>
+            </w:r>
+          </w:p>
+          <w:p>
+            <w:pPr>
               <w:rPr>
                 <w:color w:val="FF0000"/>
               </w:rPr>
-              <w:t>Pelliccione</w:t>
-            </w:r>
-            <w:proofErr w:type="spellEnd"/>
-          </w:p>
-          <w:p>
-            <w:r>
-              <w:t>Kauz Informatik Medien AG</w:t>
-            </w:r>
-          </w:p>
-          <w:p>
-            <w:proofErr w:type="spellStart"/>
-            <w:r>
-              <w:t>Luzernstrasse</w:t>
-            </w:r>
-            <w:proofErr w:type="spellEnd"/>
-            <w:r>
-              <w:t xml:space="preserve"> 18</w:t>
-            </w:r>
-          </w:p>
-          <w:p>
-            <w:r>
-              <w:t xml:space="preserve">6275 </w:t>
-            </w:r>
-            <w:proofErr w:type="spellStart"/>
-            <w:r>
-              <w:t>Ballwil</w:t>
-            </w:r>
-            <w:proofErr w:type="spellEnd"/>
-          </w:p>
-          <w:p>
-            <w:pPr>
+            </w:pPr>
+            <w:r>
               <w:rPr>
                 <w:color w:val="FF0000"/>
               </w:rPr>
-            </w:pPr>
-            <w:r>
+              <w:t>Telefon</w:t>
+            </w:r>
+          </w:p>
+          <w:p>
+            <w:pPr>
               <w:rPr>
                 <w:color w:val="FF0000"/>
               </w:rPr>
-              <w:t>Telefon</w:t>
-            </w:r>
-          </w:p>
-          <w:p>
-            <w:pPr>
+            </w:pPr>
+            <w:r>
               <w:rPr>
                 <w:color w:val="FF0000"/>
               </w:rPr>
-            </w:pPr>
-            <w:proofErr w:type="gramStart"/>
-            <w:r>
-              <w:rPr>
-                <w:color w:val="FF0000"/>
-              </w:rPr>
               <w:t>Email</w:t>
             </w:r>
-            <w:proofErr w:type="gramEnd"/>
           </w:p>
         </w:tc>
       </w:tr>
@@ -6414,13 +6378,8 @@
           </w:p>
           <w:p>
             <w:r>
-              <w:t xml:space="preserve">6275 </w:t>
-            </w:r>
-            <w:proofErr w:type="spellStart"/>
-            <w:r>
-              <w:t>Ballwil</w:t>
-            </w:r>
-            <w:proofErr w:type="spellEnd"/>
+              <w:t>6275 Ballwil</w:t>
+            </w:r>
           </w:p>
           <w:p>
             <w:pPr>
@@ -6441,14 +6400,12 @@
                 <w:color w:val="FF0000"/>
               </w:rPr>
             </w:pPr>
-            <w:proofErr w:type="gramStart"/>
             <w:r>
               <w:rPr>
                 <w:color w:val="FF0000"/>
               </w:rPr>
               <w:t>Email</w:t>
             </w:r>
-            <w:proofErr w:type="gramEnd"/>
           </w:p>
         </w:tc>
       </w:tr>
@@ -6524,14 +6481,12 @@
             </w:r>
           </w:p>
           <w:p>
-            <w:proofErr w:type="gramStart"/>
             <w:r>
               <w:rPr>
                 <w:color w:val="FF0000"/>
               </w:rPr>
               <w:t>Email</w:t>
             </w:r>
-            <w:proofErr w:type="gramEnd"/>
           </w:p>
         </w:tc>
       </w:tr>
@@ -6564,15 +6519,7 @@
       </w:pPr>
       <w:bookmarkStart w:id="9" w:name="_Hlk24373257"/>
       <w:r>
-        <w:t xml:space="preserve">Ein Fotograf möchte für sein Studio und auch privat eine </w:t>
-      </w:r>
-      <w:proofErr w:type="spellStart"/>
-      <w:r>
-        <w:t>WebApp</w:t>
-      </w:r>
-      <w:proofErr w:type="spellEnd"/>
-      <w:r>
-        <w:t>, um all seine Bilder zu speichern und verwalten zu können. Auf der Webseite kann man, wenn man angemeldet ist, neue Bilder hochladen, die dann gespeichert werden. Zu jedem Bild können noch folgende Informationen erfasst werden: Titel, optionale Beschreibung, Datum, Ort und ob das Bild öffentlich einsehbar sein sollte. Denn neue Einträge kann man nur erfassen, wenn man angemeldet ist. Auch sieht man nur alle Bilder in der Datenbank, wenn man angemeldet ist. Denn private Fotos sollen nicht öffentlich einsehbar sein. Wenn man nicht angemeldet ist, sieht man einfach auf der Startseite die Galerie mit den öffentlichen Bildern. In der Applikation soll es möglich sein, alle Benutzer zu verwalten und auch welche neu hinzuzufügen. Dazu soll die ganze Webseite responsiv sein und mit allen Bildgrössen klarkommen.</w:t>
+        <w:t>Ein Fotograf möchte für sein Studio und auch privat eine WebApp, um all seine Bilder zu speichern und verwalten zu können. Auf der Webseite kann man, wenn man angemeldet ist, neue Bilder hochladen, die dann gespeichert werden. Zu jedem Bild können noch folgende Informationen erfasst werden: Titel, optionale Beschreibung, Datum, Ort und ob das Bild öffentlich einsehbar sein sollte. Denn neue Einträge kann man nur erfassen, wenn man angemeldet ist. Auch sieht man nur alle Bilder in der Datenbank, wenn man angemeldet ist. Denn private Fotos sollen nicht öffentlich einsehbar sein. Wenn man nicht angemeldet ist, sieht man einfach auf der Startseite die Galerie mit den öffentlichen Bildern. In der Applikation soll es möglich sein, alle Benutzer zu verwalten und auch welche neu hinzuzufügen. Dazu soll die ganze Webseite responsiv sein und mit allen Bildgrössen klarkommen.</w:t>
       </w:r>
     </w:p>
     <w:p>
@@ -6585,24 +6532,11 @@
         <w:pStyle w:val="K-Einzug"/>
       </w:pPr>
       <w:r>
-        <w:t xml:space="preserve">Für die Aufgabe muss ein privates Repo im internen </w:t>
-      </w:r>
-      <w:proofErr w:type="spellStart"/>
-      <w:r>
-        <w:t>Gitea</w:t>
-      </w:r>
-      <w:proofErr w:type="spellEnd"/>
-      <w:r>
-        <w:t xml:space="preserve"> erstellt werden. Der Name des Repos ist zwingen “</w:t>
-      </w:r>
-      <w:proofErr w:type="spellStart"/>
-      <w:r>
-        <w:t>MPA_</w:t>
+        <w:t>Für die Aufgabe muss ein privates Repo im internen Gitea erstellt werden. Der Name des Repos ist zwingen “MPA_</w:t>
       </w:r>
       <w:r>
         <w:t>Fotogalerie</w:t>
       </w:r>
-      <w:proofErr w:type="spellEnd"/>
       <w:r>
         <w:t>”.</w:t>
       </w:r>
@@ -7917,10 +7851,26 @@
             <w:r>
               <w:t>Aufgabe 1</w:t>
             </w:r>
+            <w:r>
+              <w:t>: SQL-Datenbank erstellen</w:t>
+            </w:r>
           </w:p>
           <w:p>
             <w:r>
               <w:t>Aufgabe 2</w:t>
+            </w:r>
+            <w:r>
+              <w:t>: Login System erstellen</w:t>
+            </w:r>
+          </w:p>
+          <w:p>
+            <w:r>
+              <w:t>Aufgabe 3: Zugriffsrechte einrichten</w:t>
+            </w:r>
+          </w:p>
+          <w:p>
+            <w:r>
+              <w:t>Aufgabe 4: Benutzerübersicht mit CSS erstellen</w:t>
             </w:r>
           </w:p>
         </w:tc>
@@ -8024,59 +7974,6 @@
             <w:r>
               <w:t xml:space="preserve"> </w:t>
             </w:r>
-            <w:r>
-              <w:rPr>
-                <w:noProof/>
-              </w:rPr>
-              <w:drawing>
-                <wp:inline distT="0" distB="0" distL="0" distR="0" wp14:anchorId="62786428" wp14:editId="3FA7477F">
-                  <wp:extent cx="216000" cy="216000"/>
-                  <wp:effectExtent l="0" t="0" r="0" b="0"/>
-                  <wp:docPr id="26" name="Grafik 26"/>
-                  <wp:cNvGraphicFramePr>
-                    <a:graphicFrameLocks xmlns:a="http://schemas.openxmlformats.org/drawingml/2006/main" noChangeAspect="1"/>
-                  </wp:cNvGraphicFramePr>
-                  <a:graphic xmlns:a="http://schemas.openxmlformats.org/drawingml/2006/main">
-                    <a:graphicData uri="http://schemas.openxmlformats.org/drawingml/2006/picture">
-                      <pic:pic xmlns:pic="http://schemas.openxmlformats.org/drawingml/2006/picture">
-                        <pic:nvPicPr>
-                          <pic:cNvPr id="0" name="Grafik 9"/>
-                          <pic:cNvPicPr>
-                            <a:picLocks noChangeAspect="1" noChangeArrowheads="1"/>
-                          </pic:cNvPicPr>
-                        </pic:nvPicPr>
-                        <pic:blipFill>
-                          <a:blip r:embed="rId19">
-                            <a:extLst>
-                              <a:ext uri="{28A0092B-C50C-407E-A947-70E740481C1C}">
-                                <a14:useLocalDpi xmlns:a14="http://schemas.microsoft.com/office/drawing/2010/main" val="0"/>
-                              </a:ext>
-                            </a:extLst>
-                          </a:blip>
-                          <a:srcRect l="-5115" t="-5115" r="-5115" b="-5115"/>
-                          <a:stretch>
-                            <a:fillRect/>
-                          </a:stretch>
-                        </pic:blipFill>
-                        <pic:spPr bwMode="auto">
-                          <a:xfrm>
-                            <a:off x="0" y="0"/>
-                            <a:ext cx="216000" cy="216000"/>
-                          </a:xfrm>
-                          <a:prstGeom prst="rect">
-                            <a:avLst/>
-                          </a:prstGeom>
-                          <a:noFill/>
-                          <a:ln>
-                            <a:noFill/>
-                          </a:ln>
-                        </pic:spPr>
-                      </pic:pic>
-                    </a:graphicData>
-                  </a:graphic>
-                </wp:inline>
-              </w:drawing>
-            </w:r>
           </w:p>
         </w:tc>
       </w:tr>
@@ -8125,7 +8022,11 @@
               </w:rPr>
             </w:pPr>
             <w:r>
-              <w:t>Text…</w:t>
+              <w:rPr>
+                <w:b/>
+                <w:bCs/>
+              </w:rPr>
+              <w:t>Ich konnte heute alle vorgenommenen Arbeiten erledigen.</w:t>
             </w:r>
           </w:p>
         </w:tc>
@@ -8166,7 +8067,11 @@
             <w:tcW w:w="9081" w:type="dxa"/>
             <w:gridSpan w:val="4"/>
           </w:tcPr>
-          <w:p/>
+          <w:p>
+            <w:r>
+              <w:t>Es traten beim Erarbeiten der Arbeiten keine Fehler auf.</w:t>
+            </w:r>
+          </w:p>
         </w:tc>
       </w:tr>
       <w:tr>
@@ -8205,7 +8110,11 @@
             <w:tcW w:w="9081" w:type="dxa"/>
             <w:gridSpan w:val="4"/>
           </w:tcPr>
-          <w:p/>
+          <w:p>
+            <w:r>
+              <w:t>Es wurden an dem Tag keine Tests durchgeführt.</w:t>
+            </w:r>
+          </w:p>
         </w:tc>
       </w:tr>
       <w:tr>
@@ -8244,7 +8153,11 @@
             <w:tcW w:w="9081" w:type="dxa"/>
             <w:gridSpan w:val="4"/>
           </w:tcPr>
-          <w:p/>
+          <w:p>
+            <w:r>
+              <w:t>Es wurde an dem Tag keine Hilfe beansprucht.</w:t>
+            </w:r>
+          </w:p>
         </w:tc>
       </w:tr>
       <w:tr>
@@ -8269,6 +8182,7 @@
               <w:rPr>
                 <w:b/>
               </w:rPr>
+              <w:lastRenderedPageBreak/>
               <w:t>Vergleich mit Zeitplan</w:t>
             </w:r>
           </w:p>
@@ -8283,7 +8197,11 @@
             <w:tcW w:w="9081" w:type="dxa"/>
             <w:gridSpan w:val="4"/>
           </w:tcPr>
-          <w:p/>
+          <w:p>
+            <w:r>
+              <w:t>Verglichen mit dem Zeitplan bin ich sehr gut drin.</w:t>
+            </w:r>
+          </w:p>
         </w:tc>
       </w:tr>
       <w:tr>
@@ -8308,7 +8226,6 @@
               <w:rPr>
                 <w:b/>
               </w:rPr>
-              <w:lastRenderedPageBreak/>
               <w:t>Reflexion</w:t>
             </w:r>
           </w:p>
@@ -8329,6 +8246,12 @@
                 <w:bCs/>
               </w:rPr>
             </w:pPr>
+            <w:r>
+              <w:rPr>
+                <w:bCs/>
+              </w:rPr>
+              <w:t>Ich kam heute sehr gut vorwärts. Ich konnte eigentlich den für mich Kompliziertesten Teil erledigen und war überrascht, dass ich es so schnell fertig geschafft habe. Hätte allerdings aus meiner Wahrnehmung deutlich mehr machen können.</w:t>
+            </w:r>
           </w:p>
         </w:tc>
       </w:tr>
@@ -9730,6 +9653,7 @@
               <w:rPr>
                 <w:b/>
               </w:rPr>
+              <w:lastRenderedPageBreak/>
               <w:t>Erreichte Ziele &amp; abgeschlossene Arbeit</w:t>
             </w:r>
           </w:p>
@@ -9819,7 +9743,6 @@
               <w:rPr>
                 <w:b/>
               </w:rPr>
-              <w:lastRenderedPageBreak/>
               <w:t>Erfolgreiche oder erfolglose Tests</w:t>
             </w:r>
           </w:p>
@@ -11019,6 +10942,7 @@
               <w:rPr>
                 <w:b/>
               </w:rPr>
+              <w:lastRenderedPageBreak/>
               <w:t>Reflexion</w:t>
             </w:r>
           </w:p>
@@ -11055,7 +10979,6 @@
       <w:bookmarkStart w:id="36" w:name="_Toc25148317"/>
       <w:bookmarkStart w:id="37" w:name="_Toc110858275"/>
       <w:r>
-        <w:lastRenderedPageBreak/>
         <w:t xml:space="preserve">Tag 8: </w:t>
       </w:r>
       <w:bookmarkEnd w:id="36"/>
@@ -12490,6 +12413,7 @@
               <w:rPr>
                 <w:b/>
               </w:rPr>
+              <w:lastRenderedPageBreak/>
               <w:t>Aufgetretene Probleme</w:t>
             </w:r>
           </w:p>
@@ -12568,7 +12492,6 @@
               <w:rPr>
                 <w:b/>
               </w:rPr>
-              <w:lastRenderedPageBreak/>
               <w:t>Beanspruchte Hilfe</w:t>
             </w:r>
           </w:p>
@@ -12731,15 +12654,7 @@
         <w:t xml:space="preserve">Nachfolgend werden die User Storys für </w:t>
       </w:r>
       <w:r>
-        <w:t>die Rolle «</w:t>
-      </w:r>
-      <w:proofErr w:type="spellStart"/>
-      <w:r>
-        <w:t>Owner</w:t>
-      </w:r>
-      <w:proofErr w:type="spellEnd"/>
-      <w:r>
-        <w:t>»</w:t>
+        <w:t>die Rolle «Owner»</w:t>
       </w:r>
       <w:r>
         <w:t xml:space="preserve"> aufgeführt:</w:t>
@@ -12844,15 +12759,7 @@
               <w:ind w:left="0"/>
             </w:pPr>
             <w:r>
-              <w:t>Als Benutzer mit der Rolle «</w:t>
-            </w:r>
-            <w:proofErr w:type="spellStart"/>
-            <w:r>
-              <w:t>Owner</w:t>
-            </w:r>
-            <w:proofErr w:type="spellEnd"/>
-            <w:r>
-              <w:t>» kann ich Bilder hochladen, damit ich sie auf der Webseite anzeigen kann.</w:t>
+              <w:t>Als Benutzer mit der Rolle «Owner» kann ich Bilder hochladen, damit ich sie auf der Webseite anzeigen kann.</w:t>
             </w:r>
           </w:p>
         </w:tc>
@@ -13028,15 +12935,7 @@
               <w:t>Als Benutzer</w:t>
             </w:r>
             <w:r>
-              <w:t xml:space="preserve"> mit der Rolle «</w:t>
-            </w:r>
-            <w:proofErr w:type="spellStart"/>
-            <w:r>
-              <w:t>Owner</w:t>
-            </w:r>
-            <w:proofErr w:type="spellEnd"/>
-            <w:r>
-              <w:t>»</w:t>
+              <w:t xml:space="preserve"> mit der Rolle «Owner»</w:t>
             </w:r>
             <w:r>
               <w:t xml:space="preserve"> kann ich</w:t>
@@ -13221,15 +13120,7 @@
               <w:ind w:left="0"/>
             </w:pPr>
             <w:r>
-              <w:t>Als Benutzer mit der Rolle «</w:t>
-            </w:r>
-            <w:proofErr w:type="spellStart"/>
-            <w:r>
-              <w:t>Owner</w:t>
-            </w:r>
-            <w:proofErr w:type="spellEnd"/>
-            <w:r>
-              <w:t xml:space="preserve">» kann ich hinzugefügte Bilder </w:t>
+              <w:t xml:space="preserve">Als Benutzer mit der Rolle «Owner» kann ich hinzugefügte Bilder </w:t>
             </w:r>
             <w:r>
               <w:t>löschen</w:t>
@@ -13420,15 +13311,7 @@
               <w:ind w:left="0"/>
             </w:pPr>
             <w:r>
-              <w:t>Als Benutzer mit der Rolle «</w:t>
-            </w:r>
-            <w:proofErr w:type="spellStart"/>
-            <w:r>
-              <w:t>Owner</w:t>
-            </w:r>
-            <w:proofErr w:type="spellEnd"/>
-            <w:r>
-              <w:t xml:space="preserve">» kann ich </w:t>
+              <w:t xml:space="preserve">Als Benutzer mit der Rolle «Owner» kann ich </w:t>
             </w:r>
             <w:r>
               <w:t>VIP-</w:t>
@@ -13622,15 +13505,7 @@
               <w:ind w:left="0"/>
             </w:pPr>
             <w:r>
-              <w:t>Als Benutzer mit der Rolle «</w:t>
-            </w:r>
-            <w:proofErr w:type="spellStart"/>
-            <w:r>
-              <w:t>Owner</w:t>
-            </w:r>
-            <w:proofErr w:type="spellEnd"/>
-            <w:r>
-              <w:t xml:space="preserve">» kann ich </w:t>
+              <w:t xml:space="preserve">Als Benutzer mit der Rolle «Owner» kann ich </w:t>
             </w:r>
             <w:r>
               <w:t>VIP-</w:t>
@@ -13735,10 +13610,7 @@
               <w:ind w:left="0"/>
             </w:pPr>
             <w:r>
-              <w:t xml:space="preserve">User Story </w:t>
-            </w:r>
-            <w:r>
-              <w:t>6</w:t>
+              <w:t>User Story 6</w:t>
             </w:r>
           </w:p>
         </w:tc>
@@ -13782,10 +13654,7 @@
               <w:ind w:left="0"/>
             </w:pPr>
             <w:r>
-              <w:t xml:space="preserve">Benutzer </w:t>
-            </w:r>
-            <w:r>
-              <w:t>löschen</w:t>
+              <w:t>Benutzer löschen</w:t>
             </w:r>
           </w:p>
         </w:tc>
@@ -13815,33 +13684,7 @@
               <w:ind w:left="0"/>
             </w:pPr>
             <w:r>
-              <w:t>Als Benutzer mit der Rolle «</w:t>
-            </w:r>
-            <w:proofErr w:type="spellStart"/>
-            <w:r>
-              <w:t>Owner</w:t>
-            </w:r>
-            <w:proofErr w:type="spellEnd"/>
-            <w:r>
-              <w:t xml:space="preserve">» kann ich </w:t>
-            </w:r>
-            <w:r>
-              <w:t>VIP-</w:t>
-            </w:r>
-            <w:r>
-              <w:t xml:space="preserve">Benutzer </w:t>
-            </w:r>
-            <w:r>
-              <w:t>löschen</w:t>
-            </w:r>
-            <w:r>
-              <w:t xml:space="preserve">, damit der Fotograph </w:t>
-            </w:r>
-            <w:r>
-              <w:t>ihre Daten löschen kann</w:t>
-            </w:r>
-            <w:r>
-              <w:t>.</w:t>
+              <w:t>Als Benutzer mit der Rolle «Owner» kann ich VIP-Benutzer löschen, damit der Fotograph ihre Daten löschen kann.</w:t>
             </w:r>
           </w:p>
         </w:tc>
@@ -14018,15 +13861,7 @@
               <w:ind w:left="0"/>
             </w:pPr>
             <w:r>
-              <w:t>Als Benutzer mit der Rolle «</w:t>
-            </w:r>
-            <w:proofErr w:type="spellStart"/>
-            <w:r>
-              <w:t>Owner</w:t>
-            </w:r>
-            <w:proofErr w:type="spellEnd"/>
-            <w:r>
-              <w:t xml:space="preserve">» kann </w:t>
+              <w:t xml:space="preserve">Als Benutzer mit der Rolle «Owner» kann </w:t>
             </w:r>
             <w:r>
               <w:t>man sich einloggen</w:t>
@@ -14394,13 +14229,7 @@
               <w:ind w:left="0"/>
             </w:pPr>
             <w:r>
-              <w:t>Als Benutzer mit der Rolle «</w:t>
-            </w:r>
-            <w:r>
-              <w:t>VIP</w:t>
-            </w:r>
-            <w:r>
-              <w:t>» kann ich Bilder hochladen, damit ich sie auf der Webseite anzeigen kann.</w:t>
+              <w:t>Als Benutzer mit der Rolle «VIP» kann ich Bilder hochladen, damit ich sie auf der Webseite anzeigen kann.</w:t>
             </w:r>
           </w:p>
         </w:tc>
@@ -14501,10 +14330,7 @@
               <w:ind w:left="0"/>
             </w:pPr>
             <w:r>
-              <w:t xml:space="preserve">User Story </w:t>
-            </w:r>
-            <w:r>
-              <w:t>3</w:t>
+              <w:t>User Story 3</w:t>
             </w:r>
           </w:p>
         </w:tc>
@@ -14548,10 +14374,7 @@
               <w:ind w:left="0"/>
             </w:pPr>
             <w:r>
-              <w:t xml:space="preserve">Bilder </w:t>
-            </w:r>
-            <w:r>
-              <w:t>bearbeiten</w:t>
+              <w:t>Bilder bearbeiten</w:t>
             </w:r>
           </w:p>
         </w:tc>
@@ -14581,13 +14404,7 @@
               <w:ind w:left="0"/>
             </w:pPr>
             <w:r>
-              <w:t>Als Benutzer mit der Rolle «</w:t>
-            </w:r>
-            <w:r>
-              <w:t>VIP</w:t>
-            </w:r>
-            <w:r>
-              <w:t>» kann ich hinzugefügte Bilder bearbeiten, damit ich sie auf der Webseite aktualisieren kann.</w:t>
+              <w:t>Als Benutzer mit der Rolle «VIP» kann ich hinzugefügte Bilder bearbeiten, damit ich sie auf der Webseite aktualisieren kann.</w:t>
             </w:r>
           </w:p>
         </w:tc>
@@ -14687,10 +14504,7 @@
               <w:ind w:left="0"/>
             </w:pPr>
             <w:r>
-              <w:t xml:space="preserve">User Story </w:t>
-            </w:r>
-            <w:r>
-              <w:t>4</w:t>
+              <w:t>User Story 4</w:t>
             </w:r>
           </w:p>
         </w:tc>
@@ -14764,13 +14578,7 @@
               <w:ind w:left="0"/>
             </w:pPr>
             <w:r>
-              <w:t>Als Benutzer mit der Rolle «</w:t>
-            </w:r>
-            <w:r>
-              <w:t>VIP</w:t>
-            </w:r>
-            <w:r>
-              <w:t>» kann ich hinzugefügte Bilder löschen, damit ich sie aus der Webseite löschen kann.</w:t>
+              <w:t>Als Benutzer mit der Rolle «VIP» kann ich hinzugefügte Bilder löschen, damit ich sie aus der Webseite löschen kann.</w:t>
             </w:r>
           </w:p>
         </w:tc>
@@ -14925,22 +14733,30 @@
       <w:r>
         <w:t xml:space="preserve">Abbildung </w:t>
       </w:r>
-      <w:fldSimple w:instr=" SEQ Abbildung \* ARABIC ">
-        <w:r>
-          <w:rPr>
-            <w:noProof/>
-          </w:rPr>
-          <w:t>1</w:t>
-        </w:r>
-      </w:fldSimple>
-      <w:r>
-        <w:t xml:space="preserve">: Use Case </w:t>
-      </w:r>
-      <w:proofErr w:type="spellStart"/>
-      <w:r>
-        <w:t>Diagram</w:t>
-      </w:r>
-      <w:proofErr w:type="spellEnd"/>
+      <w:r>
+        <w:fldChar w:fldCharType="begin"/>
+      </w:r>
+      <w:r>
+        <w:instrText xml:space="preserve"> SEQ Abbildung \* ARABIC </w:instrText>
+      </w:r>
+      <w:r>
+        <w:fldChar w:fldCharType="separate"/>
+      </w:r>
+      <w:r>
+        <w:rPr>
+          <w:noProof/>
+        </w:rPr>
+        <w:t>1</w:t>
+      </w:r>
+      <w:r>
+        <w:rPr>
+          <w:noProof/>
+        </w:rPr>
+        <w:fldChar w:fldCharType="end"/>
+      </w:r>
+      <w:r>
+        <w:t>: Use Case Diagram</w:t>
+      </w:r>
     </w:p>
     <w:p>
       <w:pPr>
@@ -15244,15 +15060,7 @@
         <w:pStyle w:val="K-Einzug"/>
       </w:pPr>
       <w:r>
-        <w:t>Grundsätzlich soll man auf der Webseite öffentliche Bilder eines Fotographen sehen können. Nur der Benutzer mit der Rolle «</w:t>
-      </w:r>
-      <w:proofErr w:type="spellStart"/>
-      <w:r>
-        <w:t>Owner</w:t>
-      </w:r>
-      <w:proofErr w:type="spellEnd"/>
-      <w:r>
-        <w:t xml:space="preserve">», also der Fotographen kann Bilder hochladen, bearbeiten und löschen, sowie auch Benutzer hinzufügen, bearbeiten und löschen welche </w:t>
+        <w:t xml:space="preserve">Grundsätzlich soll man auf der Webseite öffentliche Bilder eines Fotographen sehen können. Nur der Benutzer mit der Rolle «Owner», also der Fotographen kann Bilder hochladen, bearbeiten und löschen, sowie auch Benutzer hinzufügen, bearbeiten und löschen welche </w:t>
       </w:r>
       <w:r>
         <w:t>seinen privaten Bildern</w:t>
@@ -15489,15 +15297,7 @@
         </w:rPr>
       </w:pPr>
       <w:r>
-        <w:t xml:space="preserve">Für die Applikation wurde die Sprache XY benutz. Für die Versionskontrolle wurde ein Firmen Internes </w:t>
-      </w:r>
-      <w:proofErr w:type="spellStart"/>
-      <w:r>
-        <w:t>Git</w:t>
-      </w:r>
-      <w:proofErr w:type="spellEnd"/>
-      <w:r>
-        <w:t xml:space="preserve"> Repository verwendet. Das Backup des Servers wird nach dem </w:t>
+        <w:t xml:space="preserve">Für die Applikation wurde die Sprache XY benutz. Für die Versionskontrolle wurde ein Firmen Internes Git Repository verwendet. Das Backup des Servers wird nach dem </w:t>
       </w:r>
       <w:hyperlink r:id="rId21" w:history="1">
         <w:r>
@@ -15825,13 +15625,11 @@
       </w:pPr>
       <w:bookmarkStart w:id="78" w:name="_Toc25148338"/>
       <w:bookmarkStart w:id="79" w:name="_Toc110858296"/>
-      <w:proofErr w:type="spellStart"/>
       <w:r>
         <w:t>Activity</w:t>
       </w:r>
       <w:bookmarkEnd w:id="78"/>
       <w:bookmarkEnd w:id="79"/>
-      <w:proofErr w:type="spellEnd"/>
     </w:p>
     <w:p>
       <w:pPr>
@@ -15864,15 +15662,10 @@
       <w:bookmarkStart w:id="84" w:name="_Toc25148342"/>
       <w:bookmarkStart w:id="85" w:name="_Toc110858299"/>
       <w:r>
-        <w:t>Mock-</w:t>
-      </w:r>
-      <w:proofErr w:type="spellStart"/>
-      <w:r>
-        <w:t>Ups</w:t>
+        <w:t>Mock-Ups</w:t>
       </w:r>
       <w:bookmarkEnd w:id="84"/>
       <w:bookmarkEnd w:id="85"/>
-      <w:proofErr w:type="spellEnd"/>
     </w:p>
     <w:p>
       <w:pPr>
@@ -16747,11 +16540,9 @@
               <w:pStyle w:val="K-Einzug"/>
               <w:ind w:left="0"/>
             </w:pPr>
-            <w:proofErr w:type="spellStart"/>
             <w:r>
               <w:t>Ballwil</w:t>
             </w:r>
-            <w:proofErr w:type="spellEnd"/>
           </w:p>
         </w:tc>
         <w:tc>
@@ -16920,17 +16711,33 @@
       <w:pPr>
         <w:pStyle w:val="K-Einzug"/>
       </w:pPr>
-      <w:fldSimple w:instr=" TOC \h \z \c &quot;Abbildung&quot; ">
-        <w:r>
-          <w:rPr>
-            <w:b/>
-            <w:bCs w:val="0"/>
-            <w:noProof/>
-            <w:lang w:val="de-DE"/>
-          </w:rPr>
-          <w:t>Es konnten keine Einträge für ein Abbildungsverzeichnis gefunden werden.</w:t>
-        </w:r>
-      </w:fldSimple>
+      <w:r>
+        <w:fldChar w:fldCharType="begin"/>
+      </w:r>
+      <w:r>
+        <w:instrText xml:space="preserve"> TOC \h \z \c "Abbildung" </w:instrText>
+      </w:r>
+      <w:r>
+        <w:fldChar w:fldCharType="separate"/>
+      </w:r>
+      <w:r>
+        <w:rPr>
+          <w:b/>
+          <w:bCs w:val="0"/>
+          <w:noProof/>
+          <w:lang w:val="de-DE"/>
+        </w:rPr>
+        <w:t>Es konnten keine Einträge für ein Abbildungsverzeichnis gefunden werden.</w:t>
+      </w:r>
+      <w:r>
+        <w:rPr>
+          <w:b/>
+          <w:bCs w:val="0"/>
+          <w:noProof/>
+          <w:lang w:val="de-DE"/>
+        </w:rPr>
+        <w:fldChar w:fldCharType="end"/>
+      </w:r>
     </w:p>
     <w:p/>
     <w:p>
@@ -18057,36 +17864,15 @@
               <w:sz w:val="18"/>
             </w:rPr>
             <w:br/>
-          </w:r>
-          <w:proofErr w:type="spellStart"/>
-          <w:r>
-            <w:rPr>
-              <w:sz w:val="18"/>
-            </w:rPr>
-            <w:t>Luzernstrasse</w:t>
-          </w:r>
-          <w:proofErr w:type="spellEnd"/>
-          <w:r>
-            <w:rPr>
-              <w:sz w:val="18"/>
-            </w:rPr>
-            <w:t xml:space="preserve"> 18</w:t>
+            <w:t>Luzernstrasse 18</w:t>
           </w:r>
           <w:r>
             <w:rPr>
               <w:sz w:val="18"/>
             </w:rPr>
             <w:br/>
-            <w:t xml:space="preserve">6275 </w:t>
+            <w:t>6275 Ballwil</w:t>
           </w:r>
-          <w:proofErr w:type="spellStart"/>
-          <w:r>
-            <w:rPr>
-              <w:sz w:val="18"/>
-            </w:rPr>
-            <w:t>Ballwil</w:t>
-          </w:r>
-          <w:proofErr w:type="spellEnd"/>
         </w:p>
       </w:tc>
       <w:tc>
@@ -22705,6 +22491,7 @@
     <w:rsid w:val="00487EB2"/>
     <w:rsid w:val="004D1121"/>
     <w:rsid w:val="00510DBA"/>
+    <w:rsid w:val="005F5EC3"/>
     <w:rsid w:val="006D7424"/>
     <w:rsid w:val="0089013A"/>
     <w:rsid w:val="00962AB4"/>
@@ -22716,6 +22503,7 @@
     <w:rsid w:val="00D01ED4"/>
     <w:rsid w:val="00D55047"/>
     <w:rsid w:val="00D95FBC"/>
+    <w:rsid w:val="00E16C82"/>
     <w:rsid w:val="00E44AEE"/>
     <w:rsid w:val="00FF5032"/>
   </w:rsids>

</xml_diff>

<commit_message>
Teil 1 - 3 fast fertig
</commit_message>
<xml_diff>
--- a/docs/PA_Fotostudio_Doku.docx
+++ b/docs/PA_Fotostudio_Doku.docx
@@ -6553,53 +6553,77 @@
     </w:p>
     <w:p>
       <w:pPr>
-        <w:pStyle w:val="K-Einzug"/>
+        <w:ind w:left="709"/>
       </w:pPr>
       <w:r>
-        <w:t>Ein Projekt in welche</w:t>
+        <w:t>Es soll eine Applikation geschaffen werden, in welchem ein Photograph seine Bilder hochlädt. Der Photograph ist der «Owner», also hat diese Rolle und soll auch Benutzer hinzufügen</w:t>
       </w:r>
       <w:r>
-        <w:t xml:space="preserve">s der Fotograph seine Bilder hochladen kann. </w:t>
+        <w:t>, bearbeiten und löschen</w:t>
       </w:r>
       <w:r>
-        <w:t xml:space="preserve">Zu </w:t>
+        <w:t xml:space="preserve"> können mit der Rolle «VIP», die ebenfalls Bilder hochladen können und alles sehen können, nur nicht Benutzer verwalten. Dies soll nur der «Owner» können. Normale </w:t>
       </w:r>
       <w:r>
-        <w:t>einem hochgeladenen Bild</w:t>
+        <w:t>Benutzer,</w:t>
       </w:r>
       <w:r>
-        <w:t xml:space="preserve"> gehören Titel, Beschreibung, Datum, Ort und ob das Bild öffentlich sein soll oder nicht.</w:t>
+        <w:t xml:space="preserve"> die keine Rolle haben, also nicht in der Benutzerverwaltung hinzugefügt wurden, können nur öffentliche Bilder sehen und sonst gar nichts.</w:t>
       </w:r>
     </w:p>
     <w:p>
       <w:pPr>
-        <w:pStyle w:val="K-Einzug"/>
+        <w:ind w:firstLine="709"/>
+      </w:pPr>
+    </w:p>
+    <w:p>
+      <w:pPr>
+        <w:ind w:left="709"/>
       </w:pPr>
       <w:r>
-        <w:t>Wenn man angemeldet ist, soll man alle Bilder sehen und wenn man nicht eingeloggt ist, nur die öffentlichen.</w:t>
+        <w:t>Wenn ein Bild hinzugefügt wurde, soll das Bild auf der Applikation angezeigt werden. Wenn man mit der Maus über das Bild drüberfährt, sollen weitere Informationen über das Bild angezeigt werden, wie Titel, Beschreibung, Datum, Ort und von wem das Bild kommt bzw. wer es hinzugefügt hat.</w:t>
       </w:r>
     </w:p>
     <w:p>
       <w:pPr>
-        <w:pStyle w:val="K-Einzug"/>
-      </w:pPr>
-    </w:p>
-    <w:p>
-      <w:pPr>
-        <w:pStyle w:val="K-Einzug"/>
+        <w:ind w:firstLine="709"/>
+      </w:pPr>
+    </w:p>
+    <w:p>
+      <w:pPr>
+        <w:ind w:left="709"/>
       </w:pPr>
       <w:r>
-        <w:t xml:space="preserve">Der Fotograph, welchem die Seite gehört, kann beliebig viele Benutzer hinzufügen, bearbeiten und löschen. Diese können dann auch </w:t>
+        <w:t xml:space="preserve">Bei der Benutzerverwaltung sollen alle Benutzer angezeigt werden, die vom «Owner» hinzugefügt wurden. Dort soll man die Benutzer ID, Benutzernamen, </w:t>
       </w:r>
       <w:r>
-        <w:t>seine privaten Bilder</w:t>
+        <w:t>E-Mail-Adresse</w:t>
       </w:r>
       <w:r>
-        <w:t xml:space="preserve"> sehen.</w:t>
+        <w:t>, die Rolle und das Datum angezeigt werden. Beim Datum wird das Datum angezeigt, wann der Benutzer genau ins System hinzugefügt wurde.</w:t>
       </w:r>
     </w:p>
     <w:p>
       <w:pPr>
+        <w:ind w:firstLine="709"/>
+      </w:pPr>
+    </w:p>
+    <w:p>
+      <w:pPr>
+        <w:ind w:left="709"/>
+      </w:pPr>
+      <w:r>
+        <w:t xml:space="preserve">Damit sich der «Owner» oder der «VIP» auf der Applikation ihre Rechte ergattern können, müssen sie sich einloggen. Im Login soll man die </w:t>
+      </w:r>
+      <w:r>
+        <w:t>E-Mail-Adresse</w:t>
+      </w:r>
+      <w:r>
+        <w:t xml:space="preserve"> und das Passwort eingeben. Die Passwörter entscheidet der «Owner» für beide Seiten selbst. Respektive wenn der «Owner» einen Benutzer als «VIP» in der Benutzerverwaltung hinzufügt, entscheidet er welches Passwort er hat.</w:t>
+      </w:r>
+    </w:p>
+    <w:p>
+      <w:pPr>
         <w:pStyle w:val="K-Einzug"/>
       </w:pPr>
     </w:p>
@@ -6608,8 +6632,26 @@
         <w:pStyle w:val="K-Einzug"/>
       </w:pPr>
       <w:r>
-        <w:t>Die Umsetzung erfolgt mit der Programmiersprache PHP und dem MVC (Model View Controller) Pattern, das für die Struktur des Projekts zuständig ist.</w:t>
+        <w:t>Die Umsetzung</w:t>
       </w:r>
+      <w:r>
+        <w:t xml:space="preserve"> soll</w:t>
+      </w:r>
+      <w:r>
+        <w:t xml:space="preserve"> mit der </w:t>
+      </w:r>
+      <w:r>
+        <w:t xml:space="preserve">serverseitigen </w:t>
+      </w:r>
+      <w:r>
+        <w:t>Programmiersprache PHP und dem MVC (Model View Controller) Pattern, das für die Struktur des Projekts zuständig ist</w:t>
+      </w:r>
+      <w:r>
+        <w:t>, erschaffen werden</w:t>
+      </w:r>
+      <w:r>
+        <w:t>.</w:t>
+      </w:r>
     </w:p>
     <w:p>
       <w:pPr>
@@ -6621,47 +6663,13 @@
         <w:pStyle w:val="K-Einzug"/>
       </w:pPr>
       <w:r>
-        <w:t>Eine konzeptionelle Zusammenfassung der Arbeit und des erarbeiteten Ergebnisses erleichtert dem mit dem Projekt befassten Leser des Berichts den Einstieg für das Verständnis der geleisteten Arbeit. Die Kurzfassung richtet sich an die fachlich kompetenten Leser.</w:t>
+        <w:t xml:space="preserve">Das Ergebnis soll </w:t>
       </w:r>
-    </w:p>
-    <w:p>
-      <w:pPr>
-        <w:pStyle w:val="K-Einzug"/>
-      </w:pPr>
       <w:r>
-        <w:t xml:space="preserve">Die Kurzfassung enthält die Punkte: </w:t>
+        <w:t>ein Web</w:t>
       </w:r>
-    </w:p>
-    <w:p>
-      <w:pPr>
-        <w:pStyle w:val="K-Aufzhlung1"/>
-      </w:pPr>
       <w:r>
-        <w:t xml:space="preserve">Kurze Ausgangssituation </w:t>
-      </w:r>
-    </w:p>
-    <w:p>
-      <w:pPr>
-        <w:pStyle w:val="K-Aufzhlung1"/>
-      </w:pPr>
-      <w:r>
-        <w:t>Umsetzung</w:t>
-      </w:r>
-    </w:p>
-    <w:p>
-      <w:pPr>
-        <w:pStyle w:val="K-Aufzhlung1"/>
-      </w:pPr>
-      <w:r>
-        <w:t>Ergebnis</w:t>
-      </w:r>
-    </w:p>
-    <w:p>
-      <w:pPr>
-        <w:pStyle w:val="K-Einzug"/>
-      </w:pPr>
-      <w:r>
-        <w:t>Die Kurzfassung enthält zu jedem dieser genannten Punkte die wesentlichen Aspekte. Die Kurzfassung ist nicht länger als 1 A4-Seite Text und enthält keine Grafik.</w:t>
+        <w:t xml:space="preserve"> basierte Applikation sein, die nur eine Verbindung mit dem Server braucht und mehr nicht. Eine Verbindung zum Internet ist also nicht zwingend.</w:t>
       </w:r>
     </w:p>
     <w:p>
@@ -6679,72 +6687,21 @@
     </w:p>
     <w:p>
       <w:pPr>
-        <w:pStyle w:val="K-Einzug"/>
+        <w:pStyle w:val="K-Aufzhlung1"/>
+        <w:numPr>
+          <w:ilvl w:val="0"/>
+          <w:numId w:val="0"/>
+        </w:numPr>
+        <w:ind w:left="993" w:hanging="284"/>
       </w:pPr>
       <w:r>
-        <w:t>Welche Vorkenntnisse man selbst besitzt (max. ½ Seite).</w:t>
-      </w:r>
-    </w:p>
-    <w:p>
-      <w:pPr>
-        <w:pStyle w:val="K-Einzug"/>
-      </w:pPr>
-      <w:r>
-        <w:t>Beispiele für die Formulierung:</w:t>
-      </w:r>
-    </w:p>
-    <w:p>
-      <w:pPr>
-        <w:pStyle w:val="K-Aufzhlung1"/>
-      </w:pPr>
-      <w:r>
-        <w:t>Access: Anfängerkurs, bisher keine eigenen Arbeiten</w:t>
-      </w:r>
-    </w:p>
-    <w:p>
-      <w:pPr>
-        <w:pStyle w:val="K-Aufzhlung1"/>
-      </w:pPr>
-      <w:r>
-        <w:t>Windows-Installation: regelmässig bei Kunden</w:t>
-      </w:r>
-    </w:p>
-    <w:p>
-      <w:pPr>
-        <w:pStyle w:val="K-Aufzhlung1"/>
-      </w:pPr>
-      <w:r>
-        <w:t>Programmieren: mehrere vergleichbare Programme geschrieben.</w:t>
-      </w:r>
-    </w:p>
-    <w:p>
-      <w:pPr>
-        <w:pStyle w:val="K-Aufzhlung1"/>
-      </w:pPr>
-      <w:r>
-        <w:t>Kennt</w:t>
+        <w:t xml:space="preserve">Ich </w:t>
       </w:r>
       <w:r>
-        <w:t xml:space="preserve"> </w:t>
+        <w:t>selbst</w:t>
       </w:r>
       <w:r>
-        <w:t>alle gebrauchten Komponenten</w:t>
-      </w:r>
-    </w:p>
-    <w:p>
-      <w:pPr>
-        <w:pStyle w:val="K-Aufzhlung1"/>
-      </w:pPr>
-      <w:r>
-        <w:t>Gerät X: erst einmal installiert</w:t>
-      </w:r>
-    </w:p>
-    <w:p>
-      <w:pPr>
-        <w:pStyle w:val="K-Aufzhlung1"/>
-      </w:pPr>
-      <w:r>
-        <w:t>SW Y: mehrmals installiert, noch nie so konfiguriert</w:t>
+        <w:t xml:space="preserve"> habe sehr viele Vorkenntnisse mit PHP und dem MVC Pattern gemacht.</w:t>
       </w:r>
     </w:p>
     <w:p>
@@ -6765,15 +6722,10 @@
       </w:pPr>
       <w:r>
         <w:lastRenderedPageBreak/>
-        <w:t>Welche Vorarbeiten man selbst getätigt hat (max. ½ Seite).</w:t>
+        <w:t>Meine</w:t>
       </w:r>
-    </w:p>
-    <w:p>
-      <w:pPr>
-        <w:pStyle w:val="K-Einzug"/>
-      </w:pPr>
       <w:r>
-        <w:t>Beispiel für Vorarbeiten</w:t>
+        <w:t xml:space="preserve"> Vorarbeiten</w:t>
       </w:r>
       <w:r>
         <w:t>:</w:t>
@@ -6784,7 +6736,7 @@
         <w:pStyle w:val="K-Aufzhlung1"/>
       </w:pPr>
       <w:r>
-        <w:t>Materialbestellungen</w:t>
+        <w:t>Notiz App, auf der man sich einloggen kann und Notizen hinzufügen kann.</w:t>
       </w:r>
     </w:p>
     <w:p>
@@ -6792,7 +6744,7 @@
         <w:pStyle w:val="K-Aufzhlung1"/>
       </w:pPr>
       <w:r>
-        <w:t>Vorbereitende Kurse, Selbststudium, Literaturstudium, ...</w:t>
+        <w:t>Game Shop, auf dem der Verkäufer Videospiele hinzufügen kann und die Käufer quasi das Spiel kaufen oder auch wieder nach einer gewissen Zeit zurückgeben können.</w:t>
       </w:r>
     </w:p>
     <w:p>
@@ -6800,15 +6752,13 @@
         <w:pStyle w:val="K-Aufzhlung1"/>
       </w:pPr>
       <w:r>
-        <w:t>Kennenlernender Umgebung (z.B., wenn bestehende Produkte ausgebaut werden sollen)</w:t>
+        <w:t xml:space="preserve">ÜK Modul 307: </w:t>
       </w:r>
-    </w:p>
-    <w:p>
-      <w:pPr>
-        <w:pStyle w:val="K-Aufzhlung1"/>
-      </w:pPr>
       <w:r>
-        <w:t>Ähnliche Projekte</w:t>
+        <w:t>Interaktive Webseite mit Formular erstellen</w:t>
+      </w:r>
+      <w:r>
+        <w:t>. War ebenfalls mit PHP. Dort habe ich das MVC Pattern kennengelernt.</w:t>
       </w:r>
     </w:p>
     <w:p>
@@ -7873,6 +7823,11 @@
               <w:t>Aufgabe 4: Benutzerübersicht mit CSS erstellen</w:t>
             </w:r>
           </w:p>
+          <w:p>
+            <w:r>
+              <w:t>Aufgabe 5: Bilder hochladen und anzeigen</w:t>
+            </w:r>
+          </w:p>
         </w:tc>
         <w:tc>
           <w:tcPr>
@@ -8069,7 +8024,25 @@
           </w:tcPr>
           <w:p>
             <w:r>
-              <w:t>Es traten beim Erarbeiten der Arbeiten keine Fehler auf.</w:t>
+              <w:t xml:space="preserve">Leider traten Fehler auf </w:t>
+            </w:r>
+            <w:r>
+              <w:t>beim Anzeigen</w:t>
+            </w:r>
+            <w:r>
+              <w:t xml:space="preserve"> der Bilder. Nachdem man ein Bild hoch</w:t>
+            </w:r>
+            <w:r>
+              <w:t>ge</w:t>
+            </w:r>
+            <w:r>
+              <w:t>lade</w:t>
+            </w:r>
+            <w:r>
+              <w:t>n hat</w:t>
+            </w:r>
+            <w:r>
+              <w:t>, wird es nicht angezeigt. Diesen Fehler hatte ich schon bei der Vorbereitung für die Mini PA. Ich hatte mir damals Hilfe bei Janik geholt, er konnte allerdings den Fehler ebenfalls nicht finden.</w:t>
             </w:r>
           </w:p>
         </w:tc>
@@ -8112,6 +8085,7 @@
           </w:tcPr>
           <w:p>
             <w:r>
+              <w:lastRenderedPageBreak/>
               <w:t>Es wurden an dem Tag keine Tests durchgeführt.</w:t>
             </w:r>
           </w:p>
@@ -8182,7 +8156,6 @@
               <w:rPr>
                 <w:b/>
               </w:rPr>
-              <w:lastRenderedPageBreak/>
               <w:t>Vergleich mit Zeitplan</w:t>
             </w:r>
           </w:p>
@@ -8389,10 +8362,24 @@
             <w:r>
               <w:t>Aufgabe 1</w:t>
             </w:r>
+            <w:r>
+              <w:t>: Benutzer hinzufügen, bearbeiten und löschen</w:t>
+            </w:r>
           </w:p>
           <w:p>
             <w:r>
               <w:t>Aufgabe 2</w:t>
+            </w:r>
+            <w:r>
+              <w:t xml:space="preserve">: Dokumentation </w:t>
+            </w:r>
+            <w:r>
+              <w:t>Teil 1 – 3 fertigstellen</w:t>
+            </w:r>
+          </w:p>
+          <w:p>
+            <w:r>
+              <w:t>Aufgabe 3: Zeitplan fertigstellen</w:t>
             </w:r>
           </w:p>
         </w:tc>
@@ -9386,6 +9373,7 @@
           </w:tcPr>
           <w:p>
             <w:r>
+              <w:lastRenderedPageBreak/>
               <w:t>Anwesenheit:</w:t>
             </w:r>
             <w:r>
@@ -9653,7 +9641,6 @@
               <w:rPr>
                 <w:b/>
               </w:rPr>
-              <w:lastRenderedPageBreak/>
               <w:t>Erreichte Ziele &amp; abgeschlossene Arbeit</w:t>
             </w:r>
           </w:p>
@@ -10942,7 +10929,6 @@
               <w:rPr>
                 <w:b/>
               </w:rPr>
-              <w:lastRenderedPageBreak/>
               <w:t>Reflexion</w:t>
             </w:r>
           </w:p>
@@ -12181,6 +12167,7 @@
           </w:p>
           <w:p>
             <w:r>
+              <w:lastRenderedPageBreak/>
               <w:t>Aufgabe 2</w:t>
             </w:r>
           </w:p>
@@ -12192,6 +12179,7 @@
           </w:tcPr>
           <w:p>
             <w:r>
+              <w:lastRenderedPageBreak/>
               <w:t>Erreicht</w:t>
             </w:r>
           </w:p>
@@ -12413,7 +12401,6 @@
               <w:rPr>
                 <w:b/>
               </w:rPr>
-              <w:lastRenderedPageBreak/>
               <w:t>Aufgetretene Probleme</w:t>
             </w:r>
           </w:p>
@@ -14733,27 +14720,14 @@
       <w:r>
         <w:t xml:space="preserve">Abbildung </w:t>
       </w:r>
-      <w:r>
-        <w:fldChar w:fldCharType="begin"/>
-      </w:r>
-      <w:r>
-        <w:instrText xml:space="preserve"> SEQ Abbildung \* ARABIC </w:instrText>
-      </w:r>
-      <w:r>
-        <w:fldChar w:fldCharType="separate"/>
-      </w:r>
-      <w:r>
-        <w:rPr>
-          <w:noProof/>
-        </w:rPr>
-        <w:t>1</w:t>
-      </w:r>
-      <w:r>
-        <w:rPr>
-          <w:noProof/>
-        </w:rPr>
-        <w:fldChar w:fldCharType="end"/>
-      </w:r>
+      <w:fldSimple w:instr=" SEQ Abbildung \* ARABIC ">
+        <w:r>
+          <w:rPr>
+            <w:noProof/>
+          </w:rPr>
+          <w:t>1</w:t>
+        </w:r>
+      </w:fldSimple>
       <w:r>
         <w:t>: Use Case Diagram</w:t>
       </w:r>
@@ -14850,7 +14824,7 @@
           </w:tcPr>
           <w:p>
             <w:r>
-              <w:t>Items verwenden</w:t>
+              <w:t>Bilder hochladen</w:t>
             </w:r>
           </w:p>
         </w:tc>
@@ -14872,7 +14846,7 @@
           </w:tcPr>
           <w:p>
             <w:r>
-              <w:t>Benutzer</w:t>
+              <w:t>Benutzer mit Rolle «Owner» und Rolle «VIP»</w:t>
             </w:r>
           </w:p>
         </w:tc>
@@ -14897,7 +14871,7 @@
           </w:tcPr>
           <w:p>
             <w:r>
-              <w:t>Benutzbares Item im Inventar</w:t>
+              <w:t>Die Benutzer müssen schon im System hinzugefügt sein.</w:t>
             </w:r>
           </w:p>
         </w:tc>
@@ -14919,7 +14893,7 @@
           </w:tcPr>
           <w:p>
             <w:r>
-              <w:t>Item wird aus dem Inventar entfernt und Effekt je nach Typ auf den Spieler oder Gegner angewendet</w:t>
+              <w:t>Ein Bild mit den dazugehörigen Details wird in das Inventar hinzugefügt.</w:t>
             </w:r>
           </w:p>
         </w:tc>
@@ -14944,7 +14918,7 @@
           </w:tcPr>
           <w:p>
             <w:r>
-              <w:t>Spielerzug fertig</w:t>
+              <w:t>Das Bild wird auf der Webseite angezeigt.</w:t>
             </w:r>
           </w:p>
         </w:tc>
@@ -15013,10 +14987,1219 @@
     </w:tbl>
     <w:p>
       <w:pPr>
-        <w:pStyle w:val="berschrift3"/>
+        <w:ind w:firstLine="709"/>
       </w:pPr>
       <w:bookmarkStart w:id="52" w:name="_Toc25148325"/>
       <w:bookmarkStart w:id="53" w:name="_Toc110858283"/>
+    </w:p>
+    <w:tbl>
+      <w:tblPr>
+        <w:tblStyle w:val="Kauzfarbig"/>
+        <w:tblW w:w="9152" w:type="dxa"/>
+        <w:tblLook w:val="04A0" w:firstRow="1" w:lastRow="0" w:firstColumn="1" w:lastColumn="0" w:noHBand="0" w:noVBand="1"/>
+      </w:tblPr>
+      <w:tblGrid>
+        <w:gridCol w:w="2016"/>
+        <w:gridCol w:w="7136"/>
+      </w:tblGrid>
+      <w:tr>
+        <w:trPr>
+          <w:cnfStyle w:val="100000000000" w:firstRow="1" w:lastRow="0" w:firstColumn="0" w:lastColumn="0" w:oddVBand="0" w:evenVBand="0" w:oddHBand="0" w:evenHBand="0" w:firstRowFirstColumn="0" w:firstRowLastColumn="0" w:lastRowFirstColumn="0" w:lastRowLastColumn="0"/>
+        </w:trPr>
+        <w:tc>
+          <w:tcPr>
+            <w:tcW w:w="2016" w:type="dxa"/>
+          </w:tcPr>
+          <w:p>
+            <w:r>
+              <w:t>Was</w:t>
+            </w:r>
+          </w:p>
+        </w:tc>
+        <w:tc>
+          <w:tcPr>
+            <w:tcW w:w="7136" w:type="dxa"/>
+          </w:tcPr>
+          <w:p>
+            <w:r>
+              <w:t>Beschreibung</w:t>
+            </w:r>
+          </w:p>
+        </w:tc>
+      </w:tr>
+      <w:tr>
+        <w:trPr>
+          <w:cnfStyle w:val="000000100000" w:firstRow="0" w:lastRow="0" w:firstColumn="0" w:lastColumn="0" w:oddVBand="0" w:evenVBand="0" w:oddHBand="1" w:evenHBand="0" w:firstRowFirstColumn="0" w:firstRowLastColumn="0" w:lastRowFirstColumn="0" w:lastRowLastColumn="0"/>
+        </w:trPr>
+        <w:tc>
+          <w:tcPr>
+            <w:tcW w:w="2016" w:type="dxa"/>
+          </w:tcPr>
+          <w:p>
+            <w:r>
+              <w:t>Bezeichnung</w:t>
+            </w:r>
+          </w:p>
+        </w:tc>
+        <w:tc>
+          <w:tcPr>
+            <w:tcW w:w="7136" w:type="dxa"/>
+          </w:tcPr>
+          <w:p>
+            <w:r>
+              <w:t xml:space="preserve">Bilder </w:t>
+            </w:r>
+            <w:r>
+              <w:t>bearbeiten</w:t>
+            </w:r>
+          </w:p>
+        </w:tc>
+      </w:tr>
+      <w:tr>
+        <w:tc>
+          <w:tcPr>
+            <w:tcW w:w="2016" w:type="dxa"/>
+          </w:tcPr>
+          <w:p>
+            <w:r>
+              <w:t>Akteur / Auslöser</w:t>
+            </w:r>
+          </w:p>
+        </w:tc>
+        <w:tc>
+          <w:tcPr>
+            <w:tcW w:w="7136" w:type="dxa"/>
+          </w:tcPr>
+          <w:p>
+            <w:r>
+              <w:t>Benutzer mit Rolle «Owner» und Rolle «VIP»</w:t>
+            </w:r>
+          </w:p>
+        </w:tc>
+      </w:tr>
+      <w:tr>
+        <w:trPr>
+          <w:cnfStyle w:val="000000100000" w:firstRow="0" w:lastRow="0" w:firstColumn="0" w:lastColumn="0" w:oddVBand="0" w:evenVBand="0" w:oddHBand="1" w:evenHBand="0" w:firstRowFirstColumn="0" w:firstRowLastColumn="0" w:lastRowFirstColumn="0" w:lastRowLastColumn="0"/>
+        </w:trPr>
+        <w:tc>
+          <w:tcPr>
+            <w:tcW w:w="2016" w:type="dxa"/>
+          </w:tcPr>
+          <w:p>
+            <w:r>
+              <w:t>Voraussetzung</w:t>
+            </w:r>
+          </w:p>
+        </w:tc>
+        <w:tc>
+          <w:tcPr>
+            <w:tcW w:w="7136" w:type="dxa"/>
+          </w:tcPr>
+          <w:p>
+            <w:r>
+              <w:t>Die Benutzer müssen schon im System hinzugefügt sein.</w:t>
+            </w:r>
+          </w:p>
+        </w:tc>
+      </w:tr>
+      <w:tr>
+        <w:tc>
+          <w:tcPr>
+            <w:tcW w:w="2016" w:type="dxa"/>
+          </w:tcPr>
+          <w:p>
+            <w:r>
+              <w:t>Funktionsablauf</w:t>
+            </w:r>
+          </w:p>
+        </w:tc>
+        <w:tc>
+          <w:tcPr>
+            <w:tcW w:w="7136" w:type="dxa"/>
+          </w:tcPr>
+          <w:p>
+            <w:r>
+              <w:t xml:space="preserve">Ein Bild mit den dazugehörigen Details wird </w:t>
+            </w:r>
+            <w:r>
+              <w:t>im</w:t>
+            </w:r>
+            <w:r>
+              <w:t xml:space="preserve"> Inventar </w:t>
+            </w:r>
+            <w:r>
+              <w:t>bearbeitet</w:t>
+            </w:r>
+            <w:r>
+              <w:t>.</w:t>
+            </w:r>
+          </w:p>
+        </w:tc>
+      </w:tr>
+      <w:tr>
+        <w:trPr>
+          <w:cnfStyle w:val="000000100000" w:firstRow="0" w:lastRow="0" w:firstColumn="0" w:lastColumn="0" w:oddVBand="0" w:evenVBand="0" w:oddHBand="1" w:evenHBand="0" w:firstRowFirstColumn="0" w:firstRowLastColumn="0" w:lastRowFirstColumn="0" w:lastRowLastColumn="0"/>
+        </w:trPr>
+        <w:tc>
+          <w:tcPr>
+            <w:tcW w:w="2016" w:type="dxa"/>
+          </w:tcPr>
+          <w:p>
+            <w:r>
+              <w:t>Endzustand</w:t>
+            </w:r>
+          </w:p>
+        </w:tc>
+        <w:tc>
+          <w:tcPr>
+            <w:tcW w:w="7136" w:type="dxa"/>
+          </w:tcPr>
+          <w:p>
+            <w:r>
+              <w:t xml:space="preserve">Das Bild wird auf der Webseite </w:t>
+            </w:r>
+            <w:r>
+              <w:t>aktualisiert</w:t>
+            </w:r>
+            <w:r>
+              <w:t>.</w:t>
+            </w:r>
+          </w:p>
+        </w:tc>
+      </w:tr>
+      <w:tr>
+        <w:tc>
+          <w:tcPr>
+            <w:tcW w:w="2016" w:type="dxa"/>
+          </w:tcPr>
+          <w:p>
+            <w:r>
+              <w:t>Risiko</w:t>
+            </w:r>
+          </w:p>
+        </w:tc>
+        <w:tc>
+          <w:tcPr>
+            <w:tcW w:w="7136" w:type="dxa"/>
+          </w:tcPr>
+          <w:p>
+            <w:r>
+              <w:t>Mittel</w:t>
+            </w:r>
+          </w:p>
+        </w:tc>
+      </w:tr>
+      <w:tr>
+        <w:trPr>
+          <w:cnfStyle w:val="000000100000" w:firstRow="0" w:lastRow="0" w:firstColumn="0" w:lastColumn="0" w:oddVBand="0" w:evenVBand="0" w:oddHBand="1" w:evenHBand="0" w:firstRowFirstColumn="0" w:firstRowLastColumn="0" w:lastRowFirstColumn="0" w:lastRowLastColumn="0"/>
+        </w:trPr>
+        <w:tc>
+          <w:tcPr>
+            <w:tcW w:w="2016" w:type="dxa"/>
+          </w:tcPr>
+          <w:p>
+            <w:r>
+              <w:t>Aufwand</w:t>
+            </w:r>
+          </w:p>
+        </w:tc>
+        <w:tc>
+          <w:tcPr>
+            <w:tcW w:w="7136" w:type="dxa"/>
+          </w:tcPr>
+          <w:p>
+            <w:r>
+              <w:t>Mittel</w:t>
+            </w:r>
+          </w:p>
+        </w:tc>
+      </w:tr>
+      <w:tr>
+        <w:tc>
+          <w:tcPr>
+            <w:tcW w:w="2016" w:type="dxa"/>
+          </w:tcPr>
+          <w:p/>
+        </w:tc>
+        <w:tc>
+          <w:tcPr>
+            <w:tcW w:w="7136" w:type="dxa"/>
+          </w:tcPr>
+          <w:p/>
+        </w:tc>
+      </w:tr>
+    </w:tbl>
+    <w:p>
+      <w:pPr>
+        <w:ind w:firstLine="709"/>
+      </w:pPr>
+    </w:p>
+    <w:tbl>
+      <w:tblPr>
+        <w:tblStyle w:val="Kauzfarbig"/>
+        <w:tblW w:w="9152" w:type="dxa"/>
+        <w:tblLook w:val="04A0" w:firstRow="1" w:lastRow="0" w:firstColumn="1" w:lastColumn="0" w:noHBand="0" w:noVBand="1"/>
+      </w:tblPr>
+      <w:tblGrid>
+        <w:gridCol w:w="2016"/>
+        <w:gridCol w:w="7136"/>
+      </w:tblGrid>
+      <w:tr>
+        <w:trPr>
+          <w:cnfStyle w:val="100000000000" w:firstRow="1" w:lastRow="0" w:firstColumn="0" w:lastColumn="0" w:oddVBand="0" w:evenVBand="0" w:oddHBand="0" w:evenHBand="0" w:firstRowFirstColumn="0" w:firstRowLastColumn="0" w:lastRowFirstColumn="0" w:lastRowLastColumn="0"/>
+        </w:trPr>
+        <w:tc>
+          <w:tcPr>
+            <w:tcW w:w="2016" w:type="dxa"/>
+          </w:tcPr>
+          <w:p>
+            <w:r>
+              <w:t>Was</w:t>
+            </w:r>
+          </w:p>
+        </w:tc>
+        <w:tc>
+          <w:tcPr>
+            <w:tcW w:w="7136" w:type="dxa"/>
+          </w:tcPr>
+          <w:p>
+            <w:r>
+              <w:t>Beschreibung</w:t>
+            </w:r>
+          </w:p>
+        </w:tc>
+      </w:tr>
+      <w:tr>
+        <w:trPr>
+          <w:cnfStyle w:val="000000100000" w:firstRow="0" w:lastRow="0" w:firstColumn="0" w:lastColumn="0" w:oddVBand="0" w:evenVBand="0" w:oddHBand="1" w:evenHBand="0" w:firstRowFirstColumn="0" w:firstRowLastColumn="0" w:lastRowFirstColumn="0" w:lastRowLastColumn="0"/>
+        </w:trPr>
+        <w:tc>
+          <w:tcPr>
+            <w:tcW w:w="2016" w:type="dxa"/>
+          </w:tcPr>
+          <w:p>
+            <w:r>
+              <w:t>Bezeichnung</w:t>
+            </w:r>
+          </w:p>
+        </w:tc>
+        <w:tc>
+          <w:tcPr>
+            <w:tcW w:w="7136" w:type="dxa"/>
+          </w:tcPr>
+          <w:p>
+            <w:r>
+              <w:t xml:space="preserve">Bilder </w:t>
+            </w:r>
+            <w:r>
+              <w:t>löschen</w:t>
+            </w:r>
+          </w:p>
+        </w:tc>
+      </w:tr>
+      <w:tr>
+        <w:tc>
+          <w:tcPr>
+            <w:tcW w:w="2016" w:type="dxa"/>
+          </w:tcPr>
+          <w:p>
+            <w:r>
+              <w:t>Akteur / Auslöser</w:t>
+            </w:r>
+          </w:p>
+        </w:tc>
+        <w:tc>
+          <w:tcPr>
+            <w:tcW w:w="7136" w:type="dxa"/>
+          </w:tcPr>
+          <w:p>
+            <w:r>
+              <w:t>Benutzer mit Rolle «Owner» und Rolle «VIP»</w:t>
+            </w:r>
+          </w:p>
+        </w:tc>
+      </w:tr>
+      <w:tr>
+        <w:trPr>
+          <w:cnfStyle w:val="000000100000" w:firstRow="0" w:lastRow="0" w:firstColumn="0" w:lastColumn="0" w:oddVBand="0" w:evenVBand="0" w:oddHBand="1" w:evenHBand="0" w:firstRowFirstColumn="0" w:firstRowLastColumn="0" w:lastRowFirstColumn="0" w:lastRowLastColumn="0"/>
+        </w:trPr>
+        <w:tc>
+          <w:tcPr>
+            <w:tcW w:w="2016" w:type="dxa"/>
+          </w:tcPr>
+          <w:p>
+            <w:r>
+              <w:t>Voraussetzung</w:t>
+            </w:r>
+          </w:p>
+        </w:tc>
+        <w:tc>
+          <w:tcPr>
+            <w:tcW w:w="7136" w:type="dxa"/>
+          </w:tcPr>
+          <w:p>
+            <w:r>
+              <w:t>Die Benutzer müssen schon im System hinzugefügt sein.</w:t>
+            </w:r>
+          </w:p>
+        </w:tc>
+      </w:tr>
+      <w:tr>
+        <w:tc>
+          <w:tcPr>
+            <w:tcW w:w="2016" w:type="dxa"/>
+          </w:tcPr>
+          <w:p>
+            <w:r>
+              <w:t>Funktionsablauf</w:t>
+            </w:r>
+          </w:p>
+        </w:tc>
+        <w:tc>
+          <w:tcPr>
+            <w:tcW w:w="7136" w:type="dxa"/>
+          </w:tcPr>
+          <w:p>
+            <w:r>
+              <w:t xml:space="preserve">Ein Bild mit den dazugehörigen Details wird </w:t>
+            </w:r>
+            <w:r>
+              <w:t xml:space="preserve">vom </w:t>
+            </w:r>
+            <w:r>
+              <w:t xml:space="preserve">Inventar </w:t>
+            </w:r>
+            <w:r>
+              <w:t>gelöscht</w:t>
+            </w:r>
+            <w:r>
+              <w:t>.</w:t>
+            </w:r>
+          </w:p>
+        </w:tc>
+      </w:tr>
+      <w:tr>
+        <w:trPr>
+          <w:cnfStyle w:val="000000100000" w:firstRow="0" w:lastRow="0" w:firstColumn="0" w:lastColumn="0" w:oddVBand="0" w:evenVBand="0" w:oddHBand="1" w:evenHBand="0" w:firstRowFirstColumn="0" w:firstRowLastColumn="0" w:lastRowFirstColumn="0" w:lastRowLastColumn="0"/>
+        </w:trPr>
+        <w:tc>
+          <w:tcPr>
+            <w:tcW w:w="2016" w:type="dxa"/>
+          </w:tcPr>
+          <w:p>
+            <w:r>
+              <w:t>Endzustand</w:t>
+            </w:r>
+          </w:p>
+        </w:tc>
+        <w:tc>
+          <w:tcPr>
+            <w:tcW w:w="7136" w:type="dxa"/>
+          </w:tcPr>
+          <w:p>
+            <w:r>
+              <w:t xml:space="preserve">Das Bild wird auf der Webseite </w:t>
+            </w:r>
+            <w:r>
+              <w:t>nicht mehr angezeigt</w:t>
+            </w:r>
+            <w:r>
+              <w:t>.</w:t>
+            </w:r>
+          </w:p>
+        </w:tc>
+      </w:tr>
+      <w:tr>
+        <w:tc>
+          <w:tcPr>
+            <w:tcW w:w="2016" w:type="dxa"/>
+          </w:tcPr>
+          <w:p>
+            <w:r>
+              <w:t>Risiko</w:t>
+            </w:r>
+          </w:p>
+        </w:tc>
+        <w:tc>
+          <w:tcPr>
+            <w:tcW w:w="7136" w:type="dxa"/>
+          </w:tcPr>
+          <w:p>
+            <w:r>
+              <w:t>Mittel</w:t>
+            </w:r>
+          </w:p>
+        </w:tc>
+      </w:tr>
+      <w:tr>
+        <w:trPr>
+          <w:cnfStyle w:val="000000100000" w:firstRow="0" w:lastRow="0" w:firstColumn="0" w:lastColumn="0" w:oddVBand="0" w:evenVBand="0" w:oddHBand="1" w:evenHBand="0" w:firstRowFirstColumn="0" w:firstRowLastColumn="0" w:lastRowFirstColumn="0" w:lastRowLastColumn="0"/>
+        </w:trPr>
+        <w:tc>
+          <w:tcPr>
+            <w:tcW w:w="2016" w:type="dxa"/>
+          </w:tcPr>
+          <w:p>
+            <w:r>
+              <w:t>Aufwand</w:t>
+            </w:r>
+          </w:p>
+        </w:tc>
+        <w:tc>
+          <w:tcPr>
+            <w:tcW w:w="7136" w:type="dxa"/>
+          </w:tcPr>
+          <w:p>
+            <w:r>
+              <w:t>Mittel</w:t>
+            </w:r>
+          </w:p>
+        </w:tc>
+      </w:tr>
+      <w:tr>
+        <w:tc>
+          <w:tcPr>
+            <w:tcW w:w="2016" w:type="dxa"/>
+          </w:tcPr>
+          <w:p/>
+        </w:tc>
+        <w:tc>
+          <w:tcPr>
+            <w:tcW w:w="7136" w:type="dxa"/>
+          </w:tcPr>
+          <w:p/>
+        </w:tc>
+      </w:tr>
+    </w:tbl>
+    <w:p>
+      <w:pPr>
+        <w:ind w:firstLine="709"/>
+      </w:pPr>
+    </w:p>
+    <w:tbl>
+      <w:tblPr>
+        <w:tblStyle w:val="Kauzfarbig"/>
+        <w:tblW w:w="9152" w:type="dxa"/>
+        <w:tblLook w:val="04A0" w:firstRow="1" w:lastRow="0" w:firstColumn="1" w:lastColumn="0" w:noHBand="0" w:noVBand="1"/>
+      </w:tblPr>
+      <w:tblGrid>
+        <w:gridCol w:w="2016"/>
+        <w:gridCol w:w="7136"/>
+      </w:tblGrid>
+      <w:tr>
+        <w:trPr>
+          <w:cnfStyle w:val="100000000000" w:firstRow="1" w:lastRow="0" w:firstColumn="0" w:lastColumn="0" w:oddVBand="0" w:evenVBand="0" w:oddHBand="0" w:evenHBand="0" w:firstRowFirstColumn="0" w:firstRowLastColumn="0" w:lastRowFirstColumn="0" w:lastRowLastColumn="0"/>
+        </w:trPr>
+        <w:tc>
+          <w:tcPr>
+            <w:tcW w:w="2016" w:type="dxa"/>
+          </w:tcPr>
+          <w:p>
+            <w:r>
+              <w:t>Was</w:t>
+            </w:r>
+          </w:p>
+        </w:tc>
+        <w:tc>
+          <w:tcPr>
+            <w:tcW w:w="7136" w:type="dxa"/>
+          </w:tcPr>
+          <w:p>
+            <w:r>
+              <w:t>Beschreibung</w:t>
+            </w:r>
+          </w:p>
+        </w:tc>
+      </w:tr>
+      <w:tr>
+        <w:trPr>
+          <w:cnfStyle w:val="000000100000" w:firstRow="0" w:lastRow="0" w:firstColumn="0" w:lastColumn="0" w:oddVBand="0" w:evenVBand="0" w:oddHBand="1" w:evenHBand="0" w:firstRowFirstColumn="0" w:firstRowLastColumn="0" w:lastRowFirstColumn="0" w:lastRowLastColumn="0"/>
+        </w:trPr>
+        <w:tc>
+          <w:tcPr>
+            <w:tcW w:w="2016" w:type="dxa"/>
+          </w:tcPr>
+          <w:p>
+            <w:r>
+              <w:t>Bezeichnung</w:t>
+            </w:r>
+          </w:p>
+        </w:tc>
+        <w:tc>
+          <w:tcPr>
+            <w:tcW w:w="7136" w:type="dxa"/>
+          </w:tcPr>
+          <w:p>
+            <w:r>
+              <w:t>Benutzer hinzufügen</w:t>
+            </w:r>
+          </w:p>
+        </w:tc>
+      </w:tr>
+      <w:tr>
+        <w:tc>
+          <w:tcPr>
+            <w:tcW w:w="2016" w:type="dxa"/>
+          </w:tcPr>
+          <w:p>
+            <w:r>
+              <w:t>Akteur / Auslöser</w:t>
+            </w:r>
+          </w:p>
+        </w:tc>
+        <w:tc>
+          <w:tcPr>
+            <w:tcW w:w="7136" w:type="dxa"/>
+          </w:tcPr>
+          <w:p>
+            <w:r>
+              <w:t>Benutzer mit Rolle «Owner»</w:t>
+            </w:r>
+          </w:p>
+        </w:tc>
+      </w:tr>
+      <w:tr>
+        <w:trPr>
+          <w:cnfStyle w:val="000000100000" w:firstRow="0" w:lastRow="0" w:firstColumn="0" w:lastColumn="0" w:oddVBand="0" w:evenVBand="0" w:oddHBand="1" w:evenHBand="0" w:firstRowFirstColumn="0" w:firstRowLastColumn="0" w:lastRowFirstColumn="0" w:lastRowLastColumn="0"/>
+        </w:trPr>
+        <w:tc>
+          <w:tcPr>
+            <w:tcW w:w="2016" w:type="dxa"/>
+          </w:tcPr>
+          <w:p>
+            <w:r>
+              <w:t>Voraussetzung</w:t>
+            </w:r>
+          </w:p>
+        </w:tc>
+        <w:tc>
+          <w:tcPr>
+            <w:tcW w:w="7136" w:type="dxa"/>
+          </w:tcPr>
+          <w:p>
+            <w:r>
+              <w:t>Benutzer m</w:t>
+            </w:r>
+            <w:r>
+              <w:t>uss</w:t>
+            </w:r>
+            <w:r>
+              <w:t xml:space="preserve"> schon im System </w:t>
+            </w:r>
+            <w:r>
+              <w:t>erfasst</w:t>
+            </w:r>
+            <w:r>
+              <w:t xml:space="preserve"> sein.</w:t>
+            </w:r>
+          </w:p>
+        </w:tc>
+      </w:tr>
+      <w:tr>
+        <w:tc>
+          <w:tcPr>
+            <w:tcW w:w="2016" w:type="dxa"/>
+          </w:tcPr>
+          <w:p>
+            <w:r>
+              <w:t>Funktionsablauf</w:t>
+            </w:r>
+          </w:p>
+        </w:tc>
+        <w:tc>
+          <w:tcPr>
+            <w:tcW w:w="7136" w:type="dxa"/>
+          </w:tcPr>
+          <w:p>
+            <w:r>
+              <w:t>Ein Benutzer mit den dazugehörigen Details wird im Inventar hinzugefügt.</w:t>
+            </w:r>
+          </w:p>
+        </w:tc>
+      </w:tr>
+      <w:tr>
+        <w:trPr>
+          <w:cnfStyle w:val="000000100000" w:firstRow="0" w:lastRow="0" w:firstColumn="0" w:lastColumn="0" w:oddVBand="0" w:evenVBand="0" w:oddHBand="1" w:evenHBand="0" w:firstRowFirstColumn="0" w:firstRowLastColumn="0" w:lastRowFirstColumn="0" w:lastRowLastColumn="0"/>
+        </w:trPr>
+        <w:tc>
+          <w:tcPr>
+            <w:tcW w:w="2016" w:type="dxa"/>
+          </w:tcPr>
+          <w:p>
+            <w:r>
+              <w:t>Endzustand</w:t>
+            </w:r>
+          </w:p>
+        </w:tc>
+        <w:tc>
+          <w:tcPr>
+            <w:tcW w:w="7136" w:type="dxa"/>
+          </w:tcPr>
+          <w:p>
+            <w:r>
+              <w:t>Der Benutzer wird auf der Webseite in der Benutzerverwaltung angezeigt.</w:t>
+            </w:r>
+            <w:r>
+              <w:t xml:space="preserve"> Der Benutzer erhält somit die Rolle «VIP».</w:t>
+            </w:r>
+          </w:p>
+        </w:tc>
+      </w:tr>
+      <w:tr>
+        <w:tc>
+          <w:tcPr>
+            <w:tcW w:w="2016" w:type="dxa"/>
+          </w:tcPr>
+          <w:p>
+            <w:r>
+              <w:t>Risiko</w:t>
+            </w:r>
+          </w:p>
+        </w:tc>
+        <w:tc>
+          <w:tcPr>
+            <w:tcW w:w="7136" w:type="dxa"/>
+          </w:tcPr>
+          <w:p>
+            <w:r>
+              <w:t>Mittel</w:t>
+            </w:r>
+          </w:p>
+        </w:tc>
+      </w:tr>
+      <w:tr>
+        <w:trPr>
+          <w:cnfStyle w:val="000000100000" w:firstRow="0" w:lastRow="0" w:firstColumn="0" w:lastColumn="0" w:oddVBand="0" w:evenVBand="0" w:oddHBand="1" w:evenHBand="0" w:firstRowFirstColumn="0" w:firstRowLastColumn="0" w:lastRowFirstColumn="0" w:lastRowLastColumn="0"/>
+        </w:trPr>
+        <w:tc>
+          <w:tcPr>
+            <w:tcW w:w="2016" w:type="dxa"/>
+          </w:tcPr>
+          <w:p>
+            <w:r>
+              <w:t>Aufwand</w:t>
+            </w:r>
+          </w:p>
+        </w:tc>
+        <w:tc>
+          <w:tcPr>
+            <w:tcW w:w="7136" w:type="dxa"/>
+          </w:tcPr>
+          <w:p>
+            <w:r>
+              <w:t>Mittel</w:t>
+            </w:r>
+          </w:p>
+        </w:tc>
+      </w:tr>
+      <w:tr>
+        <w:tc>
+          <w:tcPr>
+            <w:tcW w:w="2016" w:type="dxa"/>
+          </w:tcPr>
+          <w:p/>
+        </w:tc>
+        <w:tc>
+          <w:tcPr>
+            <w:tcW w:w="7136" w:type="dxa"/>
+          </w:tcPr>
+          <w:p/>
+        </w:tc>
+      </w:tr>
+    </w:tbl>
+    <w:p>
+      <w:pPr>
+        <w:ind w:firstLine="709"/>
+      </w:pPr>
+    </w:p>
+    <w:tbl>
+      <w:tblPr>
+        <w:tblStyle w:val="Kauzfarbig"/>
+        <w:tblW w:w="9152" w:type="dxa"/>
+        <w:tblLook w:val="04A0" w:firstRow="1" w:lastRow="0" w:firstColumn="1" w:lastColumn="0" w:noHBand="0" w:noVBand="1"/>
+      </w:tblPr>
+      <w:tblGrid>
+        <w:gridCol w:w="2016"/>
+        <w:gridCol w:w="7136"/>
+      </w:tblGrid>
+      <w:tr>
+        <w:trPr>
+          <w:cnfStyle w:val="100000000000" w:firstRow="1" w:lastRow="0" w:firstColumn="0" w:lastColumn="0" w:oddVBand="0" w:evenVBand="0" w:oddHBand="0" w:evenHBand="0" w:firstRowFirstColumn="0" w:firstRowLastColumn="0" w:lastRowFirstColumn="0" w:lastRowLastColumn="0"/>
+        </w:trPr>
+        <w:tc>
+          <w:tcPr>
+            <w:tcW w:w="2016" w:type="dxa"/>
+          </w:tcPr>
+          <w:p>
+            <w:r>
+              <w:t>Was</w:t>
+            </w:r>
+          </w:p>
+        </w:tc>
+        <w:tc>
+          <w:tcPr>
+            <w:tcW w:w="7136" w:type="dxa"/>
+          </w:tcPr>
+          <w:p>
+            <w:r>
+              <w:t>Beschreibung</w:t>
+            </w:r>
+          </w:p>
+        </w:tc>
+      </w:tr>
+      <w:tr>
+        <w:trPr>
+          <w:cnfStyle w:val="000000100000" w:firstRow="0" w:lastRow="0" w:firstColumn="0" w:lastColumn="0" w:oddVBand="0" w:evenVBand="0" w:oddHBand="1" w:evenHBand="0" w:firstRowFirstColumn="0" w:firstRowLastColumn="0" w:lastRowFirstColumn="0" w:lastRowLastColumn="0"/>
+        </w:trPr>
+        <w:tc>
+          <w:tcPr>
+            <w:tcW w:w="2016" w:type="dxa"/>
+          </w:tcPr>
+          <w:p>
+            <w:r>
+              <w:t>Bezeichnung</w:t>
+            </w:r>
+          </w:p>
+        </w:tc>
+        <w:tc>
+          <w:tcPr>
+            <w:tcW w:w="7136" w:type="dxa"/>
+          </w:tcPr>
+          <w:p>
+            <w:r>
+              <w:t xml:space="preserve">Benutzer </w:t>
+            </w:r>
+            <w:r>
+              <w:t>bearbeiten</w:t>
+            </w:r>
+          </w:p>
+        </w:tc>
+      </w:tr>
+      <w:tr>
+        <w:tc>
+          <w:tcPr>
+            <w:tcW w:w="2016" w:type="dxa"/>
+          </w:tcPr>
+          <w:p>
+            <w:r>
+              <w:t>Akteur / Auslöser</w:t>
+            </w:r>
+          </w:p>
+        </w:tc>
+        <w:tc>
+          <w:tcPr>
+            <w:tcW w:w="7136" w:type="dxa"/>
+          </w:tcPr>
+          <w:p>
+            <w:r>
+              <w:t>Benutzer mit Rolle «Owner»</w:t>
+            </w:r>
+          </w:p>
+        </w:tc>
+      </w:tr>
+      <w:tr>
+        <w:trPr>
+          <w:cnfStyle w:val="000000100000" w:firstRow="0" w:lastRow="0" w:firstColumn="0" w:lastColumn="0" w:oddVBand="0" w:evenVBand="0" w:oddHBand="1" w:evenHBand="0" w:firstRowFirstColumn="0" w:firstRowLastColumn="0" w:lastRowFirstColumn="0" w:lastRowLastColumn="0"/>
+        </w:trPr>
+        <w:tc>
+          <w:tcPr>
+            <w:tcW w:w="2016" w:type="dxa"/>
+          </w:tcPr>
+          <w:p>
+            <w:r>
+              <w:t>Voraussetzung</w:t>
+            </w:r>
+          </w:p>
+        </w:tc>
+        <w:tc>
+          <w:tcPr>
+            <w:tcW w:w="7136" w:type="dxa"/>
+          </w:tcPr>
+          <w:p>
+            <w:r>
+              <w:t>Ein Benutzer mit der Rolle «VIP» und ein «Owner» müssen</w:t>
+            </w:r>
+            <w:r>
+              <w:t xml:space="preserve"> schon im System erfasst sein.</w:t>
+            </w:r>
+          </w:p>
+        </w:tc>
+      </w:tr>
+      <w:tr>
+        <w:tc>
+          <w:tcPr>
+            <w:tcW w:w="2016" w:type="dxa"/>
+          </w:tcPr>
+          <w:p>
+            <w:r>
+              <w:t>Funktionsablauf</w:t>
+            </w:r>
+          </w:p>
+        </w:tc>
+        <w:tc>
+          <w:tcPr>
+            <w:tcW w:w="7136" w:type="dxa"/>
+          </w:tcPr>
+          <w:p>
+            <w:r>
+              <w:t xml:space="preserve">Ein Benutzer mit den dazugehörigen Details wird im Inventar </w:t>
+            </w:r>
+            <w:r>
+              <w:t>bearbeitet</w:t>
+            </w:r>
+            <w:r>
+              <w:t>.</w:t>
+            </w:r>
+          </w:p>
+        </w:tc>
+      </w:tr>
+      <w:tr>
+        <w:trPr>
+          <w:cnfStyle w:val="000000100000" w:firstRow="0" w:lastRow="0" w:firstColumn="0" w:lastColumn="0" w:oddVBand="0" w:evenVBand="0" w:oddHBand="1" w:evenHBand="0" w:firstRowFirstColumn="0" w:firstRowLastColumn="0" w:lastRowFirstColumn="0" w:lastRowLastColumn="0"/>
+        </w:trPr>
+        <w:tc>
+          <w:tcPr>
+            <w:tcW w:w="2016" w:type="dxa"/>
+          </w:tcPr>
+          <w:p>
+            <w:r>
+              <w:t>Endzustand</w:t>
+            </w:r>
+          </w:p>
+        </w:tc>
+        <w:tc>
+          <w:tcPr>
+            <w:tcW w:w="7136" w:type="dxa"/>
+          </w:tcPr>
+          <w:p>
+            <w:r>
+              <w:t xml:space="preserve">Der Benutzer wird auf der Webseite in der Benutzerverwaltung </w:t>
+            </w:r>
+            <w:r>
+              <w:t>aktualisiert</w:t>
+            </w:r>
+            <w:r>
+              <w:t>.</w:t>
+            </w:r>
+          </w:p>
+        </w:tc>
+      </w:tr>
+      <w:tr>
+        <w:tc>
+          <w:tcPr>
+            <w:tcW w:w="2016" w:type="dxa"/>
+          </w:tcPr>
+          <w:p>
+            <w:r>
+              <w:t>Risiko</w:t>
+            </w:r>
+          </w:p>
+        </w:tc>
+        <w:tc>
+          <w:tcPr>
+            <w:tcW w:w="7136" w:type="dxa"/>
+          </w:tcPr>
+          <w:p>
+            <w:r>
+              <w:t>Mittel</w:t>
+            </w:r>
+          </w:p>
+        </w:tc>
+      </w:tr>
+      <w:tr>
+        <w:trPr>
+          <w:cnfStyle w:val="000000100000" w:firstRow="0" w:lastRow="0" w:firstColumn="0" w:lastColumn="0" w:oddVBand="0" w:evenVBand="0" w:oddHBand="1" w:evenHBand="0" w:firstRowFirstColumn="0" w:firstRowLastColumn="0" w:lastRowFirstColumn="0" w:lastRowLastColumn="0"/>
+        </w:trPr>
+        <w:tc>
+          <w:tcPr>
+            <w:tcW w:w="2016" w:type="dxa"/>
+          </w:tcPr>
+          <w:p>
+            <w:r>
+              <w:t>Aufwand</w:t>
+            </w:r>
+          </w:p>
+        </w:tc>
+        <w:tc>
+          <w:tcPr>
+            <w:tcW w:w="7136" w:type="dxa"/>
+          </w:tcPr>
+          <w:p>
+            <w:r>
+              <w:t>Mittel</w:t>
+            </w:r>
+          </w:p>
+        </w:tc>
+      </w:tr>
+      <w:tr>
+        <w:tc>
+          <w:tcPr>
+            <w:tcW w:w="2016" w:type="dxa"/>
+          </w:tcPr>
+          <w:p/>
+        </w:tc>
+        <w:tc>
+          <w:tcPr>
+            <w:tcW w:w="7136" w:type="dxa"/>
+          </w:tcPr>
+          <w:p/>
+        </w:tc>
+      </w:tr>
+    </w:tbl>
+    <w:p>
+      <w:pPr>
+        <w:ind w:firstLine="709"/>
+      </w:pPr>
+    </w:p>
+    <w:tbl>
+      <w:tblPr>
+        <w:tblStyle w:val="Kauzfarbig"/>
+        <w:tblW w:w="9152" w:type="dxa"/>
+        <w:tblLook w:val="04A0" w:firstRow="1" w:lastRow="0" w:firstColumn="1" w:lastColumn="0" w:noHBand="0" w:noVBand="1"/>
+      </w:tblPr>
+      <w:tblGrid>
+        <w:gridCol w:w="2016"/>
+        <w:gridCol w:w="7136"/>
+      </w:tblGrid>
+      <w:tr>
+        <w:trPr>
+          <w:cnfStyle w:val="100000000000" w:firstRow="1" w:lastRow="0" w:firstColumn="0" w:lastColumn="0" w:oddVBand="0" w:evenVBand="0" w:oddHBand="0" w:evenHBand="0" w:firstRowFirstColumn="0" w:firstRowLastColumn="0" w:lastRowFirstColumn="0" w:lastRowLastColumn="0"/>
+        </w:trPr>
+        <w:tc>
+          <w:tcPr>
+            <w:tcW w:w="2016" w:type="dxa"/>
+          </w:tcPr>
+          <w:p>
+            <w:r>
+              <w:t>Was</w:t>
+            </w:r>
+          </w:p>
+        </w:tc>
+        <w:tc>
+          <w:tcPr>
+            <w:tcW w:w="7136" w:type="dxa"/>
+          </w:tcPr>
+          <w:p>
+            <w:r>
+              <w:t>Beschreibung</w:t>
+            </w:r>
+          </w:p>
+        </w:tc>
+      </w:tr>
+      <w:tr>
+        <w:trPr>
+          <w:cnfStyle w:val="000000100000" w:firstRow="0" w:lastRow="0" w:firstColumn="0" w:lastColumn="0" w:oddVBand="0" w:evenVBand="0" w:oddHBand="1" w:evenHBand="0" w:firstRowFirstColumn="0" w:firstRowLastColumn="0" w:lastRowFirstColumn="0" w:lastRowLastColumn="0"/>
+        </w:trPr>
+        <w:tc>
+          <w:tcPr>
+            <w:tcW w:w="2016" w:type="dxa"/>
+          </w:tcPr>
+          <w:p>
+            <w:r>
+              <w:t>Bezeichnung</w:t>
+            </w:r>
+          </w:p>
+        </w:tc>
+        <w:tc>
+          <w:tcPr>
+            <w:tcW w:w="7136" w:type="dxa"/>
+          </w:tcPr>
+          <w:p>
+            <w:r>
+              <w:t xml:space="preserve">Benutzer </w:t>
+            </w:r>
+            <w:r>
+              <w:t>löschen</w:t>
+            </w:r>
+          </w:p>
+        </w:tc>
+      </w:tr>
+      <w:tr>
+        <w:tc>
+          <w:tcPr>
+            <w:tcW w:w="2016" w:type="dxa"/>
+          </w:tcPr>
+          <w:p>
+            <w:r>
+              <w:t>Akteur / Auslöser</w:t>
+            </w:r>
+          </w:p>
+        </w:tc>
+        <w:tc>
+          <w:tcPr>
+            <w:tcW w:w="7136" w:type="dxa"/>
+          </w:tcPr>
+          <w:p>
+            <w:r>
+              <w:t>Benutzer mit Rolle «Owner»</w:t>
+            </w:r>
+          </w:p>
+        </w:tc>
+      </w:tr>
+      <w:tr>
+        <w:trPr>
+          <w:cnfStyle w:val="000000100000" w:firstRow="0" w:lastRow="0" w:firstColumn="0" w:lastColumn="0" w:oddVBand="0" w:evenVBand="0" w:oddHBand="1" w:evenHBand="0" w:firstRowFirstColumn="0" w:firstRowLastColumn="0" w:lastRowFirstColumn="0" w:lastRowLastColumn="0"/>
+        </w:trPr>
+        <w:tc>
+          <w:tcPr>
+            <w:tcW w:w="2016" w:type="dxa"/>
+          </w:tcPr>
+          <w:p>
+            <w:r>
+              <w:t>Voraussetzung</w:t>
+            </w:r>
+          </w:p>
+        </w:tc>
+        <w:tc>
+          <w:tcPr>
+            <w:tcW w:w="7136" w:type="dxa"/>
+          </w:tcPr>
+          <w:p>
+            <w:r>
+              <w:t>Ein Benutzer mit der Rolle «VIP» und ein «Owner» müssen schon im System erfasst sein.</w:t>
+            </w:r>
+          </w:p>
+        </w:tc>
+      </w:tr>
+      <w:tr>
+        <w:tc>
+          <w:tcPr>
+            <w:tcW w:w="2016" w:type="dxa"/>
+          </w:tcPr>
+          <w:p>
+            <w:r>
+              <w:t>Funktionsablauf</w:t>
+            </w:r>
+          </w:p>
+        </w:tc>
+        <w:tc>
+          <w:tcPr>
+            <w:tcW w:w="7136" w:type="dxa"/>
+          </w:tcPr>
+          <w:p>
+            <w:r>
+              <w:t>Ein Benutzer</w:t>
+            </w:r>
+            <w:r>
+              <w:t xml:space="preserve"> mit der Rolle «VIP»</w:t>
+            </w:r>
+            <w:r>
+              <w:t xml:space="preserve"> wird</w:t>
+            </w:r>
+            <w:r>
+              <w:t xml:space="preserve"> vom</w:t>
+            </w:r>
+            <w:r>
+              <w:t xml:space="preserve"> Inventar </w:t>
+            </w:r>
+            <w:r>
+              <w:t>gelöscht.</w:t>
+            </w:r>
+          </w:p>
+        </w:tc>
+      </w:tr>
+      <w:tr>
+        <w:trPr>
+          <w:cnfStyle w:val="000000100000" w:firstRow="0" w:lastRow="0" w:firstColumn="0" w:lastColumn="0" w:oddVBand="0" w:evenVBand="0" w:oddHBand="1" w:evenHBand="0" w:firstRowFirstColumn="0" w:firstRowLastColumn="0" w:lastRowFirstColumn="0" w:lastRowLastColumn="0"/>
+        </w:trPr>
+        <w:tc>
+          <w:tcPr>
+            <w:tcW w:w="2016" w:type="dxa"/>
+          </w:tcPr>
+          <w:p>
+            <w:r>
+              <w:t>Endzustand</w:t>
+            </w:r>
+          </w:p>
+        </w:tc>
+        <w:tc>
+          <w:tcPr>
+            <w:tcW w:w="7136" w:type="dxa"/>
+          </w:tcPr>
+          <w:p>
+            <w:r>
+              <w:t xml:space="preserve">Der Benutzer wird auf der Webseite in der Benutzerverwaltung </w:t>
+            </w:r>
+            <w:r>
+              <w:t>nicht mehr angezeigt</w:t>
+            </w:r>
+            <w:r>
+              <w:t>.</w:t>
+            </w:r>
+          </w:p>
+        </w:tc>
+      </w:tr>
+      <w:tr>
+        <w:tc>
+          <w:tcPr>
+            <w:tcW w:w="2016" w:type="dxa"/>
+          </w:tcPr>
+          <w:p>
+            <w:r>
+              <w:t>Risiko</w:t>
+            </w:r>
+          </w:p>
+        </w:tc>
+        <w:tc>
+          <w:tcPr>
+            <w:tcW w:w="7136" w:type="dxa"/>
+          </w:tcPr>
+          <w:p>
+            <w:r>
+              <w:t>Mittel</w:t>
+            </w:r>
+          </w:p>
+        </w:tc>
+      </w:tr>
+      <w:tr>
+        <w:trPr>
+          <w:cnfStyle w:val="000000100000" w:firstRow="0" w:lastRow="0" w:firstColumn="0" w:lastColumn="0" w:oddVBand="0" w:evenVBand="0" w:oddHBand="1" w:evenHBand="0" w:firstRowFirstColumn="0" w:firstRowLastColumn="0" w:lastRowFirstColumn="0" w:lastRowLastColumn="0"/>
+        </w:trPr>
+        <w:tc>
+          <w:tcPr>
+            <w:tcW w:w="2016" w:type="dxa"/>
+          </w:tcPr>
+          <w:p>
+            <w:r>
+              <w:t>Aufwand</w:t>
+            </w:r>
+          </w:p>
+        </w:tc>
+        <w:tc>
+          <w:tcPr>
+            <w:tcW w:w="7136" w:type="dxa"/>
+          </w:tcPr>
+          <w:p>
+            <w:r>
+              <w:t>Mittel</w:t>
+            </w:r>
+          </w:p>
+        </w:tc>
+      </w:tr>
+      <w:tr>
+        <w:tc>
+          <w:tcPr>
+            <w:tcW w:w="2016" w:type="dxa"/>
+          </w:tcPr>
+          <w:p/>
+        </w:tc>
+        <w:tc>
+          <w:tcPr>
+            <w:tcW w:w="7136" w:type="dxa"/>
+          </w:tcPr>
+          <w:p/>
+        </w:tc>
+      </w:tr>
+    </w:tbl>
+    <w:p>
+      <w:pPr>
+        <w:ind w:firstLine="709"/>
+      </w:pPr>
+    </w:p>
+    <w:p>
+      <w:pPr>
+        <w:pStyle w:val="berschrift3"/>
+      </w:pPr>
       <w:r>
         <w:t>Nicht-Funktional</w:t>
       </w:r>
@@ -15028,7 +16211,7 @@
         <w:pStyle w:val="K-Einzug"/>
       </w:pPr>
       <w:r>
-        <w:t>Sicherheit, Aussehen</w:t>
+        <w:t>Bilder werden noch nicht korrekt angezeigt. (Wird hoffentlich noch aktualisiert)</w:t>
       </w:r>
     </w:p>
     <w:p>
@@ -15060,13 +16243,7 @@
         <w:pStyle w:val="K-Einzug"/>
       </w:pPr>
       <w:r>
-        <w:t xml:space="preserve">Grundsätzlich soll man auf der Webseite öffentliche Bilder eines Fotographen sehen können. Nur der Benutzer mit der Rolle «Owner», also der Fotographen kann Bilder hochladen, bearbeiten und löschen, sowie auch Benutzer hinzufügen, bearbeiten und löschen welche </w:t>
-      </w:r>
-      <w:r>
-        <w:t>seinen privaten Bildern</w:t>
-      </w:r>
-      <w:r>
-        <w:t xml:space="preserve"> sehen können. Normale Benutzer können nur öffentliche Bilder sehen.</w:t>
+        <w:t>Der Auftrag umfasst das ganze Soll-System. Weitere Implementationen oder Erweiterungen sind daher aktuell nicht geplant.</w:t>
       </w:r>
     </w:p>
     <w:p>
@@ -15086,7 +16263,31 @@
         <w:pStyle w:val="K-Einzug"/>
       </w:pPr>
       <w:r>
-        <w:t>Was noch hinzugefügt werden muss, damit es funktioniert.</w:t>
+        <w:t>Damit das Projekt vollständig ist, sind folgende Funktionen erforderlich:</w:t>
+      </w:r>
+    </w:p>
+    <w:p>
+      <w:pPr>
+        <w:pStyle w:val="K-Einzug"/>
+        <w:numPr>
+          <w:ilvl w:val="0"/>
+          <w:numId w:val="8"/>
+        </w:numPr>
+      </w:pPr>
+      <w:r>
+        <w:t>Bilder hochladen und verwalten</w:t>
+      </w:r>
+    </w:p>
+    <w:p>
+      <w:pPr>
+        <w:pStyle w:val="K-Einzug"/>
+        <w:numPr>
+          <w:ilvl w:val="0"/>
+          <w:numId w:val="8"/>
+        </w:numPr>
+      </w:pPr>
+      <w:r>
+        <w:t>Benutzer hinzufügen und verwalten</w:t>
       </w:r>
     </w:p>
     <w:p>
@@ -15150,6 +16351,7 @@
           </w:tcPr>
           <w:p>
             <w:r>
+              <w:lastRenderedPageBreak/>
               <w:t>Risikotitel</w:t>
             </w:r>
           </w:p>
@@ -15238,7 +16440,6 @@
       <w:bookmarkStart w:id="64" w:name="_Toc25148331"/>
       <w:bookmarkStart w:id="65" w:name="_Toc110858289"/>
       <w:r>
-        <w:lastRenderedPageBreak/>
         <w:t>Lösungsvarianten</w:t>
       </w:r>
       <w:bookmarkEnd w:id="64"/>
@@ -15297,7 +16498,19 @@
         </w:rPr>
       </w:pPr>
       <w:r>
-        <w:t xml:space="preserve">Für die Applikation wurde die Sprache XY benutz. Für die Versionskontrolle wurde ein Firmen Internes Git Repository verwendet. Das Backup des Servers wird nach dem </w:t>
+        <w:t xml:space="preserve">Für die Applikation wurde die Sprache </w:t>
+      </w:r>
+      <w:r>
+        <w:t>PHP</w:t>
+      </w:r>
+      <w:r>
+        <w:t xml:space="preserve"> benutz</w:t>
+      </w:r>
+      <w:r>
+        <w:t>t</w:t>
+      </w:r>
+      <w:r>
+        <w:t xml:space="preserve">. Für die Versionskontrolle wurde ein Firmen Internes Git Repository verwendet. Das Backup des Servers wird nach dem </w:t>
       </w:r>
       <w:hyperlink r:id="rId21" w:history="1">
         <w:r>
@@ -15408,7 +16621,11 @@
               </w:rPr>
             </w:pPr>
             <w:r>
-              <w:t>XY</w:t>
+              <w:rPr>
+                <w:b/>
+                <w:bCs/>
+              </w:rPr>
+              <w:t>XAMPP</w:t>
             </w:r>
           </w:p>
         </w:tc>
@@ -15421,7 +16638,82 @@
               <w:keepNext/>
             </w:pPr>
             <w:r>
-              <w:t>1.5.2</w:t>
+              <w:t>3.3.0</w:t>
+            </w:r>
+          </w:p>
+        </w:tc>
+      </w:tr>
+      <w:tr>
+        <w:tc>
+          <w:tcPr>
+            <w:tcW w:w="1610" w:type="dxa"/>
+          </w:tcPr>
+          <w:p>
+            <w:pPr>
+              <w:keepNext/>
+              <w:rPr>
+                <w:b/>
+                <w:bCs/>
+              </w:rPr>
+            </w:pPr>
+            <w:r>
+              <w:rPr>
+                <w:b/>
+                <w:bCs/>
+              </w:rPr>
+              <w:t>Visual Studio Code</w:t>
+            </w:r>
+          </w:p>
+        </w:tc>
+        <w:tc>
+          <w:tcPr>
+            <w:tcW w:w="7542" w:type="dxa"/>
+          </w:tcPr>
+          <w:p>
+            <w:pPr>
+              <w:keepNext/>
+            </w:pPr>
+            <w:r>
+              <w:t>1.70</w:t>
+            </w:r>
+          </w:p>
+        </w:tc>
+      </w:tr>
+      <w:tr>
+        <w:trPr>
+          <w:cnfStyle w:val="000000100000" w:firstRow="0" w:lastRow="0" w:firstColumn="0" w:lastColumn="0" w:oddVBand="0" w:evenVBand="0" w:oddHBand="1" w:evenHBand="0" w:firstRowFirstColumn="0" w:firstRowLastColumn="0" w:lastRowFirstColumn="0" w:lastRowLastColumn="0"/>
+        </w:trPr>
+        <w:tc>
+          <w:tcPr>
+            <w:tcW w:w="1610" w:type="dxa"/>
+          </w:tcPr>
+          <w:p>
+            <w:pPr>
+              <w:keepNext/>
+              <w:rPr>
+                <w:b/>
+                <w:bCs/>
+              </w:rPr>
+            </w:pPr>
+            <w:r>
+              <w:rPr>
+                <w:b/>
+                <w:bCs/>
+              </w:rPr>
+              <w:t>Google Chrome</w:t>
+            </w:r>
+          </w:p>
+        </w:tc>
+        <w:tc>
+          <w:tcPr>
+            <w:tcW w:w="7542" w:type="dxa"/>
+          </w:tcPr>
+          <w:p>
+            <w:pPr>
+              <w:keepNext/>
+            </w:pPr>
+            <w:r>
+              <w:t>104.0.5112.79</w:t>
             </w:r>
           </w:p>
         </w:tc>
@@ -15444,7 +16736,10 @@
         <w:pStyle w:val="K-Einzug"/>
       </w:pPr>
       <w:r>
-        <w:t>Für dieses Projekt wurde das Modell XY verwendet (wenn benötigt).</w:t>
+        <w:t>Für dieses Projekt</w:t>
+      </w:r>
+      <w:r>
+        <w:t xml:space="preserve"> wurde das MVC Modell verwendet.</w:t>
       </w:r>
     </w:p>
     <w:p>
@@ -15472,124 +16767,8 @@
         <w:pStyle w:val="K-Einzug"/>
       </w:pPr>
       <w:r>
-        <w:t>Interne Skripte und APIs, die benutzt werden.</w:t>
+        <w:t>Es wurden keine internen Skripte oder APIs verwendet.</w:t>
       </w:r>
-    </w:p>
-    <w:tbl>
-      <w:tblPr>
-        <w:tblStyle w:val="Kauzfarbig"/>
-        <w:tblW w:w="0" w:type="auto"/>
-        <w:tblLook w:val="04A0" w:firstRow="1" w:lastRow="0" w:firstColumn="1" w:lastColumn="0" w:noHBand="0" w:noVBand="1"/>
-      </w:tblPr>
-      <w:tblGrid>
-        <w:gridCol w:w="2239"/>
-        <w:gridCol w:w="2239"/>
-        <w:gridCol w:w="2239"/>
-        <w:gridCol w:w="2240"/>
-      </w:tblGrid>
-      <w:tr>
-        <w:trPr>
-          <w:cnfStyle w:val="100000000000" w:firstRow="1" w:lastRow="0" w:firstColumn="0" w:lastColumn="0" w:oddVBand="0" w:evenVBand="0" w:oddHBand="0" w:evenHBand="0" w:firstRowFirstColumn="0" w:firstRowLastColumn="0" w:lastRowFirstColumn="0" w:lastRowLastColumn="0"/>
-        </w:trPr>
-        <w:tc>
-          <w:tcPr>
-            <w:tcW w:w="2409" w:type="dxa"/>
-          </w:tcPr>
-          <w:p>
-            <w:pPr>
-              <w:pStyle w:val="K-Einzug"/>
-              <w:ind w:left="0"/>
-            </w:pPr>
-          </w:p>
-        </w:tc>
-        <w:tc>
-          <w:tcPr>
-            <w:tcW w:w="2409" w:type="dxa"/>
-          </w:tcPr>
-          <w:p>
-            <w:pPr>
-              <w:pStyle w:val="K-Einzug"/>
-              <w:ind w:left="0"/>
-            </w:pPr>
-          </w:p>
-        </w:tc>
-        <w:tc>
-          <w:tcPr>
-            <w:tcW w:w="2409" w:type="dxa"/>
-          </w:tcPr>
-          <w:p>
-            <w:pPr>
-              <w:pStyle w:val="K-Einzug"/>
-              <w:ind w:left="0"/>
-            </w:pPr>
-          </w:p>
-        </w:tc>
-        <w:tc>
-          <w:tcPr>
-            <w:tcW w:w="2410" w:type="dxa"/>
-          </w:tcPr>
-          <w:p>
-            <w:pPr>
-              <w:pStyle w:val="K-Einzug"/>
-              <w:ind w:left="0"/>
-            </w:pPr>
-          </w:p>
-        </w:tc>
-      </w:tr>
-      <w:tr>
-        <w:trPr>
-          <w:cnfStyle w:val="000000100000" w:firstRow="0" w:lastRow="0" w:firstColumn="0" w:lastColumn="0" w:oddVBand="0" w:evenVBand="0" w:oddHBand="1" w:evenHBand="0" w:firstRowFirstColumn="0" w:firstRowLastColumn="0" w:lastRowFirstColumn="0" w:lastRowLastColumn="0"/>
-        </w:trPr>
-        <w:tc>
-          <w:tcPr>
-            <w:tcW w:w="2409" w:type="dxa"/>
-          </w:tcPr>
-          <w:p>
-            <w:pPr>
-              <w:pStyle w:val="K-Einzug"/>
-              <w:ind w:left="0"/>
-            </w:pPr>
-          </w:p>
-        </w:tc>
-        <w:tc>
-          <w:tcPr>
-            <w:tcW w:w="2409" w:type="dxa"/>
-          </w:tcPr>
-          <w:p>
-            <w:pPr>
-              <w:pStyle w:val="K-Einzug"/>
-              <w:ind w:left="0"/>
-            </w:pPr>
-          </w:p>
-        </w:tc>
-        <w:tc>
-          <w:tcPr>
-            <w:tcW w:w="2409" w:type="dxa"/>
-          </w:tcPr>
-          <w:p>
-            <w:pPr>
-              <w:pStyle w:val="K-Einzug"/>
-              <w:ind w:left="0"/>
-            </w:pPr>
-          </w:p>
-        </w:tc>
-        <w:tc>
-          <w:tcPr>
-            <w:tcW w:w="2410" w:type="dxa"/>
-          </w:tcPr>
-          <w:p>
-            <w:pPr>
-              <w:pStyle w:val="K-Einzug"/>
-              <w:ind w:left="0"/>
-            </w:pPr>
-          </w:p>
-        </w:tc>
-      </w:tr>
-    </w:tbl>
-    <w:p>
-      <w:pPr>
-        <w:pStyle w:val="K-Einzug"/>
-      </w:pPr>
     </w:p>
     <w:p>
       <w:pPr>
@@ -15604,7 +16783,18 @@
         <w:pStyle w:val="K-Einzug"/>
       </w:pPr>
       <w:r>
-        <w:t>Externe Skripte oder APIs, die benutzt werden.</w:t>
+        <w:t xml:space="preserve">Es wurde die Schnittstelle von </w:t>
+      </w:r>
+      <w:hyperlink r:id="rId22" w:history="1">
+        <w:r>
+          <w:rPr>
+            <w:rStyle w:val="Hyperlink"/>
+          </w:rPr>
+          <w:t>https://fontawesome.com/icons</w:t>
+        </w:r>
+      </w:hyperlink>
+      <w:r>
+        <w:t xml:space="preserve"> für gewisse Icons genutzt.</w:t>
       </w:r>
     </w:p>
     <w:p>
@@ -15644,12 +16834,68 @@
       <w:bookmarkEnd w:id="81"/>
     </w:p>
     <w:p>
+      <w:r>
+        <w:rPr>
+          <w:noProof/>
+        </w:rPr>
+        <w:drawing>
+          <wp:inline distT="0" distB="0" distL="0" distR="0" wp14:anchorId="42A7EC9E" wp14:editId="10C805B6">
+            <wp:extent cx="6115050" cy="2047875"/>
+            <wp:effectExtent l="0" t="0" r="0" b="9525"/>
+            <wp:docPr id="21" name="Grafik 21"/>
+            <wp:cNvGraphicFramePr>
+              <a:graphicFrameLocks xmlns:a="http://schemas.openxmlformats.org/drawingml/2006/main" noChangeAspect="1"/>
+            </wp:cNvGraphicFramePr>
+            <a:graphic xmlns:a="http://schemas.openxmlformats.org/drawingml/2006/main">
+              <a:graphicData uri="http://schemas.openxmlformats.org/drawingml/2006/picture">
+                <pic:pic xmlns:pic="http://schemas.openxmlformats.org/drawingml/2006/picture">
+                  <pic:nvPicPr>
+                    <pic:cNvPr id="0" name="Picture 1"/>
+                    <pic:cNvPicPr>
+                      <a:picLocks noChangeAspect="1" noChangeArrowheads="1"/>
+                    </pic:cNvPicPr>
+                  </pic:nvPicPr>
+                  <pic:blipFill>
+                    <a:blip r:embed="rId23">
+                      <a:extLst>
+                        <a:ext uri="{28A0092B-C50C-407E-A947-70E740481C1C}">
+                          <a14:useLocalDpi xmlns:a14="http://schemas.microsoft.com/office/drawing/2010/main" val="0"/>
+                        </a:ext>
+                      </a:extLst>
+                    </a:blip>
+                    <a:srcRect/>
+                    <a:stretch>
+                      <a:fillRect/>
+                    </a:stretch>
+                  </pic:blipFill>
+                  <pic:spPr bwMode="auto">
+                    <a:xfrm>
+                      <a:off x="0" y="0"/>
+                      <a:ext cx="6115050" cy="2047875"/>
+                    </a:xfrm>
+                    <a:prstGeom prst="rect">
+                      <a:avLst/>
+                    </a:prstGeom>
+                    <a:noFill/>
+                    <a:ln>
+                      <a:noFill/>
+                    </a:ln>
+                  </pic:spPr>
+                </pic:pic>
+              </a:graphicData>
+            </a:graphic>
+          </wp:inline>
+        </w:drawing>
+      </w:r>
+    </w:p>
+    <w:p>
       <w:pPr>
         <w:pStyle w:val="berschrift3"/>
       </w:pPr>
       <w:bookmarkStart w:id="82" w:name="_Toc25148341"/>
       <w:bookmarkStart w:id="83" w:name="_Toc110858298"/>
       <w:r>
+        <w:lastRenderedPageBreak/>
         <w:t>Klassendiagramm</w:t>
       </w:r>
       <w:bookmarkEnd w:id="82"/>
@@ -15702,6 +16948,88 @@
         <w:t>Entscheiden</w:t>
       </w:r>
       <w:bookmarkEnd w:id="90"/>
+    </w:p>
+    <w:p>
+      <w:pPr>
+        <w:ind w:left="709"/>
+      </w:pPr>
+      <w:r>
+        <w:t>In diesem Projekt konnte ich, oder durfte ich sehr viel selbst entscheiden. Dazu gehört:</w:t>
+      </w:r>
+    </w:p>
+    <w:p>
+      <w:pPr>
+        <w:pStyle w:val="Listenabsatz"/>
+        <w:numPr>
+          <w:ilvl w:val="0"/>
+          <w:numId w:val="9"/>
+        </w:numPr>
+      </w:pPr>
+      <w:r>
+        <w:t>Farbschema,</w:t>
+      </w:r>
+    </w:p>
+    <w:p>
+      <w:pPr>
+        <w:pStyle w:val="Listenabsatz"/>
+        <w:numPr>
+          <w:ilvl w:val="0"/>
+          <w:numId w:val="9"/>
+        </w:numPr>
+      </w:pPr>
+      <w:r>
+        <w:t>Struktur,</w:t>
+      </w:r>
+    </w:p>
+    <w:p>
+      <w:pPr>
+        <w:pStyle w:val="Listenabsatz"/>
+        <w:numPr>
+          <w:ilvl w:val="0"/>
+          <w:numId w:val="9"/>
+        </w:numPr>
+      </w:pPr>
+      <w:r>
+        <w:t>Aussehen, und</w:t>
+      </w:r>
+    </w:p>
+    <w:p>
+      <w:pPr>
+        <w:pStyle w:val="Listenabsatz"/>
+        <w:numPr>
+          <w:ilvl w:val="0"/>
+          <w:numId w:val="9"/>
+        </w:numPr>
+      </w:pPr>
+      <w:r>
+        <w:t>Alles was mit der Schrift zutun hat</w:t>
+      </w:r>
+    </w:p>
+    <w:p>
+      <w:pPr>
+        <w:ind w:firstLine="709"/>
+      </w:pPr>
+    </w:p>
+    <w:p>
+      <w:pPr>
+        <w:ind w:left="709"/>
+      </w:pPr>
+      <w:r>
+        <w:t>Für das Farbschema habe ich nicht lange überlegt und einfach eine Farbe genommen, die mir gerade gefiel. Daraus kam eine hellblaue Farbe für die Navigation, sowie für die Modale. Für die Hintergrundfarbe und für die Tabelle habe ich schwarz genommen.</w:t>
+      </w:r>
+    </w:p>
+    <w:p>
+      <w:pPr>
+        <w:ind w:firstLine="709"/>
+      </w:pPr>
+    </w:p>
+    <w:p>
+      <w:pPr>
+        <w:ind w:left="709"/>
+      </w:pPr>
+      <w:r>
+        <w:t>Für die Bilder wollte ich etwas Spezielleres nehmen. Etwas das einem Museum ähnelt, einfach in Form einer Webseite. Darauf hinaus habe ich mich entschieden ein schöner weisser Rahmen zu nehmen.</w:t>
+      </w:r>
     </w:p>
     <w:p>
       <w:pPr>
@@ -15811,7 +17139,11 @@
           <w:tcPr>
             <w:tcW w:w="7510" w:type="dxa"/>
           </w:tcPr>
-          <w:p/>
+          <w:p>
+            <w:r>
+              <w:t>Computer</w:t>
+            </w:r>
+          </w:p>
         </w:tc>
       </w:tr>
       <w:tr>
@@ -15829,7 +17161,11 @@
           <w:tcPr>
             <w:tcW w:w="7510" w:type="dxa"/>
           </w:tcPr>
-          <w:p/>
+          <w:p>
+            <w:r>
+              <w:t>Pentium 4 processor or higher</w:t>
+            </w:r>
+          </w:p>
         </w:tc>
       </w:tr>
       <w:tr>
@@ -15850,7 +17186,18 @@
           <w:tcPr>
             <w:tcW w:w="7510" w:type="dxa"/>
           </w:tcPr>
-          <w:p/>
+          <w:p>
+            <w:pPr>
+              <w:rPr>
+                <w:rFonts w:ascii="Arial" w:hAnsi="Arial" w:cs="Arial"/>
+                <w:color w:val="BDC1C6"/>
+                <w:shd w:val="clear" w:color="auto" w:fill="202124"/>
+              </w:rPr>
+            </w:pPr>
+            <w:r>
+              <w:t>128MB</w:t>
+            </w:r>
+          </w:p>
         </w:tc>
       </w:tr>
       <w:tr>
@@ -15870,7 +17217,7 @@
           </w:tcPr>
           <w:p>
             <w:r>
-              <w:t>Chrome /Firefox / Opera</w:t>
+              <w:t>Chrome</w:t>
             </w:r>
           </w:p>
         </w:tc>
@@ -15895,7 +17242,7 @@
           </w:tcPr>
           <w:p>
             <w:r>
-              <w:t>Windows / Android / Mac</w:t>
+              <w:t>Windows</w:t>
             </w:r>
           </w:p>
         </w:tc>
@@ -16711,33 +18058,17 @@
       <w:pPr>
         <w:pStyle w:val="K-Einzug"/>
       </w:pPr>
-      <w:r>
-        <w:fldChar w:fldCharType="begin"/>
-      </w:r>
-      <w:r>
-        <w:instrText xml:space="preserve"> TOC \h \z \c "Abbildung" </w:instrText>
-      </w:r>
-      <w:r>
-        <w:fldChar w:fldCharType="separate"/>
-      </w:r>
-      <w:r>
-        <w:rPr>
-          <w:b/>
-          <w:bCs w:val="0"/>
-          <w:noProof/>
-          <w:lang w:val="de-DE"/>
-        </w:rPr>
-        <w:t>Es konnten keine Einträge für ein Abbildungsverzeichnis gefunden werden.</w:t>
-      </w:r>
-      <w:r>
-        <w:rPr>
-          <w:b/>
-          <w:bCs w:val="0"/>
-          <w:noProof/>
-          <w:lang w:val="de-DE"/>
-        </w:rPr>
-        <w:fldChar w:fldCharType="end"/>
-      </w:r>
+      <w:fldSimple w:instr=" TOC \h \z \c &quot;Abbildung&quot; ">
+        <w:r>
+          <w:rPr>
+            <w:b/>
+            <w:bCs w:val="0"/>
+            <w:noProof/>
+            <w:lang w:val="de-DE"/>
+          </w:rPr>
+          <w:t>Es konnten keine Einträge für ein Abbildungsverzeichnis gefunden werden.</w:t>
+        </w:r>
+      </w:fldSimple>
     </w:p>
     <w:p/>
     <w:p>
@@ -16750,8 +18081,8 @@
         <w:spacing w:after="160" w:line="259" w:lineRule="auto"/>
         <w:ind w:left="709" w:hanging="709"/>
         <w:sectPr>
-          <w:headerReference w:type="default" r:id="rId22"/>
-          <w:footerReference w:type="default" r:id="rId23"/>
+          <w:headerReference w:type="default" r:id="rId24"/>
+          <w:footerReference w:type="default" r:id="rId25"/>
           <w:pgSz w:w="11906" w:h="16838" w:code="9"/>
           <w:pgMar w:top="1985" w:right="851" w:bottom="1531" w:left="1418" w:header="709" w:footer="244" w:gutter="0"/>
           <w:cols w:space="708"/>
@@ -17052,7 +18383,7 @@
       </w:pPr>
     </w:p>
     <w:sectPr>
-      <w:footerReference w:type="default" r:id="rId24"/>
+      <w:footerReference w:type="default" r:id="rId26"/>
       <w:pgSz w:w="11906" w:h="16838" w:code="9"/>
       <w:pgMar w:top="1985" w:right="851" w:bottom="1531" w:left="1418" w:header="709" w:footer="244" w:gutter="0"/>
       <w:pgNumType w:fmt="upperRoman" w:start="1"/>
@@ -19459,6 +20790,92 @@
 <file path=word/numbering.xml><?xml version="1.0" encoding="utf-8"?>
 <w:numbering xmlns:wpc="http://schemas.microsoft.com/office/word/2010/wordprocessingCanvas" xmlns:cx="http://schemas.microsoft.com/office/drawing/2014/chartex" xmlns:cx1="http://schemas.microsoft.com/office/drawing/2015/9/8/chartex" xmlns:cx2="http://schemas.microsoft.com/office/drawing/2015/10/21/chartex" xmlns:cx3="http://schemas.microsoft.com/office/drawing/2016/5/9/chartex" xmlns:cx4="http://schemas.microsoft.com/office/drawing/2016/5/10/chartex" xmlns:cx5="http://schemas.microsoft.com/office/drawing/2016/5/11/chartex" xmlns:cx6="http://schemas.microsoft.com/office/drawing/2016/5/12/chartex" xmlns:cx7="http://schemas.microsoft.com/office/drawing/2016/5/13/chartex" xmlns:cx8="http://schemas.microsoft.com/office/drawing/2016/5/14/chartex" xmlns:mc="http://schemas.openxmlformats.org/markup-compatibility/2006" xmlns:aink="http://schemas.microsoft.com/office/drawing/2016/ink" xmlns:am3d="http://schemas.microsoft.com/office/drawing/2017/model3d" xmlns:o="urn:schemas-microsoft-com:office:office" xmlns:r="http://schemas.openxmlformats.org/officeDocument/2006/relationships" xmlns:m="http://schemas.openxmlformats.org/officeDocument/2006/math" xmlns:v="urn:schemas-microsoft-com:vml" xmlns:wp14="http://schemas.microsoft.com/office/word/2010/wordprocessingDrawing" xmlns:wp="http://schemas.openxmlformats.org/drawingml/2006/wordprocessingDrawing" xmlns:w10="urn:schemas-microsoft-com:office:word" xmlns:w="http://schemas.openxmlformats.org/wordprocessingml/2006/main" xmlns:w14="http://schemas.microsoft.com/office/word/2010/wordml" xmlns:w15="http://schemas.microsoft.com/office/word/2012/wordml" xmlns:w16cex="http://schemas.microsoft.com/office/word/2018/wordml/cex" xmlns:w16cid="http://schemas.microsoft.com/office/word/2016/wordml/cid" xmlns:w16="http://schemas.microsoft.com/office/word/2018/wordml" xmlns:w16sdtdh="http://schemas.microsoft.com/office/word/2020/wordml/sdtdatahash" xmlns:w16se="http://schemas.microsoft.com/office/word/2015/wordml/symex" xmlns:wpg="http://schemas.microsoft.com/office/word/2010/wordprocessingGroup" xmlns:wpi="http://schemas.microsoft.com/office/word/2010/wordprocessingInk" xmlns:wne="http://schemas.microsoft.com/office/word/2006/wordml" xmlns:wps="http://schemas.microsoft.com/office/word/2010/wordprocessingShape" mc:Ignorable="w14 w15 w16se w16cid w16 w16cex w16sdtdh wp14">
   <w:abstractNum w:abstractNumId="0" w15:restartNumberingAfterBreak="0">
+    <w:nsid w:val="0CFD7BAF"/>
+    <w:multiLevelType w:val="hybridMultilevel"/>
+    <w:tmpl w:val="6DBA1060"/>
+    <w:lvl w:ilvl="0" w:tplc="0807000F">
+      <w:start w:val="1"/>
+      <w:numFmt w:val="decimal"/>
+      <w:lvlText w:val="%1."/>
+      <w:lvlJc w:val="left"/>
+      <w:pPr>
+        <w:ind w:left="1429" w:hanging="360"/>
+      </w:pPr>
+    </w:lvl>
+    <w:lvl w:ilvl="1" w:tplc="08070019" w:tentative="1">
+      <w:start w:val="1"/>
+      <w:numFmt w:val="lowerLetter"/>
+      <w:lvlText w:val="%2."/>
+      <w:lvlJc w:val="left"/>
+      <w:pPr>
+        <w:ind w:left="2149" w:hanging="360"/>
+      </w:pPr>
+    </w:lvl>
+    <w:lvl w:ilvl="2" w:tplc="0807001B" w:tentative="1">
+      <w:start w:val="1"/>
+      <w:numFmt w:val="lowerRoman"/>
+      <w:lvlText w:val="%3."/>
+      <w:lvlJc w:val="right"/>
+      <w:pPr>
+        <w:ind w:left="2869" w:hanging="180"/>
+      </w:pPr>
+    </w:lvl>
+    <w:lvl w:ilvl="3" w:tplc="0807000F" w:tentative="1">
+      <w:start w:val="1"/>
+      <w:numFmt w:val="decimal"/>
+      <w:lvlText w:val="%4."/>
+      <w:lvlJc w:val="left"/>
+      <w:pPr>
+        <w:ind w:left="3589" w:hanging="360"/>
+      </w:pPr>
+    </w:lvl>
+    <w:lvl w:ilvl="4" w:tplc="08070019" w:tentative="1">
+      <w:start w:val="1"/>
+      <w:numFmt w:val="lowerLetter"/>
+      <w:lvlText w:val="%5."/>
+      <w:lvlJc w:val="left"/>
+      <w:pPr>
+        <w:ind w:left="4309" w:hanging="360"/>
+      </w:pPr>
+    </w:lvl>
+    <w:lvl w:ilvl="5" w:tplc="0807001B" w:tentative="1">
+      <w:start w:val="1"/>
+      <w:numFmt w:val="lowerRoman"/>
+      <w:lvlText w:val="%6."/>
+      <w:lvlJc w:val="right"/>
+      <w:pPr>
+        <w:ind w:left="5029" w:hanging="180"/>
+      </w:pPr>
+    </w:lvl>
+    <w:lvl w:ilvl="6" w:tplc="0807000F" w:tentative="1">
+      <w:start w:val="1"/>
+      <w:numFmt w:val="decimal"/>
+      <w:lvlText w:val="%7."/>
+      <w:lvlJc w:val="left"/>
+      <w:pPr>
+        <w:ind w:left="5749" w:hanging="360"/>
+      </w:pPr>
+    </w:lvl>
+    <w:lvl w:ilvl="7" w:tplc="08070019" w:tentative="1">
+      <w:start w:val="1"/>
+      <w:numFmt w:val="lowerLetter"/>
+      <w:lvlText w:val="%8."/>
+      <w:lvlJc w:val="left"/>
+      <w:pPr>
+        <w:ind w:left="6469" w:hanging="360"/>
+      </w:pPr>
+    </w:lvl>
+    <w:lvl w:ilvl="8" w:tplc="0807001B" w:tentative="1">
+      <w:start w:val="1"/>
+      <w:numFmt w:val="lowerRoman"/>
+      <w:lvlText w:val="%9."/>
+      <w:lvlJc w:val="right"/>
+      <w:pPr>
+        <w:ind w:left="7189" w:hanging="180"/>
+      </w:pPr>
+    </w:lvl>
+  </w:abstractNum>
+  <w:abstractNum w:abstractNumId="1" w15:restartNumberingAfterBreak="0">
     <w:nsid w:val="0D175F7C"/>
     <w:multiLevelType w:val="hybridMultilevel"/>
     <w:tmpl w:val="3B8248C4"/>
@@ -19547,7 +20964,7 @@
       </w:pPr>
     </w:lvl>
   </w:abstractNum>
-  <w:abstractNum w:abstractNumId="1" w15:restartNumberingAfterBreak="0">
+  <w:abstractNum w:abstractNumId="2" w15:restartNumberingAfterBreak="0">
     <w:nsid w:val="33DE0566"/>
     <w:multiLevelType w:val="hybridMultilevel"/>
     <w:tmpl w:val="7E726BBC"/>
@@ -19660,7 +21077,7 @@
       </w:rPr>
     </w:lvl>
   </w:abstractNum>
-  <w:abstractNum w:abstractNumId="2" w15:restartNumberingAfterBreak="0">
+  <w:abstractNum w:abstractNumId="3" w15:restartNumberingAfterBreak="0">
     <w:nsid w:val="3C3A310F"/>
     <w:multiLevelType w:val="multilevel"/>
     <w:tmpl w:val="3022E5E4"/>
@@ -19755,7 +21172,7 @@
       </w:pPr>
     </w:lvl>
   </w:abstractNum>
-  <w:abstractNum w:abstractNumId="3" w15:restartNumberingAfterBreak="0">
+  <w:abstractNum w:abstractNumId="4" w15:restartNumberingAfterBreak="0">
     <w:nsid w:val="3E7967DE"/>
     <w:multiLevelType w:val="hybridMultilevel"/>
     <w:tmpl w:val="B20AC618"/>
@@ -19869,7 +21286,96 @@
       </w:rPr>
     </w:lvl>
   </w:abstractNum>
-  <w:abstractNum w:abstractNumId="4" w15:restartNumberingAfterBreak="0">
+  <w:abstractNum w:abstractNumId="5" w15:restartNumberingAfterBreak="0">
+    <w:nsid w:val="47695430"/>
+    <w:multiLevelType w:val="hybridMultilevel"/>
+    <w:tmpl w:val="4266D140"/>
+    <w:lvl w:ilvl="0" w:tplc="3C3AE538">
+      <w:start w:val="1"/>
+      <w:numFmt w:val="decimal"/>
+      <w:lvlText w:val="%1."/>
+      <w:lvlJc w:val="left"/>
+      <w:pPr>
+        <w:ind w:left="1069" w:hanging="360"/>
+      </w:pPr>
+      <w:rPr>
+        <w:rFonts w:hint="default"/>
+      </w:rPr>
+    </w:lvl>
+    <w:lvl w:ilvl="1" w:tplc="04070019" w:tentative="1">
+      <w:start w:val="1"/>
+      <w:numFmt w:val="lowerLetter"/>
+      <w:lvlText w:val="%2."/>
+      <w:lvlJc w:val="left"/>
+      <w:pPr>
+        <w:ind w:left="1789" w:hanging="360"/>
+      </w:pPr>
+    </w:lvl>
+    <w:lvl w:ilvl="2" w:tplc="0407001B" w:tentative="1">
+      <w:start w:val="1"/>
+      <w:numFmt w:val="lowerRoman"/>
+      <w:lvlText w:val="%3."/>
+      <w:lvlJc w:val="right"/>
+      <w:pPr>
+        <w:ind w:left="2509" w:hanging="180"/>
+      </w:pPr>
+    </w:lvl>
+    <w:lvl w:ilvl="3" w:tplc="0407000F" w:tentative="1">
+      <w:start w:val="1"/>
+      <w:numFmt w:val="decimal"/>
+      <w:lvlText w:val="%4."/>
+      <w:lvlJc w:val="left"/>
+      <w:pPr>
+        <w:ind w:left="3229" w:hanging="360"/>
+      </w:pPr>
+    </w:lvl>
+    <w:lvl w:ilvl="4" w:tplc="04070019" w:tentative="1">
+      <w:start w:val="1"/>
+      <w:numFmt w:val="lowerLetter"/>
+      <w:lvlText w:val="%5."/>
+      <w:lvlJc w:val="left"/>
+      <w:pPr>
+        <w:ind w:left="3949" w:hanging="360"/>
+      </w:pPr>
+    </w:lvl>
+    <w:lvl w:ilvl="5" w:tplc="0407001B" w:tentative="1">
+      <w:start w:val="1"/>
+      <w:numFmt w:val="lowerRoman"/>
+      <w:lvlText w:val="%6."/>
+      <w:lvlJc w:val="right"/>
+      <w:pPr>
+        <w:ind w:left="4669" w:hanging="180"/>
+      </w:pPr>
+    </w:lvl>
+    <w:lvl w:ilvl="6" w:tplc="0407000F" w:tentative="1">
+      <w:start w:val="1"/>
+      <w:numFmt w:val="decimal"/>
+      <w:lvlText w:val="%7."/>
+      <w:lvlJc w:val="left"/>
+      <w:pPr>
+        <w:ind w:left="5389" w:hanging="360"/>
+      </w:pPr>
+    </w:lvl>
+    <w:lvl w:ilvl="7" w:tplc="04070019" w:tentative="1">
+      <w:start w:val="1"/>
+      <w:numFmt w:val="lowerLetter"/>
+      <w:lvlText w:val="%8."/>
+      <w:lvlJc w:val="left"/>
+      <w:pPr>
+        <w:ind w:left="6109" w:hanging="360"/>
+      </w:pPr>
+    </w:lvl>
+    <w:lvl w:ilvl="8" w:tplc="0407001B" w:tentative="1">
+      <w:start w:val="1"/>
+      <w:numFmt w:val="lowerRoman"/>
+      <w:lvlText w:val="%9."/>
+      <w:lvlJc w:val="right"/>
+      <w:pPr>
+        <w:ind w:left="6829" w:hanging="180"/>
+      </w:pPr>
+    </w:lvl>
+  </w:abstractNum>
+  <w:abstractNum w:abstractNumId="6" w15:restartNumberingAfterBreak="0">
     <w:nsid w:val="49947ABD"/>
     <w:multiLevelType w:val="hybridMultilevel"/>
     <w:tmpl w:val="0F8A8166"/>
@@ -19982,7 +21488,7 @@
       </w:rPr>
     </w:lvl>
   </w:abstractNum>
-  <w:abstractNum w:abstractNumId="5" w15:restartNumberingAfterBreak="0">
+  <w:abstractNum w:abstractNumId="7" w15:restartNumberingAfterBreak="0">
     <w:nsid w:val="590B4545"/>
     <w:multiLevelType w:val="hybridMultilevel"/>
     <w:tmpl w:val="ACBA0B84"/>
@@ -20094,7 +21600,7 @@
       </w:rPr>
     </w:lvl>
   </w:abstractNum>
-  <w:abstractNum w:abstractNumId="6" w15:restartNumberingAfterBreak="0">
+  <w:abstractNum w:abstractNumId="8" w15:restartNumberingAfterBreak="0">
     <w:nsid w:val="719372AF"/>
     <w:multiLevelType w:val="multilevel"/>
     <w:tmpl w:val="3D8237F8"/>
@@ -20209,25 +21715,31 @@
     </w:lvl>
   </w:abstractNum>
   <w:num w:numId="1">
+    <w:abstractNumId w:val="6"/>
+  </w:num>
+  <w:num w:numId="2">
     <w:abstractNumId w:val="4"/>
   </w:num>
-  <w:num w:numId="2">
+  <w:num w:numId="3">
     <w:abstractNumId w:val="3"/>
   </w:num>
-  <w:num w:numId="3">
+  <w:num w:numId="4">
+    <w:abstractNumId w:val="1"/>
+  </w:num>
+  <w:num w:numId="5">
+    <w:abstractNumId w:val="7"/>
+  </w:num>
+  <w:num w:numId="6">
     <w:abstractNumId w:val="2"/>
   </w:num>
-  <w:num w:numId="4">
-    <w:abstractNumId w:val="0"/>
+  <w:num w:numId="7">
+    <w:abstractNumId w:val="8"/>
   </w:num>
-  <w:num w:numId="5">
+  <w:num w:numId="8">
     <w:abstractNumId w:val="5"/>
   </w:num>
-  <w:num w:numId="6">
-    <w:abstractNumId w:val="1"/>
-  </w:num>
-  <w:num w:numId="7">
-    <w:abstractNumId w:val="6"/>
+  <w:num w:numId="9">
+    <w:abstractNumId w:val="0"/>
   </w:num>
 </w:numbering>
 </file>
@@ -20630,7 +22142,7 @@
   <w:style w:type="paragraph" w:default="1" w:styleId="Standard">
     <w:name w:val="Normal"/>
     <w:qFormat/>
-    <w:rsid w:val="00F60FB9"/>
+    <w:rsid w:val="00CE4EF4"/>
     <w:pPr>
       <w:spacing w:after="0" w:line="240" w:lineRule="auto"/>
     </w:pPr>
@@ -22424,7 +23936,7 @@
     <w:charset w:val="86"/>
     <w:family w:val="auto"/>
     <w:pitch w:val="variable"/>
-    <w:sig w:usb0="00000203" w:usb1="288F0000" w:usb2="00000016" w:usb3="00000000" w:csb0="00040001" w:csb1="00000000"/>
+    <w:sig w:usb0="00000003" w:usb1="288F0000" w:usb2="00000016" w:usb3="00000000" w:csb0="00040001" w:csb1="00000000"/>
   </w:font>
   <w:font w:name="Courier New">
     <w:panose1 w:val="02070309020205020404"/>
@@ -22461,6 +23973,13 @@
     <w:pitch w:val="variable"/>
     <w:sig w:usb0="E4002EFF" w:usb1="C000E47F" w:usb2="00000009" w:usb3="00000000" w:csb0="000001FF" w:csb1="00000000"/>
   </w:font>
+  <w:font w:name="Arial">
+    <w:panose1 w:val="020B0604020202020204"/>
+    <w:charset w:val="00"/>
+    <w:family w:val="swiss"/>
+    <w:pitch w:val="variable"/>
+    <w:sig w:usb0="E0002EFF" w:usb1="C000785B" w:usb2="00000009" w:usb3="00000000" w:csb0="000001FF" w:csb1="00000000"/>
+  </w:font>
 </w:fonts>
 </file>
 
@@ -22483,8 +24002,10 @@
   <w:rsids>
     <w:rsidRoot w:val="002A790C"/>
     <w:rsid w:val="00075B9D"/>
+    <w:rsid w:val="00154DBA"/>
     <w:rsid w:val="00155468"/>
     <w:rsid w:val="00187613"/>
+    <w:rsid w:val="00222806"/>
     <w:rsid w:val="00294465"/>
     <w:rsid w:val="002A790C"/>
     <w:rsid w:val="002C6637"/>

</xml_diff>

<commit_message>
Zeitplan, Doku, Readme aktu..., imageView delete
</commit_message>
<xml_diff>
--- a/docs/PA_Fotostudio_Doku.docx
+++ b/docs/PA_Fotostudio_Doku.docx
@@ -7049,34 +7049,14 @@
       <w:pPr>
         <w:pStyle w:val="berschrift2"/>
       </w:pPr>
-      <w:bookmarkStart w:id="20" w:name="_Toc25148308"/>
-      <w:bookmarkStart w:id="21" w:name="_Toc110858266"/>
+      <w:bookmarkStart w:id="20" w:name="_Toc25148309"/>
+      <w:bookmarkStart w:id="21" w:name="_Toc110858267"/>
       <w:r>
         <w:lastRenderedPageBreak/>
-        <w:t>Gewählte Parameter</w:t>
+        <w:t>Arbeitsjournal</w:t>
       </w:r>
       <w:bookmarkEnd w:id="20"/>
       <w:bookmarkEnd w:id="21"/>
-    </w:p>
-    <w:p>
-      <w:pPr>
-        <w:pStyle w:val="K-Einzug"/>
-      </w:pPr>
-      <w:r>
-        <w:t>Folgt…</w:t>
-      </w:r>
-    </w:p>
-    <w:p>
-      <w:pPr>
-        <w:pStyle w:val="berschrift2"/>
-      </w:pPr>
-      <w:bookmarkStart w:id="22" w:name="_Toc25148309"/>
-      <w:bookmarkStart w:id="23" w:name="_Toc110858267"/>
-      <w:r>
-        <w:t>Arbeitsjournal</w:t>
-      </w:r>
-      <w:bookmarkEnd w:id="22"/>
-      <w:bookmarkEnd w:id="23"/>
     </w:p>
     <w:p>
       <w:pPr>
@@ -7126,16 +7106,16 @@
       <w:pPr>
         <w:pStyle w:val="berschrift3"/>
       </w:pPr>
-      <w:bookmarkStart w:id="24" w:name="_Toc25148310"/>
-      <w:bookmarkStart w:id="25" w:name="_Toc110858268"/>
+      <w:bookmarkStart w:id="22" w:name="_Toc25148310"/>
+      <w:bookmarkStart w:id="23" w:name="_Toc110858268"/>
       <w:r>
         <w:t xml:space="preserve">Tag 1: </w:t>
       </w:r>
-      <w:bookmarkEnd w:id="24"/>
+      <w:bookmarkEnd w:id="22"/>
       <w:r>
         <w:t>08.08.2022</w:t>
       </w:r>
-      <w:bookmarkEnd w:id="25"/>
+      <w:bookmarkEnd w:id="23"/>
     </w:p>
     <w:tbl>
       <w:tblPr>
@@ -7672,15 +7652,15 @@
       <w:pPr>
         <w:pStyle w:val="berschrift3"/>
       </w:pPr>
-      <w:bookmarkStart w:id="26" w:name="_Toc110858269"/>
-      <w:bookmarkStart w:id="27" w:name="_Toc25148312"/>
+      <w:bookmarkStart w:id="24" w:name="_Toc110858269"/>
+      <w:bookmarkStart w:id="25" w:name="_Toc25148312"/>
       <w:r>
         <w:t xml:space="preserve">Tag 2: </w:t>
       </w:r>
       <w:r>
         <w:t>09.08.2022</w:t>
       </w:r>
-      <w:bookmarkEnd w:id="26"/>
+      <w:bookmarkEnd w:id="24"/>
     </w:p>
     <w:tbl>
       <w:tblPr>
@@ -8085,7 +8065,6 @@
           </w:tcPr>
           <w:p>
             <w:r>
-              <w:lastRenderedPageBreak/>
               <w:t>Es wurden an dem Tag keine Tests durchgeführt.</w:t>
             </w:r>
           </w:p>
@@ -8172,6 +8151,7 @@
           </w:tcPr>
           <w:p>
             <w:r>
+              <w:lastRenderedPageBreak/>
               <w:t>Verglichen mit dem Zeitplan bin ich sehr gut drin.</w:t>
             </w:r>
           </w:p>
@@ -8233,15 +8213,15 @@
       <w:pPr>
         <w:pStyle w:val="berschrift3"/>
       </w:pPr>
-      <w:bookmarkStart w:id="28" w:name="_Toc110858270"/>
+      <w:bookmarkStart w:id="26" w:name="_Toc110858270"/>
       <w:r>
         <w:t xml:space="preserve">Tag 3: </w:t>
       </w:r>
-      <w:bookmarkEnd w:id="27"/>
+      <w:bookmarkEnd w:id="25"/>
       <w:r>
         <w:t>10.08.2022</w:t>
       </w:r>
-      <w:bookmarkEnd w:id="28"/>
+      <w:bookmarkEnd w:id="26"/>
     </w:p>
     <w:tbl>
       <w:tblPr>
@@ -8427,59 +8407,6 @@
                 <w:noProof/>
               </w:rPr>
             </w:pPr>
-            <w:r>
-              <w:rPr>
-                <w:noProof/>
-              </w:rPr>
-              <w:drawing>
-                <wp:inline distT="0" distB="0" distL="0" distR="0" wp14:anchorId="38E4F7B8" wp14:editId="430030D3">
-                  <wp:extent cx="216000" cy="216000"/>
-                  <wp:effectExtent l="0" t="0" r="0" b="0"/>
-                  <wp:docPr id="27" name="Grafik 27"/>
-                  <wp:cNvGraphicFramePr>
-                    <a:graphicFrameLocks xmlns:a="http://schemas.openxmlformats.org/drawingml/2006/main" noChangeAspect="1"/>
-                  </wp:cNvGraphicFramePr>
-                  <a:graphic xmlns:a="http://schemas.openxmlformats.org/drawingml/2006/main">
-                    <a:graphicData uri="http://schemas.openxmlformats.org/drawingml/2006/picture">
-                      <pic:pic xmlns:pic="http://schemas.openxmlformats.org/drawingml/2006/picture">
-                        <pic:nvPicPr>
-                          <pic:cNvPr id="0" name="Grafik 10"/>
-                          <pic:cNvPicPr>
-                            <a:picLocks noChangeAspect="1" noChangeArrowheads="1"/>
-                          </pic:cNvPicPr>
-                        </pic:nvPicPr>
-                        <pic:blipFill>
-                          <a:blip r:embed="rId18">
-                            <a:extLst>
-                              <a:ext uri="{28A0092B-C50C-407E-A947-70E740481C1C}">
-                                <a14:useLocalDpi xmlns:a14="http://schemas.microsoft.com/office/drawing/2010/main" val="0"/>
-                              </a:ext>
-                            </a:extLst>
-                          </a:blip>
-                          <a:srcRect/>
-                          <a:stretch>
-                            <a:fillRect/>
-                          </a:stretch>
-                        </pic:blipFill>
-                        <pic:spPr bwMode="auto">
-                          <a:xfrm>
-                            <a:off x="0" y="0"/>
-                            <a:ext cx="216000" cy="216000"/>
-                          </a:xfrm>
-                          <a:prstGeom prst="rect">
-                            <a:avLst/>
-                          </a:prstGeom>
-                          <a:noFill/>
-                          <a:ln>
-                            <a:noFill/>
-                          </a:ln>
-                        </pic:spPr>
-                      </pic:pic>
-                    </a:graphicData>
-                  </a:graphic>
-                </wp:inline>
-              </w:drawing>
-            </w:r>
             <w:r>
               <w:t xml:space="preserve"> </w:t>
             </w:r>
@@ -8584,7 +8511,46 @@
               </w:rPr>
             </w:pPr>
             <w:r>
-              <w:t>Text…</w:t>
+              <w:rPr>
+                <w:b/>
+                <w:bCs/>
+              </w:rPr>
+              <w:t xml:space="preserve">Heute habe ich mehrheitlich in der </w:t>
+            </w:r>
+            <w:r>
+              <w:rPr>
+                <w:b/>
+                <w:bCs/>
+              </w:rPr>
+              <w:t>Dokumentation</w:t>
+            </w:r>
+            <w:r>
+              <w:rPr>
+                <w:b/>
+                <w:bCs/>
+              </w:rPr>
+              <w:t xml:space="preserve"> gearbeitet und Diagramme erstell</w:t>
+            </w:r>
+            <w:r>
+              <w:rPr>
+                <w:b/>
+                <w:bCs/>
+              </w:rPr>
+              <w:t>t</w:t>
+            </w:r>
+            <w:r>
+              <w:rPr>
+                <w:b/>
+                <w:bCs/>
+              </w:rPr>
+              <w:t xml:space="preserve">. </w:t>
+            </w:r>
+            <w:r>
+              <w:rPr>
+                <w:b/>
+                <w:bCs/>
+              </w:rPr>
+              <w:t>Allerdings habe ich es tatsächlich geschafft, trotz grossen Verzögerungen den Zeitplan fertigzustellen. Leider fehlen bei mir noch in der Dokumentation gewisse Stellen, die ich noch füllen muss.</w:t>
             </w:r>
           </w:p>
         </w:tc>
@@ -8625,7 +8591,17 @@
             <w:tcW w:w="9081" w:type="dxa"/>
             <w:gridSpan w:val="4"/>
           </w:tcPr>
-          <w:p/>
+          <w:p>
+            <w:r>
+              <w:t xml:space="preserve">Bilder konnten lange nicht </w:t>
+            </w:r>
+            <w:r>
+              <w:t>angezeigt</w:t>
+            </w:r>
+            <w:r>
+              <w:t xml:space="preserve"> werden, bis mir Aurel Wicki nach ein paar Stunden helfen konnte.</w:t>
+            </w:r>
+          </w:p>
         </w:tc>
       </w:tr>
       <w:tr>
@@ -8664,7 +8640,11 @@
             <w:tcW w:w="9081" w:type="dxa"/>
             <w:gridSpan w:val="4"/>
           </w:tcPr>
-          <w:p/>
+          <w:p>
+            <w:r>
+              <w:t>Bilder können angezeigt werden.</w:t>
+            </w:r>
+          </w:p>
         </w:tc>
       </w:tr>
       <w:tr>
@@ -8703,7 +8683,11 @@
             <w:tcW w:w="9081" w:type="dxa"/>
             <w:gridSpan w:val="4"/>
           </w:tcPr>
-          <w:p/>
+          <w:p>
+            <w:r>
+              <w:t>Ich habe heute Hilfe von Janik Lüthi und von Aurel Wichi beansprucht.</w:t>
+            </w:r>
+          </w:p>
         </w:tc>
       </w:tr>
       <w:tr>
@@ -8742,7 +8726,17 @@
             <w:tcW w:w="9081" w:type="dxa"/>
             <w:gridSpan w:val="4"/>
           </w:tcPr>
-          <w:p/>
+          <w:p>
+            <w:r>
+              <w:t xml:space="preserve">Laut Zeitplan liege etwas weiter hinten, und </w:t>
+            </w:r>
+            <w:r>
+              <w:t>dass</w:t>
+            </w:r>
+            <w:r>
+              <w:t xml:space="preserve"> nur weil ich den Zeitplan zu spät angefangen habe zu machen und die Dokumentation etwas vernachlässigt habe.</w:t>
+            </w:r>
+          </w:p>
         </w:tc>
       </w:tr>
       <w:tr>
@@ -8787,6 +8781,42 @@
                 <w:bCs/>
               </w:rPr>
             </w:pPr>
+            <w:r>
+              <w:rPr>
+                <w:bCs/>
+              </w:rPr>
+              <w:t xml:space="preserve">Trotz allem Missgeschick und </w:t>
+            </w:r>
+            <w:r>
+              <w:rPr>
+                <w:bCs/>
+              </w:rPr>
+              <w:t>Mühseligkeit</w:t>
+            </w:r>
+            <w:r>
+              <w:rPr>
+                <w:bCs/>
+              </w:rPr>
+              <w:t xml:space="preserve"> habe ich es trotzdem, relativ nahe ans Ziel geschafft. Mag auch sein, dass ich mir für heute zu viele Ziele gesetzt habe. Aber ich will halt eben 2 bis 3 Tage vor der Abgabe der Mini PA fertig werden, um alles noch zu korri</w:t>
+            </w:r>
+            <w:r>
+              <w:rPr>
+                <w:bCs/>
+              </w:rPr>
+              <w:t>gi</w:t>
+            </w:r>
+            <w:r>
+              <w:rPr>
+                <w:bCs/>
+              </w:rPr>
+              <w:t>eren, was noch korrigiert werden muss.</w:t>
+            </w:r>
+            <w:r>
+              <w:rPr>
+                <w:bCs/>
+              </w:rPr>
+              <w:t xml:space="preserve"> Denn die Zeit rennt schneller als man denkt bei solchen Arbeiten!</w:t>
+            </w:r>
           </w:p>
         </w:tc>
       </w:tr>
@@ -8795,16 +8825,16 @@
       <w:pPr>
         <w:pStyle w:val="berschrift3"/>
       </w:pPr>
-      <w:bookmarkStart w:id="29" w:name="_Toc25148313"/>
-      <w:bookmarkStart w:id="30" w:name="_Toc110858271"/>
+      <w:bookmarkStart w:id="27" w:name="_Toc25148313"/>
+      <w:bookmarkStart w:id="28" w:name="_Toc110858271"/>
       <w:r>
         <w:t xml:space="preserve">Tag 4: </w:t>
       </w:r>
-      <w:bookmarkEnd w:id="29"/>
+      <w:bookmarkEnd w:id="27"/>
       <w:r>
         <w:t>11.08.2022</w:t>
       </w:r>
-      <w:bookmarkEnd w:id="30"/>
+      <w:bookmarkEnd w:id="28"/>
     </w:p>
     <w:tbl>
       <w:tblPr>
@@ -9337,16 +9367,16 @@
       <w:pPr>
         <w:pStyle w:val="berschrift3"/>
       </w:pPr>
-      <w:bookmarkStart w:id="31" w:name="_Toc25148314"/>
-      <w:bookmarkStart w:id="32" w:name="_Toc110858272"/>
+      <w:bookmarkStart w:id="29" w:name="_Toc25148314"/>
+      <w:bookmarkStart w:id="30" w:name="_Toc110858272"/>
       <w:r>
         <w:t xml:space="preserve">Tag 5: </w:t>
       </w:r>
-      <w:bookmarkEnd w:id="31"/>
+      <w:bookmarkEnd w:id="29"/>
       <w:r>
         <w:t>12.08.2022</w:t>
       </w:r>
-      <w:bookmarkEnd w:id="32"/>
+      <w:bookmarkEnd w:id="30"/>
     </w:p>
     <w:tbl>
       <w:tblPr>
@@ -9373,7 +9403,6 @@
           </w:tcPr>
           <w:p>
             <w:r>
-              <w:lastRenderedPageBreak/>
               <w:t>Anwesenheit:</w:t>
             </w:r>
             <w:r>
@@ -9880,14 +9909,14 @@
       <w:pPr>
         <w:pStyle w:val="berschrift3"/>
       </w:pPr>
-      <w:bookmarkStart w:id="33" w:name="_Toc110858273"/>
+      <w:bookmarkStart w:id="31" w:name="_Toc110858273"/>
       <w:r>
         <w:t xml:space="preserve">Tag 6: </w:t>
       </w:r>
       <w:r>
         <w:t>16.08.2022</w:t>
       </w:r>
-      <w:bookmarkEnd w:id="33"/>
+      <w:bookmarkEnd w:id="31"/>
     </w:p>
     <w:tbl>
       <w:tblPr>
@@ -10420,16 +10449,16 @@
       <w:pPr>
         <w:pStyle w:val="berschrift3"/>
       </w:pPr>
-      <w:bookmarkStart w:id="34" w:name="_Toc25148316"/>
-      <w:bookmarkStart w:id="35" w:name="_Toc110858274"/>
+      <w:bookmarkStart w:id="32" w:name="_Toc25148316"/>
+      <w:bookmarkStart w:id="33" w:name="_Toc110858274"/>
       <w:r>
         <w:t xml:space="preserve">Tag 7: </w:t>
       </w:r>
-      <w:bookmarkEnd w:id="34"/>
+      <w:bookmarkEnd w:id="32"/>
       <w:r>
         <w:t>17.08.2022</w:t>
       </w:r>
-      <w:bookmarkEnd w:id="35"/>
+      <w:bookmarkEnd w:id="33"/>
     </w:p>
     <w:tbl>
       <w:tblPr>
@@ -10812,6 +10841,7 @@
               <w:rPr>
                 <w:b/>
               </w:rPr>
+              <w:lastRenderedPageBreak/>
               <w:t>Erfolgreiche oder erfolglose Tests</w:t>
             </w:r>
           </w:p>
@@ -10962,16 +10992,16 @@
       <w:pPr>
         <w:pStyle w:val="berschrift3"/>
       </w:pPr>
-      <w:bookmarkStart w:id="36" w:name="_Toc25148317"/>
-      <w:bookmarkStart w:id="37" w:name="_Toc110858275"/>
+      <w:bookmarkStart w:id="34" w:name="_Toc25148317"/>
+      <w:bookmarkStart w:id="35" w:name="_Toc110858275"/>
       <w:r>
         <w:t xml:space="preserve">Tag 8: </w:t>
       </w:r>
-      <w:bookmarkEnd w:id="36"/>
+      <w:bookmarkEnd w:id="34"/>
       <w:r>
         <w:t>18.08.2022</w:t>
       </w:r>
-      <w:bookmarkEnd w:id="37"/>
+      <w:bookmarkEnd w:id="35"/>
     </w:p>
     <w:tbl>
       <w:tblPr>
@@ -11504,16 +11534,16 @@
       <w:pPr>
         <w:pStyle w:val="berschrift3"/>
       </w:pPr>
-      <w:bookmarkStart w:id="38" w:name="_Toc25148318"/>
-      <w:bookmarkStart w:id="39" w:name="_Toc110858276"/>
+      <w:bookmarkStart w:id="36" w:name="_Toc25148318"/>
+      <w:bookmarkStart w:id="37" w:name="_Toc110858276"/>
       <w:r>
         <w:t xml:space="preserve">Tag 9: </w:t>
       </w:r>
-      <w:bookmarkEnd w:id="38"/>
+      <w:bookmarkEnd w:id="36"/>
       <w:r>
         <w:t>19.08.2022</w:t>
       </w:r>
-      <w:bookmarkEnd w:id="39"/>
+      <w:bookmarkEnd w:id="37"/>
     </w:p>
     <w:tbl>
       <w:tblPr>
@@ -12046,16 +12076,17 @@
       <w:pPr>
         <w:pStyle w:val="berschrift3"/>
       </w:pPr>
-      <w:bookmarkStart w:id="40" w:name="_Toc25148319"/>
-      <w:bookmarkStart w:id="41" w:name="_Toc110858277"/>
+      <w:bookmarkStart w:id="38" w:name="_Toc25148319"/>
+      <w:bookmarkStart w:id="39" w:name="_Toc110858277"/>
       <w:r>
+        <w:lastRenderedPageBreak/>
         <w:t xml:space="preserve">Tag 10: </w:t>
       </w:r>
-      <w:bookmarkEnd w:id="40"/>
+      <w:bookmarkEnd w:id="38"/>
       <w:r>
         <w:t>20.08.2022</w:t>
       </w:r>
-      <w:bookmarkEnd w:id="41"/>
+      <w:bookmarkEnd w:id="39"/>
     </w:p>
     <w:tbl>
       <w:tblPr>
@@ -12167,7 +12198,6 @@
           </w:p>
           <w:p>
             <w:r>
-              <w:lastRenderedPageBreak/>
               <w:t>Aufgabe 2</w:t>
             </w:r>
           </w:p>
@@ -12179,7 +12209,6 @@
           </w:tcPr>
           <w:p>
             <w:r>
-              <w:lastRenderedPageBreak/>
               <w:t>Erreicht</w:t>
             </w:r>
           </w:p>
@@ -12590,29 +12619,29 @@
       <w:pPr>
         <w:pStyle w:val="berschrift1"/>
       </w:pPr>
-      <w:bookmarkStart w:id="42" w:name="_Toc25148320"/>
-      <w:bookmarkStart w:id="43" w:name="_Toc110858278"/>
+      <w:bookmarkStart w:id="40" w:name="_Toc25148320"/>
+      <w:bookmarkStart w:id="41" w:name="_Toc110858278"/>
       <w:r>
         <w:lastRenderedPageBreak/>
         <w:t>Analyse</w:t>
       </w:r>
-      <w:bookmarkEnd w:id="42"/>
-      <w:bookmarkEnd w:id="43"/>
+      <w:bookmarkEnd w:id="40"/>
+      <w:bookmarkEnd w:id="41"/>
     </w:p>
     <w:p>
       <w:pPr>
         <w:pStyle w:val="berschrift2"/>
       </w:pPr>
-      <w:bookmarkStart w:id="44" w:name="_Toc25148321"/>
-      <w:bookmarkStart w:id="45" w:name="_Toc110858279"/>
+      <w:bookmarkStart w:id="42" w:name="_Toc25148321"/>
+      <w:bookmarkStart w:id="43" w:name="_Toc110858279"/>
       <w:r>
         <w:t xml:space="preserve">User </w:t>
       </w:r>
       <w:r>
         <w:t>Stories</w:t>
       </w:r>
-      <w:bookmarkEnd w:id="44"/>
-      <w:bookmarkEnd w:id="45"/>
+      <w:bookmarkEnd w:id="42"/>
+      <w:bookmarkEnd w:id="43"/>
     </w:p>
     <w:p>
       <w:pPr>
@@ -14644,14 +14673,14 @@
       <w:pPr>
         <w:pStyle w:val="berschrift2"/>
       </w:pPr>
-      <w:bookmarkStart w:id="46" w:name="_Toc25148322"/>
-      <w:bookmarkStart w:id="47" w:name="_Toc110858280"/>
+      <w:bookmarkStart w:id="44" w:name="_Toc25148322"/>
+      <w:bookmarkStart w:id="45" w:name="_Toc110858280"/>
       <w:r>
         <w:lastRenderedPageBreak/>
         <w:t>Use Case</w:t>
       </w:r>
-      <w:bookmarkEnd w:id="46"/>
-      <w:bookmarkEnd w:id="47"/>
+      <w:bookmarkEnd w:id="44"/>
+      <w:bookmarkEnd w:id="45"/>
     </w:p>
     <w:p>
       <w:pPr>
@@ -14662,11 +14691,10 @@
         <w:rPr>
           <w:noProof/>
         </w:rPr>
-        <w:lastRenderedPageBreak/>
         <w:drawing>
-          <wp:inline distT="0" distB="0" distL="0" distR="0" wp14:anchorId="14102231" wp14:editId="143290C3">
-            <wp:extent cx="6114415" cy="8237855"/>
-            <wp:effectExtent l="0" t="0" r="635" b="0"/>
+          <wp:inline distT="0" distB="0" distL="0" distR="0" wp14:anchorId="14102231" wp14:editId="70574471">
+            <wp:extent cx="6094149" cy="8210550"/>
+            <wp:effectExtent l="0" t="0" r="1905" b="0"/>
             <wp:docPr id="20" name="Grafik 20"/>
             <wp:cNvGraphicFramePr>
               <a:graphicFrameLocks xmlns:a="http://schemas.openxmlformats.org/drawingml/2006/main" noChangeAspect="1"/>
@@ -14696,7 +14724,7 @@
                   <pic:spPr bwMode="auto">
                     <a:xfrm>
                       <a:off x="0" y="0"/>
-                      <a:ext cx="6114415" cy="8237855"/>
+                      <a:ext cx="6106760" cy="8227541"/>
                     </a:xfrm>
                     <a:prstGeom prst="rect">
                       <a:avLst/>
@@ -14718,6 +14746,7 @@
         <w:pStyle w:val="Beschriftung"/>
       </w:pPr>
       <w:r>
+        <w:lastRenderedPageBreak/>
         <w:t xml:space="preserve">Abbildung </w:t>
       </w:r>
       <w:fldSimple w:instr=" SEQ Abbildung \* ARABIC ">
@@ -14741,25 +14770,25 @@
       <w:pPr>
         <w:pStyle w:val="berschrift2"/>
       </w:pPr>
-      <w:bookmarkStart w:id="48" w:name="_Toc25148323"/>
-      <w:bookmarkStart w:id="49" w:name="_Toc110858281"/>
+      <w:bookmarkStart w:id="46" w:name="_Toc25148323"/>
+      <w:bookmarkStart w:id="47" w:name="_Toc110858281"/>
       <w:r>
         <w:t>Anforderungen</w:t>
       </w:r>
-      <w:bookmarkEnd w:id="48"/>
-      <w:bookmarkEnd w:id="49"/>
+      <w:bookmarkEnd w:id="46"/>
+      <w:bookmarkEnd w:id="47"/>
     </w:p>
     <w:p>
       <w:pPr>
         <w:pStyle w:val="berschrift3"/>
       </w:pPr>
-      <w:bookmarkStart w:id="50" w:name="_Toc25148324"/>
-      <w:bookmarkStart w:id="51" w:name="_Toc110858282"/>
+      <w:bookmarkStart w:id="48" w:name="_Toc25148324"/>
+      <w:bookmarkStart w:id="49" w:name="_Toc110858282"/>
       <w:r>
         <w:t>Funktional</w:t>
       </w:r>
-      <w:bookmarkEnd w:id="50"/>
-      <w:bookmarkEnd w:id="51"/>
+      <w:bookmarkEnd w:id="48"/>
+      <w:bookmarkEnd w:id="49"/>
     </w:p>
     <w:p>
       <w:pPr>
@@ -14989,8 +15018,8 @@
       <w:pPr>
         <w:ind w:firstLine="709"/>
       </w:pPr>
-      <w:bookmarkStart w:id="52" w:name="_Toc25148325"/>
-      <w:bookmarkStart w:id="53" w:name="_Toc110858283"/>
+      <w:bookmarkStart w:id="50" w:name="_Toc25148325"/>
+      <w:bookmarkStart w:id="51" w:name="_Toc110858283"/>
     </w:p>
     <w:tbl>
       <w:tblPr>
@@ -16203,8 +16232,8 @@
       <w:r>
         <w:t>Nicht-Funktional</w:t>
       </w:r>
-      <w:bookmarkEnd w:id="52"/>
-      <w:bookmarkEnd w:id="53"/>
+      <w:bookmarkEnd w:id="50"/>
+      <w:bookmarkEnd w:id="51"/>
     </w:p>
     <w:p>
       <w:pPr>
@@ -16218,25 +16247,25 @@
       <w:pPr>
         <w:pStyle w:val="berschrift2"/>
       </w:pPr>
-      <w:bookmarkStart w:id="54" w:name="_Toc25148326"/>
-      <w:bookmarkStart w:id="55" w:name="_Toc110858284"/>
+      <w:bookmarkStart w:id="52" w:name="_Toc25148326"/>
+      <w:bookmarkStart w:id="53" w:name="_Toc110858284"/>
       <w:r>
         <w:t>Ziele</w:t>
       </w:r>
-      <w:bookmarkEnd w:id="54"/>
-      <w:bookmarkEnd w:id="55"/>
+      <w:bookmarkEnd w:id="52"/>
+      <w:bookmarkEnd w:id="53"/>
     </w:p>
     <w:p>
       <w:pPr>
         <w:pStyle w:val="berschrift3"/>
       </w:pPr>
-      <w:bookmarkStart w:id="56" w:name="_Toc25148327"/>
-      <w:bookmarkStart w:id="57" w:name="_Toc110858285"/>
+      <w:bookmarkStart w:id="54" w:name="_Toc25148327"/>
+      <w:bookmarkStart w:id="55" w:name="_Toc110858285"/>
       <w:r>
         <w:t>Soll-System</w:t>
       </w:r>
-      <w:bookmarkEnd w:id="56"/>
-      <w:bookmarkEnd w:id="57"/>
+      <w:bookmarkEnd w:id="54"/>
+      <w:bookmarkEnd w:id="55"/>
     </w:p>
     <w:p>
       <w:pPr>
@@ -16250,13 +16279,13 @@
       <w:pPr>
         <w:pStyle w:val="berschrift3"/>
       </w:pPr>
-      <w:bookmarkStart w:id="58" w:name="_Toc25148328"/>
-      <w:bookmarkStart w:id="59" w:name="_Toc110858286"/>
+      <w:bookmarkStart w:id="56" w:name="_Toc25148328"/>
+      <w:bookmarkStart w:id="57" w:name="_Toc110858286"/>
       <w:r>
         <w:t>Erforderlich</w:t>
       </w:r>
-      <w:bookmarkEnd w:id="58"/>
-      <w:bookmarkEnd w:id="59"/>
+      <w:bookmarkEnd w:id="56"/>
+      <w:bookmarkEnd w:id="57"/>
     </w:p>
     <w:p>
       <w:pPr>
@@ -16294,13 +16323,13 @@
       <w:pPr>
         <w:pStyle w:val="berschrift3"/>
       </w:pPr>
-      <w:bookmarkStart w:id="60" w:name="_Toc25148329"/>
-      <w:bookmarkStart w:id="61" w:name="_Toc110858287"/>
+      <w:bookmarkStart w:id="58" w:name="_Toc25148329"/>
+      <w:bookmarkStart w:id="59" w:name="_Toc110858287"/>
       <w:r>
         <w:t>Optional</w:t>
       </w:r>
-      <w:bookmarkEnd w:id="60"/>
-      <w:bookmarkEnd w:id="61"/>
+      <w:bookmarkEnd w:id="58"/>
+      <w:bookmarkEnd w:id="59"/>
     </w:p>
     <w:p>
       <w:pPr>
@@ -16315,13 +16344,14 @@
       <w:pPr>
         <w:pStyle w:val="berschrift2"/>
       </w:pPr>
-      <w:bookmarkStart w:id="62" w:name="_Toc25148330"/>
-      <w:bookmarkStart w:id="63" w:name="_Toc110858288"/>
+      <w:bookmarkStart w:id="60" w:name="_Toc25148330"/>
+      <w:bookmarkStart w:id="61" w:name="_Toc110858288"/>
       <w:r>
+        <w:lastRenderedPageBreak/>
         <w:t>Risiken</w:t>
       </w:r>
-      <w:bookmarkEnd w:id="62"/>
-      <w:bookmarkEnd w:id="63"/>
+      <w:bookmarkEnd w:id="60"/>
+      <w:bookmarkEnd w:id="61"/>
     </w:p>
     <w:p>
       <w:pPr>
@@ -16351,7 +16381,6 @@
           </w:tcPr>
           <w:p>
             <w:r>
-              <w:lastRenderedPageBreak/>
               <w:t>Risikotitel</w:t>
             </w:r>
           </w:p>
@@ -16437,13 +16466,13 @@
       <w:pPr>
         <w:pStyle w:val="berschrift2"/>
       </w:pPr>
-      <w:bookmarkStart w:id="64" w:name="_Toc25148331"/>
-      <w:bookmarkStart w:id="65" w:name="_Toc110858289"/>
+      <w:bookmarkStart w:id="62" w:name="_Toc25148331"/>
+      <w:bookmarkStart w:id="63" w:name="_Toc110858289"/>
       <w:r>
         <w:t>Lösungsvarianten</w:t>
       </w:r>
-      <w:bookmarkEnd w:id="64"/>
-      <w:bookmarkEnd w:id="65"/>
+      <w:bookmarkEnd w:id="62"/>
+      <w:bookmarkEnd w:id="63"/>
     </w:p>
     <w:p>
       <w:pPr>
@@ -16457,38 +16486,38 @@
       <w:pPr>
         <w:pStyle w:val="berschrift1"/>
       </w:pPr>
-      <w:bookmarkStart w:id="66" w:name="_Toc25148332"/>
-      <w:bookmarkStart w:id="67" w:name="_Toc110858290"/>
+      <w:bookmarkStart w:id="64" w:name="_Toc25148332"/>
+      <w:bookmarkStart w:id="65" w:name="_Toc110858290"/>
       <w:r>
         <w:lastRenderedPageBreak/>
         <w:t>Entwurf</w:t>
       </w:r>
-      <w:bookmarkEnd w:id="66"/>
-      <w:bookmarkEnd w:id="67"/>
+      <w:bookmarkEnd w:id="64"/>
+      <w:bookmarkEnd w:id="65"/>
     </w:p>
     <w:p>
       <w:pPr>
         <w:pStyle w:val="berschrift2"/>
       </w:pPr>
-      <w:bookmarkStart w:id="68" w:name="_Toc25148333"/>
-      <w:bookmarkStart w:id="69" w:name="_Toc110858291"/>
+      <w:bookmarkStart w:id="66" w:name="_Toc25148333"/>
+      <w:bookmarkStart w:id="67" w:name="_Toc110858291"/>
       <w:r>
         <w:t>Systembeschreibung</w:t>
       </w:r>
-      <w:bookmarkEnd w:id="68"/>
-      <w:bookmarkEnd w:id="69"/>
+      <w:bookmarkEnd w:id="66"/>
+      <w:bookmarkEnd w:id="67"/>
     </w:p>
     <w:p>
       <w:pPr>
         <w:pStyle w:val="berschrift3"/>
       </w:pPr>
-      <w:bookmarkStart w:id="70" w:name="_Toc25148334"/>
-      <w:bookmarkStart w:id="71" w:name="_Toc110858292"/>
+      <w:bookmarkStart w:id="68" w:name="_Toc25148334"/>
+      <w:bookmarkStart w:id="69" w:name="_Toc110858292"/>
       <w:r>
         <w:t>Technologien</w:t>
       </w:r>
-      <w:bookmarkEnd w:id="70"/>
-      <w:bookmarkEnd w:id="71"/>
+      <w:bookmarkEnd w:id="68"/>
+      <w:bookmarkEnd w:id="69"/>
     </w:p>
     <w:p>
       <w:pPr>
@@ -16723,13 +16752,13 @@
       <w:pPr>
         <w:pStyle w:val="berschrift3"/>
       </w:pPr>
-      <w:bookmarkStart w:id="72" w:name="_Toc25148335"/>
-      <w:bookmarkStart w:id="73" w:name="_Toc110858293"/>
+      <w:bookmarkStart w:id="70" w:name="_Toc25148335"/>
+      <w:bookmarkStart w:id="71" w:name="_Toc110858293"/>
       <w:r>
         <w:t>Architektur</w:t>
       </w:r>
-      <w:bookmarkEnd w:id="72"/>
-      <w:bookmarkEnd w:id="73"/>
+      <w:bookmarkEnd w:id="70"/>
+      <w:bookmarkEnd w:id="71"/>
     </w:p>
     <w:p>
       <w:pPr>
@@ -16746,13 +16775,13 @@
       <w:pPr>
         <w:pStyle w:val="berschrift3"/>
       </w:pPr>
-      <w:bookmarkStart w:id="74" w:name="_Toc25148336"/>
-      <w:bookmarkStart w:id="75" w:name="_Toc110858294"/>
+      <w:bookmarkStart w:id="72" w:name="_Toc25148336"/>
+      <w:bookmarkStart w:id="73" w:name="_Toc110858294"/>
       <w:r>
         <w:t>Projektumfeld</w:t>
       </w:r>
-      <w:bookmarkEnd w:id="74"/>
-      <w:bookmarkEnd w:id="75"/>
+      <w:bookmarkEnd w:id="72"/>
+      <w:bookmarkEnd w:id="73"/>
     </w:p>
     <w:p>
       <w:pPr>
@@ -16801,37 +16830,37 @@
       <w:pPr>
         <w:pStyle w:val="berschrift2"/>
       </w:pPr>
-      <w:bookmarkStart w:id="76" w:name="_Toc25148337"/>
-      <w:bookmarkStart w:id="77" w:name="_Toc110858295"/>
+      <w:bookmarkStart w:id="74" w:name="_Toc25148337"/>
+      <w:bookmarkStart w:id="75" w:name="_Toc110858295"/>
       <w:r>
         <w:t>Design</w:t>
       </w:r>
-      <w:bookmarkEnd w:id="76"/>
-      <w:bookmarkEnd w:id="77"/>
+      <w:bookmarkEnd w:id="74"/>
+      <w:bookmarkEnd w:id="75"/>
     </w:p>
     <w:p>
       <w:pPr>
         <w:pStyle w:val="berschrift3"/>
       </w:pPr>
-      <w:bookmarkStart w:id="78" w:name="_Toc25148338"/>
-      <w:bookmarkStart w:id="79" w:name="_Toc110858296"/>
+      <w:bookmarkStart w:id="76" w:name="_Toc25148338"/>
+      <w:bookmarkStart w:id="77" w:name="_Toc110858296"/>
       <w:r>
         <w:t>Activity</w:t>
       </w:r>
-      <w:bookmarkEnd w:id="78"/>
-      <w:bookmarkEnd w:id="79"/>
+      <w:bookmarkEnd w:id="76"/>
+      <w:bookmarkEnd w:id="77"/>
     </w:p>
     <w:p>
       <w:pPr>
         <w:pStyle w:val="berschrift3"/>
       </w:pPr>
-      <w:bookmarkStart w:id="80" w:name="_Toc25148340"/>
-      <w:bookmarkStart w:id="81" w:name="_Toc110858297"/>
+      <w:bookmarkStart w:id="78" w:name="_Toc25148340"/>
+      <w:bookmarkStart w:id="79" w:name="_Toc110858297"/>
       <w:r>
         <w:t>ERM</w:t>
       </w:r>
-      <w:bookmarkEnd w:id="80"/>
-      <w:bookmarkEnd w:id="81"/>
+      <w:bookmarkEnd w:id="78"/>
+      <w:bookmarkEnd w:id="79"/>
     </w:p>
     <w:p>
       <w:r>
@@ -16892,62 +16921,62 @@
       <w:pPr>
         <w:pStyle w:val="berschrift3"/>
       </w:pPr>
-      <w:bookmarkStart w:id="82" w:name="_Toc25148341"/>
-      <w:bookmarkStart w:id="83" w:name="_Toc110858298"/>
+      <w:bookmarkStart w:id="80" w:name="_Toc25148341"/>
+      <w:bookmarkStart w:id="81" w:name="_Toc110858298"/>
       <w:r>
         <w:lastRenderedPageBreak/>
         <w:t>Klassendiagramm</w:t>
       </w:r>
-      <w:bookmarkEnd w:id="82"/>
-      <w:bookmarkEnd w:id="83"/>
+      <w:bookmarkEnd w:id="80"/>
+      <w:bookmarkEnd w:id="81"/>
     </w:p>
     <w:p>
       <w:pPr>
         <w:pStyle w:val="berschrift3"/>
       </w:pPr>
-      <w:bookmarkStart w:id="84" w:name="_Toc25148342"/>
-      <w:bookmarkStart w:id="85" w:name="_Toc110858299"/>
+      <w:bookmarkStart w:id="82" w:name="_Toc25148342"/>
+      <w:bookmarkStart w:id="83" w:name="_Toc110858299"/>
       <w:r>
         <w:t>Mock-Ups</w:t>
       </w:r>
-      <w:bookmarkEnd w:id="84"/>
-      <w:bookmarkEnd w:id="85"/>
+      <w:bookmarkEnd w:id="82"/>
+      <w:bookmarkEnd w:id="83"/>
     </w:p>
     <w:p>
       <w:pPr>
         <w:pStyle w:val="berschrift3"/>
       </w:pPr>
-      <w:bookmarkStart w:id="86" w:name="_Toc25148343"/>
-      <w:bookmarkStart w:id="87" w:name="_Toc110858300"/>
+      <w:bookmarkStart w:id="84" w:name="_Toc25148343"/>
+      <w:bookmarkStart w:id="85" w:name="_Toc110858300"/>
       <w:r>
         <w:t>Struktogramm</w:t>
       </w:r>
-      <w:bookmarkEnd w:id="86"/>
-      <w:bookmarkEnd w:id="87"/>
+      <w:bookmarkEnd w:id="84"/>
+      <w:bookmarkEnd w:id="85"/>
     </w:p>
     <w:p>
       <w:pPr>
         <w:pStyle w:val="berschrift3"/>
       </w:pPr>
-      <w:bookmarkStart w:id="88" w:name="_Toc25148344"/>
-      <w:bookmarkStart w:id="89" w:name="_Toc110858301"/>
+      <w:bookmarkStart w:id="86" w:name="_Toc25148344"/>
+      <w:bookmarkStart w:id="87" w:name="_Toc110858301"/>
       <w:r>
         <w:t>…?</w:t>
       </w:r>
-      <w:bookmarkEnd w:id="88"/>
-      <w:bookmarkEnd w:id="89"/>
+      <w:bookmarkEnd w:id="86"/>
+      <w:bookmarkEnd w:id="87"/>
     </w:p>
     <w:p>
       <w:pPr>
         <w:pStyle w:val="berschrift1"/>
       </w:pPr>
-      <w:bookmarkStart w:id="90" w:name="_Toc110858302"/>
-      <w:bookmarkStart w:id="91" w:name="_Toc25148348"/>
+      <w:bookmarkStart w:id="88" w:name="_Toc110858302"/>
+      <w:bookmarkStart w:id="89" w:name="_Toc25148348"/>
       <w:r>
         <w:lastRenderedPageBreak/>
         <w:t>Entscheiden</w:t>
       </w:r>
-      <w:bookmarkEnd w:id="90"/>
+      <w:bookmarkEnd w:id="88"/>
     </w:p>
     <w:p>
       <w:pPr>
@@ -17035,36 +17064,36 @@
       <w:pPr>
         <w:pStyle w:val="berschrift1"/>
       </w:pPr>
-      <w:bookmarkStart w:id="92" w:name="_Toc110858303"/>
+      <w:bookmarkStart w:id="90" w:name="_Toc110858303"/>
       <w:r>
         <w:lastRenderedPageBreak/>
         <w:t>Realisierung</w:t>
       </w:r>
-      <w:bookmarkEnd w:id="92"/>
+      <w:bookmarkEnd w:id="90"/>
     </w:p>
     <w:p>
       <w:pPr>
         <w:pStyle w:val="berschrift1"/>
       </w:pPr>
-      <w:bookmarkStart w:id="93" w:name="_Toc110858304"/>
+      <w:bookmarkStart w:id="91" w:name="_Toc110858304"/>
       <w:r>
         <w:lastRenderedPageBreak/>
         <w:t>Testplan</w:t>
       </w:r>
+      <w:bookmarkEnd w:id="89"/>
       <w:bookmarkEnd w:id="91"/>
-      <w:bookmarkEnd w:id="93"/>
     </w:p>
     <w:p>
       <w:pPr>
         <w:pStyle w:val="berschrift2"/>
       </w:pPr>
-      <w:bookmarkStart w:id="94" w:name="_Toc25148349"/>
-      <w:bookmarkStart w:id="95" w:name="_Toc110858305"/>
+      <w:bookmarkStart w:id="92" w:name="_Toc25148349"/>
+      <w:bookmarkStart w:id="93" w:name="_Toc110858305"/>
       <w:r>
         <w:t>Testmethode</w:t>
       </w:r>
-      <w:bookmarkEnd w:id="94"/>
-      <w:bookmarkEnd w:id="95"/>
+      <w:bookmarkEnd w:id="92"/>
+      <w:bookmarkEnd w:id="93"/>
     </w:p>
     <w:p>
       <w:pPr>
@@ -17078,13 +17107,13 @@
       <w:pPr>
         <w:pStyle w:val="berschrift2"/>
       </w:pPr>
-      <w:bookmarkStart w:id="96" w:name="_Toc25148350"/>
-      <w:bookmarkStart w:id="97" w:name="_Toc110858306"/>
+      <w:bookmarkStart w:id="94" w:name="_Toc25148350"/>
+      <w:bookmarkStart w:id="95" w:name="_Toc110858306"/>
       <w:r>
         <w:t>Voraussetzungen</w:t>
       </w:r>
-      <w:bookmarkEnd w:id="96"/>
-      <w:bookmarkEnd w:id="97"/>
+      <w:bookmarkEnd w:id="94"/>
+      <w:bookmarkEnd w:id="95"/>
     </w:p>
     <w:tbl>
       <w:tblPr>
@@ -17252,13 +17281,13 @@
       <w:pPr>
         <w:pStyle w:val="berschrift2"/>
       </w:pPr>
-      <w:bookmarkStart w:id="98" w:name="_Toc25148351"/>
-      <w:bookmarkStart w:id="99" w:name="_Toc110858307"/>
+      <w:bookmarkStart w:id="96" w:name="_Toc25148351"/>
+      <w:bookmarkStart w:id="97" w:name="_Toc110858307"/>
       <w:r>
         <w:t>Testfälle</w:t>
       </w:r>
-      <w:bookmarkEnd w:id="98"/>
-      <w:bookmarkEnd w:id="99"/>
+      <w:bookmarkEnd w:id="96"/>
+      <w:bookmarkEnd w:id="97"/>
     </w:p>
     <w:tbl>
       <w:tblPr>
@@ -17513,13 +17542,13 @@
       <w:pPr>
         <w:pStyle w:val="berschrift2"/>
       </w:pPr>
-      <w:bookmarkStart w:id="100" w:name="_Toc25148352"/>
-      <w:bookmarkStart w:id="101" w:name="_Toc110858308"/>
+      <w:bookmarkStart w:id="98" w:name="_Toc25148352"/>
+      <w:bookmarkStart w:id="99" w:name="_Toc110858308"/>
       <w:r>
         <w:t>Testbericht</w:t>
       </w:r>
-      <w:bookmarkEnd w:id="100"/>
-      <w:bookmarkEnd w:id="101"/>
+      <w:bookmarkEnd w:id="98"/>
+      <w:bookmarkEnd w:id="99"/>
     </w:p>
     <w:p>
       <w:pPr>
@@ -17534,26 +17563,26 @@
       <w:pPr>
         <w:pStyle w:val="berschrift1"/>
       </w:pPr>
-      <w:bookmarkStart w:id="102" w:name="_Toc25148353"/>
-      <w:bookmarkStart w:id="103" w:name="_Toc110858309"/>
+      <w:bookmarkStart w:id="100" w:name="_Toc25148353"/>
+      <w:bookmarkStart w:id="101" w:name="_Toc110858309"/>
       <w:r>
         <w:lastRenderedPageBreak/>
         <w:t>Benutzeranleitung</w:t>
       </w:r>
-      <w:bookmarkEnd w:id="102"/>
-      <w:bookmarkEnd w:id="103"/>
+      <w:bookmarkEnd w:id="100"/>
+      <w:bookmarkEnd w:id="101"/>
     </w:p>
     <w:p>
       <w:pPr>
         <w:pStyle w:val="berschrift2"/>
       </w:pPr>
-      <w:bookmarkStart w:id="104" w:name="_Toc25148354"/>
-      <w:bookmarkStart w:id="105" w:name="_Toc110858310"/>
+      <w:bookmarkStart w:id="102" w:name="_Toc25148354"/>
+      <w:bookmarkStart w:id="103" w:name="_Toc110858310"/>
       <w:r>
         <w:t>Systemeinstellungen</w:t>
       </w:r>
-      <w:bookmarkEnd w:id="104"/>
-      <w:bookmarkEnd w:id="105"/>
+      <w:bookmarkEnd w:id="102"/>
+      <w:bookmarkEnd w:id="103"/>
     </w:p>
     <w:p>
       <w:pPr>
@@ -17567,13 +17596,13 @@
       <w:pPr>
         <w:pStyle w:val="berschrift2"/>
       </w:pPr>
-      <w:bookmarkStart w:id="106" w:name="_Toc25148355"/>
-      <w:bookmarkStart w:id="107" w:name="_Toc110858311"/>
+      <w:bookmarkStart w:id="104" w:name="_Toc25148355"/>
+      <w:bookmarkStart w:id="105" w:name="_Toc110858311"/>
       <w:r>
         <w:t>Installationsanleitung</w:t>
       </w:r>
-      <w:bookmarkEnd w:id="106"/>
-      <w:bookmarkEnd w:id="107"/>
+      <w:bookmarkEnd w:id="104"/>
+      <w:bookmarkEnd w:id="105"/>
     </w:p>
     <w:p>
       <w:pPr>
@@ -17587,13 +17616,13 @@
       <w:pPr>
         <w:pStyle w:val="berschrift2"/>
       </w:pPr>
-      <w:bookmarkStart w:id="108" w:name="_Toc25148356"/>
-      <w:bookmarkStart w:id="109" w:name="_Toc110858312"/>
+      <w:bookmarkStart w:id="106" w:name="_Toc25148356"/>
+      <w:bookmarkStart w:id="107" w:name="_Toc110858312"/>
       <w:r>
         <w:t>Bedienungsanleitung</w:t>
       </w:r>
-      <w:bookmarkEnd w:id="108"/>
-      <w:bookmarkEnd w:id="109"/>
+      <w:bookmarkEnd w:id="106"/>
+      <w:bookmarkEnd w:id="107"/>
     </w:p>
     <w:p>
       <w:pPr>
@@ -17608,14 +17637,14 @@
       <w:pPr>
         <w:pStyle w:val="berschrift1"/>
       </w:pPr>
-      <w:bookmarkStart w:id="110" w:name="_Toc25148357"/>
-      <w:bookmarkStart w:id="111" w:name="_Toc110858313"/>
+      <w:bookmarkStart w:id="108" w:name="_Toc25148357"/>
+      <w:bookmarkStart w:id="109" w:name="_Toc110858313"/>
       <w:r>
         <w:lastRenderedPageBreak/>
         <w:t>Probleme</w:t>
       </w:r>
-      <w:bookmarkEnd w:id="110"/>
-      <w:bookmarkEnd w:id="111"/>
+      <w:bookmarkEnd w:id="108"/>
+      <w:bookmarkEnd w:id="109"/>
     </w:p>
     <w:p>
       <w:pPr>
@@ -17634,8 +17663,8 @@
       </w:tblPr>
       <w:tblGrid>
         <w:gridCol w:w="1887"/>
-        <w:gridCol w:w="3640"/>
-        <w:gridCol w:w="3403"/>
+        <w:gridCol w:w="1940"/>
+        <w:gridCol w:w="5103"/>
       </w:tblGrid>
       <w:tr>
         <w:trPr>
@@ -17653,7 +17682,7 @@
         </w:tc>
         <w:tc>
           <w:tcPr>
-            <w:tcW w:w="3640" w:type="dxa"/>
+            <w:tcW w:w="1940" w:type="dxa"/>
           </w:tcPr>
           <w:p>
             <w:pPr>
@@ -17665,14 +17694,11 @@
             <w:r>
               <w:t>Beschreibung</w:t>
             </w:r>
-            <w:r>
-              <w:t>1</w:t>
-            </w:r>
-          </w:p>
-        </w:tc>
-        <w:tc>
-          <w:tcPr>
-            <w:tcW w:w="3403" w:type="dxa"/>
+          </w:p>
+        </w:tc>
+        <w:tc>
+          <w:tcPr>
+            <w:tcW w:w="5103" w:type="dxa"/>
           </w:tcPr>
           <w:p>
             <w:r>
@@ -17697,49 +17723,749 @@
               </w:rPr>
             </w:pPr>
             <w:r>
-              <w:t>Designer</w:t>
-            </w:r>
-            <w:r>
-              <w:t xml:space="preserve"> stützt ab</w:t>
-            </w:r>
-          </w:p>
-        </w:tc>
-        <w:tc>
-          <w:tcPr>
-            <w:tcW w:w="3640" w:type="dxa"/>
-          </w:tcPr>
-          <w:p>
-            <w:r>
-              <w:t>Der Designer für das ERM stützte während der Arbeit direkt nach dem Aufstarten wieder ab.</w:t>
-            </w:r>
-          </w:p>
-        </w:tc>
-        <w:tc>
-          <w:tcPr>
-            <w:tcW w:w="3403" w:type="dxa"/>
-          </w:tcPr>
-          <w:p>
-            <w:r>
-              <w:t>Neuer Designer heruntergeladen.</w:t>
+              <w:rPr>
+                <w:b/>
+                <w:bCs/>
+              </w:rPr>
+              <w:t>Das hochgeladene Bild wird nicht angezeigt</w:t>
+            </w:r>
+          </w:p>
+        </w:tc>
+        <w:tc>
+          <w:tcPr>
+            <w:tcW w:w="1940" w:type="dxa"/>
+          </w:tcPr>
+          <w:p>
+            <w:r>
+              <w:t>Nachdem man als «Owner» oder als «VIP» ein Bild hochladet, wird das hochgeladene Bild auf der Webseite nicht angezeigt.</w:t>
+            </w:r>
+          </w:p>
+        </w:tc>
+        <w:tc>
+          <w:tcPr>
+            <w:tcW w:w="5103" w:type="dxa"/>
+          </w:tcPr>
+          <w:p>
+            <w:r>
+              <w:t>Nachdem ich das Problem zusammen mit Janik Lüthi und danach mit Aurel Wicki versucht habe zu lösen, hat es nicht funktioniert. Wir kamen dem Problem aber etwas näher. Wir haben festgestellt, das i</w:t>
+            </w:r>
+            <w:r>
+              <w:t xml:space="preserve">rgendetwas beim </w:t>
+            </w:r>
+            <w:r>
+              <w:t xml:space="preserve">Hochladen des Bildes zur Datenbank </w:t>
+            </w:r>
+            <w:r>
+              <w:t xml:space="preserve">nicht richtig </w:t>
+            </w:r>
+            <w:r>
+              <w:t>ist.</w:t>
+            </w:r>
+            <w:r>
+              <w:t xml:space="preserve"> Nach einer ganzen Ewigkeit habe ich mich dazu entschieden, dass Bild als Pfad auf der Datenbank zu speichern. Das heisst, dass einfach nur der Pfad des Bildes vom Computer in die Datenbank gespeichert wird.</w:t>
+            </w:r>
+          </w:p>
+          <w:p>
+            <w:r>
+              <w:t>Danach kam Aurel noch einmal zu mir und wir konnten das Problem lösen. Es lag an einem während dem Upload mit hinzugefügten Slash im Image File:</w:t>
+            </w:r>
+          </w:p>
+          <w:p>
+            <w:pPr>
+              <w:shd w:val="clear" w:color="auto" w:fill="1E1E1E"/>
+              <w:spacing w:line="285" w:lineRule="atLeast"/>
+              <w:rPr>
+                <w:rFonts w:ascii="Consolas" w:eastAsia="Times New Roman" w:hAnsi="Consolas" w:cs="Times New Roman"/>
+                <w:color w:val="D4D4D4"/>
+                <w:sz w:val="21"/>
+                <w:szCs w:val="21"/>
+                <w:lang w:val="en-GB" w:eastAsia="de-DE"/>
+              </w:rPr>
+            </w:pPr>
+            <w:r>
+              <w:rPr>
+                <w:rFonts w:ascii="Consolas" w:eastAsia="Times New Roman" w:hAnsi="Consolas" w:cs="Times New Roman"/>
+                <w:color w:val="C586C0"/>
+                <w:sz w:val="21"/>
+                <w:szCs w:val="21"/>
+                <w:lang w:val="en-GB" w:eastAsia="de-DE"/>
+              </w:rPr>
+              <w:t>if</w:t>
+            </w:r>
+            <w:r>
+              <w:rPr>
+                <w:rFonts w:ascii="Consolas" w:eastAsia="Times New Roman" w:hAnsi="Consolas" w:cs="Times New Roman"/>
+                <w:color w:val="D4D4D4"/>
+                <w:sz w:val="21"/>
+                <w:szCs w:val="21"/>
+                <w:lang w:val="en-GB" w:eastAsia="de-DE"/>
+              </w:rPr>
+              <w:t>(</w:t>
+            </w:r>
+            <w:r>
+              <w:rPr>
+                <w:rFonts w:ascii="Consolas" w:eastAsia="Times New Roman" w:hAnsi="Consolas" w:cs="Times New Roman"/>
+                <w:color w:val="DCDCAA"/>
+                <w:sz w:val="21"/>
+                <w:szCs w:val="21"/>
+                <w:lang w:val="en-GB" w:eastAsia="de-DE"/>
+              </w:rPr>
+              <w:t>is_uploaded_file</w:t>
+            </w:r>
+            <w:r>
+              <w:rPr>
+                <w:rFonts w:ascii="Consolas" w:eastAsia="Times New Roman" w:hAnsi="Consolas" w:cs="Times New Roman"/>
+                <w:color w:val="D4D4D4"/>
+                <w:sz w:val="21"/>
+                <w:szCs w:val="21"/>
+                <w:lang w:val="en-GB" w:eastAsia="de-DE"/>
+              </w:rPr>
+              <w:t>(</w:t>
+            </w:r>
+            <w:r>
+              <w:rPr>
+                <w:rFonts w:ascii="Consolas" w:eastAsia="Times New Roman" w:hAnsi="Consolas" w:cs="Times New Roman"/>
+                <w:color w:val="9CDCFE"/>
+                <w:sz w:val="21"/>
+                <w:szCs w:val="21"/>
+                <w:lang w:val="en-GB" w:eastAsia="de-DE"/>
+              </w:rPr>
+              <w:t>$_FILES</w:t>
+            </w:r>
+            <w:r>
+              <w:rPr>
+                <w:rFonts w:ascii="Consolas" w:eastAsia="Times New Roman" w:hAnsi="Consolas" w:cs="Times New Roman"/>
+                <w:color w:val="D4D4D4"/>
+                <w:sz w:val="21"/>
+                <w:szCs w:val="21"/>
+                <w:lang w:val="en-GB" w:eastAsia="de-DE"/>
+              </w:rPr>
+              <w:t>[</w:t>
+            </w:r>
+            <w:r>
+              <w:rPr>
+                <w:rFonts w:ascii="Consolas" w:eastAsia="Times New Roman" w:hAnsi="Consolas" w:cs="Times New Roman"/>
+                <w:color w:val="CE9178"/>
+                <w:sz w:val="21"/>
+                <w:szCs w:val="21"/>
+                <w:lang w:val="en-GB" w:eastAsia="de-DE"/>
+              </w:rPr>
+              <w:t>'filename'</w:t>
+            </w:r>
+            <w:r>
+              <w:rPr>
+                <w:rFonts w:ascii="Consolas" w:eastAsia="Times New Roman" w:hAnsi="Consolas" w:cs="Times New Roman"/>
+                <w:color w:val="D4D4D4"/>
+                <w:sz w:val="21"/>
+                <w:szCs w:val="21"/>
+                <w:lang w:val="en-GB" w:eastAsia="de-DE"/>
+              </w:rPr>
+              <w:t>][</w:t>
+            </w:r>
+            <w:r>
+              <w:rPr>
+                <w:rFonts w:ascii="Consolas" w:eastAsia="Times New Roman" w:hAnsi="Consolas" w:cs="Times New Roman"/>
+                <w:color w:val="CE9178"/>
+                <w:sz w:val="21"/>
+                <w:szCs w:val="21"/>
+                <w:lang w:val="en-GB" w:eastAsia="de-DE"/>
+              </w:rPr>
+              <w:t>'tmp_name'</w:t>
+            </w:r>
+            <w:r>
+              <w:rPr>
+                <w:rFonts w:ascii="Consolas" w:eastAsia="Times New Roman" w:hAnsi="Consolas" w:cs="Times New Roman"/>
+                <w:color w:val="D4D4D4"/>
+                <w:sz w:val="21"/>
+                <w:szCs w:val="21"/>
+                <w:lang w:val="en-GB" w:eastAsia="de-DE"/>
+              </w:rPr>
+              <w:t>])) {</w:t>
+            </w:r>
+          </w:p>
+          <w:p>
+            <w:pPr>
+              <w:shd w:val="clear" w:color="auto" w:fill="1E1E1E"/>
+              <w:spacing w:line="285" w:lineRule="atLeast"/>
+              <w:rPr>
+                <w:rFonts w:ascii="Consolas" w:eastAsia="Times New Roman" w:hAnsi="Consolas" w:cs="Times New Roman"/>
+                <w:color w:val="D4D4D4"/>
+                <w:sz w:val="21"/>
+                <w:szCs w:val="21"/>
+                <w:lang w:val="en-GB" w:eastAsia="de-DE"/>
+              </w:rPr>
+            </w:pPr>
+            <w:r>
+              <w:rPr>
+                <w:rFonts w:ascii="Consolas" w:eastAsia="Times New Roman" w:hAnsi="Consolas" w:cs="Times New Roman"/>
+                <w:color w:val="D4D4D4"/>
+                <w:sz w:val="21"/>
+                <w:szCs w:val="21"/>
+                <w:lang w:val="en-GB" w:eastAsia="de-DE"/>
+              </w:rPr>
+              <w:t xml:space="preserve">                    </w:t>
+            </w:r>
+            <w:r>
+              <w:rPr>
+                <w:rFonts w:ascii="Consolas" w:eastAsia="Times New Roman" w:hAnsi="Consolas" w:cs="Times New Roman"/>
+                <w:color w:val="9CDCFE"/>
+                <w:sz w:val="21"/>
+                <w:szCs w:val="21"/>
+                <w:lang w:val="en-GB" w:eastAsia="de-DE"/>
+              </w:rPr>
+              <w:t>$imgData</w:t>
+            </w:r>
+            <w:r>
+              <w:rPr>
+                <w:rFonts w:ascii="Consolas" w:eastAsia="Times New Roman" w:hAnsi="Consolas" w:cs="Times New Roman"/>
+                <w:color w:val="D4D4D4"/>
+                <w:sz w:val="21"/>
+                <w:szCs w:val="21"/>
+                <w:lang w:val="en-GB" w:eastAsia="de-DE"/>
+              </w:rPr>
+              <w:t xml:space="preserve"> = </w:t>
+            </w:r>
+            <w:r>
+              <w:rPr>
+                <w:rFonts w:ascii="Consolas" w:eastAsia="Times New Roman" w:hAnsi="Consolas" w:cs="Times New Roman"/>
+                <w:color w:val="DCDCAA"/>
+                <w:sz w:val="21"/>
+                <w:szCs w:val="21"/>
+                <w:lang w:val="en-GB" w:eastAsia="de-DE"/>
+              </w:rPr>
+              <w:t>addslashes</w:t>
+            </w:r>
+            <w:r>
+              <w:rPr>
+                <w:rFonts w:ascii="Consolas" w:eastAsia="Times New Roman" w:hAnsi="Consolas" w:cs="Times New Roman"/>
+                <w:color w:val="D4D4D4"/>
+                <w:sz w:val="21"/>
+                <w:szCs w:val="21"/>
+                <w:lang w:val="en-GB" w:eastAsia="de-DE"/>
+              </w:rPr>
+              <w:t>(</w:t>
+            </w:r>
+            <w:r>
+              <w:rPr>
+                <w:rFonts w:ascii="Consolas" w:eastAsia="Times New Roman" w:hAnsi="Consolas" w:cs="Times New Roman"/>
+                <w:color w:val="DCDCAA"/>
+                <w:sz w:val="21"/>
+                <w:szCs w:val="21"/>
+                <w:lang w:val="en-GB" w:eastAsia="de-DE"/>
+              </w:rPr>
+              <w:t>file_get_contents</w:t>
+            </w:r>
+            <w:r>
+              <w:rPr>
+                <w:rFonts w:ascii="Consolas" w:eastAsia="Times New Roman" w:hAnsi="Consolas" w:cs="Times New Roman"/>
+                <w:color w:val="D4D4D4"/>
+                <w:sz w:val="21"/>
+                <w:szCs w:val="21"/>
+                <w:lang w:val="en-GB" w:eastAsia="de-DE"/>
+              </w:rPr>
+              <w:t>(</w:t>
+            </w:r>
+            <w:r>
+              <w:rPr>
+                <w:rFonts w:ascii="Consolas" w:eastAsia="Times New Roman" w:hAnsi="Consolas" w:cs="Times New Roman"/>
+                <w:color w:val="9CDCFE"/>
+                <w:sz w:val="21"/>
+                <w:szCs w:val="21"/>
+                <w:lang w:val="en-GB" w:eastAsia="de-DE"/>
+              </w:rPr>
+              <w:t>$_FILES</w:t>
+            </w:r>
+            <w:r>
+              <w:rPr>
+                <w:rFonts w:ascii="Consolas" w:eastAsia="Times New Roman" w:hAnsi="Consolas" w:cs="Times New Roman"/>
+                <w:color w:val="D4D4D4"/>
+                <w:sz w:val="21"/>
+                <w:szCs w:val="21"/>
+                <w:lang w:val="en-GB" w:eastAsia="de-DE"/>
+              </w:rPr>
+              <w:t>[</w:t>
+            </w:r>
+            <w:r>
+              <w:rPr>
+                <w:rFonts w:ascii="Consolas" w:eastAsia="Times New Roman" w:hAnsi="Consolas" w:cs="Times New Roman"/>
+                <w:color w:val="CE9178"/>
+                <w:sz w:val="21"/>
+                <w:szCs w:val="21"/>
+                <w:lang w:val="en-GB" w:eastAsia="de-DE"/>
+              </w:rPr>
+              <w:t>'filename'</w:t>
+            </w:r>
+            <w:r>
+              <w:rPr>
+                <w:rFonts w:ascii="Consolas" w:eastAsia="Times New Roman" w:hAnsi="Consolas" w:cs="Times New Roman"/>
+                <w:color w:val="D4D4D4"/>
+                <w:sz w:val="21"/>
+                <w:szCs w:val="21"/>
+                <w:lang w:val="en-GB" w:eastAsia="de-DE"/>
+              </w:rPr>
+              <w:t>][</w:t>
+            </w:r>
+            <w:r>
+              <w:rPr>
+                <w:rFonts w:ascii="Consolas" w:eastAsia="Times New Roman" w:hAnsi="Consolas" w:cs="Times New Roman"/>
+                <w:color w:val="CE9178"/>
+                <w:sz w:val="21"/>
+                <w:szCs w:val="21"/>
+                <w:lang w:val="en-GB" w:eastAsia="de-DE"/>
+              </w:rPr>
+              <w:t>'tmp_name'</w:t>
+            </w:r>
+            <w:r>
+              <w:rPr>
+                <w:rFonts w:ascii="Consolas" w:eastAsia="Times New Roman" w:hAnsi="Consolas" w:cs="Times New Roman"/>
+                <w:color w:val="D4D4D4"/>
+                <w:sz w:val="21"/>
+                <w:szCs w:val="21"/>
+                <w:lang w:val="en-GB" w:eastAsia="de-DE"/>
+              </w:rPr>
+              <w:t>]));</w:t>
+            </w:r>
+          </w:p>
+          <w:p>
+            <w:pPr>
+              <w:shd w:val="clear" w:color="auto" w:fill="1E1E1E"/>
+              <w:spacing w:line="285" w:lineRule="atLeast"/>
+              <w:rPr>
+                <w:rFonts w:ascii="Consolas" w:eastAsia="Times New Roman" w:hAnsi="Consolas" w:cs="Times New Roman"/>
+                <w:color w:val="D4D4D4"/>
+                <w:sz w:val="21"/>
+                <w:szCs w:val="21"/>
+                <w:lang w:val="en-GB" w:eastAsia="de-DE"/>
+              </w:rPr>
+            </w:pPr>
+            <w:r>
+              <w:rPr>
+                <w:rFonts w:ascii="Consolas" w:eastAsia="Times New Roman" w:hAnsi="Consolas" w:cs="Times New Roman"/>
+                <w:color w:val="D4D4D4"/>
+                <w:sz w:val="21"/>
+                <w:szCs w:val="21"/>
+                <w:lang w:val="en-GB" w:eastAsia="de-DE"/>
+              </w:rPr>
+              <w:t xml:space="preserve">                    </w:t>
+            </w:r>
+            <w:r>
+              <w:rPr>
+                <w:rFonts w:ascii="Consolas" w:eastAsia="Times New Roman" w:hAnsi="Consolas" w:cs="Times New Roman"/>
+                <w:color w:val="9CDCFE"/>
+                <w:sz w:val="21"/>
+                <w:szCs w:val="21"/>
+                <w:lang w:val="en-GB" w:eastAsia="de-DE"/>
+              </w:rPr>
+              <w:t>$imageProperties</w:t>
+            </w:r>
+            <w:r>
+              <w:rPr>
+                <w:rFonts w:ascii="Consolas" w:eastAsia="Times New Roman" w:hAnsi="Consolas" w:cs="Times New Roman"/>
+                <w:color w:val="D4D4D4"/>
+                <w:sz w:val="21"/>
+                <w:szCs w:val="21"/>
+                <w:lang w:val="en-GB" w:eastAsia="de-DE"/>
+              </w:rPr>
+              <w:t xml:space="preserve"> = </w:t>
+            </w:r>
+            <w:r>
+              <w:rPr>
+                <w:rFonts w:ascii="Consolas" w:eastAsia="Times New Roman" w:hAnsi="Consolas" w:cs="Times New Roman"/>
+                <w:color w:val="DCDCAA"/>
+                <w:sz w:val="21"/>
+                <w:szCs w:val="21"/>
+                <w:lang w:val="en-GB" w:eastAsia="de-DE"/>
+              </w:rPr>
+              <w:t>getimageSize</w:t>
+            </w:r>
+            <w:r>
+              <w:rPr>
+                <w:rFonts w:ascii="Consolas" w:eastAsia="Times New Roman" w:hAnsi="Consolas" w:cs="Times New Roman"/>
+                <w:color w:val="D4D4D4"/>
+                <w:sz w:val="21"/>
+                <w:szCs w:val="21"/>
+                <w:lang w:val="en-GB" w:eastAsia="de-DE"/>
+              </w:rPr>
+              <w:t>(</w:t>
+            </w:r>
+            <w:r>
+              <w:rPr>
+                <w:rFonts w:ascii="Consolas" w:eastAsia="Times New Roman" w:hAnsi="Consolas" w:cs="Times New Roman"/>
+                <w:color w:val="9CDCFE"/>
+                <w:sz w:val="21"/>
+                <w:szCs w:val="21"/>
+                <w:lang w:val="en-GB" w:eastAsia="de-DE"/>
+              </w:rPr>
+              <w:t>$_FILES</w:t>
+            </w:r>
+            <w:r>
+              <w:rPr>
+                <w:rFonts w:ascii="Consolas" w:eastAsia="Times New Roman" w:hAnsi="Consolas" w:cs="Times New Roman"/>
+                <w:color w:val="D4D4D4"/>
+                <w:sz w:val="21"/>
+                <w:szCs w:val="21"/>
+                <w:lang w:val="en-GB" w:eastAsia="de-DE"/>
+              </w:rPr>
+              <w:t>[</w:t>
+            </w:r>
+            <w:r>
+              <w:rPr>
+                <w:rFonts w:ascii="Consolas" w:eastAsia="Times New Roman" w:hAnsi="Consolas" w:cs="Times New Roman"/>
+                <w:color w:val="CE9178"/>
+                <w:sz w:val="21"/>
+                <w:szCs w:val="21"/>
+                <w:lang w:val="en-GB" w:eastAsia="de-DE"/>
+              </w:rPr>
+              <w:t>'filename'</w:t>
+            </w:r>
+            <w:r>
+              <w:rPr>
+                <w:rFonts w:ascii="Consolas" w:eastAsia="Times New Roman" w:hAnsi="Consolas" w:cs="Times New Roman"/>
+                <w:color w:val="D4D4D4"/>
+                <w:sz w:val="21"/>
+                <w:szCs w:val="21"/>
+                <w:lang w:val="en-GB" w:eastAsia="de-DE"/>
+              </w:rPr>
+              <w:t>][</w:t>
+            </w:r>
+            <w:r>
+              <w:rPr>
+                <w:rFonts w:ascii="Consolas" w:eastAsia="Times New Roman" w:hAnsi="Consolas" w:cs="Times New Roman"/>
+                <w:color w:val="CE9178"/>
+                <w:sz w:val="21"/>
+                <w:szCs w:val="21"/>
+                <w:lang w:val="en-GB" w:eastAsia="de-DE"/>
+              </w:rPr>
+              <w:t>'tmp_name'</w:t>
+            </w:r>
+            <w:r>
+              <w:rPr>
+                <w:rFonts w:ascii="Consolas" w:eastAsia="Times New Roman" w:hAnsi="Consolas" w:cs="Times New Roman"/>
+                <w:color w:val="D4D4D4"/>
+                <w:sz w:val="21"/>
+                <w:szCs w:val="21"/>
+                <w:lang w:val="en-GB" w:eastAsia="de-DE"/>
+              </w:rPr>
+              <w:t>]);</w:t>
+            </w:r>
+          </w:p>
+          <w:p>
+            <w:pPr>
+              <w:rPr>
+                <w:lang w:val="de-DE"/>
+              </w:rPr>
+            </w:pPr>
+            <w:r>
+              <w:rPr>
+                <w:lang w:val="de-DE"/>
+              </w:rPr>
+              <w:t>Die “addslashes” Funktion fügt e</w:t>
+            </w:r>
+            <w:r>
+              <w:rPr>
+                <w:lang w:val="de-DE"/>
+              </w:rPr>
+              <w:t>in Slash am Ende hinzu, was zum Fehler geführt hat:</w:t>
+            </w:r>
+          </w:p>
+          <w:p>
+            <w:pPr>
+              <w:rPr>
+                <w:lang w:val="de-DE"/>
+              </w:rPr>
+            </w:pPr>
+          </w:p>
+          <w:p>
+            <w:pPr>
+              <w:shd w:val="clear" w:color="auto" w:fill="1E1E1E"/>
+              <w:spacing w:line="285" w:lineRule="atLeast"/>
+              <w:rPr>
+                <w:rFonts w:ascii="Consolas" w:eastAsia="Times New Roman" w:hAnsi="Consolas" w:cs="Times New Roman"/>
+                <w:color w:val="D4D4D4"/>
+                <w:sz w:val="21"/>
+                <w:szCs w:val="21"/>
+                <w:lang w:val="en-GB" w:eastAsia="de-DE"/>
+              </w:rPr>
+            </w:pPr>
+            <w:r>
+              <w:rPr>
+                <w:rFonts w:ascii="Consolas" w:eastAsia="Times New Roman" w:hAnsi="Consolas" w:cs="Times New Roman"/>
+                <w:color w:val="9CDCFE"/>
+                <w:sz w:val="21"/>
+                <w:szCs w:val="21"/>
+                <w:lang w:val="en-GB" w:eastAsia="de-DE"/>
+              </w:rPr>
+              <w:t>$imgData</w:t>
+            </w:r>
+            <w:r>
+              <w:rPr>
+                <w:rFonts w:ascii="Consolas" w:eastAsia="Times New Roman" w:hAnsi="Consolas" w:cs="Times New Roman"/>
+                <w:color w:val="D4D4D4"/>
+                <w:sz w:val="21"/>
+                <w:szCs w:val="21"/>
+                <w:lang w:val="en-GB" w:eastAsia="de-DE"/>
+              </w:rPr>
+              <w:t xml:space="preserve"> = </w:t>
+            </w:r>
+            <w:r>
+              <w:rPr>
+                <w:rFonts w:ascii="Consolas" w:eastAsia="Times New Roman" w:hAnsi="Consolas" w:cs="Times New Roman"/>
+                <w:color w:val="DCDCAA"/>
+                <w:sz w:val="21"/>
+                <w:szCs w:val="21"/>
+                <w:lang w:val="en-GB" w:eastAsia="de-DE"/>
+              </w:rPr>
+              <w:t>file_get_contents</w:t>
+            </w:r>
+            <w:r>
+              <w:rPr>
+                <w:rFonts w:ascii="Consolas" w:eastAsia="Times New Roman" w:hAnsi="Consolas" w:cs="Times New Roman"/>
+                <w:color w:val="D4D4D4"/>
+                <w:sz w:val="21"/>
+                <w:szCs w:val="21"/>
+                <w:lang w:val="en-GB" w:eastAsia="de-DE"/>
+              </w:rPr>
+              <w:t>(</w:t>
+            </w:r>
+            <w:r>
+              <w:rPr>
+                <w:rFonts w:ascii="Consolas" w:eastAsia="Times New Roman" w:hAnsi="Consolas" w:cs="Times New Roman"/>
+                <w:color w:val="9CDCFE"/>
+                <w:sz w:val="21"/>
+                <w:szCs w:val="21"/>
+                <w:lang w:val="en-GB" w:eastAsia="de-DE"/>
+              </w:rPr>
+              <w:t>$_FILES</w:t>
+            </w:r>
+            <w:r>
+              <w:rPr>
+                <w:rFonts w:ascii="Consolas" w:eastAsia="Times New Roman" w:hAnsi="Consolas" w:cs="Times New Roman"/>
+                <w:color w:val="D4D4D4"/>
+                <w:sz w:val="21"/>
+                <w:szCs w:val="21"/>
+                <w:lang w:val="en-GB" w:eastAsia="de-DE"/>
+              </w:rPr>
+              <w:t>[</w:t>
+            </w:r>
+            <w:r>
+              <w:rPr>
+                <w:rFonts w:ascii="Consolas" w:eastAsia="Times New Roman" w:hAnsi="Consolas" w:cs="Times New Roman"/>
+                <w:color w:val="CE9178"/>
+                <w:sz w:val="21"/>
+                <w:szCs w:val="21"/>
+                <w:lang w:val="en-GB" w:eastAsia="de-DE"/>
+              </w:rPr>
+              <w:t>'filename'</w:t>
+            </w:r>
+            <w:r>
+              <w:rPr>
+                <w:rFonts w:ascii="Consolas" w:eastAsia="Times New Roman" w:hAnsi="Consolas" w:cs="Times New Roman"/>
+                <w:color w:val="D4D4D4"/>
+                <w:sz w:val="21"/>
+                <w:szCs w:val="21"/>
+                <w:lang w:val="en-GB" w:eastAsia="de-DE"/>
+              </w:rPr>
+              <w:t>][</w:t>
+            </w:r>
+            <w:r>
+              <w:rPr>
+                <w:rFonts w:ascii="Consolas" w:eastAsia="Times New Roman" w:hAnsi="Consolas" w:cs="Times New Roman"/>
+                <w:color w:val="CE9178"/>
+                <w:sz w:val="21"/>
+                <w:szCs w:val="21"/>
+                <w:lang w:val="en-GB" w:eastAsia="de-DE"/>
+              </w:rPr>
+              <w:t>'tmp_name'</w:t>
+            </w:r>
+            <w:r>
+              <w:rPr>
+                <w:rFonts w:ascii="Consolas" w:eastAsia="Times New Roman" w:hAnsi="Consolas" w:cs="Times New Roman"/>
+                <w:color w:val="D4D4D4"/>
+                <w:sz w:val="21"/>
+                <w:szCs w:val="21"/>
+                <w:lang w:val="en-GB" w:eastAsia="de-DE"/>
+              </w:rPr>
+              <w:t>]);</w:t>
+            </w:r>
+          </w:p>
+          <w:p>
+            <w:pPr>
+              <w:shd w:val="clear" w:color="auto" w:fill="1E1E1E"/>
+              <w:spacing w:line="285" w:lineRule="atLeast"/>
+              <w:rPr>
+                <w:rFonts w:ascii="Consolas" w:eastAsia="Times New Roman" w:hAnsi="Consolas" w:cs="Times New Roman"/>
+                <w:color w:val="D4D4D4"/>
+                <w:sz w:val="21"/>
+                <w:szCs w:val="21"/>
+                <w:lang w:val="en-GB" w:eastAsia="de-DE"/>
+              </w:rPr>
+            </w:pPr>
+            <w:r>
+              <w:rPr>
+                <w:rFonts w:ascii="Consolas" w:eastAsia="Times New Roman" w:hAnsi="Consolas" w:cs="Times New Roman"/>
+                <w:color w:val="D4D4D4"/>
+                <w:sz w:val="21"/>
+                <w:szCs w:val="21"/>
+                <w:lang w:val="en-GB" w:eastAsia="de-DE"/>
+              </w:rPr>
+              <w:t xml:space="preserve">                    </w:t>
+            </w:r>
+            <w:r>
+              <w:rPr>
+                <w:rFonts w:ascii="Consolas" w:eastAsia="Times New Roman" w:hAnsi="Consolas" w:cs="Times New Roman"/>
+                <w:color w:val="9CDCFE"/>
+                <w:sz w:val="21"/>
+                <w:szCs w:val="21"/>
+                <w:lang w:val="en-GB" w:eastAsia="de-DE"/>
+              </w:rPr>
+              <w:t>$imageProperties</w:t>
+            </w:r>
+            <w:r>
+              <w:rPr>
+                <w:rFonts w:ascii="Consolas" w:eastAsia="Times New Roman" w:hAnsi="Consolas" w:cs="Times New Roman"/>
+                <w:color w:val="D4D4D4"/>
+                <w:sz w:val="21"/>
+                <w:szCs w:val="21"/>
+                <w:lang w:val="en-GB" w:eastAsia="de-DE"/>
+              </w:rPr>
+              <w:t xml:space="preserve"> = </w:t>
+            </w:r>
+            <w:r>
+              <w:rPr>
+                <w:rFonts w:ascii="Consolas" w:eastAsia="Times New Roman" w:hAnsi="Consolas" w:cs="Times New Roman"/>
+                <w:color w:val="DCDCAA"/>
+                <w:sz w:val="21"/>
+                <w:szCs w:val="21"/>
+                <w:lang w:val="en-GB" w:eastAsia="de-DE"/>
+              </w:rPr>
+              <w:t>getimageSize</w:t>
+            </w:r>
+            <w:r>
+              <w:rPr>
+                <w:rFonts w:ascii="Consolas" w:eastAsia="Times New Roman" w:hAnsi="Consolas" w:cs="Times New Roman"/>
+                <w:color w:val="D4D4D4"/>
+                <w:sz w:val="21"/>
+                <w:szCs w:val="21"/>
+                <w:lang w:val="en-GB" w:eastAsia="de-DE"/>
+              </w:rPr>
+              <w:t>(</w:t>
+            </w:r>
+            <w:r>
+              <w:rPr>
+                <w:rFonts w:ascii="Consolas" w:eastAsia="Times New Roman" w:hAnsi="Consolas" w:cs="Times New Roman"/>
+                <w:color w:val="9CDCFE"/>
+                <w:sz w:val="21"/>
+                <w:szCs w:val="21"/>
+                <w:lang w:val="en-GB" w:eastAsia="de-DE"/>
+              </w:rPr>
+              <w:t>$_FILES</w:t>
+            </w:r>
+            <w:r>
+              <w:rPr>
+                <w:rFonts w:ascii="Consolas" w:eastAsia="Times New Roman" w:hAnsi="Consolas" w:cs="Times New Roman"/>
+                <w:color w:val="D4D4D4"/>
+                <w:sz w:val="21"/>
+                <w:szCs w:val="21"/>
+                <w:lang w:val="en-GB" w:eastAsia="de-DE"/>
+              </w:rPr>
+              <w:t>[</w:t>
+            </w:r>
+            <w:r>
+              <w:rPr>
+                <w:rFonts w:ascii="Consolas" w:eastAsia="Times New Roman" w:hAnsi="Consolas" w:cs="Times New Roman"/>
+                <w:color w:val="CE9178"/>
+                <w:sz w:val="21"/>
+                <w:szCs w:val="21"/>
+                <w:lang w:val="en-GB" w:eastAsia="de-DE"/>
+              </w:rPr>
+              <w:t>'filename'</w:t>
+            </w:r>
+            <w:r>
+              <w:rPr>
+                <w:rFonts w:ascii="Consolas" w:eastAsia="Times New Roman" w:hAnsi="Consolas" w:cs="Times New Roman"/>
+                <w:color w:val="D4D4D4"/>
+                <w:sz w:val="21"/>
+                <w:szCs w:val="21"/>
+                <w:lang w:val="en-GB" w:eastAsia="de-DE"/>
+              </w:rPr>
+              <w:t>][</w:t>
+            </w:r>
+            <w:r>
+              <w:rPr>
+                <w:rFonts w:ascii="Consolas" w:eastAsia="Times New Roman" w:hAnsi="Consolas" w:cs="Times New Roman"/>
+                <w:color w:val="CE9178"/>
+                <w:sz w:val="21"/>
+                <w:szCs w:val="21"/>
+                <w:lang w:val="en-GB" w:eastAsia="de-DE"/>
+              </w:rPr>
+              <w:t>'tmp_name'</w:t>
+            </w:r>
+            <w:r>
+              <w:rPr>
+                <w:rFonts w:ascii="Consolas" w:eastAsia="Times New Roman" w:hAnsi="Consolas" w:cs="Times New Roman"/>
+                <w:color w:val="D4D4D4"/>
+                <w:sz w:val="21"/>
+                <w:szCs w:val="21"/>
+                <w:lang w:val="en-GB" w:eastAsia="de-DE"/>
+              </w:rPr>
+              <w:t>]);</w:t>
+            </w:r>
+          </w:p>
+          <w:p>
+            <w:pPr>
+              <w:rPr>
+                <w:lang w:val="en-GB"/>
+              </w:rPr>
+            </w:pPr>
+          </w:p>
+          <w:p>
+            <w:pPr>
+              <w:rPr>
+                <w:lang w:val="de-DE"/>
+              </w:rPr>
+            </w:pPr>
+            <w:r>
+              <w:rPr>
+                <w:lang w:val="de-DE"/>
+              </w:rPr>
+              <w:t>Nachdem man die “addslashes” F</w:t>
+            </w:r>
+            <w:r>
+              <w:rPr>
+                <w:lang w:val="de-DE"/>
+              </w:rPr>
+              <w:t>unktion entfernt, funktioniert es!</w:t>
             </w:r>
           </w:p>
         </w:tc>
       </w:tr>
     </w:tbl>
-    <w:p/>
-    <w:p/>
+    <w:p>
+      <w:pPr>
+        <w:rPr>
+          <w:lang w:val="de-DE"/>
+        </w:rPr>
+      </w:pPr>
+    </w:p>
+    <w:p>
+      <w:pPr>
+        <w:rPr>
+          <w:lang w:val="de-DE"/>
+        </w:rPr>
+      </w:pPr>
+    </w:p>
     <w:p>
       <w:pPr>
         <w:pStyle w:val="berschrift1"/>
       </w:pPr>
-      <w:bookmarkStart w:id="112" w:name="_Toc25148358"/>
-      <w:bookmarkStart w:id="113" w:name="_Toc110858314"/>
+      <w:bookmarkStart w:id="110" w:name="_Toc25148358"/>
+      <w:bookmarkStart w:id="111" w:name="_Toc110858314"/>
       <w:r>
         <w:lastRenderedPageBreak/>
         <w:t>Schlusswort</w:t>
       </w:r>
-      <w:bookmarkEnd w:id="112"/>
-      <w:bookmarkEnd w:id="113"/>
+      <w:bookmarkEnd w:id="110"/>
+      <w:bookmarkEnd w:id="111"/>
     </w:p>
     <w:p>
       <w:pPr>
@@ -17796,23 +18522,23 @@
       <w:pPr>
         <w:pStyle w:val="berschrift1"/>
       </w:pPr>
-      <w:bookmarkStart w:id="114" w:name="_Toc110858315"/>
+      <w:bookmarkStart w:id="112" w:name="_Toc110858315"/>
       <w:r>
         <w:lastRenderedPageBreak/>
         <w:t>Verzeichnisse</w:t>
       </w:r>
-      <w:bookmarkEnd w:id="114"/>
+      <w:bookmarkEnd w:id="112"/>
     </w:p>
     <w:p/>
     <w:p>
       <w:pPr>
         <w:pStyle w:val="berschrift2"/>
       </w:pPr>
-      <w:bookmarkStart w:id="115" w:name="_Toc110858316"/>
+      <w:bookmarkStart w:id="113" w:name="_Toc110858316"/>
       <w:r>
         <w:t>Glossar</w:t>
       </w:r>
-      <w:bookmarkEnd w:id="115"/>
+      <w:bookmarkEnd w:id="113"/>
     </w:p>
     <w:p>
       <w:pPr>
@@ -18018,21 +18744,21 @@
       <w:pPr>
         <w:pStyle w:val="berschrift2"/>
       </w:pPr>
-      <w:bookmarkStart w:id="116" w:name="_Toc110858317"/>
+      <w:bookmarkStart w:id="114" w:name="_Toc110858317"/>
       <w:r>
         <w:t>Quellenverzeichnis</w:t>
       </w:r>
-      <w:bookmarkEnd w:id="116"/>
+      <w:bookmarkEnd w:id="114"/>
     </w:p>
     <w:p>
       <w:pPr>
         <w:pStyle w:val="berschrift3"/>
       </w:pPr>
-      <w:bookmarkStart w:id="117" w:name="_Toc110858318"/>
+      <w:bookmarkStart w:id="115" w:name="_Toc110858318"/>
       <w:r>
         <w:t>Sitzungsprotokolle</w:t>
       </w:r>
-      <w:bookmarkEnd w:id="117"/>
+      <w:bookmarkEnd w:id="115"/>
     </w:p>
     <w:p>
       <w:pPr>
@@ -18046,11 +18772,11 @@
       <w:pPr>
         <w:pStyle w:val="berschrift2"/>
       </w:pPr>
-      <w:bookmarkStart w:id="118" w:name="_Toc110858319"/>
+      <w:bookmarkStart w:id="116" w:name="_Toc110858319"/>
       <w:r>
         <w:t>Bildverzeichnis</w:t>
       </w:r>
-      <w:bookmarkEnd w:id="118"/>
+      <w:bookmarkEnd w:id="116"/>
     </w:p>
     <w:p/>
     <w:p/>
@@ -18089,7 +18815,7 @@
           <w:docGrid w:linePitch="360"/>
         </w:sectPr>
       </w:pPr>
-      <w:bookmarkStart w:id="119" w:name="_Toc25148360"/>
+      <w:bookmarkStart w:id="117" w:name="_Toc25148360"/>
     </w:p>
     <w:p>
       <w:pPr>
@@ -18101,13 +18827,13 @@
         <w:spacing w:after="160" w:line="259" w:lineRule="auto"/>
         <w:ind w:left="709" w:hanging="709"/>
       </w:pPr>
-      <w:bookmarkStart w:id="120" w:name="_Toc110858320"/>
+      <w:bookmarkStart w:id="118" w:name="_Toc110858320"/>
       <w:r>
         <w:lastRenderedPageBreak/>
         <w:t>Anhänge</w:t>
       </w:r>
-      <w:bookmarkEnd w:id="119"/>
-      <w:bookmarkEnd w:id="120"/>
+      <w:bookmarkEnd w:id="117"/>
+      <w:bookmarkEnd w:id="118"/>
     </w:p>
     <w:p/>
     <w:p>
@@ -18305,20 +19031,20 @@
       <w:pPr>
         <w:pStyle w:val="K-Einzug"/>
       </w:pPr>
-      <w:bookmarkStart w:id="121" w:name="_Toc34813925"/>
+      <w:bookmarkStart w:id="119" w:name="_Toc34813925"/>
     </w:p>
     <w:p>
       <w:pPr>
         <w:pStyle w:val="K-Anh2"/>
       </w:pPr>
-      <w:bookmarkStart w:id="122" w:name="_Toc63925768"/>
-      <w:bookmarkStart w:id="123" w:name="_Toc110858321"/>
+      <w:bookmarkStart w:id="120" w:name="_Toc63925768"/>
+      <w:bookmarkStart w:id="121" w:name="_Toc110858321"/>
       <w:r>
         <w:t>Anhang 1: Listings</w:t>
       </w:r>
+      <w:bookmarkEnd w:id="119"/>
+      <w:bookmarkEnd w:id="120"/>
       <w:bookmarkEnd w:id="121"/>
-      <w:bookmarkEnd w:id="122"/>
-      <w:bookmarkEnd w:id="123"/>
     </w:p>
     <w:p>
       <w:pPr>
@@ -18354,18 +19080,18 @@
       <w:pPr>
         <w:pStyle w:val="K-Anh2"/>
       </w:pPr>
-      <w:bookmarkStart w:id="124" w:name="_Toc25148363"/>
-      <w:bookmarkStart w:id="125" w:name="_Toc63925769"/>
-      <w:bookmarkStart w:id="126" w:name="_Toc110858322"/>
+      <w:bookmarkStart w:id="122" w:name="_Toc25148363"/>
+      <w:bookmarkStart w:id="123" w:name="_Toc63925769"/>
+      <w:bookmarkStart w:id="124" w:name="_Toc110858322"/>
       <w:r>
         <w:t>Anhang</w:t>
       </w:r>
       <w:r>
         <w:t xml:space="preserve"> 2: Zusatz-Informationen</w:t>
       </w:r>
+      <w:bookmarkEnd w:id="122"/>
+      <w:bookmarkEnd w:id="123"/>
       <w:bookmarkEnd w:id="124"/>
-      <w:bookmarkEnd w:id="125"/>
-      <w:bookmarkEnd w:id="126"/>
     </w:p>
     <w:p>
       <w:pPr>
@@ -23980,6 +24706,13 @@
     <w:pitch w:val="variable"/>
     <w:sig w:usb0="E0002EFF" w:usb1="C000785B" w:usb2="00000009" w:usb3="00000000" w:csb0="000001FF" w:csb1="00000000"/>
   </w:font>
+  <w:font w:name="Consolas">
+    <w:panose1 w:val="020B0609020204030204"/>
+    <w:charset w:val="00"/>
+    <w:family w:val="modern"/>
+    <w:pitch w:val="fixed"/>
+    <w:sig w:usb0="E00006FF" w:usb1="0000FCFF" w:usb2="00000001" w:usb3="00000000" w:csb0="0000019F" w:csb1="00000000"/>
+  </w:font>
 </w:fonts>
 </file>
 
@@ -24005,7 +24738,6 @@
     <w:rsid w:val="00154DBA"/>
     <w:rsid w:val="00155468"/>
     <w:rsid w:val="00187613"/>
-    <w:rsid w:val="00222806"/>
     <w:rsid w:val="00294465"/>
     <w:rsid w:val="002A790C"/>
     <w:rsid w:val="002C6637"/>
@@ -24023,6 +24755,7 @@
     <w:rsid w:val="00C64852"/>
     <w:rsid w:val="00D01ED4"/>
     <w:rsid w:val="00D55047"/>
+    <w:rsid w:val="00D773A4"/>
     <w:rsid w:val="00D95FBC"/>
     <w:rsid w:val="00E16C82"/>
     <w:rsid w:val="00E44AEE"/>

</xml_diff>

<commit_message>
CSS verbessert, valid bearb, formular bearbeitung
</commit_message>
<xml_diff>
--- a/docs/PA_Fotostudio_Doku.docx
+++ b/docs/PA_Fotostudio_Doku.docx
@@ -6027,14 +6027,24 @@
             </w:r>
           </w:p>
           <w:p>
-            <w:r>
-              <w:t>Luzernstrasse 18</w:t>
-            </w:r>
-          </w:p>
-          <w:p>
-            <w:r>
-              <w:t>6275 Ballwil</w:t>
-            </w:r>
+            <w:proofErr w:type="spellStart"/>
+            <w:r>
+              <w:t>Luzernstrasse</w:t>
+            </w:r>
+            <w:proofErr w:type="spellEnd"/>
+            <w:r>
+              <w:t xml:space="preserve"> 18</w:t>
+            </w:r>
+          </w:p>
+          <w:p>
+            <w:r>
+              <w:t xml:space="preserve">6275 </w:t>
+            </w:r>
+            <w:proofErr w:type="spellStart"/>
+            <w:r>
+              <w:t>Ballwil</w:t>
+            </w:r>
+            <w:proofErr w:type="spellEnd"/>
           </w:p>
           <w:p>
             <w:r>
@@ -6156,11 +6166,19 @@
               </w:sdtPr>
               <w:sdtEndPr/>
               <w:sdtContent>
+                <w:proofErr w:type="spellStart"/>
                 <w:r>
                   <w:rPr>
                     <w:color w:val="FF0000"/>
                   </w:rPr>
-                  <w:t>Luzernstrasse 18</w:t>
+                  <w:t>Luzernstrasse</w:t>
+                </w:r>
+                <w:proofErr w:type="spellEnd"/>
+                <w:r>
+                  <w:rPr>
+                    <w:color w:val="FF0000"/>
+                  </w:rPr>
+                  <w:t xml:space="preserve"> 18</w:t>
                 </w:r>
               </w:sdtContent>
             </w:sdt>
@@ -6287,8 +6305,16 @@
               <w:rPr>
                 <w:color w:val="FF0000"/>
               </w:rPr>
-              <w:t>Ruggiero Pelliccione</w:t>
-            </w:r>
+              <w:t xml:space="preserve">Ruggiero </w:t>
+            </w:r>
+            <w:proofErr w:type="spellStart"/>
+            <w:r>
+              <w:rPr>
+                <w:color w:val="FF0000"/>
+              </w:rPr>
+              <w:t>Pelliccione</w:t>
+            </w:r>
+            <w:proofErr w:type="spellEnd"/>
           </w:p>
           <w:p>
             <w:r>
@@ -6296,14 +6322,24 @@
             </w:r>
           </w:p>
           <w:p>
-            <w:r>
-              <w:t>Luzernstrasse 18</w:t>
-            </w:r>
-          </w:p>
-          <w:p>
-            <w:r>
-              <w:t>6275 Ballwil</w:t>
-            </w:r>
+            <w:proofErr w:type="spellStart"/>
+            <w:r>
+              <w:t>Luzernstrasse</w:t>
+            </w:r>
+            <w:proofErr w:type="spellEnd"/>
+            <w:r>
+              <w:t xml:space="preserve"> 18</w:t>
+            </w:r>
+          </w:p>
+          <w:p>
+            <w:r>
+              <w:t xml:space="preserve">6275 </w:t>
+            </w:r>
+            <w:proofErr w:type="spellStart"/>
+            <w:r>
+              <w:t>Ballwil</w:t>
+            </w:r>
+            <w:proofErr w:type="spellEnd"/>
           </w:p>
           <w:p>
             <w:pPr>
@@ -6378,8 +6414,13 @@
           </w:p>
           <w:p>
             <w:r>
-              <w:t>6275 Ballwil</w:t>
-            </w:r>
+              <w:t xml:space="preserve">6275 </w:t>
+            </w:r>
+            <w:proofErr w:type="spellStart"/>
+            <w:r>
+              <w:t>Ballwil</w:t>
+            </w:r>
+            <w:proofErr w:type="spellEnd"/>
           </w:p>
           <w:p>
             <w:pPr>
@@ -6519,7 +6560,15 @@
       </w:pPr>
       <w:bookmarkStart w:id="9" w:name="_Hlk24373257"/>
       <w:r>
-        <w:t>Ein Fotograf möchte für sein Studio und auch privat eine WebApp, um all seine Bilder zu speichern und verwalten zu können. Auf der Webseite kann man, wenn man angemeldet ist, neue Bilder hochladen, die dann gespeichert werden. Zu jedem Bild können noch folgende Informationen erfasst werden: Titel, optionale Beschreibung, Datum, Ort und ob das Bild öffentlich einsehbar sein sollte. Denn neue Einträge kann man nur erfassen, wenn man angemeldet ist. Auch sieht man nur alle Bilder in der Datenbank, wenn man angemeldet ist. Denn private Fotos sollen nicht öffentlich einsehbar sein. Wenn man nicht angemeldet ist, sieht man einfach auf der Startseite die Galerie mit den öffentlichen Bildern. In der Applikation soll es möglich sein, alle Benutzer zu verwalten und auch welche neu hinzuzufügen. Dazu soll die ganze Webseite responsiv sein und mit allen Bildgrössen klarkommen.</w:t>
+        <w:t xml:space="preserve">Ein Fotograf möchte für sein Studio und auch privat eine </w:t>
+      </w:r>
+      <w:proofErr w:type="spellStart"/>
+      <w:r>
+        <w:t>WebApp</w:t>
+      </w:r>
+      <w:proofErr w:type="spellEnd"/>
+      <w:r>
+        <w:t>, um all seine Bilder zu speichern und verwalten zu können. Auf der Webseite kann man, wenn man angemeldet ist, neue Bilder hochladen, die dann gespeichert werden. Zu jedem Bild können noch folgende Informationen erfasst werden: Titel, optionale Beschreibung, Datum, Ort und ob das Bild öffentlich einsehbar sein sollte. Denn neue Einträge kann man nur erfassen, wenn man angemeldet ist. Auch sieht man nur alle Bilder in der Datenbank, wenn man angemeldet ist. Denn private Fotos sollen nicht öffentlich einsehbar sein. Wenn man nicht angemeldet ist, sieht man einfach auf der Startseite die Galerie mit den öffentlichen Bildern. In der Applikation soll es möglich sein, alle Benutzer zu verwalten und auch welche neu hinzuzufügen. Dazu soll die ganze Webseite responsiv sein und mit allen Bildgrössen klarkommen.</w:t>
       </w:r>
     </w:p>
     <w:p>
@@ -6532,11 +6581,24 @@
         <w:pStyle w:val="K-Einzug"/>
       </w:pPr>
       <w:r>
-        <w:t>Für die Aufgabe muss ein privates Repo im internen Gitea erstellt werden. Der Name des Repos ist zwingen “MPA_</w:t>
+        <w:t xml:space="preserve">Für die Aufgabe muss ein privates Repo im internen </w:t>
+      </w:r>
+      <w:proofErr w:type="spellStart"/>
+      <w:r>
+        <w:t>Gitea</w:t>
+      </w:r>
+      <w:proofErr w:type="spellEnd"/>
+      <w:r>
+        <w:t xml:space="preserve"> erstellt werden. Der Name des Repos ist zwingen “</w:t>
+      </w:r>
+      <w:proofErr w:type="spellStart"/>
+      <w:r>
+        <w:t>MPA_</w:t>
       </w:r>
       <w:r>
         <w:t>Fotogalerie</w:t>
       </w:r>
+      <w:proofErr w:type="spellEnd"/>
       <w:r>
         <w:t>”.</w:t>
       </w:r>
@@ -6556,13 +6618,29 @@
         <w:ind w:left="709"/>
       </w:pPr>
       <w:r>
-        <w:t>Es soll eine Applikation geschaffen werden, in welchem ein Photograph seine Bilder hochlädt. Der Photograph ist der «Owner», also hat diese Rolle und soll auch Benutzer hinzufügen</w:t>
+        <w:t>Es soll eine Applikation geschaffen werden, in welchem ein Photograph seine Bilder hochlädt. Der Photograph ist der «</w:t>
+      </w:r>
+      <w:proofErr w:type="spellStart"/>
+      <w:r>
+        <w:t>Owner</w:t>
+      </w:r>
+      <w:proofErr w:type="spellEnd"/>
+      <w:r>
+        <w:t>», also hat diese Rolle und soll auch Benutzer hinzufügen</w:t>
       </w:r>
       <w:r>
         <w:t>, bearbeiten und löschen</w:t>
       </w:r>
       <w:r>
-        <w:t xml:space="preserve"> können mit der Rolle «VIP», die ebenfalls Bilder hochladen können und alles sehen können, nur nicht Benutzer verwalten. Dies soll nur der «Owner» können. Normale </w:t>
+        <w:t xml:space="preserve"> können mit der Rolle «VIP», die ebenfalls Bilder hochladen können und alles sehen können, nur nicht Benutzer verwalten. Dies soll nur der «</w:t>
+      </w:r>
+      <w:proofErr w:type="spellStart"/>
+      <w:r>
+        <w:t>Owner</w:t>
+      </w:r>
+      <w:proofErr w:type="spellEnd"/>
+      <w:r>
+        <w:t xml:space="preserve">» können. Normale </w:t>
       </w:r>
       <w:r>
         <w:t>Benutzer,</w:t>
@@ -6594,7 +6672,15 @@
         <w:ind w:left="709"/>
       </w:pPr>
       <w:r>
-        <w:t xml:space="preserve">Bei der Benutzerverwaltung sollen alle Benutzer angezeigt werden, die vom «Owner» hinzugefügt wurden. Dort soll man die Benutzer ID, Benutzernamen, </w:t>
+        <w:t>Bei der Benutzerverwaltung sollen alle Benutzer angezeigt werden, die vom «</w:t>
+      </w:r>
+      <w:proofErr w:type="spellStart"/>
+      <w:r>
+        <w:t>Owner</w:t>
+      </w:r>
+      <w:proofErr w:type="spellEnd"/>
+      <w:r>
+        <w:t xml:space="preserve">» hinzugefügt wurden. Dort soll man die Benutzer ID, Benutzernamen, </w:t>
       </w:r>
       <w:r>
         <w:t>E-Mail-Adresse</w:t>
@@ -6613,13 +6699,37 @@
         <w:ind w:left="709"/>
       </w:pPr>
       <w:r>
-        <w:t xml:space="preserve">Damit sich der «Owner» oder der «VIP» auf der Applikation ihre Rechte ergattern können, müssen sie sich einloggen. Im Login soll man die </w:t>
+        <w:t>Damit sich der «</w:t>
+      </w:r>
+      <w:proofErr w:type="spellStart"/>
+      <w:r>
+        <w:t>Owner</w:t>
+      </w:r>
+      <w:proofErr w:type="spellEnd"/>
+      <w:r>
+        <w:t xml:space="preserve">» oder der «VIP» auf der Applikation ihre Rechte ergattern können, müssen sie sich einloggen. Im Login soll man die </w:t>
       </w:r>
       <w:r>
         <w:t>E-Mail-Adresse</w:t>
       </w:r>
       <w:r>
-        <w:t xml:space="preserve"> und das Passwort eingeben. Die Passwörter entscheidet der «Owner» für beide Seiten selbst. Respektive wenn der «Owner» einen Benutzer als «VIP» in der Benutzerverwaltung hinzufügt, entscheidet er welches Passwort er hat.</w:t>
+        <w:t xml:space="preserve"> und das Passwort eingeben. Die Passwörter entscheidet der «</w:t>
+      </w:r>
+      <w:proofErr w:type="spellStart"/>
+      <w:r>
+        <w:t>Owner</w:t>
+      </w:r>
+      <w:proofErr w:type="spellEnd"/>
+      <w:r>
+        <w:t>» für beide Seiten selbst. Respektive wenn der «</w:t>
+      </w:r>
+      <w:proofErr w:type="spellStart"/>
+      <w:r>
+        <w:t>Owner</w:t>
+      </w:r>
+      <w:proofErr w:type="spellEnd"/>
+      <w:r>
+        <w:t>» einen Benutzer als «VIP» in der Benutzerverwaltung hinzufügt, entscheidet er welches Passwort er hat.</w:t>
       </w:r>
     </w:p>
     <w:p>
@@ -8685,7 +8795,13 @@
           </w:tcPr>
           <w:p>
             <w:r>
-              <w:t>Ich habe heute Hilfe von Janik Lüthi und von Aurel Wichi beansprucht.</w:t>
+              <w:t>Ich habe heute Hilfe von Janik Lüthi und von Aurel Wic</w:t>
+            </w:r>
+            <w:r>
+              <w:t>k</w:t>
+            </w:r>
+            <w:r>
+              <w:t>i beansprucht.</w:t>
             </w:r>
           </w:p>
         </w:tc>
@@ -8943,11 +9059,22 @@
             <w:r>
               <w:t>Aufgabe 1</w:t>
             </w:r>
+            <w:r>
+              <w:t>: Benutzer hinzufügen, bearbeiten und löschen</w:t>
+            </w:r>
           </w:p>
           <w:p>
             <w:r>
               <w:t>Aufgabe 2</w:t>
             </w:r>
+            <w:r>
+              <w:t xml:space="preserve">: Zeitplan </w:t>
+            </w:r>
+            <w:proofErr w:type="spellStart"/>
+            <w:r>
+              <w:t>aktualisierenex</w:t>
+            </w:r>
+            <w:proofErr w:type="spellEnd"/>
           </w:p>
         </w:tc>
         <w:tc>
@@ -9151,7 +9278,11 @@
               </w:rPr>
             </w:pPr>
             <w:r>
-              <w:t>Text…</w:t>
+              <w:rPr>
+                <w:b/>
+                <w:bCs/>
+              </w:rPr>
+              <w:t>Nach langer Zeit habe ich es endlich geschafft, das Feature hinzuzufügen, um Benutzer hinzuzufügen, bearbeiten und zu löschen.</w:t>
             </w:r>
           </w:p>
         </w:tc>
@@ -10841,7 +10972,6 @@
               <w:rPr>
                 <w:b/>
               </w:rPr>
-              <w:lastRenderedPageBreak/>
               <w:t>Erfolgreiche oder erfolglose Tests</w:t>
             </w:r>
           </w:p>
@@ -12670,7 +12800,15 @@
         <w:t xml:space="preserve">Nachfolgend werden die User Storys für </w:t>
       </w:r>
       <w:r>
-        <w:t>die Rolle «Owner»</w:t>
+        <w:t>die Rolle «</w:t>
+      </w:r>
+      <w:proofErr w:type="spellStart"/>
+      <w:r>
+        <w:t>Owner</w:t>
+      </w:r>
+      <w:proofErr w:type="spellEnd"/>
+      <w:r>
+        <w:t>»</w:t>
       </w:r>
       <w:r>
         <w:t xml:space="preserve"> aufgeführt:</w:t>
@@ -12775,7 +12913,15 @@
               <w:ind w:left="0"/>
             </w:pPr>
             <w:r>
-              <w:t>Als Benutzer mit der Rolle «Owner» kann ich Bilder hochladen, damit ich sie auf der Webseite anzeigen kann.</w:t>
+              <w:t>Als Benutzer mit der Rolle «</w:t>
+            </w:r>
+            <w:proofErr w:type="spellStart"/>
+            <w:r>
+              <w:t>Owner</w:t>
+            </w:r>
+            <w:proofErr w:type="spellEnd"/>
+            <w:r>
+              <w:t>» kann ich Bilder hochladen, damit ich sie auf der Webseite anzeigen kann.</w:t>
             </w:r>
           </w:p>
         </w:tc>
@@ -12951,7 +13097,15 @@
               <w:t>Als Benutzer</w:t>
             </w:r>
             <w:r>
-              <w:t xml:space="preserve"> mit der Rolle «Owner»</w:t>
+              <w:t xml:space="preserve"> mit der Rolle «</w:t>
+            </w:r>
+            <w:proofErr w:type="spellStart"/>
+            <w:r>
+              <w:t>Owner</w:t>
+            </w:r>
+            <w:proofErr w:type="spellEnd"/>
+            <w:r>
+              <w:t>»</w:t>
             </w:r>
             <w:r>
               <w:t xml:space="preserve"> kann ich</w:t>
@@ -13136,7 +13290,15 @@
               <w:ind w:left="0"/>
             </w:pPr>
             <w:r>
-              <w:t xml:space="preserve">Als Benutzer mit der Rolle «Owner» kann ich hinzugefügte Bilder </w:t>
+              <w:t>Als Benutzer mit der Rolle «</w:t>
+            </w:r>
+            <w:proofErr w:type="spellStart"/>
+            <w:r>
+              <w:t>Owner</w:t>
+            </w:r>
+            <w:proofErr w:type="spellEnd"/>
+            <w:r>
+              <w:t xml:space="preserve">» kann ich hinzugefügte Bilder </w:t>
             </w:r>
             <w:r>
               <w:t>löschen</w:t>
@@ -13327,7 +13489,15 @@
               <w:ind w:left="0"/>
             </w:pPr>
             <w:r>
-              <w:t xml:space="preserve">Als Benutzer mit der Rolle «Owner» kann ich </w:t>
+              <w:t>Als Benutzer mit der Rolle «</w:t>
+            </w:r>
+            <w:proofErr w:type="spellStart"/>
+            <w:r>
+              <w:t>Owner</w:t>
+            </w:r>
+            <w:proofErr w:type="spellEnd"/>
+            <w:r>
+              <w:t xml:space="preserve">» kann ich </w:t>
             </w:r>
             <w:r>
               <w:t>VIP-</w:t>
@@ -13521,7 +13691,15 @@
               <w:ind w:left="0"/>
             </w:pPr>
             <w:r>
-              <w:t xml:space="preserve">Als Benutzer mit der Rolle «Owner» kann ich </w:t>
+              <w:t>Als Benutzer mit der Rolle «</w:t>
+            </w:r>
+            <w:proofErr w:type="spellStart"/>
+            <w:r>
+              <w:t>Owner</w:t>
+            </w:r>
+            <w:proofErr w:type="spellEnd"/>
+            <w:r>
+              <w:t xml:space="preserve">» kann ich </w:t>
             </w:r>
             <w:r>
               <w:t>VIP-</w:t>
@@ -13700,7 +13878,15 @@
               <w:ind w:left="0"/>
             </w:pPr>
             <w:r>
-              <w:t>Als Benutzer mit der Rolle «Owner» kann ich VIP-Benutzer löschen, damit der Fotograph ihre Daten löschen kann.</w:t>
+              <w:t>Als Benutzer mit der Rolle «</w:t>
+            </w:r>
+            <w:proofErr w:type="spellStart"/>
+            <w:r>
+              <w:t>Owner</w:t>
+            </w:r>
+            <w:proofErr w:type="spellEnd"/>
+            <w:r>
+              <w:t>» kann ich VIP-Benutzer löschen, damit der Fotograph ihre Daten löschen kann.</w:t>
             </w:r>
           </w:p>
         </w:tc>
@@ -13877,7 +14063,15 @@
               <w:ind w:left="0"/>
             </w:pPr>
             <w:r>
-              <w:t xml:space="preserve">Als Benutzer mit der Rolle «Owner» kann </w:t>
+              <w:t>Als Benutzer mit der Rolle «</w:t>
+            </w:r>
+            <w:proofErr w:type="spellStart"/>
+            <w:r>
+              <w:t>Owner</w:t>
+            </w:r>
+            <w:proofErr w:type="spellEnd"/>
+            <w:r>
+              <w:t xml:space="preserve">» kann </w:t>
             </w:r>
             <w:r>
               <w:t>man sich einloggen</w:t>
@@ -14749,17 +14943,35 @@
         <w:lastRenderedPageBreak/>
         <w:t xml:space="preserve">Abbildung </w:t>
       </w:r>
-      <w:fldSimple w:instr=" SEQ Abbildung \* ARABIC ">
-        <w:r>
-          <w:rPr>
-            <w:noProof/>
-          </w:rPr>
-          <w:t>1</w:t>
-        </w:r>
-      </w:fldSimple>
-      <w:r>
-        <w:t>: Use Case Diagram</w:t>
-      </w:r>
+      <w:r>
+        <w:fldChar w:fldCharType="begin"/>
+      </w:r>
+      <w:r>
+        <w:instrText xml:space="preserve"> SEQ Abbildung \* ARABIC </w:instrText>
+      </w:r>
+      <w:r>
+        <w:fldChar w:fldCharType="separate"/>
+      </w:r>
+      <w:r>
+        <w:rPr>
+          <w:noProof/>
+        </w:rPr>
+        <w:t>1</w:t>
+      </w:r>
+      <w:r>
+        <w:rPr>
+          <w:noProof/>
+        </w:rPr>
+        <w:fldChar w:fldCharType="end"/>
+      </w:r>
+      <w:r>
+        <w:t xml:space="preserve">: Use Case </w:t>
+      </w:r>
+      <w:proofErr w:type="spellStart"/>
+      <w:r>
+        <w:t>Diagram</w:t>
+      </w:r>
+      <w:proofErr w:type="spellEnd"/>
     </w:p>
     <w:p>
       <w:pPr>
@@ -14875,7 +15087,15 @@
           </w:tcPr>
           <w:p>
             <w:r>
-              <w:t>Benutzer mit Rolle «Owner» und Rolle «VIP»</w:t>
+              <w:t>Benutzer mit Rolle «</w:t>
+            </w:r>
+            <w:proofErr w:type="spellStart"/>
+            <w:r>
+              <w:t>Owner</w:t>
+            </w:r>
+            <w:proofErr w:type="spellEnd"/>
+            <w:r>
+              <w:t>» und Rolle «VIP»</w:t>
             </w:r>
           </w:p>
         </w:tc>
@@ -15076,10 +15296,7 @@
           </w:tcPr>
           <w:p>
             <w:r>
-              <w:t xml:space="preserve">Bilder </w:t>
-            </w:r>
-            <w:r>
-              <w:t>bearbeiten</w:t>
+              <w:t>Bilder bearbeiten</w:t>
             </w:r>
           </w:p>
         </w:tc>
@@ -15101,7 +15318,15 @@
           </w:tcPr>
           <w:p>
             <w:r>
-              <w:t>Benutzer mit Rolle «Owner» und Rolle «VIP»</w:t>
+              <w:t>Benutzer mit Rolle «</w:t>
+            </w:r>
+            <w:proofErr w:type="spellStart"/>
+            <w:r>
+              <w:t>Owner</w:t>
+            </w:r>
+            <w:proofErr w:type="spellEnd"/>
+            <w:r>
+              <w:t>» und Rolle «VIP»</w:t>
             </w:r>
           </w:p>
         </w:tc>
@@ -15148,19 +15373,7 @@
           </w:tcPr>
           <w:p>
             <w:r>
-              <w:t xml:space="preserve">Ein Bild mit den dazugehörigen Details wird </w:t>
-            </w:r>
-            <w:r>
-              <w:t>im</w:t>
-            </w:r>
-            <w:r>
-              <w:t xml:space="preserve"> Inventar </w:t>
-            </w:r>
-            <w:r>
-              <w:t>bearbeitet</w:t>
-            </w:r>
-            <w:r>
-              <w:t>.</w:t>
+              <w:t>Ein Bild mit den dazugehörigen Details wird im Inventar bearbeitet.</w:t>
             </w:r>
           </w:p>
         </w:tc>
@@ -15185,13 +15398,7 @@
           </w:tcPr>
           <w:p>
             <w:r>
-              <w:t xml:space="preserve">Das Bild wird auf der Webseite </w:t>
-            </w:r>
-            <w:r>
-              <w:t>aktualisiert</w:t>
-            </w:r>
-            <w:r>
-              <w:t>.</w:t>
+              <w:t>Das Bild wird auf der Webseite aktualisiert.</w:t>
             </w:r>
           </w:p>
         </w:tc>
@@ -15318,10 +15525,7 @@
           </w:tcPr>
           <w:p>
             <w:r>
-              <w:t xml:space="preserve">Bilder </w:t>
-            </w:r>
-            <w:r>
-              <w:t>löschen</w:t>
+              <w:t>Bilder löschen</w:t>
             </w:r>
           </w:p>
         </w:tc>
@@ -15343,7 +15547,15 @@
           </w:tcPr>
           <w:p>
             <w:r>
-              <w:t>Benutzer mit Rolle «Owner» und Rolle «VIP»</w:t>
+              <w:t>Benutzer mit Rolle «</w:t>
+            </w:r>
+            <w:proofErr w:type="spellStart"/>
+            <w:r>
+              <w:t>Owner</w:t>
+            </w:r>
+            <w:proofErr w:type="spellEnd"/>
+            <w:r>
+              <w:t>» und Rolle «VIP»</w:t>
             </w:r>
           </w:p>
         </w:tc>
@@ -15390,19 +15602,7 @@
           </w:tcPr>
           <w:p>
             <w:r>
-              <w:t xml:space="preserve">Ein Bild mit den dazugehörigen Details wird </w:t>
-            </w:r>
-            <w:r>
-              <w:t xml:space="preserve">vom </w:t>
-            </w:r>
-            <w:r>
-              <w:t xml:space="preserve">Inventar </w:t>
-            </w:r>
-            <w:r>
-              <w:t>gelöscht</w:t>
-            </w:r>
-            <w:r>
-              <w:t>.</w:t>
+              <w:t>Ein Bild mit den dazugehörigen Details wird vom Inventar gelöscht.</w:t>
             </w:r>
           </w:p>
         </w:tc>
@@ -15427,13 +15627,7 @@
           </w:tcPr>
           <w:p>
             <w:r>
-              <w:t xml:space="preserve">Das Bild wird auf der Webseite </w:t>
-            </w:r>
-            <w:r>
-              <w:t>nicht mehr angezeigt</w:t>
-            </w:r>
-            <w:r>
-              <w:t>.</w:t>
+              <w:t>Das Bild wird auf der Webseite nicht mehr angezeigt.</w:t>
             </w:r>
           </w:p>
         </w:tc>
@@ -15582,7 +15776,15 @@
           </w:tcPr>
           <w:p>
             <w:r>
-              <w:t>Benutzer mit Rolle «Owner»</w:t>
+              <w:t>Benutzer mit Rolle «</w:t>
+            </w:r>
+            <w:proofErr w:type="spellStart"/>
+            <w:r>
+              <w:t>Owner</w:t>
+            </w:r>
+            <w:proofErr w:type="spellEnd"/>
+            <w:r>
+              <w:t>»</w:t>
             </w:r>
           </w:p>
         </w:tc>
@@ -15796,10 +15998,7 @@
           </w:tcPr>
           <w:p>
             <w:r>
-              <w:t xml:space="preserve">Benutzer </w:t>
-            </w:r>
-            <w:r>
-              <w:t>bearbeiten</w:t>
+              <w:t>Benutzer bearbeiten</w:t>
             </w:r>
           </w:p>
         </w:tc>
@@ -15821,7 +16020,15 @@
           </w:tcPr>
           <w:p>
             <w:r>
-              <w:t>Benutzer mit Rolle «Owner»</w:t>
+              <w:t>Benutzer mit Rolle «</w:t>
+            </w:r>
+            <w:proofErr w:type="spellStart"/>
+            <w:r>
+              <w:t>Owner</w:t>
+            </w:r>
+            <w:proofErr w:type="spellEnd"/>
+            <w:r>
+              <w:t>»</w:t>
             </w:r>
           </w:p>
         </w:tc>
@@ -15846,10 +16053,15 @@
           </w:tcPr>
           <w:p>
             <w:r>
-              <w:t>Ein Benutzer mit der Rolle «VIP» und ein «Owner» müssen</w:t>
-            </w:r>
-            <w:r>
-              <w:t xml:space="preserve"> schon im System erfasst sein.</w:t>
+              <w:t>Ein Benutzer mit der Rolle «VIP» und ein «</w:t>
+            </w:r>
+            <w:proofErr w:type="spellStart"/>
+            <w:r>
+              <w:t>Owner</w:t>
+            </w:r>
+            <w:proofErr w:type="spellEnd"/>
+            <w:r>
+              <w:t>» müssen schon im System erfasst sein.</w:t>
             </w:r>
           </w:p>
         </w:tc>
@@ -15871,13 +16083,7 @@
           </w:tcPr>
           <w:p>
             <w:r>
-              <w:t xml:space="preserve">Ein Benutzer mit den dazugehörigen Details wird im Inventar </w:t>
-            </w:r>
-            <w:r>
-              <w:t>bearbeitet</w:t>
-            </w:r>
-            <w:r>
-              <w:t>.</w:t>
+              <w:t>Ein Benutzer mit den dazugehörigen Details wird im Inventar bearbeitet.</w:t>
             </w:r>
           </w:p>
         </w:tc>
@@ -15902,13 +16108,7 @@
           </w:tcPr>
           <w:p>
             <w:r>
-              <w:t xml:space="preserve">Der Benutzer wird auf der Webseite in der Benutzerverwaltung </w:t>
-            </w:r>
-            <w:r>
-              <w:t>aktualisiert</w:t>
-            </w:r>
-            <w:r>
-              <w:t>.</w:t>
+              <w:t>Der Benutzer wird auf der Webseite in der Benutzerverwaltung aktualisiert.</w:t>
             </w:r>
           </w:p>
         </w:tc>
@@ -16035,10 +16235,7 @@
           </w:tcPr>
           <w:p>
             <w:r>
-              <w:t xml:space="preserve">Benutzer </w:t>
-            </w:r>
-            <w:r>
-              <w:t>löschen</w:t>
+              <w:t>Benutzer löschen</w:t>
             </w:r>
           </w:p>
         </w:tc>
@@ -16060,7 +16257,15 @@
           </w:tcPr>
           <w:p>
             <w:r>
-              <w:t>Benutzer mit Rolle «Owner»</w:t>
+              <w:t>Benutzer mit Rolle «</w:t>
+            </w:r>
+            <w:proofErr w:type="spellStart"/>
+            <w:r>
+              <w:t>Owner</w:t>
+            </w:r>
+            <w:proofErr w:type="spellEnd"/>
+            <w:r>
+              <w:t>»</w:t>
             </w:r>
           </w:p>
         </w:tc>
@@ -16085,7 +16290,15 @@
           </w:tcPr>
           <w:p>
             <w:r>
-              <w:t>Ein Benutzer mit der Rolle «VIP» und ein «Owner» müssen schon im System erfasst sein.</w:t>
+              <w:t>Ein Benutzer mit der Rolle «VIP» und ein «</w:t>
+            </w:r>
+            <w:proofErr w:type="spellStart"/>
+            <w:r>
+              <w:t>Owner</w:t>
+            </w:r>
+            <w:proofErr w:type="spellEnd"/>
+            <w:r>
+              <w:t>» müssen schon im System erfasst sein.</w:t>
             </w:r>
           </w:p>
         </w:tc>
@@ -16107,22 +16320,7 @@
           </w:tcPr>
           <w:p>
             <w:r>
-              <w:t>Ein Benutzer</w:t>
-            </w:r>
-            <w:r>
-              <w:t xml:space="preserve"> mit der Rolle «VIP»</w:t>
-            </w:r>
-            <w:r>
-              <w:t xml:space="preserve"> wird</w:t>
-            </w:r>
-            <w:r>
-              <w:t xml:space="preserve"> vom</w:t>
-            </w:r>
-            <w:r>
-              <w:t xml:space="preserve"> Inventar </w:t>
-            </w:r>
-            <w:r>
-              <w:t>gelöscht.</w:t>
+              <w:t>Ein Benutzer mit der Rolle «VIP» wird vom Inventar gelöscht.</w:t>
             </w:r>
           </w:p>
         </w:tc>
@@ -16539,7 +16737,15 @@
         <w:t>t</w:t>
       </w:r>
       <w:r>
-        <w:t xml:space="preserve">. Für die Versionskontrolle wurde ein Firmen Internes Git Repository verwendet. Das Backup des Servers wird nach dem </w:t>
+        <w:t xml:space="preserve">. Für die Versionskontrolle wurde ein Firmen Internes </w:t>
+      </w:r>
+      <w:proofErr w:type="spellStart"/>
+      <w:r>
+        <w:t>Git</w:t>
+      </w:r>
+      <w:proofErr w:type="spellEnd"/>
+      <w:r>
+        <w:t xml:space="preserve"> Repository verwendet. Das Backup des Servers wird nach dem </w:t>
       </w:r>
       <w:hyperlink r:id="rId21" w:history="1">
         <w:r>
@@ -16844,11 +17050,13 @@
       </w:pPr>
       <w:bookmarkStart w:id="76" w:name="_Toc25148338"/>
       <w:bookmarkStart w:id="77" w:name="_Toc110858296"/>
+      <w:proofErr w:type="spellStart"/>
       <w:r>
         <w:t>Activity</w:t>
       </w:r>
       <w:bookmarkEnd w:id="76"/>
       <w:bookmarkEnd w:id="77"/>
+      <w:proofErr w:type="spellEnd"/>
     </w:p>
     <w:p>
       <w:pPr>
@@ -16937,10 +17145,15 @@
       <w:bookmarkStart w:id="82" w:name="_Toc25148342"/>
       <w:bookmarkStart w:id="83" w:name="_Toc110858299"/>
       <w:r>
-        <w:t>Mock-Ups</w:t>
+        <w:t>Mock-</w:t>
+      </w:r>
+      <w:proofErr w:type="spellStart"/>
+      <w:r>
+        <w:t>Ups</w:t>
       </w:r>
       <w:bookmarkEnd w:id="82"/>
       <w:bookmarkEnd w:id="83"/>
+      <w:proofErr w:type="spellEnd"/>
     </w:p>
     <w:p>
       <w:pPr>
@@ -17192,8 +17405,29 @@
           </w:tcPr>
           <w:p>
             <w:r>
-              <w:t>Pentium 4 processor or higher</w:t>
-            </w:r>
+              <w:t xml:space="preserve">Pentium 4 </w:t>
+            </w:r>
+            <w:proofErr w:type="spellStart"/>
+            <w:r>
+              <w:t>processor</w:t>
+            </w:r>
+            <w:proofErr w:type="spellEnd"/>
+            <w:r>
+              <w:t xml:space="preserve"> </w:t>
+            </w:r>
+            <w:proofErr w:type="spellStart"/>
+            <w:r>
+              <w:t>or</w:t>
+            </w:r>
+            <w:proofErr w:type="spellEnd"/>
+            <w:r>
+              <w:t xml:space="preserve"> </w:t>
+            </w:r>
+            <w:proofErr w:type="spellStart"/>
+            <w:r>
+              <w:t>higher</w:t>
+            </w:r>
+            <w:proofErr w:type="spellEnd"/>
           </w:p>
         </w:tc>
       </w:tr>
@@ -17737,7 +17971,15 @@
           </w:tcPr>
           <w:p>
             <w:r>
-              <w:t>Nachdem man als «Owner» oder als «VIP» ein Bild hochladet, wird das hochgeladene Bild auf der Webseite nicht angezeigt.</w:t>
+              <w:t>Nachdem man als «</w:t>
+            </w:r>
+            <w:proofErr w:type="spellStart"/>
+            <w:r>
+              <w:t>Owner</w:t>
+            </w:r>
+            <w:proofErr w:type="spellEnd"/>
+            <w:r>
+              <w:t>» oder als «VIP» ein Bild hochladet, wird das hochgeladene Bild auf der Webseite nicht angezeigt.</w:t>
             </w:r>
           </w:p>
         </w:tc>
@@ -17747,19 +17989,18 @@
           </w:tcPr>
           <w:p>
             <w:r>
-              <w:t>Nachdem ich das Problem zusammen mit Janik Lüthi und danach mit Aurel Wicki versucht habe zu lösen, hat es nicht funktioniert. Wir kamen dem Problem aber etwas näher. Wir haben festgestellt, das i</w:t>
-            </w:r>
-            <w:r>
-              <w:t xml:space="preserve">rgendetwas beim </w:t>
-            </w:r>
-            <w:r>
-              <w:t xml:space="preserve">Hochladen des Bildes zur Datenbank </w:t>
-            </w:r>
-            <w:r>
-              <w:t xml:space="preserve">nicht richtig </w:t>
-            </w:r>
-            <w:r>
-              <w:t>ist.</w:t>
+              <w:t xml:space="preserve">Nachdem ich das Problem zusammen mit Janik Lüthi und danach mit Aurel Wicki versucht habe zu lösen, hat es nicht funktioniert. Wir kamen dem Problem aber etwas näher. Wir haben festgestellt, </w:t>
+            </w:r>
+            <w:proofErr w:type="spellStart"/>
+            <w:r>
+              <w:t>das</w:t>
+            </w:r>
+            <w:proofErr w:type="spellEnd"/>
+            <w:r>
+              <w:t xml:space="preserve"> i</w:t>
+            </w:r>
+            <w:r>
+              <w:t>rgendetwas beim Hochladen des Bildes zur Datenbank nicht richtig ist.</w:t>
             </w:r>
             <w:r>
               <w:t xml:space="preserve"> Nach einer ganzen Ewigkeit habe ich mich dazu entschieden, dass Bild als Pfad auf der Datenbank zu speichern. Das heisst, dass einfach nur der Pfad des Bildes vom Computer in die Datenbank gespeichert wird.</w:t>
@@ -17802,6 +18043,7 @@
               </w:rPr>
               <w:t>(</w:t>
             </w:r>
+            <w:proofErr w:type="spellStart"/>
             <w:r>
               <w:rPr>
                 <w:rFonts w:ascii="Consolas" w:eastAsia="Times New Roman" w:hAnsi="Consolas" w:cs="Times New Roman"/>
@@ -17812,6 +18054,7 @@
               </w:rPr>
               <w:t>is_uploaded_file</w:t>
             </w:r>
+            <w:proofErr w:type="spellEnd"/>
             <w:r>
               <w:rPr>
                 <w:rFonts w:ascii="Consolas" w:eastAsia="Times New Roman" w:hAnsi="Consolas" w:cs="Times New Roman"/>
@@ -17870,7 +18113,29 @@
                 <w:szCs w:val="21"/>
                 <w:lang w:val="en-GB" w:eastAsia="de-DE"/>
               </w:rPr>
-              <w:t>'tmp_name'</w:t>
+              <w:t>'</w:t>
+            </w:r>
+            <w:proofErr w:type="spellStart"/>
+            <w:r>
+              <w:rPr>
+                <w:rFonts w:ascii="Consolas" w:eastAsia="Times New Roman" w:hAnsi="Consolas" w:cs="Times New Roman"/>
+                <w:color w:val="CE9178"/>
+                <w:sz w:val="21"/>
+                <w:szCs w:val="21"/>
+                <w:lang w:val="en-GB" w:eastAsia="de-DE"/>
+              </w:rPr>
+              <w:t>tmp_name</w:t>
+            </w:r>
+            <w:proofErr w:type="spellEnd"/>
+            <w:r>
+              <w:rPr>
+                <w:rFonts w:ascii="Consolas" w:eastAsia="Times New Roman" w:hAnsi="Consolas" w:cs="Times New Roman"/>
+                <w:color w:val="CE9178"/>
+                <w:sz w:val="21"/>
+                <w:szCs w:val="21"/>
+                <w:lang w:val="en-GB" w:eastAsia="de-DE"/>
+              </w:rPr>
+              <w:t>'</w:t>
             </w:r>
             <w:r>
               <w:rPr>
@@ -17913,8 +18178,20 @@
                 <w:szCs w:val="21"/>
                 <w:lang w:val="en-GB" w:eastAsia="de-DE"/>
               </w:rPr>
-              <w:t>$imgData</w:t>
-            </w:r>
+              <w:t>$</w:t>
+            </w:r>
+            <w:proofErr w:type="spellStart"/>
+            <w:r>
+              <w:rPr>
+                <w:rFonts w:ascii="Consolas" w:eastAsia="Times New Roman" w:hAnsi="Consolas" w:cs="Times New Roman"/>
+                <w:color w:val="9CDCFE"/>
+                <w:sz w:val="21"/>
+                <w:szCs w:val="21"/>
+                <w:lang w:val="en-GB" w:eastAsia="de-DE"/>
+              </w:rPr>
+              <w:t>imgData</w:t>
+            </w:r>
+            <w:proofErr w:type="spellEnd"/>
             <w:r>
               <w:rPr>
                 <w:rFonts w:ascii="Consolas" w:eastAsia="Times New Roman" w:hAnsi="Consolas" w:cs="Times New Roman"/>
@@ -17925,6 +18202,7 @@
               </w:rPr>
               <w:t xml:space="preserve"> = </w:t>
             </w:r>
+            <w:proofErr w:type="spellStart"/>
             <w:r>
               <w:rPr>
                 <w:rFonts w:ascii="Consolas" w:eastAsia="Times New Roman" w:hAnsi="Consolas" w:cs="Times New Roman"/>
@@ -17935,6 +18213,7 @@
               </w:rPr>
               <w:t>addslashes</w:t>
             </w:r>
+            <w:proofErr w:type="spellEnd"/>
             <w:r>
               <w:rPr>
                 <w:rFonts w:ascii="Consolas" w:eastAsia="Times New Roman" w:hAnsi="Consolas" w:cs="Times New Roman"/>
@@ -17945,6 +18224,7 @@
               </w:rPr>
               <w:t>(</w:t>
             </w:r>
+            <w:proofErr w:type="spellStart"/>
             <w:r>
               <w:rPr>
                 <w:rFonts w:ascii="Consolas" w:eastAsia="Times New Roman" w:hAnsi="Consolas" w:cs="Times New Roman"/>
@@ -17955,6 +18235,7 @@
               </w:rPr>
               <w:t>file_get_contents</w:t>
             </w:r>
+            <w:proofErr w:type="spellEnd"/>
             <w:r>
               <w:rPr>
                 <w:rFonts w:ascii="Consolas" w:eastAsia="Times New Roman" w:hAnsi="Consolas" w:cs="Times New Roman"/>
@@ -18013,7 +18294,29 @@
                 <w:szCs w:val="21"/>
                 <w:lang w:val="en-GB" w:eastAsia="de-DE"/>
               </w:rPr>
-              <w:t>'tmp_name'</w:t>
+              <w:t>'</w:t>
+            </w:r>
+            <w:proofErr w:type="spellStart"/>
+            <w:r>
+              <w:rPr>
+                <w:rFonts w:ascii="Consolas" w:eastAsia="Times New Roman" w:hAnsi="Consolas" w:cs="Times New Roman"/>
+                <w:color w:val="CE9178"/>
+                <w:sz w:val="21"/>
+                <w:szCs w:val="21"/>
+                <w:lang w:val="en-GB" w:eastAsia="de-DE"/>
+              </w:rPr>
+              <w:t>tmp_name</w:t>
+            </w:r>
+            <w:proofErr w:type="spellEnd"/>
+            <w:r>
+              <w:rPr>
+                <w:rFonts w:ascii="Consolas" w:eastAsia="Times New Roman" w:hAnsi="Consolas" w:cs="Times New Roman"/>
+                <w:color w:val="CE9178"/>
+                <w:sz w:val="21"/>
+                <w:szCs w:val="21"/>
+                <w:lang w:val="en-GB" w:eastAsia="de-DE"/>
+              </w:rPr>
+              <w:t>'</w:t>
             </w:r>
             <w:r>
               <w:rPr>
@@ -18056,8 +18359,20 @@
                 <w:szCs w:val="21"/>
                 <w:lang w:val="en-GB" w:eastAsia="de-DE"/>
               </w:rPr>
-              <w:t>$imageProperties</w:t>
-            </w:r>
+              <w:t>$</w:t>
+            </w:r>
+            <w:proofErr w:type="spellStart"/>
+            <w:r>
+              <w:rPr>
+                <w:rFonts w:ascii="Consolas" w:eastAsia="Times New Roman" w:hAnsi="Consolas" w:cs="Times New Roman"/>
+                <w:color w:val="9CDCFE"/>
+                <w:sz w:val="21"/>
+                <w:szCs w:val="21"/>
+                <w:lang w:val="en-GB" w:eastAsia="de-DE"/>
+              </w:rPr>
+              <w:t>imageProperties</w:t>
+            </w:r>
+            <w:proofErr w:type="spellEnd"/>
             <w:r>
               <w:rPr>
                 <w:rFonts w:ascii="Consolas" w:eastAsia="Times New Roman" w:hAnsi="Consolas" w:cs="Times New Roman"/>
@@ -18068,6 +18383,7 @@
               </w:rPr>
               <w:t xml:space="preserve"> = </w:t>
             </w:r>
+            <w:proofErr w:type="spellStart"/>
             <w:r>
               <w:rPr>
                 <w:rFonts w:ascii="Consolas" w:eastAsia="Times New Roman" w:hAnsi="Consolas" w:cs="Times New Roman"/>
@@ -18078,6 +18394,7 @@
               </w:rPr>
               <w:t>getimageSize</w:t>
             </w:r>
+            <w:proofErr w:type="spellEnd"/>
             <w:r>
               <w:rPr>
                 <w:rFonts w:ascii="Consolas" w:eastAsia="Times New Roman" w:hAnsi="Consolas" w:cs="Times New Roman"/>
@@ -18136,7 +18453,29 @@
                 <w:szCs w:val="21"/>
                 <w:lang w:val="en-GB" w:eastAsia="de-DE"/>
               </w:rPr>
-              <w:t>'tmp_name'</w:t>
+              <w:t>'</w:t>
+            </w:r>
+            <w:proofErr w:type="spellStart"/>
+            <w:r>
+              <w:rPr>
+                <w:rFonts w:ascii="Consolas" w:eastAsia="Times New Roman" w:hAnsi="Consolas" w:cs="Times New Roman"/>
+                <w:color w:val="CE9178"/>
+                <w:sz w:val="21"/>
+                <w:szCs w:val="21"/>
+                <w:lang w:val="en-GB" w:eastAsia="de-DE"/>
+              </w:rPr>
+              <w:t>tmp_name</w:t>
+            </w:r>
+            <w:proofErr w:type="spellEnd"/>
+            <w:r>
+              <w:rPr>
+                <w:rFonts w:ascii="Consolas" w:eastAsia="Times New Roman" w:hAnsi="Consolas" w:cs="Times New Roman"/>
+                <w:color w:val="CE9178"/>
+                <w:sz w:val="21"/>
+                <w:szCs w:val="21"/>
+                <w:lang w:val="en-GB" w:eastAsia="de-DE"/>
+              </w:rPr>
+              <w:t>'</w:t>
             </w:r>
             <w:r>
               <w:rPr>
@@ -18159,7 +18498,21 @@
               <w:rPr>
                 <w:lang w:val="de-DE"/>
               </w:rPr>
-              <w:t>Die “addslashes” Funktion fügt e</w:t>
+              <w:t>Die “</w:t>
+            </w:r>
+            <w:proofErr w:type="spellStart"/>
+            <w:r>
+              <w:rPr>
+                <w:lang w:val="de-DE"/>
+              </w:rPr>
+              <w:t>addslashes</w:t>
+            </w:r>
+            <w:proofErr w:type="spellEnd"/>
+            <w:r>
+              <w:rPr>
+                <w:lang w:val="de-DE"/>
+              </w:rPr>
+              <w:t>” Funktion fügt e</w:t>
             </w:r>
             <w:r>
               <w:rPr>
@@ -18195,8 +18548,20 @@
                 <w:szCs w:val="21"/>
                 <w:lang w:val="en-GB" w:eastAsia="de-DE"/>
               </w:rPr>
-              <w:t>$imgData</w:t>
-            </w:r>
+              <w:t>$</w:t>
+            </w:r>
+            <w:proofErr w:type="spellStart"/>
+            <w:r>
+              <w:rPr>
+                <w:rFonts w:ascii="Consolas" w:eastAsia="Times New Roman" w:hAnsi="Consolas" w:cs="Times New Roman"/>
+                <w:color w:val="9CDCFE"/>
+                <w:sz w:val="21"/>
+                <w:szCs w:val="21"/>
+                <w:lang w:val="en-GB" w:eastAsia="de-DE"/>
+              </w:rPr>
+              <w:t>imgData</w:t>
+            </w:r>
+            <w:proofErr w:type="spellEnd"/>
             <w:r>
               <w:rPr>
                 <w:rFonts w:ascii="Consolas" w:eastAsia="Times New Roman" w:hAnsi="Consolas" w:cs="Times New Roman"/>
@@ -18207,6 +18572,7 @@
               </w:rPr>
               <w:t xml:space="preserve"> = </w:t>
             </w:r>
+            <w:proofErr w:type="spellStart"/>
             <w:r>
               <w:rPr>
                 <w:rFonts w:ascii="Consolas" w:eastAsia="Times New Roman" w:hAnsi="Consolas" w:cs="Times New Roman"/>
@@ -18217,6 +18583,7 @@
               </w:rPr>
               <w:t>file_get_contents</w:t>
             </w:r>
+            <w:proofErr w:type="spellEnd"/>
             <w:r>
               <w:rPr>
                 <w:rFonts w:ascii="Consolas" w:eastAsia="Times New Roman" w:hAnsi="Consolas" w:cs="Times New Roman"/>
@@ -18275,7 +18642,29 @@
                 <w:szCs w:val="21"/>
                 <w:lang w:val="en-GB" w:eastAsia="de-DE"/>
               </w:rPr>
-              <w:t>'tmp_name'</w:t>
+              <w:t>'</w:t>
+            </w:r>
+            <w:proofErr w:type="spellStart"/>
+            <w:r>
+              <w:rPr>
+                <w:rFonts w:ascii="Consolas" w:eastAsia="Times New Roman" w:hAnsi="Consolas" w:cs="Times New Roman"/>
+                <w:color w:val="CE9178"/>
+                <w:sz w:val="21"/>
+                <w:szCs w:val="21"/>
+                <w:lang w:val="en-GB" w:eastAsia="de-DE"/>
+              </w:rPr>
+              <w:t>tmp_name</w:t>
+            </w:r>
+            <w:proofErr w:type="spellEnd"/>
+            <w:r>
+              <w:rPr>
+                <w:rFonts w:ascii="Consolas" w:eastAsia="Times New Roman" w:hAnsi="Consolas" w:cs="Times New Roman"/>
+                <w:color w:val="CE9178"/>
+                <w:sz w:val="21"/>
+                <w:szCs w:val="21"/>
+                <w:lang w:val="en-GB" w:eastAsia="de-DE"/>
+              </w:rPr>
+              <w:t>'</w:t>
             </w:r>
             <w:r>
               <w:rPr>
@@ -18318,8 +18707,20 @@
                 <w:szCs w:val="21"/>
                 <w:lang w:val="en-GB" w:eastAsia="de-DE"/>
               </w:rPr>
-              <w:t>$imageProperties</w:t>
-            </w:r>
+              <w:t>$</w:t>
+            </w:r>
+            <w:proofErr w:type="spellStart"/>
+            <w:r>
+              <w:rPr>
+                <w:rFonts w:ascii="Consolas" w:eastAsia="Times New Roman" w:hAnsi="Consolas" w:cs="Times New Roman"/>
+                <w:color w:val="9CDCFE"/>
+                <w:sz w:val="21"/>
+                <w:szCs w:val="21"/>
+                <w:lang w:val="en-GB" w:eastAsia="de-DE"/>
+              </w:rPr>
+              <w:t>imageProperties</w:t>
+            </w:r>
+            <w:proofErr w:type="spellEnd"/>
             <w:r>
               <w:rPr>
                 <w:rFonts w:ascii="Consolas" w:eastAsia="Times New Roman" w:hAnsi="Consolas" w:cs="Times New Roman"/>
@@ -18330,6 +18731,7 @@
               </w:rPr>
               <w:t xml:space="preserve"> = </w:t>
             </w:r>
+            <w:proofErr w:type="spellStart"/>
             <w:r>
               <w:rPr>
                 <w:rFonts w:ascii="Consolas" w:eastAsia="Times New Roman" w:hAnsi="Consolas" w:cs="Times New Roman"/>
@@ -18340,6 +18742,7 @@
               </w:rPr>
               <w:t>getimageSize</w:t>
             </w:r>
+            <w:proofErr w:type="spellEnd"/>
             <w:r>
               <w:rPr>
                 <w:rFonts w:ascii="Consolas" w:eastAsia="Times New Roman" w:hAnsi="Consolas" w:cs="Times New Roman"/>
@@ -18398,7 +18801,29 @@
                 <w:szCs w:val="21"/>
                 <w:lang w:val="en-GB" w:eastAsia="de-DE"/>
               </w:rPr>
-              <w:t>'tmp_name'</w:t>
+              <w:t>'</w:t>
+            </w:r>
+            <w:proofErr w:type="spellStart"/>
+            <w:r>
+              <w:rPr>
+                <w:rFonts w:ascii="Consolas" w:eastAsia="Times New Roman" w:hAnsi="Consolas" w:cs="Times New Roman"/>
+                <w:color w:val="CE9178"/>
+                <w:sz w:val="21"/>
+                <w:szCs w:val="21"/>
+                <w:lang w:val="en-GB" w:eastAsia="de-DE"/>
+              </w:rPr>
+              <w:t>tmp_name</w:t>
+            </w:r>
+            <w:proofErr w:type="spellEnd"/>
+            <w:r>
+              <w:rPr>
+                <w:rFonts w:ascii="Consolas" w:eastAsia="Times New Roman" w:hAnsi="Consolas" w:cs="Times New Roman"/>
+                <w:color w:val="CE9178"/>
+                <w:sz w:val="21"/>
+                <w:szCs w:val="21"/>
+                <w:lang w:val="en-GB" w:eastAsia="de-DE"/>
+              </w:rPr>
+              <w:t>'</w:t>
             </w:r>
             <w:r>
               <w:rPr>
@@ -18428,7 +18853,21 @@
               <w:rPr>
                 <w:lang w:val="de-DE"/>
               </w:rPr>
-              <w:t>Nachdem man die “addslashes” F</w:t>
+              <w:t>Nachdem man die “</w:t>
+            </w:r>
+            <w:proofErr w:type="spellStart"/>
+            <w:r>
+              <w:rPr>
+                <w:lang w:val="de-DE"/>
+              </w:rPr>
+              <w:t>addslashes</w:t>
+            </w:r>
+            <w:proofErr w:type="spellEnd"/>
+            <w:r>
+              <w:rPr>
+                <w:lang w:val="de-DE"/>
+              </w:rPr>
+              <w:t>” F</w:t>
             </w:r>
             <w:r>
               <w:rPr>
@@ -18613,9 +19052,11 @@
               <w:pStyle w:val="K-Einzug"/>
               <w:ind w:left="0"/>
             </w:pPr>
+            <w:proofErr w:type="spellStart"/>
             <w:r>
               <w:t>Ballwil</w:t>
             </w:r>
+            <w:proofErr w:type="spellEnd"/>
           </w:p>
         </w:tc>
         <w:tc>
@@ -18784,17 +19225,33 @@
       <w:pPr>
         <w:pStyle w:val="K-Einzug"/>
       </w:pPr>
-      <w:fldSimple w:instr=" TOC \h \z \c &quot;Abbildung&quot; ">
-        <w:r>
-          <w:rPr>
-            <w:b/>
-            <w:bCs w:val="0"/>
-            <w:noProof/>
-            <w:lang w:val="de-DE"/>
-          </w:rPr>
-          <w:t>Es konnten keine Einträge für ein Abbildungsverzeichnis gefunden werden.</w:t>
-        </w:r>
-      </w:fldSimple>
+      <w:r>
+        <w:fldChar w:fldCharType="begin"/>
+      </w:r>
+      <w:r>
+        <w:instrText xml:space="preserve"> TOC \h \z \c "Abbildung" </w:instrText>
+      </w:r>
+      <w:r>
+        <w:fldChar w:fldCharType="separate"/>
+      </w:r>
+      <w:r>
+        <w:rPr>
+          <w:b/>
+          <w:bCs w:val="0"/>
+          <w:noProof/>
+          <w:lang w:val="de-DE"/>
+        </w:rPr>
+        <w:t>Es konnten keine Einträge für ein Abbildungsverzeichnis gefunden werden.</w:t>
+      </w:r>
+      <w:r>
+        <w:rPr>
+          <w:b/>
+          <w:bCs w:val="0"/>
+          <w:noProof/>
+          <w:lang w:val="de-DE"/>
+        </w:rPr>
+        <w:fldChar w:fldCharType="end"/>
+      </w:r>
     </w:p>
     <w:p/>
     <w:p>
@@ -19921,15 +20378,36 @@
               <w:sz w:val="18"/>
             </w:rPr>
             <w:br/>
-            <w:t>Luzernstrasse 18</w:t>
+          </w:r>
+          <w:proofErr w:type="spellStart"/>
+          <w:r>
+            <w:rPr>
+              <w:sz w:val="18"/>
+            </w:rPr>
+            <w:t>Luzernstrasse</w:t>
+          </w:r>
+          <w:proofErr w:type="spellEnd"/>
+          <w:r>
+            <w:rPr>
+              <w:sz w:val="18"/>
+            </w:rPr>
+            <w:t xml:space="preserve"> 18</w:t>
           </w:r>
           <w:r>
             <w:rPr>
               <w:sz w:val="18"/>
             </w:rPr>
             <w:br/>
-            <w:t>6275 Ballwil</w:t>
+            <w:t xml:space="preserve">6275 </w:t>
           </w:r>
+          <w:proofErr w:type="spellStart"/>
+          <w:r>
+            <w:rPr>
+              <w:sz w:val="18"/>
+            </w:rPr>
+            <w:t>Ballwil</w:t>
+          </w:r>
+          <w:proofErr w:type="spellEnd"/>
         </w:p>
       </w:tc>
       <w:tc>
@@ -24750,6 +25228,7 @@
     <w:rsid w:val="00962AB4"/>
     <w:rsid w:val="009A34D4"/>
     <w:rsid w:val="00A32E5C"/>
+    <w:rsid w:val="00BB548A"/>
     <w:rsid w:val="00BD1F16"/>
     <w:rsid w:val="00C62BDB"/>
     <w:rsid w:val="00C64852"/>

</xml_diff>

<commit_message>
Edit image, bug bei Bild an sich ändern
</commit_message>
<xml_diff>
--- a/docs/PA_Fotostudio_Doku.docx
+++ b/docs/PA_Fotostudio_Doku.docx
@@ -6027,24 +6027,14 @@
             </w:r>
           </w:p>
           <w:p>
-            <w:proofErr w:type="spellStart"/>
-            <w:r>
-              <w:t>Luzernstrasse</w:t>
-            </w:r>
-            <w:proofErr w:type="spellEnd"/>
-            <w:r>
-              <w:t xml:space="preserve"> 18</w:t>
-            </w:r>
-          </w:p>
-          <w:p>
-            <w:r>
-              <w:t xml:space="preserve">6275 </w:t>
-            </w:r>
-            <w:proofErr w:type="spellStart"/>
-            <w:r>
-              <w:t>Ballwil</w:t>
-            </w:r>
-            <w:proofErr w:type="spellEnd"/>
+            <w:r>
+              <w:t>Luzernstrasse 18</w:t>
+            </w:r>
+          </w:p>
+          <w:p>
+            <w:r>
+              <w:t>6275 Ballwil</w:t>
+            </w:r>
           </w:p>
           <w:p>
             <w:r>
@@ -6166,19 +6156,11 @@
               </w:sdtPr>
               <w:sdtEndPr/>
               <w:sdtContent>
-                <w:proofErr w:type="spellStart"/>
                 <w:r>
                   <w:rPr>
                     <w:color w:val="FF0000"/>
                   </w:rPr>
-                  <w:t>Luzernstrasse</w:t>
-                </w:r>
-                <w:proofErr w:type="spellEnd"/>
-                <w:r>
-                  <w:rPr>
-                    <w:color w:val="FF0000"/>
-                  </w:rPr>
-                  <w:t xml:space="preserve"> 18</w:t>
+                  <w:t>Luzernstrasse 18</w:t>
                 </w:r>
               </w:sdtContent>
             </w:sdt>
@@ -6305,16 +6287,8 @@
               <w:rPr>
                 <w:color w:val="FF0000"/>
               </w:rPr>
-              <w:t xml:space="preserve">Ruggiero </w:t>
-            </w:r>
-            <w:proofErr w:type="spellStart"/>
-            <w:r>
-              <w:rPr>
-                <w:color w:val="FF0000"/>
-              </w:rPr>
-              <w:t>Pelliccione</w:t>
-            </w:r>
-            <w:proofErr w:type="spellEnd"/>
+              <w:t>Ruggiero Pelliccione</w:t>
+            </w:r>
           </w:p>
           <w:p>
             <w:r>
@@ -6322,24 +6296,14 @@
             </w:r>
           </w:p>
           <w:p>
-            <w:proofErr w:type="spellStart"/>
-            <w:r>
-              <w:t>Luzernstrasse</w:t>
-            </w:r>
-            <w:proofErr w:type="spellEnd"/>
-            <w:r>
-              <w:t xml:space="preserve"> 18</w:t>
-            </w:r>
-          </w:p>
-          <w:p>
-            <w:r>
-              <w:t xml:space="preserve">6275 </w:t>
-            </w:r>
-            <w:proofErr w:type="spellStart"/>
-            <w:r>
-              <w:t>Ballwil</w:t>
-            </w:r>
-            <w:proofErr w:type="spellEnd"/>
+            <w:r>
+              <w:t>Luzernstrasse 18</w:t>
+            </w:r>
+          </w:p>
+          <w:p>
+            <w:r>
+              <w:t>6275 Ballwil</w:t>
+            </w:r>
           </w:p>
           <w:p>
             <w:pPr>
@@ -6414,13 +6378,8 @@
           </w:p>
           <w:p>
             <w:r>
-              <w:t xml:space="preserve">6275 </w:t>
-            </w:r>
-            <w:proofErr w:type="spellStart"/>
-            <w:r>
-              <w:t>Ballwil</w:t>
-            </w:r>
-            <w:proofErr w:type="spellEnd"/>
+              <w:t>6275 Ballwil</w:t>
+            </w:r>
           </w:p>
           <w:p>
             <w:pPr>
@@ -6560,45 +6519,24 @@
       </w:pPr>
       <w:bookmarkStart w:id="9" w:name="_Hlk24373257"/>
       <w:r>
-        <w:t xml:space="preserve">Ein Fotograf möchte für sein Studio und auch privat eine </w:t>
+        <w:t>Ein Fotograf möchte für sein Studio und auch privat eine WebApp, um all seine Bilder zu speichern und verwalten zu können. Auf der Webseite kann man, wenn man angemeldet ist, neue Bilder hochladen, die dann gespeichert werden. Zu jedem Bild können noch folgende Informationen erfasst werden: Titel, optionale Beschreibung, Datum, Ort und ob das Bild öffentlich einsehbar sein sollte. Denn neue Einträge kann man nur erfassen, wenn man angemeldet ist. Auch sieht man nur alle Bilder in der Datenbank, wenn man angemeldet ist. Denn private Fotos sollen nicht öffentlich einsehbar sein. Wenn man nicht angemeldet ist, sieht man einfach auf der Startseite die Galerie mit den öffentlichen Bildern. In der Applikation soll es möglich sein, alle Benutzer zu verwalten und auch welche neu hinzuzufügen. Dazu soll die ganze Webseite responsiv sein und mit allen Bildgrössen klarkommen.</w:t>
       </w:r>
-      <w:proofErr w:type="spellStart"/>
+    </w:p>
+    <w:p>
+      <w:pPr>
+        <w:pStyle w:val="K-Einzug"/>
+      </w:pPr>
+    </w:p>
+    <w:p>
+      <w:pPr>
+        <w:pStyle w:val="K-Einzug"/>
+      </w:pPr>
       <w:r>
-        <w:t>WebApp</w:t>
-      </w:r>
-      <w:proofErr w:type="spellEnd"/>
-      <w:r>
-        <w:t>, um all seine Bilder zu speichern und verwalten zu können. Auf der Webseite kann man, wenn man angemeldet ist, neue Bilder hochladen, die dann gespeichert werden. Zu jedem Bild können noch folgende Informationen erfasst werden: Titel, optionale Beschreibung, Datum, Ort und ob das Bild öffentlich einsehbar sein sollte. Denn neue Einträge kann man nur erfassen, wenn man angemeldet ist. Auch sieht man nur alle Bilder in der Datenbank, wenn man angemeldet ist. Denn private Fotos sollen nicht öffentlich einsehbar sein. Wenn man nicht angemeldet ist, sieht man einfach auf der Startseite die Galerie mit den öffentlichen Bildern. In der Applikation soll es möglich sein, alle Benutzer zu verwalten und auch welche neu hinzuzufügen. Dazu soll die ganze Webseite responsiv sein und mit allen Bildgrössen klarkommen.</w:t>
-      </w:r>
-    </w:p>
-    <w:p>
-      <w:pPr>
-        <w:pStyle w:val="K-Einzug"/>
-      </w:pPr>
-    </w:p>
-    <w:p>
-      <w:pPr>
-        <w:pStyle w:val="K-Einzug"/>
-      </w:pPr>
-      <w:r>
-        <w:t xml:space="preserve">Für die Aufgabe muss ein privates Repo im internen </w:t>
-      </w:r>
-      <w:proofErr w:type="spellStart"/>
-      <w:r>
-        <w:t>Gitea</w:t>
-      </w:r>
-      <w:proofErr w:type="spellEnd"/>
-      <w:r>
-        <w:t xml:space="preserve"> erstellt werden. Der Name des Repos ist zwingen “</w:t>
-      </w:r>
-      <w:proofErr w:type="spellStart"/>
-      <w:r>
-        <w:t>MPA_</w:t>
+        <w:t>Für die Aufgabe muss ein privates Repo im internen Gitea erstellt werden. Der Name des Repos ist zwingen “MPA_</w:t>
       </w:r>
       <w:r>
         <w:t>Fotogalerie</w:t>
       </w:r>
-      <w:proofErr w:type="spellEnd"/>
       <w:r>
         <w:t>”.</w:t>
       </w:r>
@@ -6618,29 +6556,13 @@
         <w:ind w:left="709"/>
       </w:pPr>
       <w:r>
-        <w:t>Es soll eine Applikation geschaffen werden, in welchem ein Photograph seine Bilder hochlädt. Der Photograph ist der «</w:t>
-      </w:r>
-      <w:proofErr w:type="spellStart"/>
-      <w:r>
-        <w:t>Owner</w:t>
-      </w:r>
-      <w:proofErr w:type="spellEnd"/>
-      <w:r>
-        <w:t>», also hat diese Rolle und soll auch Benutzer hinzufügen</w:t>
+        <w:t>Es soll eine Applikation geschaffen werden, in welchem ein Photograph seine Bilder hochlädt. Der Photograph ist der «Owner», also hat diese Rolle und soll auch Benutzer hinzufügen</w:t>
       </w:r>
       <w:r>
         <w:t>, bearbeiten und löschen</w:t>
       </w:r>
       <w:r>
-        <w:t xml:space="preserve"> können mit der Rolle «VIP», die ebenfalls Bilder hochladen können und alles sehen können, nur nicht Benutzer verwalten. Dies soll nur der «</w:t>
-      </w:r>
-      <w:proofErr w:type="spellStart"/>
-      <w:r>
-        <w:t>Owner</w:t>
-      </w:r>
-      <w:proofErr w:type="spellEnd"/>
-      <w:r>
-        <w:t xml:space="preserve">» können. Normale </w:t>
+        <w:t xml:space="preserve"> können mit der Rolle «VIP», die ebenfalls Bilder hochladen können und alles sehen können, nur nicht Benutzer verwalten. Dies soll nur der «Owner» können. Normale </w:t>
       </w:r>
       <w:r>
         <w:t>Benutzer,</w:t>
@@ -6672,15 +6594,7 @@
         <w:ind w:left="709"/>
       </w:pPr>
       <w:r>
-        <w:t>Bei der Benutzerverwaltung sollen alle Benutzer angezeigt werden, die vom «</w:t>
-      </w:r>
-      <w:proofErr w:type="spellStart"/>
-      <w:r>
-        <w:t>Owner</w:t>
-      </w:r>
-      <w:proofErr w:type="spellEnd"/>
-      <w:r>
-        <w:t xml:space="preserve">» hinzugefügt wurden. Dort soll man die Benutzer ID, Benutzernamen, </w:t>
+        <w:t xml:space="preserve">Bei der Benutzerverwaltung sollen alle Benutzer angezeigt werden, die vom «Owner» hinzugefügt wurden. Dort soll man die Benutzer ID, Benutzernamen, </w:t>
       </w:r>
       <w:r>
         <w:t>E-Mail-Adresse</w:t>
@@ -6699,37 +6613,13 @@
         <w:ind w:left="709"/>
       </w:pPr>
       <w:r>
-        <w:t>Damit sich der «</w:t>
-      </w:r>
-      <w:proofErr w:type="spellStart"/>
-      <w:r>
-        <w:t>Owner</w:t>
-      </w:r>
-      <w:proofErr w:type="spellEnd"/>
-      <w:r>
-        <w:t xml:space="preserve">» oder der «VIP» auf der Applikation ihre Rechte ergattern können, müssen sie sich einloggen. Im Login soll man die </w:t>
+        <w:t xml:space="preserve">Damit sich der «Owner» oder der «VIP» auf der Applikation ihre Rechte ergattern können, müssen sie sich einloggen. Im Login soll man die </w:t>
       </w:r>
       <w:r>
         <w:t>E-Mail-Adresse</w:t>
       </w:r>
       <w:r>
-        <w:t xml:space="preserve"> und das Passwort eingeben. Die Passwörter entscheidet der «</w:t>
-      </w:r>
-      <w:proofErr w:type="spellStart"/>
-      <w:r>
-        <w:t>Owner</w:t>
-      </w:r>
-      <w:proofErr w:type="spellEnd"/>
-      <w:r>
-        <w:t>» für beide Seiten selbst. Respektive wenn der «</w:t>
-      </w:r>
-      <w:proofErr w:type="spellStart"/>
-      <w:r>
-        <w:t>Owner</w:t>
-      </w:r>
-      <w:proofErr w:type="spellEnd"/>
-      <w:r>
-        <w:t>» einen Benutzer als «VIP» in der Benutzerverwaltung hinzufügt, entscheidet er welches Passwort er hat.</w:t>
+        <w:t xml:space="preserve"> und das Passwort eingeben. Die Passwörter entscheidet der «Owner» für beide Seiten selbst. Respektive wenn der «Owner» einen Benutzer als «VIP» in der Benutzerverwaltung hinzufügt, entscheidet er welches Passwort er hat.</w:t>
       </w:r>
     </w:p>
     <w:p>
@@ -9068,13 +8958,11 @@
               <w:t>Aufgabe 2</w:t>
             </w:r>
             <w:r>
-              <w:t xml:space="preserve">: Zeitplan </w:t>
-            </w:r>
-            <w:proofErr w:type="spellStart"/>
-            <w:r>
-              <w:t>aktualisierenex</w:t>
-            </w:r>
-            <w:proofErr w:type="spellEnd"/>
+              <w:t>: Zeitplan aktualisier</w:t>
+            </w:r>
+            <w:r>
+              <w:t>en</w:t>
+            </w:r>
           </w:p>
         </w:tc>
         <w:tc>
@@ -9323,7 +9211,11 @@
             <w:tcW w:w="9081" w:type="dxa"/>
             <w:gridSpan w:val="4"/>
           </w:tcPr>
-          <w:p/>
+          <w:p>
+            <w:r>
+              <w:t>Heute traten kaum grosse Fehler auf.</w:t>
+            </w:r>
+          </w:p>
         </w:tc>
       </w:tr>
       <w:tr>
@@ -9362,7 +9254,20 @@
             <w:tcW w:w="9081" w:type="dxa"/>
             <w:gridSpan w:val="4"/>
           </w:tcPr>
-          <w:p/>
+          <w:p>
+            <w:r>
+              <w:t xml:space="preserve">Heute wurden </w:t>
+            </w:r>
+            <w:r>
+              <w:t xml:space="preserve">Tests durchgeführt, um zu </w:t>
+            </w:r>
+            <w:r>
+              <w:t>schauen,</w:t>
+            </w:r>
+            <w:r>
+              <w:t xml:space="preserve"> ob man Bilder hinzufügen kann und Benutzer hinzufügen, bearbeiten oder auch löschen kann.</w:t>
+            </w:r>
+          </w:p>
         </w:tc>
       </w:tr>
       <w:tr>
@@ -9401,7 +9306,11 @@
             <w:tcW w:w="9081" w:type="dxa"/>
             <w:gridSpan w:val="4"/>
           </w:tcPr>
-          <w:p/>
+          <w:p>
+            <w:r>
+              <w:t>Heute wurde keine Hilfe beansprucht.</w:t>
+            </w:r>
+          </w:p>
         </w:tc>
       </w:tr>
       <w:tr>
@@ -9440,7 +9349,12 @@
             <w:tcW w:w="9081" w:type="dxa"/>
             <w:gridSpan w:val="4"/>
           </w:tcPr>
-          <w:p/>
+          <w:p>
+            <w:r>
+              <w:lastRenderedPageBreak/>
+              <w:t>Laut Zeitplan bin ich noch wegen der Dokumentation etwas weit hinten, aber programmiertechnisch gesehen sehr gut dran.</w:t>
+            </w:r>
+          </w:p>
         </w:tc>
       </w:tr>
       <w:tr>
@@ -9485,6 +9399,12 @@
                 <w:bCs/>
               </w:rPr>
             </w:pPr>
+            <w:r>
+              <w:rPr>
+                <w:bCs/>
+              </w:rPr>
+              <w:t>Ich bin zufrieden, da ich meine beiden Tageszielen erreichen konnte, trotz allen Missständen die im Verlauf des Tages passiert sind.</w:t>
+            </w:r>
           </w:p>
         </w:tc>
       </w:tr>
@@ -10701,6 +10621,7 @@
           </w:p>
           <w:p>
             <w:r>
+              <w:lastRenderedPageBreak/>
               <w:t>Aufgabe 2</w:t>
             </w:r>
           </w:p>
@@ -10712,6 +10633,7 @@
           </w:tcPr>
           <w:p>
             <w:r>
+              <w:lastRenderedPageBreak/>
               <w:t>Erreicht</w:t>
             </w:r>
           </w:p>
@@ -12209,7 +12131,6 @@
       <w:bookmarkStart w:id="38" w:name="_Toc25148319"/>
       <w:bookmarkStart w:id="39" w:name="_Toc110858277"/>
       <w:r>
-        <w:lastRenderedPageBreak/>
         <w:t xml:space="preserve">Tag 10: </w:t>
       </w:r>
       <w:bookmarkEnd w:id="38"/>
@@ -12800,15 +12721,7 @@
         <w:t xml:space="preserve">Nachfolgend werden die User Storys für </w:t>
       </w:r>
       <w:r>
-        <w:t>die Rolle «</w:t>
-      </w:r>
-      <w:proofErr w:type="spellStart"/>
-      <w:r>
-        <w:t>Owner</w:t>
-      </w:r>
-      <w:proofErr w:type="spellEnd"/>
-      <w:r>
-        <w:t>»</w:t>
+        <w:t>die Rolle «Owner»</w:t>
       </w:r>
       <w:r>
         <w:t xml:space="preserve"> aufgeführt:</w:t>
@@ -12913,15 +12826,7 @@
               <w:ind w:left="0"/>
             </w:pPr>
             <w:r>
-              <w:t>Als Benutzer mit der Rolle «</w:t>
-            </w:r>
-            <w:proofErr w:type="spellStart"/>
-            <w:r>
-              <w:t>Owner</w:t>
-            </w:r>
-            <w:proofErr w:type="spellEnd"/>
-            <w:r>
-              <w:t>» kann ich Bilder hochladen, damit ich sie auf der Webseite anzeigen kann.</w:t>
+              <w:t>Als Benutzer mit der Rolle «Owner» kann ich Bilder hochladen, damit ich sie auf der Webseite anzeigen kann.</w:t>
             </w:r>
           </w:p>
         </w:tc>
@@ -13097,15 +13002,7 @@
               <w:t>Als Benutzer</w:t>
             </w:r>
             <w:r>
-              <w:t xml:space="preserve"> mit der Rolle «</w:t>
-            </w:r>
-            <w:proofErr w:type="spellStart"/>
-            <w:r>
-              <w:t>Owner</w:t>
-            </w:r>
-            <w:proofErr w:type="spellEnd"/>
-            <w:r>
-              <w:t>»</w:t>
+              <w:t xml:space="preserve"> mit der Rolle «Owner»</w:t>
             </w:r>
             <w:r>
               <w:t xml:space="preserve"> kann ich</w:t>
@@ -13290,15 +13187,7 @@
               <w:ind w:left="0"/>
             </w:pPr>
             <w:r>
-              <w:t>Als Benutzer mit der Rolle «</w:t>
-            </w:r>
-            <w:proofErr w:type="spellStart"/>
-            <w:r>
-              <w:t>Owner</w:t>
-            </w:r>
-            <w:proofErr w:type="spellEnd"/>
-            <w:r>
-              <w:t xml:space="preserve">» kann ich hinzugefügte Bilder </w:t>
+              <w:t xml:space="preserve">Als Benutzer mit der Rolle «Owner» kann ich hinzugefügte Bilder </w:t>
             </w:r>
             <w:r>
               <w:t>löschen</w:t>
@@ -13489,15 +13378,7 @@
               <w:ind w:left="0"/>
             </w:pPr>
             <w:r>
-              <w:t>Als Benutzer mit der Rolle «</w:t>
-            </w:r>
-            <w:proofErr w:type="spellStart"/>
-            <w:r>
-              <w:t>Owner</w:t>
-            </w:r>
-            <w:proofErr w:type="spellEnd"/>
-            <w:r>
-              <w:t xml:space="preserve">» kann ich </w:t>
+              <w:t xml:space="preserve">Als Benutzer mit der Rolle «Owner» kann ich </w:t>
             </w:r>
             <w:r>
               <w:t>VIP-</w:t>
@@ -13691,15 +13572,7 @@
               <w:ind w:left="0"/>
             </w:pPr>
             <w:r>
-              <w:t>Als Benutzer mit der Rolle «</w:t>
-            </w:r>
-            <w:proofErr w:type="spellStart"/>
-            <w:r>
-              <w:t>Owner</w:t>
-            </w:r>
-            <w:proofErr w:type="spellEnd"/>
-            <w:r>
-              <w:t xml:space="preserve">» kann ich </w:t>
+              <w:t xml:space="preserve">Als Benutzer mit der Rolle «Owner» kann ich </w:t>
             </w:r>
             <w:r>
               <w:t>VIP-</w:t>
@@ -13878,15 +13751,7 @@
               <w:ind w:left="0"/>
             </w:pPr>
             <w:r>
-              <w:t>Als Benutzer mit der Rolle «</w:t>
-            </w:r>
-            <w:proofErr w:type="spellStart"/>
-            <w:r>
-              <w:t>Owner</w:t>
-            </w:r>
-            <w:proofErr w:type="spellEnd"/>
-            <w:r>
-              <w:t>» kann ich VIP-Benutzer löschen, damit der Fotograph ihre Daten löschen kann.</w:t>
+              <w:t>Als Benutzer mit der Rolle «Owner» kann ich VIP-Benutzer löschen, damit der Fotograph ihre Daten löschen kann.</w:t>
             </w:r>
           </w:p>
         </w:tc>
@@ -14063,15 +13928,7 @@
               <w:ind w:left="0"/>
             </w:pPr>
             <w:r>
-              <w:t>Als Benutzer mit der Rolle «</w:t>
-            </w:r>
-            <w:proofErr w:type="spellStart"/>
-            <w:r>
-              <w:t>Owner</w:t>
-            </w:r>
-            <w:proofErr w:type="spellEnd"/>
-            <w:r>
-              <w:t xml:space="preserve">» kann </w:t>
+              <w:t xml:space="preserve">Als Benutzer mit der Rolle «Owner» kann </w:t>
             </w:r>
             <w:r>
               <w:t>man sich einloggen</w:t>
@@ -14943,35 +14800,17 @@
         <w:lastRenderedPageBreak/>
         <w:t xml:space="preserve">Abbildung </w:t>
       </w:r>
+      <w:fldSimple w:instr=" SEQ Abbildung \* ARABIC ">
+        <w:r>
+          <w:rPr>
+            <w:noProof/>
+          </w:rPr>
+          <w:t>1</w:t>
+        </w:r>
+      </w:fldSimple>
       <w:r>
-        <w:fldChar w:fldCharType="begin"/>
+        <w:t>: Use Case Diagram</w:t>
       </w:r>
-      <w:r>
-        <w:instrText xml:space="preserve"> SEQ Abbildung \* ARABIC </w:instrText>
-      </w:r>
-      <w:r>
-        <w:fldChar w:fldCharType="separate"/>
-      </w:r>
-      <w:r>
-        <w:rPr>
-          <w:noProof/>
-        </w:rPr>
-        <w:t>1</w:t>
-      </w:r>
-      <w:r>
-        <w:rPr>
-          <w:noProof/>
-        </w:rPr>
-        <w:fldChar w:fldCharType="end"/>
-      </w:r>
-      <w:r>
-        <w:t xml:space="preserve">: Use Case </w:t>
-      </w:r>
-      <w:proofErr w:type="spellStart"/>
-      <w:r>
-        <w:t>Diagram</w:t>
-      </w:r>
-      <w:proofErr w:type="spellEnd"/>
     </w:p>
     <w:p>
       <w:pPr>
@@ -15087,15 +14926,7 @@
           </w:tcPr>
           <w:p>
             <w:r>
-              <w:t>Benutzer mit Rolle «</w:t>
-            </w:r>
-            <w:proofErr w:type="spellStart"/>
-            <w:r>
-              <w:t>Owner</w:t>
-            </w:r>
-            <w:proofErr w:type="spellEnd"/>
-            <w:r>
-              <w:t>» und Rolle «VIP»</w:t>
+              <w:t>Benutzer mit Rolle «Owner» und Rolle «VIP»</w:t>
             </w:r>
           </w:p>
         </w:tc>
@@ -15318,15 +15149,7 @@
           </w:tcPr>
           <w:p>
             <w:r>
-              <w:t>Benutzer mit Rolle «</w:t>
-            </w:r>
-            <w:proofErr w:type="spellStart"/>
-            <w:r>
-              <w:t>Owner</w:t>
-            </w:r>
-            <w:proofErr w:type="spellEnd"/>
-            <w:r>
-              <w:t>» und Rolle «VIP»</w:t>
+              <w:t>Benutzer mit Rolle «Owner» und Rolle «VIP»</w:t>
             </w:r>
           </w:p>
         </w:tc>
@@ -15547,15 +15370,7 @@
           </w:tcPr>
           <w:p>
             <w:r>
-              <w:t>Benutzer mit Rolle «</w:t>
-            </w:r>
-            <w:proofErr w:type="spellStart"/>
-            <w:r>
-              <w:t>Owner</w:t>
-            </w:r>
-            <w:proofErr w:type="spellEnd"/>
-            <w:r>
-              <w:t>» und Rolle «VIP»</w:t>
+              <w:t>Benutzer mit Rolle «Owner» und Rolle «VIP»</w:t>
             </w:r>
           </w:p>
         </w:tc>
@@ -15776,15 +15591,7 @@
           </w:tcPr>
           <w:p>
             <w:r>
-              <w:t>Benutzer mit Rolle «</w:t>
-            </w:r>
-            <w:proofErr w:type="spellStart"/>
-            <w:r>
-              <w:t>Owner</w:t>
-            </w:r>
-            <w:proofErr w:type="spellEnd"/>
-            <w:r>
-              <w:t>»</w:t>
+              <w:t>Benutzer mit Rolle «Owner»</w:t>
             </w:r>
           </w:p>
         </w:tc>
@@ -16020,15 +15827,7 @@
           </w:tcPr>
           <w:p>
             <w:r>
-              <w:t>Benutzer mit Rolle «</w:t>
-            </w:r>
-            <w:proofErr w:type="spellStart"/>
-            <w:r>
-              <w:t>Owner</w:t>
-            </w:r>
-            <w:proofErr w:type="spellEnd"/>
-            <w:r>
-              <w:t>»</w:t>
+              <w:t>Benutzer mit Rolle «Owner»</w:t>
             </w:r>
           </w:p>
         </w:tc>
@@ -16053,15 +15852,7 @@
           </w:tcPr>
           <w:p>
             <w:r>
-              <w:t>Ein Benutzer mit der Rolle «VIP» und ein «</w:t>
-            </w:r>
-            <w:proofErr w:type="spellStart"/>
-            <w:r>
-              <w:t>Owner</w:t>
-            </w:r>
-            <w:proofErr w:type="spellEnd"/>
-            <w:r>
-              <w:t>» müssen schon im System erfasst sein.</w:t>
+              <w:t>Ein Benutzer mit der Rolle «VIP» und ein «Owner» müssen schon im System erfasst sein.</w:t>
             </w:r>
           </w:p>
         </w:tc>
@@ -16257,15 +16048,7 @@
           </w:tcPr>
           <w:p>
             <w:r>
-              <w:t>Benutzer mit Rolle «</w:t>
-            </w:r>
-            <w:proofErr w:type="spellStart"/>
-            <w:r>
-              <w:t>Owner</w:t>
-            </w:r>
-            <w:proofErr w:type="spellEnd"/>
-            <w:r>
-              <w:t>»</w:t>
+              <w:t>Benutzer mit Rolle «Owner»</w:t>
             </w:r>
           </w:p>
         </w:tc>
@@ -16290,15 +16073,7 @@
           </w:tcPr>
           <w:p>
             <w:r>
-              <w:t>Ein Benutzer mit der Rolle «VIP» und ein «</w:t>
-            </w:r>
-            <w:proofErr w:type="spellStart"/>
-            <w:r>
-              <w:t>Owner</w:t>
-            </w:r>
-            <w:proofErr w:type="spellEnd"/>
-            <w:r>
-              <w:t>» müssen schon im System erfasst sein.</w:t>
+              <w:t>Ein Benutzer mit der Rolle «VIP» und ein «Owner» müssen schon im System erfasst sein.</w:t>
             </w:r>
           </w:p>
         </w:tc>
@@ -16737,15 +16512,7 @@
         <w:t>t</w:t>
       </w:r>
       <w:r>
-        <w:t xml:space="preserve">. Für die Versionskontrolle wurde ein Firmen Internes </w:t>
-      </w:r>
-      <w:proofErr w:type="spellStart"/>
-      <w:r>
-        <w:t>Git</w:t>
-      </w:r>
-      <w:proofErr w:type="spellEnd"/>
-      <w:r>
-        <w:t xml:space="preserve"> Repository verwendet. Das Backup des Servers wird nach dem </w:t>
+        <w:t xml:space="preserve">. Für die Versionskontrolle wurde ein Firmen Internes Git Repository verwendet. Das Backup des Servers wird nach dem </w:t>
       </w:r>
       <w:hyperlink r:id="rId21" w:history="1">
         <w:r>
@@ -17050,13 +16817,11 @@
       </w:pPr>
       <w:bookmarkStart w:id="76" w:name="_Toc25148338"/>
       <w:bookmarkStart w:id="77" w:name="_Toc110858296"/>
-      <w:proofErr w:type="spellStart"/>
       <w:r>
         <w:t>Activity</w:t>
       </w:r>
       <w:bookmarkEnd w:id="76"/>
       <w:bookmarkEnd w:id="77"/>
-      <w:proofErr w:type="spellEnd"/>
     </w:p>
     <w:p>
       <w:pPr>
@@ -17145,15 +16910,10 @@
       <w:bookmarkStart w:id="82" w:name="_Toc25148342"/>
       <w:bookmarkStart w:id="83" w:name="_Toc110858299"/>
       <w:r>
-        <w:t>Mock-</w:t>
-      </w:r>
-      <w:proofErr w:type="spellStart"/>
-      <w:r>
-        <w:t>Ups</w:t>
+        <w:t>Mock-Ups</w:t>
       </w:r>
       <w:bookmarkEnd w:id="82"/>
       <w:bookmarkEnd w:id="83"/>
-      <w:proofErr w:type="spellEnd"/>
     </w:p>
     <w:p>
       <w:pPr>
@@ -17405,29 +17165,8 @@
           </w:tcPr>
           <w:p>
             <w:r>
-              <w:t xml:space="preserve">Pentium 4 </w:t>
-            </w:r>
-            <w:proofErr w:type="spellStart"/>
-            <w:r>
-              <w:t>processor</w:t>
-            </w:r>
-            <w:proofErr w:type="spellEnd"/>
-            <w:r>
-              <w:t xml:space="preserve"> </w:t>
-            </w:r>
-            <w:proofErr w:type="spellStart"/>
-            <w:r>
-              <w:t>or</w:t>
-            </w:r>
-            <w:proofErr w:type="spellEnd"/>
-            <w:r>
-              <w:t xml:space="preserve"> </w:t>
-            </w:r>
-            <w:proofErr w:type="spellStart"/>
-            <w:r>
-              <w:t>higher</w:t>
-            </w:r>
-            <w:proofErr w:type="spellEnd"/>
+              <w:t>Pentium 4 processor or higher</w:t>
+            </w:r>
           </w:p>
         </w:tc>
       </w:tr>
@@ -17971,15 +17710,7 @@
           </w:tcPr>
           <w:p>
             <w:r>
-              <w:t>Nachdem man als «</w:t>
-            </w:r>
-            <w:proofErr w:type="spellStart"/>
-            <w:r>
-              <w:t>Owner</w:t>
-            </w:r>
-            <w:proofErr w:type="spellEnd"/>
-            <w:r>
-              <w:t>» oder als «VIP» ein Bild hochladet, wird das hochgeladene Bild auf der Webseite nicht angezeigt.</w:t>
+              <w:t>Nachdem man als «Owner» oder als «VIP» ein Bild hochladet, wird das hochgeladene Bild auf der Webseite nicht angezeigt.</w:t>
             </w:r>
           </w:p>
         </w:tc>
@@ -17989,15 +17720,7 @@
           </w:tcPr>
           <w:p>
             <w:r>
-              <w:t xml:space="preserve">Nachdem ich das Problem zusammen mit Janik Lüthi und danach mit Aurel Wicki versucht habe zu lösen, hat es nicht funktioniert. Wir kamen dem Problem aber etwas näher. Wir haben festgestellt, </w:t>
-            </w:r>
-            <w:proofErr w:type="spellStart"/>
-            <w:r>
-              <w:t>das</w:t>
-            </w:r>
-            <w:proofErr w:type="spellEnd"/>
-            <w:r>
-              <w:t xml:space="preserve"> i</w:t>
+              <w:t>Nachdem ich das Problem zusammen mit Janik Lüthi und danach mit Aurel Wicki versucht habe zu lösen, hat es nicht funktioniert. Wir kamen dem Problem aber etwas näher. Wir haben festgestellt, das i</w:t>
             </w:r>
             <w:r>
               <w:t>rgendetwas beim Hochladen des Bildes zur Datenbank nicht richtig ist.</w:t>
@@ -18043,7 +17766,6 @@
               </w:rPr>
               <w:t>(</w:t>
             </w:r>
-            <w:proofErr w:type="spellStart"/>
             <w:r>
               <w:rPr>
                 <w:rFonts w:ascii="Consolas" w:eastAsia="Times New Roman" w:hAnsi="Consolas" w:cs="Times New Roman"/>
@@ -18054,7 +17776,6 @@
               </w:rPr>
               <w:t>is_uploaded_file</w:t>
             </w:r>
-            <w:proofErr w:type="spellEnd"/>
             <w:r>
               <w:rPr>
                 <w:rFonts w:ascii="Consolas" w:eastAsia="Times New Roman" w:hAnsi="Consolas" w:cs="Times New Roman"/>
@@ -18113,9 +17834,121 @@
                 <w:szCs w:val="21"/>
                 <w:lang w:val="en-GB" w:eastAsia="de-DE"/>
               </w:rPr>
-              <w:t>'</w:t>
-            </w:r>
-            <w:proofErr w:type="spellStart"/>
+              <w:t>'tmp_name'</w:t>
+            </w:r>
+            <w:r>
+              <w:rPr>
+                <w:rFonts w:ascii="Consolas" w:eastAsia="Times New Roman" w:hAnsi="Consolas" w:cs="Times New Roman"/>
+                <w:color w:val="D4D4D4"/>
+                <w:sz w:val="21"/>
+                <w:szCs w:val="21"/>
+                <w:lang w:val="en-GB" w:eastAsia="de-DE"/>
+              </w:rPr>
+              <w:t>])) {</w:t>
+            </w:r>
+          </w:p>
+          <w:p>
+            <w:pPr>
+              <w:shd w:val="clear" w:color="auto" w:fill="1E1E1E"/>
+              <w:spacing w:line="285" w:lineRule="atLeast"/>
+              <w:rPr>
+                <w:rFonts w:ascii="Consolas" w:eastAsia="Times New Roman" w:hAnsi="Consolas" w:cs="Times New Roman"/>
+                <w:color w:val="D4D4D4"/>
+                <w:sz w:val="21"/>
+                <w:szCs w:val="21"/>
+                <w:lang w:val="en-GB" w:eastAsia="de-DE"/>
+              </w:rPr>
+            </w:pPr>
+            <w:r>
+              <w:rPr>
+                <w:rFonts w:ascii="Consolas" w:eastAsia="Times New Roman" w:hAnsi="Consolas" w:cs="Times New Roman"/>
+                <w:color w:val="D4D4D4"/>
+                <w:sz w:val="21"/>
+                <w:szCs w:val="21"/>
+                <w:lang w:val="en-GB" w:eastAsia="de-DE"/>
+              </w:rPr>
+              <w:t xml:space="preserve">                    </w:t>
+            </w:r>
+            <w:r>
+              <w:rPr>
+                <w:rFonts w:ascii="Consolas" w:eastAsia="Times New Roman" w:hAnsi="Consolas" w:cs="Times New Roman"/>
+                <w:color w:val="9CDCFE"/>
+                <w:sz w:val="21"/>
+                <w:szCs w:val="21"/>
+                <w:lang w:val="en-GB" w:eastAsia="de-DE"/>
+              </w:rPr>
+              <w:t>$imgData</w:t>
+            </w:r>
+            <w:r>
+              <w:rPr>
+                <w:rFonts w:ascii="Consolas" w:eastAsia="Times New Roman" w:hAnsi="Consolas" w:cs="Times New Roman"/>
+                <w:color w:val="D4D4D4"/>
+                <w:sz w:val="21"/>
+                <w:szCs w:val="21"/>
+                <w:lang w:val="en-GB" w:eastAsia="de-DE"/>
+              </w:rPr>
+              <w:t xml:space="preserve"> = </w:t>
+            </w:r>
+            <w:r>
+              <w:rPr>
+                <w:rFonts w:ascii="Consolas" w:eastAsia="Times New Roman" w:hAnsi="Consolas" w:cs="Times New Roman"/>
+                <w:color w:val="DCDCAA"/>
+                <w:sz w:val="21"/>
+                <w:szCs w:val="21"/>
+                <w:lang w:val="en-GB" w:eastAsia="de-DE"/>
+              </w:rPr>
+              <w:t>addslashes</w:t>
+            </w:r>
+            <w:r>
+              <w:rPr>
+                <w:rFonts w:ascii="Consolas" w:eastAsia="Times New Roman" w:hAnsi="Consolas" w:cs="Times New Roman"/>
+                <w:color w:val="D4D4D4"/>
+                <w:sz w:val="21"/>
+                <w:szCs w:val="21"/>
+                <w:lang w:val="en-GB" w:eastAsia="de-DE"/>
+              </w:rPr>
+              <w:t>(</w:t>
+            </w:r>
+            <w:r>
+              <w:rPr>
+                <w:rFonts w:ascii="Consolas" w:eastAsia="Times New Roman" w:hAnsi="Consolas" w:cs="Times New Roman"/>
+                <w:color w:val="DCDCAA"/>
+                <w:sz w:val="21"/>
+                <w:szCs w:val="21"/>
+                <w:lang w:val="en-GB" w:eastAsia="de-DE"/>
+              </w:rPr>
+              <w:t>file_get_contents</w:t>
+            </w:r>
+            <w:r>
+              <w:rPr>
+                <w:rFonts w:ascii="Consolas" w:eastAsia="Times New Roman" w:hAnsi="Consolas" w:cs="Times New Roman"/>
+                <w:color w:val="D4D4D4"/>
+                <w:sz w:val="21"/>
+                <w:szCs w:val="21"/>
+                <w:lang w:val="en-GB" w:eastAsia="de-DE"/>
+              </w:rPr>
+              <w:t>(</w:t>
+            </w:r>
+            <w:r>
+              <w:rPr>
+                <w:rFonts w:ascii="Consolas" w:eastAsia="Times New Roman" w:hAnsi="Consolas" w:cs="Times New Roman"/>
+                <w:color w:val="9CDCFE"/>
+                <w:sz w:val="21"/>
+                <w:szCs w:val="21"/>
+                <w:lang w:val="en-GB" w:eastAsia="de-DE"/>
+              </w:rPr>
+              <w:t>$_FILES</w:t>
+            </w:r>
+            <w:r>
+              <w:rPr>
+                <w:rFonts w:ascii="Consolas" w:eastAsia="Times New Roman" w:hAnsi="Consolas" w:cs="Times New Roman"/>
+                <w:color w:val="D4D4D4"/>
+                <w:sz w:val="21"/>
+                <w:szCs w:val="21"/>
+                <w:lang w:val="en-GB" w:eastAsia="de-DE"/>
+              </w:rPr>
+              <w:t>[</w:t>
+            </w:r>
             <w:r>
               <w:rPr>
                 <w:rFonts w:ascii="Consolas" w:eastAsia="Times New Roman" w:hAnsi="Consolas" w:cs="Times New Roman"/>
@@ -18124,9 +17957,18 @@
                 <w:szCs w:val="21"/>
                 <w:lang w:val="en-GB" w:eastAsia="de-DE"/>
               </w:rPr>
-              <w:t>tmp_name</w:t>
-            </w:r>
-            <w:proofErr w:type="spellEnd"/>
+              <w:t>'filename'</w:t>
+            </w:r>
+            <w:r>
+              <w:rPr>
+                <w:rFonts w:ascii="Consolas" w:eastAsia="Times New Roman" w:hAnsi="Consolas" w:cs="Times New Roman"/>
+                <w:color w:val="D4D4D4"/>
+                <w:sz w:val="21"/>
+                <w:szCs w:val="21"/>
+                <w:lang w:val="en-GB" w:eastAsia="de-DE"/>
+              </w:rPr>
+              <w:t>][</w:t>
+            </w:r>
             <w:r>
               <w:rPr>
                 <w:rFonts w:ascii="Consolas" w:eastAsia="Times New Roman" w:hAnsi="Consolas" w:cs="Times New Roman"/>
@@ -18135,7 +17977,7 @@
                 <w:szCs w:val="21"/>
                 <w:lang w:val="en-GB" w:eastAsia="de-DE"/>
               </w:rPr>
-              <w:t>'</w:t>
+              <w:t>'tmp_name'</w:t>
             </w:r>
             <w:r>
               <w:rPr>
@@ -18145,7 +17987,7 @@
                 <w:szCs w:val="21"/>
                 <w:lang w:val="en-GB" w:eastAsia="de-DE"/>
               </w:rPr>
-              <w:t>])) {</w:t>
+              <w:t>]));</w:t>
             </w:r>
           </w:p>
           <w:p>
@@ -18178,9 +18020,38 @@
                 <w:szCs w:val="21"/>
                 <w:lang w:val="en-GB" w:eastAsia="de-DE"/>
               </w:rPr>
-              <w:t>$</w:t>
-            </w:r>
-            <w:proofErr w:type="spellStart"/>
+              <w:t>$imageProperties</w:t>
+            </w:r>
+            <w:r>
+              <w:rPr>
+                <w:rFonts w:ascii="Consolas" w:eastAsia="Times New Roman" w:hAnsi="Consolas" w:cs="Times New Roman"/>
+                <w:color w:val="D4D4D4"/>
+                <w:sz w:val="21"/>
+                <w:szCs w:val="21"/>
+                <w:lang w:val="en-GB" w:eastAsia="de-DE"/>
+              </w:rPr>
+              <w:t xml:space="preserve"> = </w:t>
+            </w:r>
+            <w:r>
+              <w:rPr>
+                <w:rFonts w:ascii="Consolas" w:eastAsia="Times New Roman" w:hAnsi="Consolas" w:cs="Times New Roman"/>
+                <w:color w:val="DCDCAA"/>
+                <w:sz w:val="21"/>
+                <w:szCs w:val="21"/>
+                <w:lang w:val="en-GB" w:eastAsia="de-DE"/>
+              </w:rPr>
+              <w:t>getimageSize</w:t>
+            </w:r>
+            <w:r>
+              <w:rPr>
+                <w:rFonts w:ascii="Consolas" w:eastAsia="Times New Roman" w:hAnsi="Consolas" w:cs="Times New Roman"/>
+                <w:color w:val="D4D4D4"/>
+                <w:sz w:val="21"/>
+                <w:szCs w:val="21"/>
+                <w:lang w:val="en-GB" w:eastAsia="de-DE"/>
+              </w:rPr>
+              <w:t>(</w:t>
+            </w:r>
             <w:r>
               <w:rPr>
                 <w:rFonts w:ascii="Consolas" w:eastAsia="Times New Roman" w:hAnsi="Consolas" w:cs="Times New Roman"/>
@@ -18189,9 +18060,8 @@
                 <w:szCs w:val="21"/>
                 <w:lang w:val="en-GB" w:eastAsia="de-DE"/>
               </w:rPr>
-              <w:t>imgData</w:t>
-            </w:r>
-            <w:proofErr w:type="spellEnd"/>
+              <w:t>$_FILES</w:t>
+            </w:r>
             <w:r>
               <w:rPr>
                 <w:rFonts w:ascii="Consolas" w:eastAsia="Times New Roman" w:hAnsi="Consolas" w:cs="Times New Roman"/>
@@ -18200,9 +18070,107 @@
                 <w:szCs w:val="21"/>
                 <w:lang w:val="en-GB" w:eastAsia="de-DE"/>
               </w:rPr>
+              <w:t>[</w:t>
+            </w:r>
+            <w:r>
+              <w:rPr>
+                <w:rFonts w:ascii="Consolas" w:eastAsia="Times New Roman" w:hAnsi="Consolas" w:cs="Times New Roman"/>
+                <w:color w:val="CE9178"/>
+                <w:sz w:val="21"/>
+                <w:szCs w:val="21"/>
+                <w:lang w:val="en-GB" w:eastAsia="de-DE"/>
+              </w:rPr>
+              <w:t>'filename'</w:t>
+            </w:r>
+            <w:r>
+              <w:rPr>
+                <w:rFonts w:ascii="Consolas" w:eastAsia="Times New Roman" w:hAnsi="Consolas" w:cs="Times New Roman"/>
+                <w:color w:val="D4D4D4"/>
+                <w:sz w:val="21"/>
+                <w:szCs w:val="21"/>
+                <w:lang w:val="en-GB" w:eastAsia="de-DE"/>
+              </w:rPr>
+              <w:t>][</w:t>
+            </w:r>
+            <w:r>
+              <w:rPr>
+                <w:rFonts w:ascii="Consolas" w:eastAsia="Times New Roman" w:hAnsi="Consolas" w:cs="Times New Roman"/>
+                <w:color w:val="CE9178"/>
+                <w:sz w:val="21"/>
+                <w:szCs w:val="21"/>
+                <w:lang w:val="en-GB" w:eastAsia="de-DE"/>
+              </w:rPr>
+              <w:t>'tmp_name'</w:t>
+            </w:r>
+            <w:r>
+              <w:rPr>
+                <w:rFonts w:ascii="Consolas" w:eastAsia="Times New Roman" w:hAnsi="Consolas" w:cs="Times New Roman"/>
+                <w:color w:val="D4D4D4"/>
+                <w:sz w:val="21"/>
+                <w:szCs w:val="21"/>
+                <w:lang w:val="en-GB" w:eastAsia="de-DE"/>
+              </w:rPr>
+              <w:t>]);</w:t>
+            </w:r>
+          </w:p>
+          <w:p>
+            <w:pPr>
+              <w:rPr>
+                <w:lang w:val="de-DE"/>
+              </w:rPr>
+            </w:pPr>
+            <w:r>
+              <w:rPr>
+                <w:lang w:val="de-DE"/>
+              </w:rPr>
+              <w:t>Die “addslashes” Funktion fügt e</w:t>
+            </w:r>
+            <w:r>
+              <w:rPr>
+                <w:lang w:val="de-DE"/>
+              </w:rPr>
+              <w:t>in Slash am Ende hinzu, was zum Fehler geführt hat:</w:t>
+            </w:r>
+          </w:p>
+          <w:p>
+            <w:pPr>
+              <w:rPr>
+                <w:lang w:val="de-DE"/>
+              </w:rPr>
+            </w:pPr>
+          </w:p>
+          <w:p>
+            <w:pPr>
+              <w:shd w:val="clear" w:color="auto" w:fill="1E1E1E"/>
+              <w:spacing w:line="285" w:lineRule="atLeast"/>
+              <w:rPr>
+                <w:rFonts w:ascii="Consolas" w:eastAsia="Times New Roman" w:hAnsi="Consolas" w:cs="Times New Roman"/>
+                <w:color w:val="D4D4D4"/>
+                <w:sz w:val="21"/>
+                <w:szCs w:val="21"/>
+                <w:lang w:val="en-GB" w:eastAsia="de-DE"/>
+              </w:rPr>
+            </w:pPr>
+            <w:r>
+              <w:rPr>
+                <w:rFonts w:ascii="Consolas" w:eastAsia="Times New Roman" w:hAnsi="Consolas" w:cs="Times New Roman"/>
+                <w:color w:val="9CDCFE"/>
+                <w:sz w:val="21"/>
+                <w:szCs w:val="21"/>
+                <w:lang w:val="en-GB" w:eastAsia="de-DE"/>
+              </w:rPr>
+              <w:t>$imgData</w:t>
+            </w:r>
+            <w:r>
+              <w:rPr>
+                <w:rFonts w:ascii="Consolas" w:eastAsia="Times New Roman" w:hAnsi="Consolas" w:cs="Times New Roman"/>
+                <w:color w:val="D4D4D4"/>
+                <w:sz w:val="21"/>
+                <w:szCs w:val="21"/>
+                <w:lang w:val="en-GB" w:eastAsia="de-DE"/>
+              </w:rPr>
               <w:t xml:space="preserve"> = </w:t>
             </w:r>
-            <w:proofErr w:type="spellStart"/>
             <w:r>
               <w:rPr>
                 <w:rFonts w:ascii="Consolas" w:eastAsia="Times New Roman" w:hAnsi="Consolas" w:cs="Times New Roman"/>
@@ -18211,9 +18179,8 @@
                 <w:szCs w:val="21"/>
                 <w:lang w:val="en-GB" w:eastAsia="de-DE"/>
               </w:rPr>
-              <w:t>addslashes</w:t>
-            </w:r>
-            <w:proofErr w:type="spellEnd"/>
+              <w:t>file_get_contents</w:t>
+            </w:r>
             <w:r>
               <w:rPr>
                 <w:rFonts w:ascii="Consolas" w:eastAsia="Times New Roman" w:hAnsi="Consolas" w:cs="Times New Roman"/>
@@ -18224,7 +18191,109 @@
               </w:rPr>
               <w:t>(</w:t>
             </w:r>
-            <w:proofErr w:type="spellStart"/>
+            <w:r>
+              <w:rPr>
+                <w:rFonts w:ascii="Consolas" w:eastAsia="Times New Roman" w:hAnsi="Consolas" w:cs="Times New Roman"/>
+                <w:color w:val="9CDCFE"/>
+                <w:sz w:val="21"/>
+                <w:szCs w:val="21"/>
+                <w:lang w:val="en-GB" w:eastAsia="de-DE"/>
+              </w:rPr>
+              <w:t>$_FILES</w:t>
+            </w:r>
+            <w:r>
+              <w:rPr>
+                <w:rFonts w:ascii="Consolas" w:eastAsia="Times New Roman" w:hAnsi="Consolas" w:cs="Times New Roman"/>
+                <w:color w:val="D4D4D4"/>
+                <w:sz w:val="21"/>
+                <w:szCs w:val="21"/>
+                <w:lang w:val="en-GB" w:eastAsia="de-DE"/>
+              </w:rPr>
+              <w:t>[</w:t>
+            </w:r>
+            <w:r>
+              <w:rPr>
+                <w:rFonts w:ascii="Consolas" w:eastAsia="Times New Roman" w:hAnsi="Consolas" w:cs="Times New Roman"/>
+                <w:color w:val="CE9178"/>
+                <w:sz w:val="21"/>
+                <w:szCs w:val="21"/>
+                <w:lang w:val="en-GB" w:eastAsia="de-DE"/>
+              </w:rPr>
+              <w:t>'filename'</w:t>
+            </w:r>
+            <w:r>
+              <w:rPr>
+                <w:rFonts w:ascii="Consolas" w:eastAsia="Times New Roman" w:hAnsi="Consolas" w:cs="Times New Roman"/>
+                <w:color w:val="D4D4D4"/>
+                <w:sz w:val="21"/>
+                <w:szCs w:val="21"/>
+                <w:lang w:val="en-GB" w:eastAsia="de-DE"/>
+              </w:rPr>
+              <w:t>][</w:t>
+            </w:r>
+            <w:r>
+              <w:rPr>
+                <w:rFonts w:ascii="Consolas" w:eastAsia="Times New Roman" w:hAnsi="Consolas" w:cs="Times New Roman"/>
+                <w:color w:val="CE9178"/>
+                <w:sz w:val="21"/>
+                <w:szCs w:val="21"/>
+                <w:lang w:val="en-GB" w:eastAsia="de-DE"/>
+              </w:rPr>
+              <w:t>'tmp_name'</w:t>
+            </w:r>
+            <w:r>
+              <w:rPr>
+                <w:rFonts w:ascii="Consolas" w:eastAsia="Times New Roman" w:hAnsi="Consolas" w:cs="Times New Roman"/>
+                <w:color w:val="D4D4D4"/>
+                <w:sz w:val="21"/>
+                <w:szCs w:val="21"/>
+                <w:lang w:val="en-GB" w:eastAsia="de-DE"/>
+              </w:rPr>
+              <w:t>]);</w:t>
+            </w:r>
+          </w:p>
+          <w:p>
+            <w:pPr>
+              <w:shd w:val="clear" w:color="auto" w:fill="1E1E1E"/>
+              <w:spacing w:line="285" w:lineRule="atLeast"/>
+              <w:rPr>
+                <w:rFonts w:ascii="Consolas" w:eastAsia="Times New Roman" w:hAnsi="Consolas" w:cs="Times New Roman"/>
+                <w:color w:val="D4D4D4"/>
+                <w:sz w:val="21"/>
+                <w:szCs w:val="21"/>
+                <w:lang w:val="en-GB" w:eastAsia="de-DE"/>
+              </w:rPr>
+            </w:pPr>
+            <w:r>
+              <w:rPr>
+                <w:rFonts w:ascii="Consolas" w:eastAsia="Times New Roman" w:hAnsi="Consolas" w:cs="Times New Roman"/>
+                <w:color w:val="D4D4D4"/>
+                <w:sz w:val="21"/>
+                <w:szCs w:val="21"/>
+                <w:lang w:val="en-GB" w:eastAsia="de-DE"/>
+              </w:rPr>
+              <w:t xml:space="preserve">                    </w:t>
+            </w:r>
+            <w:r>
+              <w:rPr>
+                <w:rFonts w:ascii="Consolas" w:eastAsia="Times New Roman" w:hAnsi="Consolas" w:cs="Times New Roman"/>
+                <w:color w:val="9CDCFE"/>
+                <w:sz w:val="21"/>
+                <w:szCs w:val="21"/>
+                <w:lang w:val="en-GB" w:eastAsia="de-DE"/>
+              </w:rPr>
+              <w:t>$imageProperties</w:t>
+            </w:r>
+            <w:r>
+              <w:rPr>
+                <w:rFonts w:ascii="Consolas" w:eastAsia="Times New Roman" w:hAnsi="Consolas" w:cs="Times New Roman"/>
+                <w:color w:val="D4D4D4"/>
+                <w:sz w:val="21"/>
+                <w:szCs w:val="21"/>
+                <w:lang w:val="en-GB" w:eastAsia="de-DE"/>
+              </w:rPr>
+              <w:t xml:space="preserve"> = </w:t>
+            </w:r>
             <w:r>
               <w:rPr>
                 <w:rFonts w:ascii="Consolas" w:eastAsia="Times New Roman" w:hAnsi="Consolas" w:cs="Times New Roman"/>
@@ -18233,9 +18302,8 @@
                 <w:szCs w:val="21"/>
                 <w:lang w:val="en-GB" w:eastAsia="de-DE"/>
               </w:rPr>
-              <w:t>file_get_contents</w:t>
-            </w:r>
-            <w:proofErr w:type="spellEnd"/>
+              <w:t>getimageSize</w:t>
+            </w:r>
             <w:r>
               <w:rPr>
                 <w:rFonts w:ascii="Consolas" w:eastAsia="Times New Roman" w:hAnsi="Consolas" w:cs="Times New Roman"/>
@@ -18294,29 +18362,7 @@
                 <w:szCs w:val="21"/>
                 <w:lang w:val="en-GB" w:eastAsia="de-DE"/>
               </w:rPr>
-              <w:t>'</w:t>
-            </w:r>
-            <w:proofErr w:type="spellStart"/>
-            <w:r>
-              <w:rPr>
-                <w:rFonts w:ascii="Consolas" w:eastAsia="Times New Roman" w:hAnsi="Consolas" w:cs="Times New Roman"/>
-                <w:color w:val="CE9178"/>
-                <w:sz w:val="21"/>
-                <w:szCs w:val="21"/>
-                <w:lang w:val="en-GB" w:eastAsia="de-DE"/>
-              </w:rPr>
-              <w:t>tmp_name</w:t>
-            </w:r>
-            <w:proofErr w:type="spellEnd"/>
-            <w:r>
-              <w:rPr>
-                <w:rFonts w:ascii="Consolas" w:eastAsia="Times New Roman" w:hAnsi="Consolas" w:cs="Times New Roman"/>
-                <w:color w:val="CE9178"/>
-                <w:sz w:val="21"/>
-                <w:szCs w:val="21"/>
-                <w:lang w:val="en-GB" w:eastAsia="de-DE"/>
-              </w:rPr>
-              <w:t>'</w:t>
+              <w:t>'tmp_name'</w:t>
             </w:r>
             <w:r>
               <w:rPr>
@@ -18326,171 +18372,19 @@
                 <w:szCs w:val="21"/>
                 <w:lang w:val="en-GB" w:eastAsia="de-DE"/>
               </w:rPr>
-              <w:t>]));</w:t>
-            </w:r>
-          </w:p>
-          <w:p>
-            <w:pPr>
-              <w:shd w:val="clear" w:color="auto" w:fill="1E1E1E"/>
-              <w:spacing w:line="285" w:lineRule="atLeast"/>
-              <w:rPr>
-                <w:rFonts w:ascii="Consolas" w:eastAsia="Times New Roman" w:hAnsi="Consolas" w:cs="Times New Roman"/>
-                <w:color w:val="D4D4D4"/>
-                <w:sz w:val="21"/>
-                <w:szCs w:val="21"/>
-                <w:lang w:val="en-GB" w:eastAsia="de-DE"/>
-              </w:rPr>
-            </w:pPr>
-            <w:r>
-              <w:rPr>
-                <w:rFonts w:ascii="Consolas" w:eastAsia="Times New Roman" w:hAnsi="Consolas" w:cs="Times New Roman"/>
-                <w:color w:val="D4D4D4"/>
-                <w:sz w:val="21"/>
-                <w:szCs w:val="21"/>
-                <w:lang w:val="en-GB" w:eastAsia="de-DE"/>
-              </w:rPr>
-              <w:t xml:space="preserve">                    </w:t>
-            </w:r>
-            <w:r>
-              <w:rPr>
-                <w:rFonts w:ascii="Consolas" w:eastAsia="Times New Roman" w:hAnsi="Consolas" w:cs="Times New Roman"/>
-                <w:color w:val="9CDCFE"/>
-                <w:sz w:val="21"/>
-                <w:szCs w:val="21"/>
-                <w:lang w:val="en-GB" w:eastAsia="de-DE"/>
-              </w:rPr>
-              <w:t>$</w:t>
-            </w:r>
-            <w:proofErr w:type="spellStart"/>
-            <w:r>
-              <w:rPr>
-                <w:rFonts w:ascii="Consolas" w:eastAsia="Times New Roman" w:hAnsi="Consolas" w:cs="Times New Roman"/>
-                <w:color w:val="9CDCFE"/>
-                <w:sz w:val="21"/>
-                <w:szCs w:val="21"/>
-                <w:lang w:val="en-GB" w:eastAsia="de-DE"/>
-              </w:rPr>
-              <w:t>imageProperties</w:t>
-            </w:r>
-            <w:proofErr w:type="spellEnd"/>
-            <w:r>
-              <w:rPr>
-                <w:rFonts w:ascii="Consolas" w:eastAsia="Times New Roman" w:hAnsi="Consolas" w:cs="Times New Roman"/>
-                <w:color w:val="D4D4D4"/>
-                <w:sz w:val="21"/>
-                <w:szCs w:val="21"/>
-                <w:lang w:val="en-GB" w:eastAsia="de-DE"/>
-              </w:rPr>
-              <w:t xml:space="preserve"> = </w:t>
-            </w:r>
-            <w:proofErr w:type="spellStart"/>
-            <w:r>
-              <w:rPr>
-                <w:rFonts w:ascii="Consolas" w:eastAsia="Times New Roman" w:hAnsi="Consolas" w:cs="Times New Roman"/>
-                <w:color w:val="DCDCAA"/>
-                <w:sz w:val="21"/>
-                <w:szCs w:val="21"/>
-                <w:lang w:val="en-GB" w:eastAsia="de-DE"/>
-              </w:rPr>
-              <w:t>getimageSize</w:t>
-            </w:r>
-            <w:proofErr w:type="spellEnd"/>
-            <w:r>
-              <w:rPr>
-                <w:rFonts w:ascii="Consolas" w:eastAsia="Times New Roman" w:hAnsi="Consolas" w:cs="Times New Roman"/>
-                <w:color w:val="D4D4D4"/>
-                <w:sz w:val="21"/>
-                <w:szCs w:val="21"/>
-                <w:lang w:val="en-GB" w:eastAsia="de-DE"/>
-              </w:rPr>
-              <w:t>(</w:t>
-            </w:r>
-            <w:r>
-              <w:rPr>
-                <w:rFonts w:ascii="Consolas" w:eastAsia="Times New Roman" w:hAnsi="Consolas" w:cs="Times New Roman"/>
-                <w:color w:val="9CDCFE"/>
-                <w:sz w:val="21"/>
-                <w:szCs w:val="21"/>
-                <w:lang w:val="en-GB" w:eastAsia="de-DE"/>
-              </w:rPr>
-              <w:t>$_FILES</w:t>
-            </w:r>
-            <w:r>
-              <w:rPr>
-                <w:rFonts w:ascii="Consolas" w:eastAsia="Times New Roman" w:hAnsi="Consolas" w:cs="Times New Roman"/>
-                <w:color w:val="D4D4D4"/>
-                <w:sz w:val="21"/>
-                <w:szCs w:val="21"/>
-                <w:lang w:val="en-GB" w:eastAsia="de-DE"/>
-              </w:rPr>
-              <w:t>[</w:t>
-            </w:r>
-            <w:r>
-              <w:rPr>
-                <w:rFonts w:ascii="Consolas" w:eastAsia="Times New Roman" w:hAnsi="Consolas" w:cs="Times New Roman"/>
-                <w:color w:val="CE9178"/>
-                <w:sz w:val="21"/>
-                <w:szCs w:val="21"/>
-                <w:lang w:val="en-GB" w:eastAsia="de-DE"/>
-              </w:rPr>
-              <w:t>'filename'</w:t>
-            </w:r>
-            <w:r>
-              <w:rPr>
-                <w:rFonts w:ascii="Consolas" w:eastAsia="Times New Roman" w:hAnsi="Consolas" w:cs="Times New Roman"/>
-                <w:color w:val="D4D4D4"/>
-                <w:sz w:val="21"/>
-                <w:szCs w:val="21"/>
-                <w:lang w:val="en-GB" w:eastAsia="de-DE"/>
-              </w:rPr>
-              <w:t>][</w:t>
-            </w:r>
-            <w:r>
-              <w:rPr>
-                <w:rFonts w:ascii="Consolas" w:eastAsia="Times New Roman" w:hAnsi="Consolas" w:cs="Times New Roman"/>
-                <w:color w:val="CE9178"/>
-                <w:sz w:val="21"/>
-                <w:szCs w:val="21"/>
-                <w:lang w:val="en-GB" w:eastAsia="de-DE"/>
-              </w:rPr>
-              <w:t>'</w:t>
-            </w:r>
-            <w:proofErr w:type="spellStart"/>
-            <w:r>
-              <w:rPr>
-                <w:rFonts w:ascii="Consolas" w:eastAsia="Times New Roman" w:hAnsi="Consolas" w:cs="Times New Roman"/>
-                <w:color w:val="CE9178"/>
-                <w:sz w:val="21"/>
-                <w:szCs w:val="21"/>
-                <w:lang w:val="en-GB" w:eastAsia="de-DE"/>
-              </w:rPr>
-              <w:t>tmp_name</w:t>
-            </w:r>
-            <w:proofErr w:type="spellEnd"/>
-            <w:r>
-              <w:rPr>
-                <w:rFonts w:ascii="Consolas" w:eastAsia="Times New Roman" w:hAnsi="Consolas" w:cs="Times New Roman"/>
-                <w:color w:val="CE9178"/>
-                <w:sz w:val="21"/>
-                <w:szCs w:val="21"/>
-                <w:lang w:val="en-GB" w:eastAsia="de-DE"/>
-              </w:rPr>
-              <w:t>'</w:t>
-            </w:r>
-            <w:r>
-              <w:rPr>
-                <w:rFonts w:ascii="Consolas" w:eastAsia="Times New Roman" w:hAnsi="Consolas" w:cs="Times New Roman"/>
-                <w:color w:val="D4D4D4"/>
-                <w:sz w:val="21"/>
-                <w:szCs w:val="21"/>
-                <w:lang w:val="en-GB" w:eastAsia="de-DE"/>
-              </w:rPr>
               <w:t>]);</w:t>
             </w:r>
           </w:p>
           <w:p>
             <w:pPr>
               <w:rPr>
+                <w:lang w:val="en-GB"/>
+              </w:rPr>
+            </w:pPr>
+          </w:p>
+          <w:p>
+            <w:pPr>
+              <w:rPr>
                 <w:lang w:val="de-DE"/>
               </w:rPr>
             </w:pPr>
@@ -18498,376 +18392,7 @@
               <w:rPr>
                 <w:lang w:val="de-DE"/>
               </w:rPr>
-              <w:t>Die “</w:t>
-            </w:r>
-            <w:proofErr w:type="spellStart"/>
-            <w:r>
-              <w:rPr>
-                <w:lang w:val="de-DE"/>
-              </w:rPr>
-              <w:t>addslashes</w:t>
-            </w:r>
-            <w:proofErr w:type="spellEnd"/>
-            <w:r>
-              <w:rPr>
-                <w:lang w:val="de-DE"/>
-              </w:rPr>
-              <w:t>” Funktion fügt e</w:t>
-            </w:r>
-            <w:r>
-              <w:rPr>
-                <w:lang w:val="de-DE"/>
-              </w:rPr>
-              <w:t>in Slash am Ende hinzu, was zum Fehler geführt hat:</w:t>
-            </w:r>
-          </w:p>
-          <w:p>
-            <w:pPr>
-              <w:rPr>
-                <w:lang w:val="de-DE"/>
-              </w:rPr>
-            </w:pPr>
-          </w:p>
-          <w:p>
-            <w:pPr>
-              <w:shd w:val="clear" w:color="auto" w:fill="1E1E1E"/>
-              <w:spacing w:line="285" w:lineRule="atLeast"/>
-              <w:rPr>
-                <w:rFonts w:ascii="Consolas" w:eastAsia="Times New Roman" w:hAnsi="Consolas" w:cs="Times New Roman"/>
-                <w:color w:val="D4D4D4"/>
-                <w:sz w:val="21"/>
-                <w:szCs w:val="21"/>
-                <w:lang w:val="en-GB" w:eastAsia="de-DE"/>
-              </w:rPr>
-            </w:pPr>
-            <w:r>
-              <w:rPr>
-                <w:rFonts w:ascii="Consolas" w:eastAsia="Times New Roman" w:hAnsi="Consolas" w:cs="Times New Roman"/>
-                <w:color w:val="9CDCFE"/>
-                <w:sz w:val="21"/>
-                <w:szCs w:val="21"/>
-                <w:lang w:val="en-GB" w:eastAsia="de-DE"/>
-              </w:rPr>
-              <w:t>$</w:t>
-            </w:r>
-            <w:proofErr w:type="spellStart"/>
-            <w:r>
-              <w:rPr>
-                <w:rFonts w:ascii="Consolas" w:eastAsia="Times New Roman" w:hAnsi="Consolas" w:cs="Times New Roman"/>
-                <w:color w:val="9CDCFE"/>
-                <w:sz w:val="21"/>
-                <w:szCs w:val="21"/>
-                <w:lang w:val="en-GB" w:eastAsia="de-DE"/>
-              </w:rPr>
-              <w:t>imgData</w:t>
-            </w:r>
-            <w:proofErr w:type="spellEnd"/>
-            <w:r>
-              <w:rPr>
-                <w:rFonts w:ascii="Consolas" w:eastAsia="Times New Roman" w:hAnsi="Consolas" w:cs="Times New Roman"/>
-                <w:color w:val="D4D4D4"/>
-                <w:sz w:val="21"/>
-                <w:szCs w:val="21"/>
-                <w:lang w:val="en-GB" w:eastAsia="de-DE"/>
-              </w:rPr>
-              <w:t xml:space="preserve"> = </w:t>
-            </w:r>
-            <w:proofErr w:type="spellStart"/>
-            <w:r>
-              <w:rPr>
-                <w:rFonts w:ascii="Consolas" w:eastAsia="Times New Roman" w:hAnsi="Consolas" w:cs="Times New Roman"/>
-                <w:color w:val="DCDCAA"/>
-                <w:sz w:val="21"/>
-                <w:szCs w:val="21"/>
-                <w:lang w:val="en-GB" w:eastAsia="de-DE"/>
-              </w:rPr>
-              <w:t>file_get_contents</w:t>
-            </w:r>
-            <w:proofErr w:type="spellEnd"/>
-            <w:r>
-              <w:rPr>
-                <w:rFonts w:ascii="Consolas" w:eastAsia="Times New Roman" w:hAnsi="Consolas" w:cs="Times New Roman"/>
-                <w:color w:val="D4D4D4"/>
-                <w:sz w:val="21"/>
-                <w:szCs w:val="21"/>
-                <w:lang w:val="en-GB" w:eastAsia="de-DE"/>
-              </w:rPr>
-              <w:t>(</w:t>
-            </w:r>
-            <w:r>
-              <w:rPr>
-                <w:rFonts w:ascii="Consolas" w:eastAsia="Times New Roman" w:hAnsi="Consolas" w:cs="Times New Roman"/>
-                <w:color w:val="9CDCFE"/>
-                <w:sz w:val="21"/>
-                <w:szCs w:val="21"/>
-                <w:lang w:val="en-GB" w:eastAsia="de-DE"/>
-              </w:rPr>
-              <w:t>$_FILES</w:t>
-            </w:r>
-            <w:r>
-              <w:rPr>
-                <w:rFonts w:ascii="Consolas" w:eastAsia="Times New Roman" w:hAnsi="Consolas" w:cs="Times New Roman"/>
-                <w:color w:val="D4D4D4"/>
-                <w:sz w:val="21"/>
-                <w:szCs w:val="21"/>
-                <w:lang w:val="en-GB" w:eastAsia="de-DE"/>
-              </w:rPr>
-              <w:t>[</w:t>
-            </w:r>
-            <w:r>
-              <w:rPr>
-                <w:rFonts w:ascii="Consolas" w:eastAsia="Times New Roman" w:hAnsi="Consolas" w:cs="Times New Roman"/>
-                <w:color w:val="CE9178"/>
-                <w:sz w:val="21"/>
-                <w:szCs w:val="21"/>
-                <w:lang w:val="en-GB" w:eastAsia="de-DE"/>
-              </w:rPr>
-              <w:t>'filename'</w:t>
-            </w:r>
-            <w:r>
-              <w:rPr>
-                <w:rFonts w:ascii="Consolas" w:eastAsia="Times New Roman" w:hAnsi="Consolas" w:cs="Times New Roman"/>
-                <w:color w:val="D4D4D4"/>
-                <w:sz w:val="21"/>
-                <w:szCs w:val="21"/>
-                <w:lang w:val="en-GB" w:eastAsia="de-DE"/>
-              </w:rPr>
-              <w:t>][</w:t>
-            </w:r>
-            <w:r>
-              <w:rPr>
-                <w:rFonts w:ascii="Consolas" w:eastAsia="Times New Roman" w:hAnsi="Consolas" w:cs="Times New Roman"/>
-                <w:color w:val="CE9178"/>
-                <w:sz w:val="21"/>
-                <w:szCs w:val="21"/>
-                <w:lang w:val="en-GB" w:eastAsia="de-DE"/>
-              </w:rPr>
-              <w:t>'</w:t>
-            </w:r>
-            <w:proofErr w:type="spellStart"/>
-            <w:r>
-              <w:rPr>
-                <w:rFonts w:ascii="Consolas" w:eastAsia="Times New Roman" w:hAnsi="Consolas" w:cs="Times New Roman"/>
-                <w:color w:val="CE9178"/>
-                <w:sz w:val="21"/>
-                <w:szCs w:val="21"/>
-                <w:lang w:val="en-GB" w:eastAsia="de-DE"/>
-              </w:rPr>
-              <w:t>tmp_name</w:t>
-            </w:r>
-            <w:proofErr w:type="spellEnd"/>
-            <w:r>
-              <w:rPr>
-                <w:rFonts w:ascii="Consolas" w:eastAsia="Times New Roman" w:hAnsi="Consolas" w:cs="Times New Roman"/>
-                <w:color w:val="CE9178"/>
-                <w:sz w:val="21"/>
-                <w:szCs w:val="21"/>
-                <w:lang w:val="en-GB" w:eastAsia="de-DE"/>
-              </w:rPr>
-              <w:t>'</w:t>
-            </w:r>
-            <w:r>
-              <w:rPr>
-                <w:rFonts w:ascii="Consolas" w:eastAsia="Times New Roman" w:hAnsi="Consolas" w:cs="Times New Roman"/>
-                <w:color w:val="D4D4D4"/>
-                <w:sz w:val="21"/>
-                <w:szCs w:val="21"/>
-                <w:lang w:val="en-GB" w:eastAsia="de-DE"/>
-              </w:rPr>
-              <w:t>]);</w:t>
-            </w:r>
-          </w:p>
-          <w:p>
-            <w:pPr>
-              <w:shd w:val="clear" w:color="auto" w:fill="1E1E1E"/>
-              <w:spacing w:line="285" w:lineRule="atLeast"/>
-              <w:rPr>
-                <w:rFonts w:ascii="Consolas" w:eastAsia="Times New Roman" w:hAnsi="Consolas" w:cs="Times New Roman"/>
-                <w:color w:val="D4D4D4"/>
-                <w:sz w:val="21"/>
-                <w:szCs w:val="21"/>
-                <w:lang w:val="en-GB" w:eastAsia="de-DE"/>
-              </w:rPr>
-            </w:pPr>
-            <w:r>
-              <w:rPr>
-                <w:rFonts w:ascii="Consolas" w:eastAsia="Times New Roman" w:hAnsi="Consolas" w:cs="Times New Roman"/>
-                <w:color w:val="D4D4D4"/>
-                <w:sz w:val="21"/>
-                <w:szCs w:val="21"/>
-                <w:lang w:val="en-GB" w:eastAsia="de-DE"/>
-              </w:rPr>
-              <w:t xml:space="preserve">                    </w:t>
-            </w:r>
-            <w:r>
-              <w:rPr>
-                <w:rFonts w:ascii="Consolas" w:eastAsia="Times New Roman" w:hAnsi="Consolas" w:cs="Times New Roman"/>
-                <w:color w:val="9CDCFE"/>
-                <w:sz w:val="21"/>
-                <w:szCs w:val="21"/>
-                <w:lang w:val="en-GB" w:eastAsia="de-DE"/>
-              </w:rPr>
-              <w:t>$</w:t>
-            </w:r>
-            <w:proofErr w:type="spellStart"/>
-            <w:r>
-              <w:rPr>
-                <w:rFonts w:ascii="Consolas" w:eastAsia="Times New Roman" w:hAnsi="Consolas" w:cs="Times New Roman"/>
-                <w:color w:val="9CDCFE"/>
-                <w:sz w:val="21"/>
-                <w:szCs w:val="21"/>
-                <w:lang w:val="en-GB" w:eastAsia="de-DE"/>
-              </w:rPr>
-              <w:t>imageProperties</w:t>
-            </w:r>
-            <w:proofErr w:type="spellEnd"/>
-            <w:r>
-              <w:rPr>
-                <w:rFonts w:ascii="Consolas" w:eastAsia="Times New Roman" w:hAnsi="Consolas" w:cs="Times New Roman"/>
-                <w:color w:val="D4D4D4"/>
-                <w:sz w:val="21"/>
-                <w:szCs w:val="21"/>
-                <w:lang w:val="en-GB" w:eastAsia="de-DE"/>
-              </w:rPr>
-              <w:t xml:space="preserve"> = </w:t>
-            </w:r>
-            <w:proofErr w:type="spellStart"/>
-            <w:r>
-              <w:rPr>
-                <w:rFonts w:ascii="Consolas" w:eastAsia="Times New Roman" w:hAnsi="Consolas" w:cs="Times New Roman"/>
-                <w:color w:val="DCDCAA"/>
-                <w:sz w:val="21"/>
-                <w:szCs w:val="21"/>
-                <w:lang w:val="en-GB" w:eastAsia="de-DE"/>
-              </w:rPr>
-              <w:t>getimageSize</w:t>
-            </w:r>
-            <w:proofErr w:type="spellEnd"/>
-            <w:r>
-              <w:rPr>
-                <w:rFonts w:ascii="Consolas" w:eastAsia="Times New Roman" w:hAnsi="Consolas" w:cs="Times New Roman"/>
-                <w:color w:val="D4D4D4"/>
-                <w:sz w:val="21"/>
-                <w:szCs w:val="21"/>
-                <w:lang w:val="en-GB" w:eastAsia="de-DE"/>
-              </w:rPr>
-              <w:t>(</w:t>
-            </w:r>
-            <w:r>
-              <w:rPr>
-                <w:rFonts w:ascii="Consolas" w:eastAsia="Times New Roman" w:hAnsi="Consolas" w:cs="Times New Roman"/>
-                <w:color w:val="9CDCFE"/>
-                <w:sz w:val="21"/>
-                <w:szCs w:val="21"/>
-                <w:lang w:val="en-GB" w:eastAsia="de-DE"/>
-              </w:rPr>
-              <w:t>$_FILES</w:t>
-            </w:r>
-            <w:r>
-              <w:rPr>
-                <w:rFonts w:ascii="Consolas" w:eastAsia="Times New Roman" w:hAnsi="Consolas" w:cs="Times New Roman"/>
-                <w:color w:val="D4D4D4"/>
-                <w:sz w:val="21"/>
-                <w:szCs w:val="21"/>
-                <w:lang w:val="en-GB" w:eastAsia="de-DE"/>
-              </w:rPr>
-              <w:t>[</w:t>
-            </w:r>
-            <w:r>
-              <w:rPr>
-                <w:rFonts w:ascii="Consolas" w:eastAsia="Times New Roman" w:hAnsi="Consolas" w:cs="Times New Roman"/>
-                <w:color w:val="CE9178"/>
-                <w:sz w:val="21"/>
-                <w:szCs w:val="21"/>
-                <w:lang w:val="en-GB" w:eastAsia="de-DE"/>
-              </w:rPr>
-              <w:t>'filename'</w:t>
-            </w:r>
-            <w:r>
-              <w:rPr>
-                <w:rFonts w:ascii="Consolas" w:eastAsia="Times New Roman" w:hAnsi="Consolas" w:cs="Times New Roman"/>
-                <w:color w:val="D4D4D4"/>
-                <w:sz w:val="21"/>
-                <w:szCs w:val="21"/>
-                <w:lang w:val="en-GB" w:eastAsia="de-DE"/>
-              </w:rPr>
-              <w:t>][</w:t>
-            </w:r>
-            <w:r>
-              <w:rPr>
-                <w:rFonts w:ascii="Consolas" w:eastAsia="Times New Roman" w:hAnsi="Consolas" w:cs="Times New Roman"/>
-                <w:color w:val="CE9178"/>
-                <w:sz w:val="21"/>
-                <w:szCs w:val="21"/>
-                <w:lang w:val="en-GB" w:eastAsia="de-DE"/>
-              </w:rPr>
-              <w:t>'</w:t>
-            </w:r>
-            <w:proofErr w:type="spellStart"/>
-            <w:r>
-              <w:rPr>
-                <w:rFonts w:ascii="Consolas" w:eastAsia="Times New Roman" w:hAnsi="Consolas" w:cs="Times New Roman"/>
-                <w:color w:val="CE9178"/>
-                <w:sz w:val="21"/>
-                <w:szCs w:val="21"/>
-                <w:lang w:val="en-GB" w:eastAsia="de-DE"/>
-              </w:rPr>
-              <w:t>tmp_name</w:t>
-            </w:r>
-            <w:proofErr w:type="spellEnd"/>
-            <w:r>
-              <w:rPr>
-                <w:rFonts w:ascii="Consolas" w:eastAsia="Times New Roman" w:hAnsi="Consolas" w:cs="Times New Roman"/>
-                <w:color w:val="CE9178"/>
-                <w:sz w:val="21"/>
-                <w:szCs w:val="21"/>
-                <w:lang w:val="en-GB" w:eastAsia="de-DE"/>
-              </w:rPr>
-              <w:t>'</w:t>
-            </w:r>
-            <w:r>
-              <w:rPr>
-                <w:rFonts w:ascii="Consolas" w:eastAsia="Times New Roman" w:hAnsi="Consolas" w:cs="Times New Roman"/>
-                <w:color w:val="D4D4D4"/>
-                <w:sz w:val="21"/>
-                <w:szCs w:val="21"/>
-                <w:lang w:val="en-GB" w:eastAsia="de-DE"/>
-              </w:rPr>
-              <w:t>]);</w:t>
-            </w:r>
-          </w:p>
-          <w:p>
-            <w:pPr>
-              <w:rPr>
-                <w:lang w:val="en-GB"/>
-              </w:rPr>
-            </w:pPr>
-          </w:p>
-          <w:p>
-            <w:pPr>
-              <w:rPr>
-                <w:lang w:val="de-DE"/>
-              </w:rPr>
-            </w:pPr>
-            <w:r>
-              <w:rPr>
-                <w:lang w:val="de-DE"/>
-              </w:rPr>
-              <w:t>Nachdem man die “</w:t>
-            </w:r>
-            <w:proofErr w:type="spellStart"/>
-            <w:r>
-              <w:rPr>
-                <w:lang w:val="de-DE"/>
-              </w:rPr>
-              <w:t>addslashes</w:t>
-            </w:r>
-            <w:proofErr w:type="spellEnd"/>
-            <w:r>
-              <w:rPr>
-                <w:lang w:val="de-DE"/>
-              </w:rPr>
-              <w:t>” F</w:t>
+              <w:t>Nachdem man die “addslashes” F</w:t>
             </w:r>
             <w:r>
               <w:rPr>
@@ -19052,11 +18577,9 @@
               <w:pStyle w:val="K-Einzug"/>
               <w:ind w:left="0"/>
             </w:pPr>
-            <w:proofErr w:type="spellStart"/>
             <w:r>
               <w:t>Ballwil</w:t>
             </w:r>
-            <w:proofErr w:type="spellEnd"/>
           </w:p>
         </w:tc>
         <w:tc>
@@ -19225,33 +18748,17 @@
       <w:pPr>
         <w:pStyle w:val="K-Einzug"/>
       </w:pPr>
-      <w:r>
-        <w:fldChar w:fldCharType="begin"/>
-      </w:r>
-      <w:r>
-        <w:instrText xml:space="preserve"> TOC \h \z \c "Abbildung" </w:instrText>
-      </w:r>
-      <w:r>
-        <w:fldChar w:fldCharType="separate"/>
-      </w:r>
-      <w:r>
-        <w:rPr>
-          <w:b/>
-          <w:bCs w:val="0"/>
-          <w:noProof/>
-          <w:lang w:val="de-DE"/>
-        </w:rPr>
-        <w:t>Es konnten keine Einträge für ein Abbildungsverzeichnis gefunden werden.</w:t>
-      </w:r>
-      <w:r>
-        <w:rPr>
-          <w:b/>
-          <w:bCs w:val="0"/>
-          <w:noProof/>
-          <w:lang w:val="de-DE"/>
-        </w:rPr>
-        <w:fldChar w:fldCharType="end"/>
-      </w:r>
+      <w:fldSimple w:instr=" TOC \h \z \c &quot;Abbildung&quot; ">
+        <w:r>
+          <w:rPr>
+            <w:b/>
+            <w:bCs w:val="0"/>
+            <w:noProof/>
+            <w:lang w:val="de-DE"/>
+          </w:rPr>
+          <w:t>Es konnten keine Einträge für ein Abbildungsverzeichnis gefunden werden.</w:t>
+        </w:r>
+      </w:fldSimple>
     </w:p>
     <w:p/>
     <w:p>
@@ -20378,36 +19885,15 @@
               <w:sz w:val="18"/>
             </w:rPr>
             <w:br/>
-          </w:r>
-          <w:proofErr w:type="spellStart"/>
-          <w:r>
-            <w:rPr>
-              <w:sz w:val="18"/>
-            </w:rPr>
-            <w:t>Luzernstrasse</w:t>
-          </w:r>
-          <w:proofErr w:type="spellEnd"/>
-          <w:r>
-            <w:rPr>
-              <w:sz w:val="18"/>
-            </w:rPr>
-            <w:t xml:space="preserve"> 18</w:t>
+            <w:t>Luzernstrasse 18</w:t>
           </w:r>
           <w:r>
             <w:rPr>
               <w:sz w:val="18"/>
             </w:rPr>
             <w:br/>
-            <w:t xml:space="preserve">6275 </w:t>
+            <w:t>6275 Ballwil</w:t>
           </w:r>
-          <w:proofErr w:type="spellStart"/>
-          <w:r>
-            <w:rPr>
-              <w:sz w:val="18"/>
-            </w:rPr>
-            <w:t>Ballwil</w:t>
-          </w:r>
-          <w:proofErr w:type="spellEnd"/>
         </w:p>
       </w:tc>
       <w:tc>
@@ -25228,6 +24714,7 @@
     <w:rsid w:val="00962AB4"/>
     <w:rsid w:val="009A34D4"/>
     <w:rsid w:val="00A32E5C"/>
+    <w:rsid w:val="00A656EB"/>
     <w:rsid w:val="00BB548A"/>
     <w:rsid w:val="00BD1F16"/>
     <w:rsid w:val="00C62BDB"/>

</xml_diff>

<commit_message>
Client side valid edit image + server side valid
</commit_message>
<xml_diff>
--- a/docs/PA_Fotostudio_Doku.docx
+++ b/docs/PA_Fotostudio_Doku.docx
@@ -9536,6 +9536,9 @@
             <w:r>
               <w:t>Aufgabe 1</w:t>
             </w:r>
+            <w:r>
+              <w:t>: Bild ändern und löschen</w:t>
+            </w:r>
           </w:p>
           <w:p>
             <w:r>
@@ -9744,7 +9747,11 @@
               </w:rPr>
             </w:pPr>
             <w:r>
-              <w:t>Text…</w:t>
+              <w:rPr>
+                <w:b/>
+                <w:bCs/>
+              </w:rPr>
+              <w:t>Nach langem ausprobieren kann man nun hochgeladene Bilder ändern und löschen.</w:t>
             </w:r>
           </w:p>
         </w:tc>
@@ -14800,14 +14807,27 @@
         <w:lastRenderedPageBreak/>
         <w:t xml:space="preserve">Abbildung </w:t>
       </w:r>
-      <w:fldSimple w:instr=" SEQ Abbildung \* ARABIC ">
-        <w:r>
-          <w:rPr>
-            <w:noProof/>
-          </w:rPr>
-          <w:t>1</w:t>
-        </w:r>
-      </w:fldSimple>
+      <w:r>
+        <w:fldChar w:fldCharType="begin"/>
+      </w:r>
+      <w:r>
+        <w:instrText xml:space="preserve"> SEQ Abbildung \* ARABIC </w:instrText>
+      </w:r>
+      <w:r>
+        <w:fldChar w:fldCharType="separate"/>
+      </w:r>
+      <w:r>
+        <w:rPr>
+          <w:noProof/>
+        </w:rPr>
+        <w:t>1</w:t>
+      </w:r>
+      <w:r>
+        <w:rPr>
+          <w:noProof/>
+        </w:rPr>
+        <w:fldChar w:fldCharType="end"/>
+      </w:r>
       <w:r>
         <w:t>: Use Case Diagram</w:t>
       </w:r>
@@ -18748,17 +18768,33 @@
       <w:pPr>
         <w:pStyle w:val="K-Einzug"/>
       </w:pPr>
-      <w:fldSimple w:instr=" TOC \h \z \c &quot;Abbildung&quot; ">
-        <w:r>
-          <w:rPr>
-            <w:b/>
-            <w:bCs w:val="0"/>
-            <w:noProof/>
-            <w:lang w:val="de-DE"/>
-          </w:rPr>
-          <w:t>Es konnten keine Einträge für ein Abbildungsverzeichnis gefunden werden.</w:t>
-        </w:r>
-      </w:fldSimple>
+      <w:r>
+        <w:fldChar w:fldCharType="begin"/>
+      </w:r>
+      <w:r>
+        <w:instrText xml:space="preserve"> TOC \h \z \c "Abbildung" </w:instrText>
+      </w:r>
+      <w:r>
+        <w:fldChar w:fldCharType="separate"/>
+      </w:r>
+      <w:r>
+        <w:rPr>
+          <w:b/>
+          <w:bCs w:val="0"/>
+          <w:noProof/>
+          <w:lang w:val="de-DE"/>
+        </w:rPr>
+        <w:t>Es konnten keine Einträge für ein Abbildungsverzeichnis gefunden werden.</w:t>
+      </w:r>
+      <w:r>
+        <w:rPr>
+          <w:b/>
+          <w:bCs w:val="0"/>
+          <w:noProof/>
+          <w:lang w:val="de-DE"/>
+        </w:rPr>
+        <w:fldChar w:fldCharType="end"/>
+      </w:r>
     </w:p>
     <w:p/>
     <w:p>
@@ -24719,6 +24755,7 @@
     <w:rsid w:val="00BD1F16"/>
     <w:rsid w:val="00C62BDB"/>
     <w:rsid w:val="00C64852"/>
+    <w:rsid w:val="00C72819"/>
     <w:rsid w:val="00D01ED4"/>
     <w:rsid w:val="00D55047"/>
     <w:rsid w:val="00D773A4"/>

</xml_diff>

<commit_message>
Responsive Navbar and security features
</commit_message>
<xml_diff>
--- a/docs/PA_Fotostudio_Doku.docx
+++ b/docs/PA_Fotostudio_Doku.docx
@@ -9646,59 +9646,6 @@
             <w:r>
               <w:t xml:space="preserve"> </w:t>
             </w:r>
-            <w:r>
-              <w:rPr>
-                <w:noProof/>
-              </w:rPr>
-              <w:drawing>
-                <wp:inline distT="0" distB="0" distL="0" distR="0" wp14:anchorId="391FEDF0" wp14:editId="18F7E589">
-                  <wp:extent cx="216000" cy="216000"/>
-                  <wp:effectExtent l="0" t="0" r="0" b="0"/>
-                  <wp:docPr id="9" name="Grafik 9"/>
-                  <wp:cNvGraphicFramePr>
-                    <a:graphicFrameLocks xmlns:a="http://schemas.openxmlformats.org/drawingml/2006/main" noChangeAspect="1"/>
-                  </wp:cNvGraphicFramePr>
-                  <a:graphic xmlns:a="http://schemas.openxmlformats.org/drawingml/2006/main">
-                    <a:graphicData uri="http://schemas.openxmlformats.org/drawingml/2006/picture">
-                      <pic:pic xmlns:pic="http://schemas.openxmlformats.org/drawingml/2006/picture">
-                        <pic:nvPicPr>
-                          <pic:cNvPr id="0" name="Grafik 9"/>
-                          <pic:cNvPicPr>
-                            <a:picLocks noChangeAspect="1" noChangeArrowheads="1"/>
-                          </pic:cNvPicPr>
-                        </pic:nvPicPr>
-                        <pic:blipFill>
-                          <a:blip r:embed="rId19">
-                            <a:extLst>
-                              <a:ext uri="{28A0092B-C50C-407E-A947-70E740481C1C}">
-                                <a14:useLocalDpi xmlns:a14="http://schemas.microsoft.com/office/drawing/2010/main" val="0"/>
-                              </a:ext>
-                            </a:extLst>
-                          </a:blip>
-                          <a:srcRect l="-5115" t="-5115" r="-5115" b="-5115"/>
-                          <a:stretch>
-                            <a:fillRect/>
-                          </a:stretch>
-                        </pic:blipFill>
-                        <pic:spPr bwMode="auto">
-                          <a:xfrm>
-                            <a:off x="0" y="0"/>
-                            <a:ext cx="216000" cy="216000"/>
-                          </a:xfrm>
-                          <a:prstGeom prst="rect">
-                            <a:avLst/>
-                          </a:prstGeom>
-                          <a:noFill/>
-                          <a:ln>
-                            <a:noFill/>
-                          </a:ln>
-                        </pic:spPr>
-                      </pic:pic>
-                    </a:graphicData>
-                  </a:graphic>
-                </wp:inline>
-              </w:drawing>
-            </w:r>
           </w:p>
         </w:tc>
       </w:tr>
@@ -9792,7 +9739,11 @@
             <w:tcW w:w="9081" w:type="dxa"/>
             <w:gridSpan w:val="4"/>
           </w:tcPr>
-          <w:p/>
+          <w:p>
+            <w:r>
+              <w:t>Heute traten eine Menge Fehler auf. Allerdings alle gegen 14:20 Uhr. Der erste war ein Logikfehler im Code und der zweite kam aus dem nichts. Dabei konnte ich im XAMPP mysql nicht mehr starten. Nach dem Neuinstallieren von XAMPP und der Deinstallation von VM ware funktionierte es wieder.</w:t>
+            </w:r>
+          </w:p>
         </w:tc>
       </w:tr>
       <w:tr>
@@ -9831,7 +9782,11 @@
             <w:tcW w:w="9081" w:type="dxa"/>
             <w:gridSpan w:val="4"/>
           </w:tcPr>
-          <w:p/>
+          <w:p>
+            <w:r>
+              <w:t>Bilder können geändert und gelöscht werden.</w:t>
+            </w:r>
+          </w:p>
         </w:tc>
       </w:tr>
       <w:tr>
@@ -9870,7 +9825,11 @@
             <w:tcW w:w="9081" w:type="dxa"/>
             <w:gridSpan w:val="4"/>
           </w:tcPr>
-          <w:p/>
+          <w:p>
+            <w:r>
+              <w:t>Heute habe ich von Janik Lüthi für den zweiten Fehler Hilfe gebraucht.</w:t>
+            </w:r>
+          </w:p>
         </w:tc>
       </w:tr>
       <w:tr>
@@ -9909,7 +9868,20 @@
             <w:tcW w:w="9081" w:type="dxa"/>
             <w:gridSpan w:val="4"/>
           </w:tcPr>
-          <w:p/>
+          <w:p>
+            <w:r>
+              <w:t>Laut Zeitplan stehe ich sehr gut. Es fehlen nur noch die Tests</w:t>
+            </w:r>
+            <w:r>
+              <w:t>, ein</w:t>
+            </w:r>
+            <w:r>
+              <w:t xml:space="preserve"> paar Diagramme</w:t>
+            </w:r>
+            <w:r>
+              <w:t xml:space="preserve"> und einzelne kleine Dinge.</w:t>
+            </w:r>
+          </w:p>
         </w:tc>
       </w:tr>
       <w:tr>
@@ -9954,6 +9926,12 @@
                 <w:bCs/>
               </w:rPr>
             </w:pPr>
+            <w:r>
+              <w:rPr>
+                <w:bCs/>
+              </w:rPr>
+              <w:t>Ich bin für heute zufrieden, da ich meine Aufgabe erledigen konnte.</w:t>
+            </w:r>
           </w:p>
         </w:tc>
       </w:tr>
@@ -10510,6 +10488,7 @@
       <w:bookmarkStart w:id="32" w:name="_Toc25148316"/>
       <w:bookmarkStart w:id="33" w:name="_Toc110858274"/>
       <w:r>
+        <w:lastRenderedPageBreak/>
         <w:t xml:space="preserve">Tag 7: </w:t>
       </w:r>
       <w:bookmarkEnd w:id="32"/>
@@ -10628,7 +10607,6 @@
           </w:p>
           <w:p>
             <w:r>
-              <w:lastRenderedPageBreak/>
               <w:t>Aufgabe 2</w:t>
             </w:r>
           </w:p>
@@ -10640,7 +10618,6 @@
           </w:tcPr>
           <w:p>
             <w:r>
-              <w:lastRenderedPageBreak/>
               <w:t>Erreicht</w:t>
             </w:r>
           </w:p>
@@ -12024,6 +12001,7 @@
               <w:rPr>
                 <w:b/>
               </w:rPr>
+              <w:lastRenderedPageBreak/>
               <w:t>Beanspruchte Hilfe</w:t>
             </w:r>
           </w:p>
@@ -14807,27 +14785,14 @@
         <w:lastRenderedPageBreak/>
         <w:t xml:space="preserve">Abbildung </w:t>
       </w:r>
-      <w:r>
-        <w:fldChar w:fldCharType="begin"/>
-      </w:r>
-      <w:r>
-        <w:instrText xml:space="preserve"> SEQ Abbildung \* ARABIC </w:instrText>
-      </w:r>
-      <w:r>
-        <w:fldChar w:fldCharType="separate"/>
-      </w:r>
-      <w:r>
-        <w:rPr>
-          <w:noProof/>
-        </w:rPr>
-        <w:t>1</w:t>
-      </w:r>
-      <w:r>
-        <w:rPr>
-          <w:noProof/>
-        </w:rPr>
-        <w:fldChar w:fldCharType="end"/>
-      </w:r>
+      <w:fldSimple w:instr=" SEQ Abbildung \* ARABIC ">
+        <w:r>
+          <w:rPr>
+            <w:noProof/>
+          </w:rPr>
+          <w:t>1</w:t>
+        </w:r>
+      </w:fldSimple>
       <w:r>
         <w:t>: Use Case Diagram</w:t>
       </w:r>
@@ -18768,33 +18733,17 @@
       <w:pPr>
         <w:pStyle w:val="K-Einzug"/>
       </w:pPr>
-      <w:r>
-        <w:fldChar w:fldCharType="begin"/>
-      </w:r>
-      <w:r>
-        <w:instrText xml:space="preserve"> TOC \h \z \c "Abbildung" </w:instrText>
-      </w:r>
-      <w:r>
-        <w:fldChar w:fldCharType="separate"/>
-      </w:r>
-      <w:r>
-        <w:rPr>
-          <w:b/>
-          <w:bCs w:val="0"/>
-          <w:noProof/>
-          <w:lang w:val="de-DE"/>
-        </w:rPr>
-        <w:t>Es konnten keine Einträge für ein Abbildungsverzeichnis gefunden werden.</w:t>
-      </w:r>
-      <w:r>
-        <w:rPr>
-          <w:b/>
-          <w:bCs w:val="0"/>
-          <w:noProof/>
-          <w:lang w:val="de-DE"/>
-        </w:rPr>
-        <w:fldChar w:fldCharType="end"/>
-      </w:r>
+      <w:fldSimple w:instr=" TOC \h \z \c &quot;Abbildung&quot; ">
+        <w:r>
+          <w:rPr>
+            <w:b/>
+            <w:bCs w:val="0"/>
+            <w:noProof/>
+            <w:lang w:val="de-DE"/>
+          </w:rPr>
+          <w:t>Es konnten keine Einträge für ein Abbildungsverzeichnis gefunden werden.</w:t>
+        </w:r>
+      </w:fldSimple>
     </w:p>
     <w:p/>
     <w:p>
@@ -24746,6 +24695,7 @@
     <w:rsid w:val="00510DBA"/>
     <w:rsid w:val="005F5EC3"/>
     <w:rsid w:val="006D7424"/>
+    <w:rsid w:val="00752337"/>
     <w:rsid w:val="0089013A"/>
     <w:rsid w:val="00962AB4"/>
     <w:rsid w:val="009A34D4"/>

</xml_diff>

<commit_message>
Fixing bugs + Security features
</commit_message>
<xml_diff>
--- a/docs/PA_Fotostudio_Doku.docx
+++ b/docs/PA_Fotostudio_Doku.docx
@@ -9646,481 +9646,15 @@
             <w:r>
               <w:t xml:space="preserve"> </w:t>
             </w:r>
-          </w:p>
-        </w:tc>
-      </w:tr>
-      <w:tr>
-        <w:trPr>
-          <w:cnfStyle w:val="000000100000" w:firstRow="0" w:lastRow="0" w:firstColumn="0" w:lastColumn="0" w:oddVBand="0" w:evenVBand="0" w:oddHBand="1" w:evenHBand="0" w:firstRowFirstColumn="0" w:firstRowLastColumn="0" w:lastRowFirstColumn="0" w:lastRowLastColumn="0"/>
-          <w:trHeight w:val="18"/>
-        </w:trPr>
-        <w:tc>
-          <w:tcPr>
-            <w:tcW w:w="9081" w:type="dxa"/>
-            <w:gridSpan w:val="4"/>
-            <w:hideMark/>
-          </w:tcPr>
-          <w:p>
-            <w:pPr>
-              <w:rPr>
-                <w:b/>
-                <w:bCs/>
-              </w:rPr>
-            </w:pPr>
-            <w:r>
-              <w:rPr>
-                <w:b/>
-              </w:rPr>
-              <w:t>Erreichte Ziele &amp; abgeschlossene Arbeit</w:t>
-            </w:r>
-          </w:p>
-        </w:tc>
-      </w:tr>
-      <w:tr>
-        <w:trPr>
-          <w:trHeight w:val="20"/>
-        </w:trPr>
-        <w:tc>
-          <w:tcPr>
-            <w:tcW w:w="9081" w:type="dxa"/>
-            <w:gridSpan w:val="4"/>
-            <w:hideMark/>
-          </w:tcPr>
-          <w:p>
-            <w:pPr>
-              <w:rPr>
-                <w:b/>
-                <w:bCs/>
-              </w:rPr>
-            </w:pPr>
-            <w:r>
-              <w:rPr>
-                <w:b/>
-                <w:bCs/>
-              </w:rPr>
-              <w:t>Nach langem ausprobieren kann man nun hochgeladene Bilder ändern und löschen.</w:t>
-            </w:r>
-          </w:p>
-        </w:tc>
-      </w:tr>
-      <w:tr>
-        <w:trPr>
-          <w:cnfStyle w:val="000000100000" w:firstRow="0" w:lastRow="0" w:firstColumn="0" w:lastColumn="0" w:oddVBand="0" w:evenVBand="0" w:oddHBand="1" w:evenHBand="0" w:firstRowFirstColumn="0" w:firstRowLastColumn="0" w:lastRowFirstColumn="0" w:lastRowLastColumn="0"/>
-          <w:trHeight w:val="18"/>
-        </w:trPr>
-        <w:tc>
-          <w:tcPr>
-            <w:tcW w:w="9081" w:type="dxa"/>
-            <w:gridSpan w:val="4"/>
-            <w:hideMark/>
-          </w:tcPr>
-          <w:p>
-            <w:pPr>
-              <w:rPr>
-                <w:b/>
-                <w:bCs/>
-              </w:rPr>
-            </w:pPr>
-            <w:r>
-              <w:rPr>
-                <w:b/>
-              </w:rPr>
-              <w:t>Aufgetretene Probleme</w:t>
-            </w:r>
-          </w:p>
-        </w:tc>
-      </w:tr>
-      <w:tr>
-        <w:trPr>
-          <w:trHeight w:val="18"/>
-        </w:trPr>
-        <w:tc>
-          <w:tcPr>
-            <w:tcW w:w="9081" w:type="dxa"/>
-            <w:gridSpan w:val="4"/>
-          </w:tcPr>
-          <w:p>
-            <w:r>
-              <w:t>Heute traten eine Menge Fehler auf. Allerdings alle gegen 14:20 Uhr. Der erste war ein Logikfehler im Code und der zweite kam aus dem nichts. Dabei konnte ich im XAMPP mysql nicht mehr starten. Nach dem Neuinstallieren von XAMPP und der Deinstallation von VM ware funktionierte es wieder.</w:t>
-            </w:r>
-          </w:p>
-        </w:tc>
-      </w:tr>
-      <w:tr>
-        <w:trPr>
-          <w:cnfStyle w:val="000000100000" w:firstRow="0" w:lastRow="0" w:firstColumn="0" w:lastColumn="0" w:oddVBand="0" w:evenVBand="0" w:oddHBand="1" w:evenHBand="0" w:firstRowFirstColumn="0" w:firstRowLastColumn="0" w:lastRowFirstColumn="0" w:lastRowLastColumn="0"/>
-          <w:trHeight w:val="18"/>
-        </w:trPr>
-        <w:tc>
-          <w:tcPr>
-            <w:tcW w:w="9081" w:type="dxa"/>
-            <w:gridSpan w:val="4"/>
-            <w:hideMark/>
-          </w:tcPr>
-          <w:p>
-            <w:pPr>
-              <w:rPr>
-                <w:b/>
-                <w:bCs/>
-              </w:rPr>
-            </w:pPr>
-            <w:r>
-              <w:rPr>
-                <w:b/>
-              </w:rPr>
-              <w:t>Erfolgreiche oder erfolglose Tests</w:t>
-            </w:r>
-          </w:p>
-        </w:tc>
-      </w:tr>
-      <w:tr>
-        <w:trPr>
-          <w:trHeight w:val="18"/>
-        </w:trPr>
-        <w:tc>
-          <w:tcPr>
-            <w:tcW w:w="9081" w:type="dxa"/>
-            <w:gridSpan w:val="4"/>
-          </w:tcPr>
-          <w:p>
-            <w:r>
-              <w:t>Bilder können geändert und gelöscht werden.</w:t>
-            </w:r>
-          </w:p>
-        </w:tc>
-      </w:tr>
-      <w:tr>
-        <w:trPr>
-          <w:cnfStyle w:val="000000100000" w:firstRow="0" w:lastRow="0" w:firstColumn="0" w:lastColumn="0" w:oddVBand="0" w:evenVBand="0" w:oddHBand="1" w:evenHBand="0" w:firstRowFirstColumn="0" w:firstRowLastColumn="0" w:lastRowFirstColumn="0" w:lastRowLastColumn="0"/>
-          <w:trHeight w:val="18"/>
-        </w:trPr>
-        <w:tc>
-          <w:tcPr>
-            <w:tcW w:w="9081" w:type="dxa"/>
-            <w:gridSpan w:val="4"/>
-            <w:hideMark/>
-          </w:tcPr>
-          <w:p>
-            <w:pPr>
-              <w:rPr>
-                <w:b/>
-                <w:bCs/>
-              </w:rPr>
-            </w:pPr>
-            <w:r>
-              <w:rPr>
-                <w:b/>
-              </w:rPr>
-              <w:t>Beanspruchte Hilfe</w:t>
-            </w:r>
-          </w:p>
-        </w:tc>
-      </w:tr>
-      <w:tr>
-        <w:trPr>
-          <w:trHeight w:val="18"/>
-        </w:trPr>
-        <w:tc>
-          <w:tcPr>
-            <w:tcW w:w="9081" w:type="dxa"/>
-            <w:gridSpan w:val="4"/>
-          </w:tcPr>
-          <w:p>
-            <w:r>
-              <w:t>Heute habe ich von Janik Lüthi für den zweiten Fehler Hilfe gebraucht.</w:t>
-            </w:r>
-          </w:p>
-        </w:tc>
-      </w:tr>
-      <w:tr>
-        <w:trPr>
-          <w:cnfStyle w:val="000000100000" w:firstRow="0" w:lastRow="0" w:firstColumn="0" w:lastColumn="0" w:oddVBand="0" w:evenVBand="0" w:oddHBand="1" w:evenHBand="0" w:firstRowFirstColumn="0" w:firstRowLastColumn="0" w:lastRowFirstColumn="0" w:lastRowLastColumn="0"/>
-          <w:trHeight w:val="18"/>
-        </w:trPr>
-        <w:tc>
-          <w:tcPr>
-            <w:tcW w:w="9081" w:type="dxa"/>
-            <w:gridSpan w:val="4"/>
-            <w:hideMark/>
-          </w:tcPr>
-          <w:p>
-            <w:pPr>
-              <w:rPr>
-                <w:b/>
-                <w:bCs/>
-              </w:rPr>
-            </w:pPr>
-            <w:r>
-              <w:rPr>
-                <w:b/>
-              </w:rPr>
-              <w:t>Vergleich mit Zeitplan</w:t>
-            </w:r>
-          </w:p>
-        </w:tc>
-      </w:tr>
-      <w:tr>
-        <w:trPr>
-          <w:trHeight w:val="18"/>
-        </w:trPr>
-        <w:tc>
-          <w:tcPr>
-            <w:tcW w:w="9081" w:type="dxa"/>
-            <w:gridSpan w:val="4"/>
-          </w:tcPr>
-          <w:p>
-            <w:r>
-              <w:t>Laut Zeitplan stehe ich sehr gut. Es fehlen nur noch die Tests</w:t>
-            </w:r>
-            <w:r>
-              <w:t>, ein</w:t>
-            </w:r>
-            <w:r>
-              <w:t xml:space="preserve"> paar Diagramme</w:t>
-            </w:r>
-            <w:r>
-              <w:t xml:space="preserve"> und einzelne kleine Dinge.</w:t>
-            </w:r>
-          </w:p>
-        </w:tc>
-      </w:tr>
-      <w:tr>
-        <w:trPr>
-          <w:cnfStyle w:val="000000100000" w:firstRow="0" w:lastRow="0" w:firstColumn="0" w:lastColumn="0" w:oddVBand="0" w:evenVBand="0" w:oddHBand="1" w:evenHBand="0" w:firstRowFirstColumn="0" w:firstRowLastColumn="0" w:lastRowFirstColumn="0" w:lastRowLastColumn="0"/>
-          <w:trHeight w:val="18"/>
-        </w:trPr>
-        <w:tc>
-          <w:tcPr>
-            <w:tcW w:w="9081" w:type="dxa"/>
-            <w:gridSpan w:val="4"/>
-            <w:hideMark/>
-          </w:tcPr>
-          <w:p>
-            <w:pPr>
-              <w:rPr>
-                <w:b/>
-                <w:bCs/>
-              </w:rPr>
-            </w:pPr>
-            <w:r>
-              <w:rPr>
-                <w:b/>
-              </w:rPr>
-              <w:t>Reflexion</w:t>
-            </w:r>
-          </w:p>
-        </w:tc>
-      </w:tr>
-      <w:tr>
-        <w:trPr>
-          <w:trHeight w:val="18"/>
-        </w:trPr>
-        <w:tc>
-          <w:tcPr>
-            <w:tcW w:w="9081" w:type="dxa"/>
-            <w:gridSpan w:val="4"/>
-          </w:tcPr>
-          <w:p>
-            <w:pPr>
-              <w:rPr>
-                <w:bCs/>
-              </w:rPr>
-            </w:pPr>
-            <w:r>
-              <w:rPr>
-                <w:bCs/>
-              </w:rPr>
-              <w:t>Ich bin für heute zufrieden, da ich meine Aufgabe erledigen konnte.</w:t>
-            </w:r>
-          </w:p>
-        </w:tc>
-      </w:tr>
-    </w:tbl>
-    <w:p>
-      <w:pPr>
-        <w:ind w:left="709"/>
-      </w:pPr>
-    </w:p>
-    <w:p>
-      <w:pPr>
-        <w:pStyle w:val="berschrift3"/>
-      </w:pPr>
-      <w:bookmarkStart w:id="31" w:name="_Toc110858273"/>
-      <w:r>
-        <w:t xml:space="preserve">Tag 6: </w:t>
-      </w:r>
-      <w:r>
-        <w:t>16.08.2022</w:t>
-      </w:r>
-      <w:bookmarkEnd w:id="31"/>
-    </w:p>
-    <w:tbl>
-      <w:tblPr>
-        <w:tblStyle w:val="Kauzfarbig"/>
-        <w:tblW w:w="9081" w:type="dxa"/>
-        <w:tblLook w:val="04A0" w:firstRow="1" w:lastRow="0" w:firstColumn="1" w:lastColumn="0" w:noHBand="0" w:noVBand="1"/>
-      </w:tblPr>
-      <w:tblGrid>
-        <w:gridCol w:w="2385"/>
-        <w:gridCol w:w="2108"/>
-        <w:gridCol w:w="3234"/>
-        <w:gridCol w:w="1354"/>
-      </w:tblGrid>
-      <w:tr>
-        <w:trPr>
-          <w:cnfStyle w:val="100000000000" w:firstRow="1" w:lastRow="0" w:firstColumn="0" w:lastColumn="0" w:oddVBand="0" w:evenVBand="0" w:oddHBand="0" w:evenHBand="0" w:firstRowFirstColumn="0" w:firstRowLastColumn="0" w:lastRowFirstColumn="0" w:lastRowLastColumn="0"/>
-          <w:trHeight w:val="18"/>
-        </w:trPr>
-        <w:tc>
-          <w:tcPr>
-            <w:tcW w:w="4493" w:type="dxa"/>
-            <w:gridSpan w:val="2"/>
-            <w:hideMark/>
-          </w:tcPr>
-          <w:p>
-            <w:r>
-              <w:t>Anwesenheit:</w:t>
-            </w:r>
-            <w:r>
-              <w:rPr>
-                <w:b w:val="0"/>
-              </w:rPr>
-              <w:t xml:space="preserve"> 8:00-17:00</w:t>
-            </w:r>
-          </w:p>
-        </w:tc>
-        <w:tc>
-          <w:tcPr>
-            <w:tcW w:w="3234" w:type="dxa"/>
-            <w:hideMark/>
-          </w:tcPr>
-          <w:p>
-            <w:pPr>
-              <w:jc w:val="right"/>
-            </w:pPr>
-            <w:r>
-              <w:t>Arbeitszeit:</w:t>
-            </w:r>
-          </w:p>
-        </w:tc>
-        <w:tc>
-          <w:tcPr>
-            <w:tcW w:w="1353" w:type="dxa"/>
-            <w:hideMark/>
-          </w:tcPr>
-          <w:p>
-            <w:pPr>
-              <w:rPr>
-                <w:b w:val="0"/>
-                <w:bCs/>
-              </w:rPr>
-            </w:pPr>
-            <w:r>
-              <w:rPr>
-                <w:b w:val="0"/>
-              </w:rPr>
-              <w:t>8 Stunden</w:t>
-            </w:r>
-          </w:p>
-        </w:tc>
-      </w:tr>
-      <w:tr>
-        <w:trPr>
-          <w:cnfStyle w:val="000000100000" w:firstRow="0" w:lastRow="0" w:firstColumn="0" w:lastColumn="0" w:oddVBand="0" w:evenVBand="0" w:oddHBand="1" w:evenHBand="0" w:firstRowFirstColumn="0" w:firstRowLastColumn="0" w:lastRowFirstColumn="0" w:lastRowLastColumn="0"/>
-          <w:trHeight w:val="18"/>
-        </w:trPr>
-        <w:tc>
-          <w:tcPr>
-            <w:tcW w:w="2385" w:type="dxa"/>
-            <w:vMerge w:val="restart"/>
-            <w:hideMark/>
-          </w:tcPr>
-          <w:p>
-            <w:pPr>
-              <w:rPr>
-                <w:b/>
-                <w:bCs/>
-              </w:rPr>
-            </w:pPr>
-            <w:r>
-              <w:rPr>
-                <w:b/>
-              </w:rPr>
-              <w:t>Geplante Arbeit</w:t>
-            </w:r>
-          </w:p>
-        </w:tc>
-        <w:tc>
-          <w:tcPr>
-            <w:tcW w:w="5342" w:type="dxa"/>
-            <w:gridSpan w:val="2"/>
-            <w:vMerge w:val="restart"/>
-            <w:hideMark/>
-          </w:tcPr>
-          <w:p>
-            <w:r>
-              <w:t>Aufgabe 1</w:t>
-            </w:r>
-          </w:p>
-          <w:p>
-            <w:r>
-              <w:t>Aufgabe 2</w:t>
-            </w:r>
-          </w:p>
-        </w:tc>
-        <w:tc>
-          <w:tcPr>
-            <w:tcW w:w="1353" w:type="dxa"/>
-            <w:hideMark/>
-          </w:tcPr>
-          <w:p>
-            <w:r>
-              <w:t>Erreicht</w:t>
-            </w:r>
-          </w:p>
-        </w:tc>
-      </w:tr>
-      <w:tr>
-        <w:trPr>
-          <w:trHeight w:val="18"/>
-        </w:trPr>
-        <w:tc>
-          <w:tcPr>
-            <w:tcW w:w="0" w:type="auto"/>
-            <w:vMerge/>
-            <w:hideMark/>
-          </w:tcPr>
-          <w:p/>
-        </w:tc>
-        <w:tc>
-          <w:tcPr>
-            <w:tcW w:w="0" w:type="auto"/>
-            <w:gridSpan w:val="2"/>
-            <w:vMerge/>
-            <w:hideMark/>
-          </w:tcPr>
-          <w:p/>
-        </w:tc>
-        <w:tc>
-          <w:tcPr>
-            <w:tcW w:w="1353" w:type="dxa"/>
-            <w:hideMark/>
-          </w:tcPr>
-          <w:p>
-            <w:pPr>
+            <w:r>
               <w:rPr>
                 <w:noProof/>
               </w:rPr>
-            </w:pPr>
-            <w:r>
-              <w:rPr>
-                <w:noProof/>
-              </w:rPr>
               <w:drawing>
-                <wp:inline distT="0" distB="0" distL="0" distR="0" wp14:anchorId="071F2030" wp14:editId="502280DE">
+                <wp:inline distT="0" distB="0" distL="0" distR="0" wp14:anchorId="391FEDF0" wp14:editId="18F7E589">
                   <wp:extent cx="216000" cy="216000"/>
                   <wp:effectExtent l="0" t="0" r="0" b="0"/>
-                  <wp:docPr id="10" name="Grafik 10"/>
+                  <wp:docPr id="9" name="Grafik 9"/>
                   <wp:cNvGraphicFramePr>
                     <a:graphicFrameLocks xmlns:a="http://schemas.openxmlformats.org/drawingml/2006/main" noChangeAspect="1"/>
                   </wp:cNvGraphicFramePr>
@@ -10128,20 +9662,20 @@
                     <a:graphicData uri="http://schemas.openxmlformats.org/drawingml/2006/picture">
                       <pic:pic xmlns:pic="http://schemas.openxmlformats.org/drawingml/2006/picture">
                         <pic:nvPicPr>
-                          <pic:cNvPr id="0" name="Grafik 10"/>
+                          <pic:cNvPr id="0" name="Grafik 9"/>
                           <pic:cNvPicPr>
                             <a:picLocks noChangeAspect="1" noChangeArrowheads="1"/>
                           </pic:cNvPicPr>
                         </pic:nvPicPr>
                         <pic:blipFill>
-                          <a:blip r:embed="rId18">
+                          <a:blip r:embed="rId19">
                             <a:extLst>
                               <a:ext uri="{28A0092B-C50C-407E-A947-70E740481C1C}">
                                 <a14:useLocalDpi xmlns:a14="http://schemas.microsoft.com/office/drawing/2010/main" val="0"/>
                               </a:ext>
                             </a:extLst>
                           </a:blip>
-                          <a:srcRect/>
+                          <a:srcRect l="-5115" t="-5115" r="-5115" b="-5115"/>
                           <a:stretch>
                             <a:fillRect/>
                           </a:stretch>
@@ -10165,6 +9699,464 @@
                 </wp:inline>
               </w:drawing>
             </w:r>
+          </w:p>
+        </w:tc>
+      </w:tr>
+      <w:tr>
+        <w:trPr>
+          <w:cnfStyle w:val="000000100000" w:firstRow="0" w:lastRow="0" w:firstColumn="0" w:lastColumn="0" w:oddVBand="0" w:evenVBand="0" w:oddHBand="1" w:evenHBand="0" w:firstRowFirstColumn="0" w:firstRowLastColumn="0" w:lastRowFirstColumn="0" w:lastRowLastColumn="0"/>
+          <w:trHeight w:val="18"/>
+        </w:trPr>
+        <w:tc>
+          <w:tcPr>
+            <w:tcW w:w="9081" w:type="dxa"/>
+            <w:gridSpan w:val="4"/>
+            <w:hideMark/>
+          </w:tcPr>
+          <w:p>
+            <w:pPr>
+              <w:rPr>
+                <w:b/>
+                <w:bCs/>
+              </w:rPr>
+            </w:pPr>
+            <w:r>
+              <w:rPr>
+                <w:b/>
+              </w:rPr>
+              <w:t>Erreichte Ziele &amp; abgeschlossene Arbeit</w:t>
+            </w:r>
+          </w:p>
+        </w:tc>
+      </w:tr>
+      <w:tr>
+        <w:trPr>
+          <w:trHeight w:val="20"/>
+        </w:trPr>
+        <w:tc>
+          <w:tcPr>
+            <w:tcW w:w="9081" w:type="dxa"/>
+            <w:gridSpan w:val="4"/>
+            <w:hideMark/>
+          </w:tcPr>
+          <w:p>
+            <w:pPr>
+              <w:rPr>
+                <w:b/>
+                <w:bCs/>
+              </w:rPr>
+            </w:pPr>
+            <w:r>
+              <w:rPr>
+                <w:b/>
+                <w:bCs/>
+              </w:rPr>
+              <w:t>Nach langem ausprobieren kann man nun hochgeladene Bilder ändern und löschen.</w:t>
+            </w:r>
+          </w:p>
+        </w:tc>
+      </w:tr>
+      <w:tr>
+        <w:trPr>
+          <w:cnfStyle w:val="000000100000" w:firstRow="0" w:lastRow="0" w:firstColumn="0" w:lastColumn="0" w:oddVBand="0" w:evenVBand="0" w:oddHBand="1" w:evenHBand="0" w:firstRowFirstColumn="0" w:firstRowLastColumn="0" w:lastRowFirstColumn="0" w:lastRowLastColumn="0"/>
+          <w:trHeight w:val="18"/>
+        </w:trPr>
+        <w:tc>
+          <w:tcPr>
+            <w:tcW w:w="9081" w:type="dxa"/>
+            <w:gridSpan w:val="4"/>
+            <w:hideMark/>
+          </w:tcPr>
+          <w:p>
+            <w:pPr>
+              <w:rPr>
+                <w:b/>
+                <w:bCs/>
+              </w:rPr>
+            </w:pPr>
+            <w:r>
+              <w:rPr>
+                <w:b/>
+              </w:rPr>
+              <w:t>Aufgetretene Probleme</w:t>
+            </w:r>
+          </w:p>
+        </w:tc>
+      </w:tr>
+      <w:tr>
+        <w:trPr>
+          <w:trHeight w:val="18"/>
+        </w:trPr>
+        <w:tc>
+          <w:tcPr>
+            <w:tcW w:w="9081" w:type="dxa"/>
+            <w:gridSpan w:val="4"/>
+          </w:tcPr>
+          <w:p/>
+        </w:tc>
+      </w:tr>
+      <w:tr>
+        <w:trPr>
+          <w:cnfStyle w:val="000000100000" w:firstRow="0" w:lastRow="0" w:firstColumn="0" w:lastColumn="0" w:oddVBand="0" w:evenVBand="0" w:oddHBand="1" w:evenHBand="0" w:firstRowFirstColumn="0" w:firstRowLastColumn="0" w:lastRowFirstColumn="0" w:lastRowLastColumn="0"/>
+          <w:trHeight w:val="18"/>
+        </w:trPr>
+        <w:tc>
+          <w:tcPr>
+            <w:tcW w:w="9081" w:type="dxa"/>
+            <w:gridSpan w:val="4"/>
+            <w:hideMark/>
+          </w:tcPr>
+          <w:p>
+            <w:pPr>
+              <w:rPr>
+                <w:b/>
+                <w:bCs/>
+              </w:rPr>
+            </w:pPr>
+            <w:r>
+              <w:rPr>
+                <w:b/>
+              </w:rPr>
+              <w:t>Erfolgreiche oder erfolglose Tests</w:t>
+            </w:r>
+          </w:p>
+        </w:tc>
+      </w:tr>
+      <w:tr>
+        <w:trPr>
+          <w:trHeight w:val="18"/>
+        </w:trPr>
+        <w:tc>
+          <w:tcPr>
+            <w:tcW w:w="9081" w:type="dxa"/>
+            <w:gridSpan w:val="4"/>
+          </w:tcPr>
+          <w:p/>
+        </w:tc>
+      </w:tr>
+      <w:tr>
+        <w:trPr>
+          <w:cnfStyle w:val="000000100000" w:firstRow="0" w:lastRow="0" w:firstColumn="0" w:lastColumn="0" w:oddVBand="0" w:evenVBand="0" w:oddHBand="1" w:evenHBand="0" w:firstRowFirstColumn="0" w:firstRowLastColumn="0" w:lastRowFirstColumn="0" w:lastRowLastColumn="0"/>
+          <w:trHeight w:val="18"/>
+        </w:trPr>
+        <w:tc>
+          <w:tcPr>
+            <w:tcW w:w="9081" w:type="dxa"/>
+            <w:gridSpan w:val="4"/>
+            <w:hideMark/>
+          </w:tcPr>
+          <w:p>
+            <w:pPr>
+              <w:rPr>
+                <w:b/>
+                <w:bCs/>
+              </w:rPr>
+            </w:pPr>
+            <w:r>
+              <w:rPr>
+                <w:b/>
+              </w:rPr>
+              <w:t>Beanspruchte Hilfe</w:t>
+            </w:r>
+          </w:p>
+        </w:tc>
+      </w:tr>
+      <w:tr>
+        <w:trPr>
+          <w:trHeight w:val="18"/>
+        </w:trPr>
+        <w:tc>
+          <w:tcPr>
+            <w:tcW w:w="9081" w:type="dxa"/>
+            <w:gridSpan w:val="4"/>
+          </w:tcPr>
+          <w:p/>
+        </w:tc>
+      </w:tr>
+      <w:tr>
+        <w:trPr>
+          <w:cnfStyle w:val="000000100000" w:firstRow="0" w:lastRow="0" w:firstColumn="0" w:lastColumn="0" w:oddVBand="0" w:evenVBand="0" w:oddHBand="1" w:evenHBand="0" w:firstRowFirstColumn="0" w:firstRowLastColumn="0" w:lastRowFirstColumn="0" w:lastRowLastColumn="0"/>
+          <w:trHeight w:val="18"/>
+        </w:trPr>
+        <w:tc>
+          <w:tcPr>
+            <w:tcW w:w="9081" w:type="dxa"/>
+            <w:gridSpan w:val="4"/>
+            <w:hideMark/>
+          </w:tcPr>
+          <w:p>
+            <w:pPr>
+              <w:rPr>
+                <w:b/>
+                <w:bCs/>
+              </w:rPr>
+            </w:pPr>
+            <w:r>
+              <w:rPr>
+                <w:b/>
+              </w:rPr>
+              <w:t>Vergleich mit Zeitplan</w:t>
+            </w:r>
+          </w:p>
+        </w:tc>
+      </w:tr>
+      <w:tr>
+        <w:trPr>
+          <w:trHeight w:val="18"/>
+        </w:trPr>
+        <w:tc>
+          <w:tcPr>
+            <w:tcW w:w="9081" w:type="dxa"/>
+            <w:gridSpan w:val="4"/>
+          </w:tcPr>
+          <w:p/>
+        </w:tc>
+      </w:tr>
+      <w:tr>
+        <w:trPr>
+          <w:cnfStyle w:val="000000100000" w:firstRow="0" w:lastRow="0" w:firstColumn="0" w:lastColumn="0" w:oddVBand="0" w:evenVBand="0" w:oddHBand="1" w:evenHBand="0" w:firstRowFirstColumn="0" w:firstRowLastColumn="0" w:lastRowFirstColumn="0" w:lastRowLastColumn="0"/>
+          <w:trHeight w:val="18"/>
+        </w:trPr>
+        <w:tc>
+          <w:tcPr>
+            <w:tcW w:w="9081" w:type="dxa"/>
+            <w:gridSpan w:val="4"/>
+            <w:hideMark/>
+          </w:tcPr>
+          <w:p>
+            <w:pPr>
+              <w:rPr>
+                <w:b/>
+                <w:bCs/>
+              </w:rPr>
+            </w:pPr>
+            <w:r>
+              <w:rPr>
+                <w:b/>
+              </w:rPr>
+              <w:t>Reflexion</w:t>
+            </w:r>
+          </w:p>
+        </w:tc>
+      </w:tr>
+      <w:tr>
+        <w:trPr>
+          <w:trHeight w:val="18"/>
+        </w:trPr>
+        <w:tc>
+          <w:tcPr>
+            <w:tcW w:w="9081" w:type="dxa"/>
+            <w:gridSpan w:val="4"/>
+          </w:tcPr>
+          <w:p>
+            <w:pPr>
+              <w:rPr>
+                <w:bCs/>
+              </w:rPr>
+            </w:pPr>
+          </w:p>
+        </w:tc>
+      </w:tr>
+    </w:tbl>
+    <w:p>
+      <w:pPr>
+        <w:ind w:left="709"/>
+      </w:pPr>
+    </w:p>
+    <w:p>
+      <w:pPr>
+        <w:pStyle w:val="berschrift3"/>
+      </w:pPr>
+      <w:bookmarkStart w:id="31" w:name="_Toc110858273"/>
+      <w:r>
+        <w:t xml:space="preserve">Tag 6: </w:t>
+      </w:r>
+      <w:r>
+        <w:t>16.08.2022</w:t>
+      </w:r>
+      <w:bookmarkEnd w:id="31"/>
+    </w:p>
+    <w:tbl>
+      <w:tblPr>
+        <w:tblStyle w:val="Kauzfarbig"/>
+        <w:tblW w:w="9081" w:type="dxa"/>
+        <w:tblLook w:val="04A0" w:firstRow="1" w:lastRow="0" w:firstColumn="1" w:lastColumn="0" w:noHBand="0" w:noVBand="1"/>
+      </w:tblPr>
+      <w:tblGrid>
+        <w:gridCol w:w="2385"/>
+        <w:gridCol w:w="2108"/>
+        <w:gridCol w:w="3234"/>
+        <w:gridCol w:w="1354"/>
+      </w:tblGrid>
+      <w:tr>
+        <w:trPr>
+          <w:cnfStyle w:val="100000000000" w:firstRow="1" w:lastRow="0" w:firstColumn="0" w:lastColumn="0" w:oddVBand="0" w:evenVBand="0" w:oddHBand="0" w:evenHBand="0" w:firstRowFirstColumn="0" w:firstRowLastColumn="0" w:lastRowFirstColumn="0" w:lastRowLastColumn="0"/>
+          <w:trHeight w:val="18"/>
+        </w:trPr>
+        <w:tc>
+          <w:tcPr>
+            <w:tcW w:w="4493" w:type="dxa"/>
+            <w:gridSpan w:val="2"/>
+            <w:hideMark/>
+          </w:tcPr>
+          <w:p>
+            <w:r>
+              <w:t>Anwesenheit:</w:t>
+            </w:r>
+            <w:r>
+              <w:rPr>
+                <w:b w:val="0"/>
+              </w:rPr>
+              <w:t xml:space="preserve"> 8:00-17:00</w:t>
+            </w:r>
+          </w:p>
+        </w:tc>
+        <w:tc>
+          <w:tcPr>
+            <w:tcW w:w="3234" w:type="dxa"/>
+            <w:hideMark/>
+          </w:tcPr>
+          <w:p>
+            <w:pPr>
+              <w:jc w:val="right"/>
+            </w:pPr>
+            <w:r>
+              <w:t>Arbeitszeit:</w:t>
+            </w:r>
+          </w:p>
+        </w:tc>
+        <w:tc>
+          <w:tcPr>
+            <w:tcW w:w="1353" w:type="dxa"/>
+            <w:hideMark/>
+          </w:tcPr>
+          <w:p>
+            <w:pPr>
+              <w:rPr>
+                <w:b w:val="0"/>
+                <w:bCs/>
+              </w:rPr>
+            </w:pPr>
+            <w:r>
+              <w:rPr>
+                <w:b w:val="0"/>
+              </w:rPr>
+              <w:t>8 Stunden</w:t>
+            </w:r>
+          </w:p>
+        </w:tc>
+      </w:tr>
+      <w:tr>
+        <w:trPr>
+          <w:cnfStyle w:val="000000100000" w:firstRow="0" w:lastRow="0" w:firstColumn="0" w:lastColumn="0" w:oddVBand="0" w:evenVBand="0" w:oddHBand="1" w:evenHBand="0" w:firstRowFirstColumn="0" w:firstRowLastColumn="0" w:lastRowFirstColumn="0" w:lastRowLastColumn="0"/>
+          <w:trHeight w:val="18"/>
+        </w:trPr>
+        <w:tc>
+          <w:tcPr>
+            <w:tcW w:w="2385" w:type="dxa"/>
+            <w:vMerge w:val="restart"/>
+            <w:hideMark/>
+          </w:tcPr>
+          <w:p>
+            <w:pPr>
+              <w:rPr>
+                <w:b/>
+                <w:bCs/>
+              </w:rPr>
+            </w:pPr>
+            <w:r>
+              <w:rPr>
+                <w:b/>
+              </w:rPr>
+              <w:t>Geplante Arbeit</w:t>
+            </w:r>
+          </w:p>
+        </w:tc>
+        <w:tc>
+          <w:tcPr>
+            <w:tcW w:w="5342" w:type="dxa"/>
+            <w:gridSpan w:val="2"/>
+            <w:vMerge w:val="restart"/>
+            <w:hideMark/>
+          </w:tcPr>
+          <w:p>
+            <w:pPr>
+              <w:rPr>
+                <w:lang w:val="fr-CH"/>
+              </w:rPr>
+            </w:pPr>
+            <w:r>
+              <w:rPr>
+                <w:lang w:val="fr-CH"/>
+              </w:rPr>
+              <w:t>Aufgabe 1</w:t>
+            </w:r>
+            <w:r>
+              <w:rPr>
+                <w:lang w:val="fr-CH"/>
+              </w:rPr>
+              <w:t>:Responsive Navbar + Responsive De</w:t>
+            </w:r>
+            <w:r>
+              <w:rPr>
+                <w:lang w:val="fr-CH"/>
+              </w:rPr>
+              <w:t>sign</w:t>
+            </w:r>
+          </w:p>
+          <w:p>
+            <w:r>
+              <w:t>Aufgabe 2</w:t>
+            </w:r>
+            <w:r>
+              <w:t>: Code Refactoring</w:t>
+            </w:r>
+          </w:p>
+        </w:tc>
+        <w:tc>
+          <w:tcPr>
+            <w:tcW w:w="1353" w:type="dxa"/>
+            <w:hideMark/>
+          </w:tcPr>
+          <w:p>
+            <w:r>
+              <w:t>Erreicht</w:t>
+            </w:r>
+          </w:p>
+        </w:tc>
+      </w:tr>
+      <w:tr>
+        <w:trPr>
+          <w:trHeight w:val="18"/>
+        </w:trPr>
+        <w:tc>
+          <w:tcPr>
+            <w:tcW w:w="0" w:type="auto"/>
+            <w:vMerge/>
+            <w:hideMark/>
+          </w:tcPr>
+          <w:p/>
+        </w:tc>
+        <w:tc>
+          <w:tcPr>
+            <w:tcW w:w="0" w:type="auto"/>
+            <w:gridSpan w:val="2"/>
+            <w:vMerge/>
+            <w:hideMark/>
+          </w:tcPr>
+          <w:p/>
+        </w:tc>
+        <w:tc>
+          <w:tcPr>
+            <w:tcW w:w="1353" w:type="dxa"/>
+            <w:hideMark/>
+          </w:tcPr>
+          <w:p>
+            <w:pPr>
+              <w:rPr>
+                <w:noProof/>
+              </w:rPr>
+            </w:pPr>
             <w:r>
               <w:t xml:space="preserve"> </w:t>
             </w:r>
@@ -10264,12 +10256,14 @@
           <w:p>
             <w:pPr>
               <w:rPr>
-                <w:b/>
                 <w:bCs/>
               </w:rPr>
             </w:pPr>
             <w:r>
-              <w:t>Text…</w:t>
+              <w:rPr>
+                <w:bCs/>
+              </w:rPr>
+              <w:t>Heute konnte ich das Responsive Design für die Navigation hinzufügen.</w:t>
             </w:r>
           </w:p>
         </w:tc>
@@ -10310,7 +10304,20 @@
             <w:tcW w:w="9081" w:type="dxa"/>
             <w:gridSpan w:val="4"/>
           </w:tcPr>
-          <w:p/>
+          <w:p>
+            <w:r>
+              <w:t xml:space="preserve">Heute Morgen traten keine Probleme auf. Alles lief wie am Schnürchen, bis ich gegen Nachmittag Code entfernt habe und aufgeteilt habe für bessere Übersicht. Ab da lief dann nicht mehr viel. Man konnte zwar Bilder noch hinzufügen, aber Benutzer </w:t>
+            </w:r>
+            <w:r>
+              <w:t>können</w:t>
+            </w:r>
+            <w:r>
+              <w:t xml:space="preserve"> keine mehr hinzugefügt werden.</w:t>
+            </w:r>
+            <w:r>
+              <w:t xml:space="preserve"> Ich habe alles gründlich durchgecheckt und habe das Gefühl, da der Computer ständig überhitzt und an seine Grenzen kommt, dass es evtl am Computer liegt.</w:t>
+            </w:r>
+          </w:p>
         </w:tc>
       </w:tr>
       <w:tr>
@@ -10388,7 +10395,11 @@
             <w:tcW w:w="9081" w:type="dxa"/>
             <w:gridSpan w:val="4"/>
           </w:tcPr>
-          <w:p/>
+          <w:p>
+            <w:r>
+              <w:t>Heute habe ich keine Hilfe beansprucht.</w:t>
+            </w:r>
+          </w:p>
         </w:tc>
       </w:tr>
       <w:tr>
@@ -10427,7 +10438,11 @@
             <w:tcW w:w="9081" w:type="dxa"/>
             <w:gridSpan w:val="4"/>
           </w:tcPr>
-          <w:p/>
+          <w:p>
+            <w:r>
+              <w:t>Laut Zeitplan liege ich nicht schlecht, kam allerdings nicht wirklich vorwärts.</w:t>
+            </w:r>
+          </w:p>
         </w:tc>
       </w:tr>
       <w:tr>
@@ -10472,6 +10487,19 @@
                 <w:bCs/>
               </w:rPr>
             </w:pPr>
+            <w:r>
+              <w:rPr>
+                <w:bCs/>
+              </w:rPr>
+              <w:t xml:space="preserve">Ich bin mit heute sulala zufrieden. Ich konnte zwar ein Ziel erreichen, aber nicht das andere und dies enttäuscht mich. Zudem kann ich nicht wirklich nachvollziehen, weshalb mein Computer </w:t>
+            </w:r>
+            <w:r>
+              <w:rPr>
+                <w:bCs/>
+              </w:rPr>
+              <w:lastRenderedPageBreak/>
+              <w:t>plötzlich anfing zu überhitzen und an dem Zeitpunkt man auch keine neuen Benutzer hinzufügen kann. Ist für mich unerklärlich.</w:t>
+            </w:r>
           </w:p>
         </w:tc>
       </w:tr>
@@ -10488,7 +10516,6 @@
       <w:bookmarkStart w:id="32" w:name="_Toc25148316"/>
       <w:bookmarkStart w:id="33" w:name="_Toc110858274"/>
       <w:r>
-        <w:lastRenderedPageBreak/>
         <w:t xml:space="preserve">Tag 7: </w:t>
       </w:r>
       <w:bookmarkEnd w:id="32"/>
@@ -11923,6 +11950,7 @@
               <w:rPr>
                 <w:b/>
               </w:rPr>
+              <w:lastRenderedPageBreak/>
               <w:t>Aufgetretene Probleme</w:t>
             </w:r>
           </w:p>
@@ -12001,7 +12029,6 @@
               <w:rPr>
                 <w:b/>
               </w:rPr>
-              <w:lastRenderedPageBreak/>
               <w:t>Beanspruchte Hilfe</w:t>
             </w:r>
           </w:p>
@@ -24690,12 +24717,13 @@
     <w:rsid w:val="00294465"/>
     <w:rsid w:val="002A790C"/>
     <w:rsid w:val="002C6637"/>
+    <w:rsid w:val="003A34CC"/>
     <w:rsid w:val="00487EB2"/>
     <w:rsid w:val="004D1121"/>
     <w:rsid w:val="00510DBA"/>
+    <w:rsid w:val="00591DD4"/>
     <w:rsid w:val="005F5EC3"/>
     <w:rsid w:val="006D7424"/>
-    <w:rsid w:val="00752337"/>
     <w:rsid w:val="0089013A"/>
     <w:rsid w:val="00962AB4"/>
     <w:rsid w:val="009A34D4"/>

</xml_diff>

<commit_message>
Code Refactoring + Kommentare
</commit_message>
<xml_diff>
--- a/docs/PA_Fotostudio_Doku.docx
+++ b/docs/PA_Fotostudio_Doku.docx
@@ -6027,14 +6027,24 @@
             </w:r>
           </w:p>
           <w:p>
-            <w:r>
-              <w:t>Luzernstrasse 18</w:t>
-            </w:r>
-          </w:p>
-          <w:p>
-            <w:r>
-              <w:t>6275 Ballwil</w:t>
-            </w:r>
+            <w:proofErr w:type="spellStart"/>
+            <w:r>
+              <w:t>Luzernstrasse</w:t>
+            </w:r>
+            <w:proofErr w:type="spellEnd"/>
+            <w:r>
+              <w:t xml:space="preserve"> 18</w:t>
+            </w:r>
+          </w:p>
+          <w:p>
+            <w:r>
+              <w:t xml:space="preserve">6275 </w:t>
+            </w:r>
+            <w:proofErr w:type="spellStart"/>
+            <w:r>
+              <w:t>Ballwil</w:t>
+            </w:r>
+            <w:proofErr w:type="spellEnd"/>
           </w:p>
           <w:p>
             <w:r>
@@ -6156,11 +6166,19 @@
               </w:sdtPr>
               <w:sdtEndPr/>
               <w:sdtContent>
+                <w:proofErr w:type="spellStart"/>
                 <w:r>
                   <w:rPr>
                     <w:color w:val="FF0000"/>
                   </w:rPr>
-                  <w:t>Luzernstrasse 18</w:t>
+                  <w:t>Luzernstrasse</w:t>
+                </w:r>
+                <w:proofErr w:type="spellEnd"/>
+                <w:r>
+                  <w:rPr>
+                    <w:color w:val="FF0000"/>
+                  </w:rPr>
+                  <w:t xml:space="preserve"> 18</w:t>
                 </w:r>
               </w:sdtContent>
             </w:sdt>
@@ -6287,8 +6305,16 @@
               <w:rPr>
                 <w:color w:val="FF0000"/>
               </w:rPr>
-              <w:t>Ruggiero Pelliccione</w:t>
-            </w:r>
+              <w:t xml:space="preserve">Ruggiero </w:t>
+            </w:r>
+            <w:proofErr w:type="spellStart"/>
+            <w:r>
+              <w:rPr>
+                <w:color w:val="FF0000"/>
+              </w:rPr>
+              <w:t>Pelliccione</w:t>
+            </w:r>
+            <w:proofErr w:type="spellEnd"/>
           </w:p>
           <w:p>
             <w:r>
@@ -6296,14 +6322,24 @@
             </w:r>
           </w:p>
           <w:p>
-            <w:r>
-              <w:t>Luzernstrasse 18</w:t>
-            </w:r>
-          </w:p>
-          <w:p>
-            <w:r>
-              <w:t>6275 Ballwil</w:t>
-            </w:r>
+            <w:proofErr w:type="spellStart"/>
+            <w:r>
+              <w:t>Luzernstrasse</w:t>
+            </w:r>
+            <w:proofErr w:type="spellEnd"/>
+            <w:r>
+              <w:t xml:space="preserve"> 18</w:t>
+            </w:r>
+          </w:p>
+          <w:p>
+            <w:r>
+              <w:t xml:space="preserve">6275 </w:t>
+            </w:r>
+            <w:proofErr w:type="spellStart"/>
+            <w:r>
+              <w:t>Ballwil</w:t>
+            </w:r>
+            <w:proofErr w:type="spellEnd"/>
           </w:p>
           <w:p>
             <w:pPr>
@@ -6378,8 +6414,13 @@
           </w:p>
           <w:p>
             <w:r>
-              <w:t>6275 Ballwil</w:t>
-            </w:r>
+              <w:t xml:space="preserve">6275 </w:t>
+            </w:r>
+            <w:proofErr w:type="spellStart"/>
+            <w:r>
+              <w:t>Ballwil</w:t>
+            </w:r>
+            <w:proofErr w:type="spellEnd"/>
           </w:p>
           <w:p>
             <w:pPr>
@@ -6519,7 +6560,15 @@
       </w:pPr>
       <w:bookmarkStart w:id="9" w:name="_Hlk24373257"/>
       <w:r>
-        <w:t>Ein Fotograf möchte für sein Studio und auch privat eine WebApp, um all seine Bilder zu speichern und verwalten zu können. Auf der Webseite kann man, wenn man angemeldet ist, neue Bilder hochladen, die dann gespeichert werden. Zu jedem Bild können noch folgende Informationen erfasst werden: Titel, optionale Beschreibung, Datum, Ort und ob das Bild öffentlich einsehbar sein sollte. Denn neue Einträge kann man nur erfassen, wenn man angemeldet ist. Auch sieht man nur alle Bilder in der Datenbank, wenn man angemeldet ist. Denn private Fotos sollen nicht öffentlich einsehbar sein. Wenn man nicht angemeldet ist, sieht man einfach auf der Startseite die Galerie mit den öffentlichen Bildern. In der Applikation soll es möglich sein, alle Benutzer zu verwalten und auch welche neu hinzuzufügen. Dazu soll die ganze Webseite responsiv sein und mit allen Bildgrössen klarkommen.</w:t>
+        <w:t xml:space="preserve">Ein Fotograf möchte für sein Studio und auch privat eine </w:t>
+      </w:r>
+      <w:proofErr w:type="spellStart"/>
+      <w:r>
+        <w:t>WebApp</w:t>
+      </w:r>
+      <w:proofErr w:type="spellEnd"/>
+      <w:r>
+        <w:t>, um all seine Bilder zu speichern und verwalten zu können. Auf der Webseite kann man, wenn man angemeldet ist, neue Bilder hochladen, die dann gespeichert werden. Zu jedem Bild können noch folgende Informationen erfasst werden: Titel, optionale Beschreibung, Datum, Ort und ob das Bild öffentlich einsehbar sein sollte. Denn neue Einträge kann man nur erfassen, wenn man angemeldet ist. Auch sieht man nur alle Bilder in der Datenbank, wenn man angemeldet ist. Denn private Fotos sollen nicht öffentlich einsehbar sein. Wenn man nicht angemeldet ist, sieht man einfach auf der Startseite die Galerie mit den öffentlichen Bildern. In der Applikation soll es möglich sein, alle Benutzer zu verwalten und auch welche neu hinzuzufügen. Dazu soll die ganze Webseite responsiv sein und mit allen Bildgrössen klarkommen.</w:t>
       </w:r>
     </w:p>
     <w:p>
@@ -6532,11 +6581,24 @@
         <w:pStyle w:val="K-Einzug"/>
       </w:pPr>
       <w:r>
-        <w:t>Für die Aufgabe muss ein privates Repo im internen Gitea erstellt werden. Der Name des Repos ist zwingen “MPA_</w:t>
+        <w:t xml:space="preserve">Für die Aufgabe muss ein privates Repo im internen </w:t>
+      </w:r>
+      <w:proofErr w:type="spellStart"/>
+      <w:r>
+        <w:t>Gitea</w:t>
+      </w:r>
+      <w:proofErr w:type="spellEnd"/>
+      <w:r>
+        <w:t xml:space="preserve"> erstellt werden. Der Name des Repos ist zwingen “</w:t>
+      </w:r>
+      <w:proofErr w:type="spellStart"/>
+      <w:r>
+        <w:t>MPA_</w:t>
       </w:r>
       <w:r>
         <w:t>Fotogalerie</w:t>
       </w:r>
+      <w:proofErr w:type="spellEnd"/>
       <w:r>
         <w:t>”.</w:t>
       </w:r>
@@ -6556,13 +6618,29 @@
         <w:ind w:left="709"/>
       </w:pPr>
       <w:r>
-        <w:t>Es soll eine Applikation geschaffen werden, in welchem ein Photograph seine Bilder hochlädt. Der Photograph ist der «Owner», also hat diese Rolle und soll auch Benutzer hinzufügen</w:t>
+        <w:t>Es soll eine Applikation geschaffen werden, in welchem ein Photograph seine Bilder hochlädt. Der Photograph ist der «</w:t>
+      </w:r>
+      <w:proofErr w:type="spellStart"/>
+      <w:r>
+        <w:t>Owner</w:t>
+      </w:r>
+      <w:proofErr w:type="spellEnd"/>
+      <w:r>
+        <w:t>», also hat diese Rolle und soll auch Benutzer hinzufügen</w:t>
       </w:r>
       <w:r>
         <w:t>, bearbeiten und löschen</w:t>
       </w:r>
       <w:r>
-        <w:t xml:space="preserve"> können mit der Rolle «VIP», die ebenfalls Bilder hochladen können und alles sehen können, nur nicht Benutzer verwalten. Dies soll nur der «Owner» können. Normale </w:t>
+        <w:t xml:space="preserve"> können mit der Rolle «VIP», die ebenfalls Bilder hochladen können und alles sehen können, nur nicht Benutzer verwalten. Dies soll nur der «</w:t>
+      </w:r>
+      <w:proofErr w:type="spellStart"/>
+      <w:r>
+        <w:t>Owner</w:t>
+      </w:r>
+      <w:proofErr w:type="spellEnd"/>
+      <w:r>
+        <w:t xml:space="preserve">» können. Normale </w:t>
       </w:r>
       <w:r>
         <w:t>Benutzer,</w:t>
@@ -6594,7 +6672,15 @@
         <w:ind w:left="709"/>
       </w:pPr>
       <w:r>
-        <w:t xml:space="preserve">Bei der Benutzerverwaltung sollen alle Benutzer angezeigt werden, die vom «Owner» hinzugefügt wurden. Dort soll man die Benutzer ID, Benutzernamen, </w:t>
+        <w:t>Bei der Benutzerverwaltung sollen alle Benutzer angezeigt werden, die vom «</w:t>
+      </w:r>
+      <w:proofErr w:type="spellStart"/>
+      <w:r>
+        <w:t>Owner</w:t>
+      </w:r>
+      <w:proofErr w:type="spellEnd"/>
+      <w:r>
+        <w:t xml:space="preserve">» hinzugefügt wurden. Dort soll man die Benutzer ID, Benutzernamen, </w:t>
       </w:r>
       <w:r>
         <w:t>E-Mail-Adresse</w:t>
@@ -6613,13 +6699,37 @@
         <w:ind w:left="709"/>
       </w:pPr>
       <w:r>
-        <w:t xml:space="preserve">Damit sich der «Owner» oder der «VIP» auf der Applikation ihre Rechte ergattern können, müssen sie sich einloggen. Im Login soll man die </w:t>
+        <w:t>Damit sich der «</w:t>
+      </w:r>
+      <w:proofErr w:type="spellStart"/>
+      <w:r>
+        <w:t>Owner</w:t>
+      </w:r>
+      <w:proofErr w:type="spellEnd"/>
+      <w:r>
+        <w:t xml:space="preserve">» oder der «VIP» auf der Applikation ihre Rechte ergattern können, müssen sie sich einloggen. Im Login soll man die </w:t>
       </w:r>
       <w:r>
         <w:t>E-Mail-Adresse</w:t>
       </w:r>
       <w:r>
-        <w:t xml:space="preserve"> und das Passwort eingeben. Die Passwörter entscheidet der «Owner» für beide Seiten selbst. Respektive wenn der «Owner» einen Benutzer als «VIP» in der Benutzerverwaltung hinzufügt, entscheidet er welches Passwort er hat.</w:t>
+        <w:t xml:space="preserve"> und das Passwort eingeben. Die Passwörter entscheidet der «</w:t>
+      </w:r>
+      <w:proofErr w:type="spellStart"/>
+      <w:r>
+        <w:t>Owner</w:t>
+      </w:r>
+      <w:proofErr w:type="spellEnd"/>
+      <w:r>
+        <w:t>» für beide Seiten selbst. Respektive wenn der «</w:t>
+      </w:r>
+      <w:proofErr w:type="spellStart"/>
+      <w:r>
+        <w:t>Owner</w:t>
+      </w:r>
+      <w:proofErr w:type="spellEnd"/>
+      <w:r>
+        <w:t>» einen Benutzer als «VIP» in der Benutzerverwaltung hinzufügt, entscheidet er welches Passwort er hat.</w:t>
       </w:r>
     </w:p>
     <w:p>
@@ -9480,7 +9590,7 @@
         </w:tc>
         <w:tc>
           <w:tcPr>
-            <w:tcW w:w="1353" w:type="dxa"/>
+            <w:tcW w:w="1354" w:type="dxa"/>
             <w:hideMark/>
           </w:tcPr>
           <w:p>
@@ -9540,15 +9650,10 @@
               <w:t>: Bild ändern und löschen</w:t>
             </w:r>
           </w:p>
-          <w:p>
-            <w:r>
-              <w:t>Aufgabe 2</w:t>
-            </w:r>
-          </w:p>
-        </w:tc>
-        <w:tc>
-          <w:tcPr>
-            <w:tcW w:w="1353" w:type="dxa"/>
+        </w:tc>
+        <w:tc>
+          <w:tcPr>
+            <w:tcW w:w="1354" w:type="dxa"/>
             <w:hideMark/>
           </w:tcPr>
           <w:p>
@@ -9581,7 +9686,7 @@
         </w:tc>
         <w:tc>
           <w:tcPr>
-            <w:tcW w:w="1353" w:type="dxa"/>
+            <w:tcW w:w="1354" w:type="dxa"/>
             <w:hideMark/>
           </w:tcPr>
           <w:p>
@@ -9646,59 +9751,6 @@
             <w:r>
               <w:t xml:space="preserve"> </w:t>
             </w:r>
-            <w:r>
-              <w:rPr>
-                <w:noProof/>
-              </w:rPr>
-              <w:drawing>
-                <wp:inline distT="0" distB="0" distL="0" distR="0" wp14:anchorId="391FEDF0" wp14:editId="18F7E589">
-                  <wp:extent cx="216000" cy="216000"/>
-                  <wp:effectExtent l="0" t="0" r="0" b="0"/>
-                  <wp:docPr id="9" name="Grafik 9"/>
-                  <wp:cNvGraphicFramePr>
-                    <a:graphicFrameLocks xmlns:a="http://schemas.openxmlformats.org/drawingml/2006/main" noChangeAspect="1"/>
-                  </wp:cNvGraphicFramePr>
-                  <a:graphic xmlns:a="http://schemas.openxmlformats.org/drawingml/2006/main">
-                    <a:graphicData uri="http://schemas.openxmlformats.org/drawingml/2006/picture">
-                      <pic:pic xmlns:pic="http://schemas.openxmlformats.org/drawingml/2006/picture">
-                        <pic:nvPicPr>
-                          <pic:cNvPr id="0" name="Grafik 9"/>
-                          <pic:cNvPicPr>
-                            <a:picLocks noChangeAspect="1" noChangeArrowheads="1"/>
-                          </pic:cNvPicPr>
-                        </pic:nvPicPr>
-                        <pic:blipFill>
-                          <a:blip r:embed="rId19">
-                            <a:extLst>
-                              <a:ext uri="{28A0092B-C50C-407E-A947-70E740481C1C}">
-                                <a14:useLocalDpi xmlns:a14="http://schemas.microsoft.com/office/drawing/2010/main" val="0"/>
-                              </a:ext>
-                            </a:extLst>
-                          </a:blip>
-                          <a:srcRect l="-5115" t="-5115" r="-5115" b="-5115"/>
-                          <a:stretch>
-                            <a:fillRect/>
-                          </a:stretch>
-                        </pic:blipFill>
-                        <pic:spPr bwMode="auto">
-                          <a:xfrm>
-                            <a:off x="0" y="0"/>
-                            <a:ext cx="216000" cy="216000"/>
-                          </a:xfrm>
-                          <a:prstGeom prst="rect">
-                            <a:avLst/>
-                          </a:prstGeom>
-                          <a:noFill/>
-                          <a:ln>
-                            <a:noFill/>
-                          </a:ln>
-                        </pic:spPr>
-                      </pic:pic>
-                    </a:graphicData>
-                  </a:graphic>
-                </wp:inline>
-              </w:drawing>
-            </w:r>
           </w:p>
         </w:tc>
       </w:tr>
@@ -9792,7 +9844,27 @@
             <w:tcW w:w="9081" w:type="dxa"/>
             <w:gridSpan w:val="4"/>
           </w:tcPr>
-          <w:p/>
+          <w:p>
+            <w:r>
+              <w:t xml:space="preserve">Heute traten eine Menge Fehler auf. Allerdings alle gegen 14:20 Uhr. Der erste war ein Logikfehler im Code und der zweite kam aus dem nichts. Dabei konnte ich im XAMPP </w:t>
+            </w:r>
+            <w:proofErr w:type="spellStart"/>
+            <w:r>
+              <w:t>mysql</w:t>
+            </w:r>
+            <w:proofErr w:type="spellEnd"/>
+            <w:r>
+              <w:t xml:space="preserve"> nicht mehr starten. Nach dem Neuinstallieren von XAMPP und der Deinstallation von VM </w:t>
+            </w:r>
+            <w:proofErr w:type="spellStart"/>
+            <w:r>
+              <w:t>ware</w:t>
+            </w:r>
+            <w:proofErr w:type="spellEnd"/>
+            <w:r>
+              <w:t xml:space="preserve"> funktionierte es wieder.</w:t>
+            </w:r>
+          </w:p>
         </w:tc>
       </w:tr>
       <w:tr>
@@ -9831,7 +9903,11 @@
             <w:tcW w:w="9081" w:type="dxa"/>
             <w:gridSpan w:val="4"/>
           </w:tcPr>
-          <w:p/>
+          <w:p>
+            <w:r>
+              <w:t>Bilder können geändert und gelöscht werden.</w:t>
+            </w:r>
+          </w:p>
         </w:tc>
       </w:tr>
       <w:tr>
@@ -9870,7 +9946,11 @@
             <w:tcW w:w="9081" w:type="dxa"/>
             <w:gridSpan w:val="4"/>
           </w:tcPr>
-          <w:p/>
+          <w:p>
+            <w:r>
+              <w:t>Heute habe ich von Janik Lüthi für den zweiten Fehler Hilfe gebraucht.</w:t>
+            </w:r>
+          </w:p>
         </w:tc>
       </w:tr>
       <w:tr>
@@ -9909,7 +9989,11 @@
             <w:tcW w:w="9081" w:type="dxa"/>
             <w:gridSpan w:val="4"/>
           </w:tcPr>
-          <w:p/>
+          <w:p>
+            <w:r>
+              <w:t>Laut Zeitplan stehe ich sehr gut. Es fehlen nur noch die Tests, ein paar Diagramme und einzelne kleine Dinge.</w:t>
+            </w:r>
+          </w:p>
         </w:tc>
       </w:tr>
       <w:tr>
@@ -9954,6 +10038,12 @@
                 <w:bCs/>
               </w:rPr>
             </w:pPr>
+            <w:r>
+              <w:rPr>
+                <w:bCs/>
+              </w:rPr>
+              <w:t>Ich bin für heute zufrieden, da ich meine Aufgabe erledigen konnte.</w:t>
+            </w:r>
           </w:p>
         </w:tc>
       </w:tr>
@@ -10085,22 +10175,44 @@
                 <w:lang w:val="fr-CH"/>
               </w:rPr>
             </w:pPr>
+            <w:proofErr w:type="spellStart"/>
             <w:r>
               <w:rPr>
                 <w:lang w:val="fr-CH"/>
               </w:rPr>
-              <w:t>Aufgabe 1</w:t>
-            </w:r>
+              <w:t>Aufgabe</w:t>
+            </w:r>
+            <w:proofErr w:type="spellEnd"/>
             <w:r>
               <w:rPr>
                 <w:lang w:val="fr-CH"/>
               </w:rPr>
-              <w:t>:Responsive Navbar + Responsive De</w:t>
+              <w:t xml:space="preserve"> 1</w:t>
             </w:r>
             <w:r>
               <w:rPr>
                 <w:lang w:val="fr-CH"/>
               </w:rPr>
+              <w:t xml:space="preserve">:Responsive </w:t>
+            </w:r>
+            <w:proofErr w:type="spellStart"/>
+            <w:r>
+              <w:rPr>
+                <w:lang w:val="fr-CH"/>
+              </w:rPr>
+              <w:t>Navbar</w:t>
+            </w:r>
+            <w:proofErr w:type="spellEnd"/>
+            <w:r>
+              <w:rPr>
+                <w:lang w:val="fr-CH"/>
+              </w:rPr>
+              <w:t xml:space="preserve"> + Responsive De</w:t>
+            </w:r>
+            <w:r>
+              <w:rPr>
+                <w:lang w:val="fr-CH"/>
+              </w:rPr>
               <w:t>sign</w:t>
             </w:r>
           </w:p>
@@ -10109,8 +10221,13 @@
               <w:t>Aufgabe 2</w:t>
             </w:r>
             <w:r>
-              <w:t>: Code Refactoring</w:t>
-            </w:r>
+              <w:t xml:space="preserve">: Code </w:t>
+            </w:r>
+            <w:proofErr w:type="spellStart"/>
+            <w:r>
+              <w:t>Refactoring</w:t>
+            </w:r>
+            <w:proofErr w:type="spellEnd"/>
           </w:p>
         </w:tc>
         <w:tc>
@@ -10315,7 +10432,15 @@
               <w:t xml:space="preserve"> keine mehr hinzugefügt werden.</w:t>
             </w:r>
             <w:r>
-              <w:t xml:space="preserve"> Ich habe alles gründlich durchgecheckt und habe das Gefühl, da der Computer ständig überhitzt und an seine Grenzen kommt, dass es evtl am Computer liegt.</w:t>
+              <w:t xml:space="preserve"> Ich habe alles gründlich durchgecheckt und habe das Gefühl, da der Computer ständig überhitzt und an seine Grenzen kommt, dass es </w:t>
+            </w:r>
+            <w:proofErr w:type="spellStart"/>
+            <w:r>
+              <w:t>evtl</w:t>
+            </w:r>
+            <w:proofErr w:type="spellEnd"/>
+            <w:r>
+              <w:t xml:space="preserve"> am Computer liegt.</w:t>
             </w:r>
           </w:p>
         </w:tc>
@@ -10356,7 +10481,11 @@
             <w:tcW w:w="9081" w:type="dxa"/>
             <w:gridSpan w:val="4"/>
           </w:tcPr>
-          <w:p/>
+          <w:p>
+            <w:r>
+              <w:t>Es können keine Benutzer mehr hinzugefügt werden.</w:t>
+            </w:r>
+          </w:p>
         </w:tc>
       </w:tr>
       <w:tr>
@@ -10467,6 +10596,7 @@
               <w:rPr>
                 <w:b/>
               </w:rPr>
+              <w:lastRenderedPageBreak/>
               <w:t>Reflexion</w:t>
             </w:r>
           </w:p>
@@ -10491,14 +10621,21 @@
               <w:rPr>
                 <w:bCs/>
               </w:rPr>
-              <w:t xml:space="preserve">Ich bin mit heute sulala zufrieden. Ich konnte zwar ein Ziel erreichen, aber nicht das andere und dies enttäuscht mich. Zudem kann ich nicht wirklich nachvollziehen, weshalb mein Computer </w:t>
-            </w:r>
+              <w:t xml:space="preserve">Ich bin mit heute </w:t>
+            </w:r>
+            <w:proofErr w:type="spellStart"/>
             <w:r>
               <w:rPr>
                 <w:bCs/>
               </w:rPr>
-              <w:lastRenderedPageBreak/>
-              <w:t>plötzlich anfing zu überhitzen und an dem Zeitpunkt man auch keine neuen Benutzer hinzufügen kann. Ist für mich unerklärlich.</w:t>
+              <w:t>sulala</w:t>
+            </w:r>
+            <w:proofErr w:type="spellEnd"/>
+            <w:r>
+              <w:rPr>
+                <w:bCs/>
+              </w:rPr>
+              <w:t xml:space="preserve"> zufrieden. Ich konnte zwar ein Ziel erreichen, aber nicht das andere und dies enttäuscht mich. Zudem kann ich nicht wirklich nachvollziehen, weshalb mein Computer plötzlich anfing zu überhitzen und an dem Zeitpunkt man auch keine neuen Benutzer hinzufügen kann. Ist für mich unerklärlich.</w:t>
             </w:r>
           </w:p>
         </w:tc>
@@ -10631,11 +10768,22 @@
             <w:r>
               <w:t>Aufgabe 1</w:t>
             </w:r>
+            <w:r>
+              <w:t>: Responsive Design</w:t>
+            </w:r>
           </w:p>
           <w:p>
             <w:r>
               <w:t>Aufgabe 2</w:t>
             </w:r>
+            <w:r>
+              <w:t xml:space="preserve">: Code </w:t>
+            </w:r>
+            <w:proofErr w:type="spellStart"/>
+            <w:r>
+              <w:t>Refactoring</w:t>
+            </w:r>
+            <w:proofErr w:type="spellEnd"/>
           </w:p>
         </w:tc>
         <w:tc>
@@ -10738,59 +10886,6 @@
             <w:r>
               <w:t xml:space="preserve"> </w:t>
             </w:r>
-            <w:r>
-              <w:rPr>
-                <w:noProof/>
-              </w:rPr>
-              <w:drawing>
-                <wp:inline distT="0" distB="0" distL="0" distR="0" wp14:anchorId="0DBB63F4" wp14:editId="68F6526B">
-                  <wp:extent cx="216000" cy="216000"/>
-                  <wp:effectExtent l="0" t="0" r="0" b="0"/>
-                  <wp:docPr id="13" name="Grafik 13"/>
-                  <wp:cNvGraphicFramePr>
-                    <a:graphicFrameLocks xmlns:a="http://schemas.openxmlformats.org/drawingml/2006/main" noChangeAspect="1"/>
-                  </wp:cNvGraphicFramePr>
-                  <a:graphic xmlns:a="http://schemas.openxmlformats.org/drawingml/2006/main">
-                    <a:graphicData uri="http://schemas.openxmlformats.org/drawingml/2006/picture">
-                      <pic:pic xmlns:pic="http://schemas.openxmlformats.org/drawingml/2006/picture">
-                        <pic:nvPicPr>
-                          <pic:cNvPr id="0" name="Grafik 9"/>
-                          <pic:cNvPicPr>
-                            <a:picLocks noChangeAspect="1" noChangeArrowheads="1"/>
-                          </pic:cNvPicPr>
-                        </pic:nvPicPr>
-                        <pic:blipFill>
-                          <a:blip r:embed="rId19">
-                            <a:extLst>
-                              <a:ext uri="{28A0092B-C50C-407E-A947-70E740481C1C}">
-                                <a14:useLocalDpi xmlns:a14="http://schemas.microsoft.com/office/drawing/2010/main" val="0"/>
-                              </a:ext>
-                            </a:extLst>
-                          </a:blip>
-                          <a:srcRect l="-5115" t="-5115" r="-5115" b="-5115"/>
-                          <a:stretch>
-                            <a:fillRect/>
-                          </a:stretch>
-                        </pic:blipFill>
-                        <pic:spPr bwMode="auto">
-                          <a:xfrm>
-                            <a:off x="0" y="0"/>
-                            <a:ext cx="216000" cy="216000"/>
-                          </a:xfrm>
-                          <a:prstGeom prst="rect">
-                            <a:avLst/>
-                          </a:prstGeom>
-                          <a:noFill/>
-                          <a:ln>
-                            <a:noFill/>
-                          </a:ln>
-                        </pic:spPr>
-                      </pic:pic>
-                    </a:graphicData>
-                  </a:graphic>
-                </wp:inline>
-              </w:drawing>
-            </w:r>
           </w:p>
         </w:tc>
       </w:tr>
@@ -11718,6 +11813,7 @@
           </w:p>
           <w:p>
             <w:r>
+              <w:lastRenderedPageBreak/>
               <w:t>Aufgabe 2</w:t>
             </w:r>
           </w:p>
@@ -11729,6 +11825,7 @@
           </w:tcPr>
           <w:p>
             <w:r>
+              <w:lastRenderedPageBreak/>
               <w:t>Erreicht</w:t>
             </w:r>
           </w:p>
@@ -11950,7 +12047,6 @@
               <w:rPr>
                 <w:b/>
               </w:rPr>
-              <w:lastRenderedPageBreak/>
               <w:t>Aufgetretene Probleme</w:t>
             </w:r>
           </w:p>
@@ -12733,7 +12829,15 @@
         <w:t xml:space="preserve">Nachfolgend werden die User Storys für </w:t>
       </w:r>
       <w:r>
-        <w:t>die Rolle «Owner»</w:t>
+        <w:t>die Rolle «</w:t>
+      </w:r>
+      <w:proofErr w:type="spellStart"/>
+      <w:r>
+        <w:t>Owner</w:t>
+      </w:r>
+      <w:proofErr w:type="spellEnd"/>
+      <w:r>
+        <w:t>»</w:t>
       </w:r>
       <w:r>
         <w:t xml:space="preserve"> aufgeführt:</w:t>
@@ -12838,7 +12942,15 @@
               <w:ind w:left="0"/>
             </w:pPr>
             <w:r>
-              <w:t>Als Benutzer mit der Rolle «Owner» kann ich Bilder hochladen, damit ich sie auf der Webseite anzeigen kann.</w:t>
+              <w:t>Als Benutzer mit der Rolle «</w:t>
+            </w:r>
+            <w:proofErr w:type="spellStart"/>
+            <w:r>
+              <w:t>Owner</w:t>
+            </w:r>
+            <w:proofErr w:type="spellEnd"/>
+            <w:r>
+              <w:t>» kann ich Bilder hochladen, damit ich sie auf der Webseite anzeigen kann.</w:t>
             </w:r>
           </w:p>
         </w:tc>
@@ -13014,7 +13126,15 @@
               <w:t>Als Benutzer</w:t>
             </w:r>
             <w:r>
-              <w:t xml:space="preserve"> mit der Rolle «Owner»</w:t>
+              <w:t xml:space="preserve"> mit der Rolle «</w:t>
+            </w:r>
+            <w:proofErr w:type="spellStart"/>
+            <w:r>
+              <w:t>Owner</w:t>
+            </w:r>
+            <w:proofErr w:type="spellEnd"/>
+            <w:r>
+              <w:t>»</w:t>
             </w:r>
             <w:r>
               <w:t xml:space="preserve"> kann ich</w:t>
@@ -13199,7 +13319,15 @@
               <w:ind w:left="0"/>
             </w:pPr>
             <w:r>
-              <w:t xml:space="preserve">Als Benutzer mit der Rolle «Owner» kann ich hinzugefügte Bilder </w:t>
+              <w:t>Als Benutzer mit der Rolle «</w:t>
+            </w:r>
+            <w:proofErr w:type="spellStart"/>
+            <w:r>
+              <w:t>Owner</w:t>
+            </w:r>
+            <w:proofErr w:type="spellEnd"/>
+            <w:r>
+              <w:t xml:space="preserve">» kann ich hinzugefügte Bilder </w:t>
             </w:r>
             <w:r>
               <w:t>löschen</w:t>
@@ -13390,7 +13518,15 @@
               <w:ind w:left="0"/>
             </w:pPr>
             <w:r>
-              <w:t xml:space="preserve">Als Benutzer mit der Rolle «Owner» kann ich </w:t>
+              <w:t>Als Benutzer mit der Rolle «</w:t>
+            </w:r>
+            <w:proofErr w:type="spellStart"/>
+            <w:r>
+              <w:t>Owner</w:t>
+            </w:r>
+            <w:proofErr w:type="spellEnd"/>
+            <w:r>
+              <w:t xml:space="preserve">» kann ich </w:t>
             </w:r>
             <w:r>
               <w:t>VIP-</w:t>
@@ -13584,7 +13720,15 @@
               <w:ind w:left="0"/>
             </w:pPr>
             <w:r>
-              <w:t xml:space="preserve">Als Benutzer mit der Rolle «Owner» kann ich </w:t>
+              <w:t>Als Benutzer mit der Rolle «</w:t>
+            </w:r>
+            <w:proofErr w:type="spellStart"/>
+            <w:r>
+              <w:t>Owner</w:t>
+            </w:r>
+            <w:proofErr w:type="spellEnd"/>
+            <w:r>
+              <w:t xml:space="preserve">» kann ich </w:t>
             </w:r>
             <w:r>
               <w:t>VIP-</w:t>
@@ -13763,7 +13907,15 @@
               <w:ind w:left="0"/>
             </w:pPr>
             <w:r>
-              <w:t>Als Benutzer mit der Rolle «Owner» kann ich VIP-Benutzer löschen, damit der Fotograph ihre Daten löschen kann.</w:t>
+              <w:t>Als Benutzer mit der Rolle «</w:t>
+            </w:r>
+            <w:proofErr w:type="spellStart"/>
+            <w:r>
+              <w:t>Owner</w:t>
+            </w:r>
+            <w:proofErr w:type="spellEnd"/>
+            <w:r>
+              <w:t>» kann ich VIP-Benutzer löschen, damit der Fotograph ihre Daten löschen kann.</w:t>
             </w:r>
           </w:p>
         </w:tc>
@@ -13940,7 +14092,15 @@
               <w:ind w:left="0"/>
             </w:pPr>
             <w:r>
-              <w:t xml:space="preserve">Als Benutzer mit der Rolle «Owner» kann </w:t>
+              <w:t>Als Benutzer mit der Rolle «</w:t>
+            </w:r>
+            <w:proofErr w:type="spellStart"/>
+            <w:r>
+              <w:t>Owner</w:t>
+            </w:r>
+            <w:proofErr w:type="spellEnd"/>
+            <w:r>
+              <w:t xml:space="preserve">» kann </w:t>
             </w:r>
             <w:r>
               <w:t>man sich einloggen</w:t>
@@ -14812,17 +14972,35 @@
         <w:lastRenderedPageBreak/>
         <w:t xml:space="preserve">Abbildung </w:t>
       </w:r>
-      <w:fldSimple w:instr=" SEQ Abbildung \* ARABIC ">
-        <w:r>
-          <w:rPr>
-            <w:noProof/>
-          </w:rPr>
-          <w:t>1</w:t>
-        </w:r>
-      </w:fldSimple>
-      <w:r>
-        <w:t>: Use Case Diagram</w:t>
-      </w:r>
+      <w:r>
+        <w:fldChar w:fldCharType="begin"/>
+      </w:r>
+      <w:r>
+        <w:instrText xml:space="preserve"> SEQ Abbildung \* ARABIC </w:instrText>
+      </w:r>
+      <w:r>
+        <w:fldChar w:fldCharType="separate"/>
+      </w:r>
+      <w:r>
+        <w:rPr>
+          <w:noProof/>
+        </w:rPr>
+        <w:t>1</w:t>
+      </w:r>
+      <w:r>
+        <w:rPr>
+          <w:noProof/>
+        </w:rPr>
+        <w:fldChar w:fldCharType="end"/>
+      </w:r>
+      <w:r>
+        <w:t xml:space="preserve">: Use Case </w:t>
+      </w:r>
+      <w:proofErr w:type="spellStart"/>
+      <w:r>
+        <w:t>Diagram</w:t>
+      </w:r>
+      <w:proofErr w:type="spellEnd"/>
     </w:p>
     <w:p>
       <w:pPr>
@@ -14938,7 +15116,15 @@
           </w:tcPr>
           <w:p>
             <w:r>
-              <w:t>Benutzer mit Rolle «Owner» und Rolle «VIP»</w:t>
+              <w:t>Benutzer mit Rolle «</w:t>
+            </w:r>
+            <w:proofErr w:type="spellStart"/>
+            <w:r>
+              <w:t>Owner</w:t>
+            </w:r>
+            <w:proofErr w:type="spellEnd"/>
+            <w:r>
+              <w:t>» und Rolle «VIP»</w:t>
             </w:r>
           </w:p>
         </w:tc>
@@ -15161,7 +15347,15 @@
           </w:tcPr>
           <w:p>
             <w:r>
-              <w:t>Benutzer mit Rolle «Owner» und Rolle «VIP»</w:t>
+              <w:t>Benutzer mit Rolle «</w:t>
+            </w:r>
+            <w:proofErr w:type="spellStart"/>
+            <w:r>
+              <w:t>Owner</w:t>
+            </w:r>
+            <w:proofErr w:type="spellEnd"/>
+            <w:r>
+              <w:t>» und Rolle «VIP»</w:t>
             </w:r>
           </w:p>
         </w:tc>
@@ -15382,7 +15576,15 @@
           </w:tcPr>
           <w:p>
             <w:r>
-              <w:t>Benutzer mit Rolle «Owner» und Rolle «VIP»</w:t>
+              <w:t>Benutzer mit Rolle «</w:t>
+            </w:r>
+            <w:proofErr w:type="spellStart"/>
+            <w:r>
+              <w:t>Owner</w:t>
+            </w:r>
+            <w:proofErr w:type="spellEnd"/>
+            <w:r>
+              <w:t>» und Rolle «VIP»</w:t>
             </w:r>
           </w:p>
         </w:tc>
@@ -15603,7 +15805,15 @@
           </w:tcPr>
           <w:p>
             <w:r>
-              <w:t>Benutzer mit Rolle «Owner»</w:t>
+              <w:t>Benutzer mit Rolle «</w:t>
+            </w:r>
+            <w:proofErr w:type="spellStart"/>
+            <w:r>
+              <w:t>Owner</w:t>
+            </w:r>
+            <w:proofErr w:type="spellEnd"/>
+            <w:r>
+              <w:t>»</w:t>
             </w:r>
           </w:p>
         </w:tc>
@@ -15839,7 +16049,15 @@
           </w:tcPr>
           <w:p>
             <w:r>
-              <w:t>Benutzer mit Rolle «Owner»</w:t>
+              <w:t>Benutzer mit Rolle «</w:t>
+            </w:r>
+            <w:proofErr w:type="spellStart"/>
+            <w:r>
+              <w:t>Owner</w:t>
+            </w:r>
+            <w:proofErr w:type="spellEnd"/>
+            <w:r>
+              <w:t>»</w:t>
             </w:r>
           </w:p>
         </w:tc>
@@ -15864,7 +16082,15 @@
           </w:tcPr>
           <w:p>
             <w:r>
-              <w:t>Ein Benutzer mit der Rolle «VIP» und ein «Owner» müssen schon im System erfasst sein.</w:t>
+              <w:t>Ein Benutzer mit der Rolle «VIP» und ein «</w:t>
+            </w:r>
+            <w:proofErr w:type="spellStart"/>
+            <w:r>
+              <w:t>Owner</w:t>
+            </w:r>
+            <w:proofErr w:type="spellEnd"/>
+            <w:r>
+              <w:t>» müssen schon im System erfasst sein.</w:t>
             </w:r>
           </w:p>
         </w:tc>
@@ -16060,7 +16286,15 @@
           </w:tcPr>
           <w:p>
             <w:r>
-              <w:t>Benutzer mit Rolle «Owner»</w:t>
+              <w:t>Benutzer mit Rolle «</w:t>
+            </w:r>
+            <w:proofErr w:type="spellStart"/>
+            <w:r>
+              <w:t>Owner</w:t>
+            </w:r>
+            <w:proofErr w:type="spellEnd"/>
+            <w:r>
+              <w:t>»</w:t>
             </w:r>
           </w:p>
         </w:tc>
@@ -16085,7 +16319,15 @@
           </w:tcPr>
           <w:p>
             <w:r>
-              <w:t>Ein Benutzer mit der Rolle «VIP» und ein «Owner» müssen schon im System erfasst sein.</w:t>
+              <w:t>Ein Benutzer mit der Rolle «VIP» und ein «</w:t>
+            </w:r>
+            <w:proofErr w:type="spellStart"/>
+            <w:r>
+              <w:t>Owner</w:t>
+            </w:r>
+            <w:proofErr w:type="spellEnd"/>
+            <w:r>
+              <w:t>» müssen schon im System erfasst sein.</w:t>
             </w:r>
           </w:p>
         </w:tc>
@@ -16524,7 +16766,15 @@
         <w:t>t</w:t>
       </w:r>
       <w:r>
-        <w:t xml:space="preserve">. Für die Versionskontrolle wurde ein Firmen Internes Git Repository verwendet. Das Backup des Servers wird nach dem </w:t>
+        <w:t xml:space="preserve">. Für die Versionskontrolle wurde ein Firmen Internes </w:t>
+      </w:r>
+      <w:proofErr w:type="spellStart"/>
+      <w:r>
+        <w:t>Git</w:t>
+      </w:r>
+      <w:proofErr w:type="spellEnd"/>
+      <w:r>
+        <w:t xml:space="preserve"> Repository verwendet. Das Backup des Servers wird nach dem </w:t>
       </w:r>
       <w:hyperlink r:id="rId21" w:history="1">
         <w:r>
@@ -16829,11 +17079,13 @@
       </w:pPr>
       <w:bookmarkStart w:id="76" w:name="_Toc25148338"/>
       <w:bookmarkStart w:id="77" w:name="_Toc110858296"/>
+      <w:proofErr w:type="spellStart"/>
       <w:r>
         <w:t>Activity</w:t>
       </w:r>
       <w:bookmarkEnd w:id="76"/>
       <w:bookmarkEnd w:id="77"/>
+      <w:proofErr w:type="spellEnd"/>
     </w:p>
     <w:p>
       <w:pPr>
@@ -16922,10 +17174,15 @@
       <w:bookmarkStart w:id="82" w:name="_Toc25148342"/>
       <w:bookmarkStart w:id="83" w:name="_Toc110858299"/>
       <w:r>
-        <w:t>Mock-Ups</w:t>
+        <w:t>Mock-</w:t>
+      </w:r>
+      <w:proofErr w:type="spellStart"/>
+      <w:r>
+        <w:t>Ups</w:t>
       </w:r>
       <w:bookmarkEnd w:id="82"/>
       <w:bookmarkEnd w:id="83"/>
+      <w:proofErr w:type="spellEnd"/>
     </w:p>
     <w:p>
       <w:pPr>
@@ -17177,8 +17434,29 @@
           </w:tcPr>
           <w:p>
             <w:r>
-              <w:t>Pentium 4 processor or higher</w:t>
-            </w:r>
+              <w:t xml:space="preserve">Pentium 4 </w:t>
+            </w:r>
+            <w:proofErr w:type="spellStart"/>
+            <w:r>
+              <w:t>processor</w:t>
+            </w:r>
+            <w:proofErr w:type="spellEnd"/>
+            <w:r>
+              <w:t xml:space="preserve"> </w:t>
+            </w:r>
+            <w:proofErr w:type="spellStart"/>
+            <w:r>
+              <w:t>or</w:t>
+            </w:r>
+            <w:proofErr w:type="spellEnd"/>
+            <w:r>
+              <w:t xml:space="preserve"> </w:t>
+            </w:r>
+            <w:proofErr w:type="spellStart"/>
+            <w:r>
+              <w:t>higher</w:t>
+            </w:r>
+            <w:proofErr w:type="spellEnd"/>
           </w:p>
         </w:tc>
       </w:tr>
@@ -17722,7 +18000,15 @@
           </w:tcPr>
           <w:p>
             <w:r>
-              <w:t>Nachdem man als «Owner» oder als «VIP» ein Bild hochladet, wird das hochgeladene Bild auf der Webseite nicht angezeigt.</w:t>
+              <w:t>Nachdem man als «</w:t>
+            </w:r>
+            <w:proofErr w:type="spellStart"/>
+            <w:r>
+              <w:t>Owner</w:t>
+            </w:r>
+            <w:proofErr w:type="spellEnd"/>
+            <w:r>
+              <w:t>» oder als «VIP» ein Bild hochladet, wird das hochgeladene Bild auf der Webseite nicht angezeigt.</w:t>
             </w:r>
           </w:p>
         </w:tc>
@@ -17732,7 +18018,15 @@
           </w:tcPr>
           <w:p>
             <w:r>
-              <w:t>Nachdem ich das Problem zusammen mit Janik Lüthi und danach mit Aurel Wicki versucht habe zu lösen, hat es nicht funktioniert. Wir kamen dem Problem aber etwas näher. Wir haben festgestellt, das i</w:t>
+              <w:t xml:space="preserve">Nachdem ich das Problem zusammen mit Janik Lüthi und danach mit Aurel Wicki versucht habe zu lösen, hat es nicht funktioniert. Wir kamen dem Problem aber etwas näher. Wir haben festgestellt, </w:t>
+            </w:r>
+            <w:proofErr w:type="spellStart"/>
+            <w:r>
+              <w:t>das</w:t>
+            </w:r>
+            <w:proofErr w:type="spellEnd"/>
+            <w:r>
+              <w:t xml:space="preserve"> i</w:t>
             </w:r>
             <w:r>
               <w:t>rgendetwas beim Hochladen des Bildes zur Datenbank nicht richtig ist.</w:t>
@@ -17778,6 +18072,7 @@
               </w:rPr>
               <w:t>(</w:t>
             </w:r>
+            <w:proofErr w:type="spellStart"/>
             <w:r>
               <w:rPr>
                 <w:rFonts w:ascii="Consolas" w:eastAsia="Times New Roman" w:hAnsi="Consolas" w:cs="Times New Roman"/>
@@ -17788,6 +18083,7 @@
               </w:rPr>
               <w:t>is_uploaded_file</w:t>
             </w:r>
+            <w:proofErr w:type="spellEnd"/>
             <w:r>
               <w:rPr>
                 <w:rFonts w:ascii="Consolas" w:eastAsia="Times New Roman" w:hAnsi="Consolas" w:cs="Times New Roman"/>
@@ -17846,7 +18142,29 @@
                 <w:szCs w:val="21"/>
                 <w:lang w:val="en-GB" w:eastAsia="de-DE"/>
               </w:rPr>
-              <w:t>'tmp_name'</w:t>
+              <w:t>'</w:t>
+            </w:r>
+            <w:proofErr w:type="spellStart"/>
+            <w:r>
+              <w:rPr>
+                <w:rFonts w:ascii="Consolas" w:eastAsia="Times New Roman" w:hAnsi="Consolas" w:cs="Times New Roman"/>
+                <w:color w:val="CE9178"/>
+                <w:sz w:val="21"/>
+                <w:szCs w:val="21"/>
+                <w:lang w:val="en-GB" w:eastAsia="de-DE"/>
+              </w:rPr>
+              <w:t>tmp_name</w:t>
+            </w:r>
+            <w:proofErr w:type="spellEnd"/>
+            <w:r>
+              <w:rPr>
+                <w:rFonts w:ascii="Consolas" w:eastAsia="Times New Roman" w:hAnsi="Consolas" w:cs="Times New Roman"/>
+                <w:color w:val="CE9178"/>
+                <w:sz w:val="21"/>
+                <w:szCs w:val="21"/>
+                <w:lang w:val="en-GB" w:eastAsia="de-DE"/>
+              </w:rPr>
+              <w:t>'</w:t>
             </w:r>
             <w:r>
               <w:rPr>
@@ -17889,8 +18207,20 @@
                 <w:szCs w:val="21"/>
                 <w:lang w:val="en-GB" w:eastAsia="de-DE"/>
               </w:rPr>
-              <w:t>$imgData</w:t>
-            </w:r>
+              <w:t>$</w:t>
+            </w:r>
+            <w:proofErr w:type="spellStart"/>
+            <w:r>
+              <w:rPr>
+                <w:rFonts w:ascii="Consolas" w:eastAsia="Times New Roman" w:hAnsi="Consolas" w:cs="Times New Roman"/>
+                <w:color w:val="9CDCFE"/>
+                <w:sz w:val="21"/>
+                <w:szCs w:val="21"/>
+                <w:lang w:val="en-GB" w:eastAsia="de-DE"/>
+              </w:rPr>
+              <w:t>imgData</w:t>
+            </w:r>
+            <w:proofErr w:type="spellEnd"/>
             <w:r>
               <w:rPr>
                 <w:rFonts w:ascii="Consolas" w:eastAsia="Times New Roman" w:hAnsi="Consolas" w:cs="Times New Roman"/>
@@ -17901,6 +18231,7 @@
               </w:rPr>
               <w:t xml:space="preserve"> = </w:t>
             </w:r>
+            <w:proofErr w:type="spellStart"/>
             <w:r>
               <w:rPr>
                 <w:rFonts w:ascii="Consolas" w:eastAsia="Times New Roman" w:hAnsi="Consolas" w:cs="Times New Roman"/>
@@ -17911,6 +18242,7 @@
               </w:rPr>
               <w:t>addslashes</w:t>
             </w:r>
+            <w:proofErr w:type="spellEnd"/>
             <w:r>
               <w:rPr>
                 <w:rFonts w:ascii="Consolas" w:eastAsia="Times New Roman" w:hAnsi="Consolas" w:cs="Times New Roman"/>
@@ -17921,6 +18253,7 @@
               </w:rPr>
               <w:t>(</w:t>
             </w:r>
+            <w:proofErr w:type="spellStart"/>
             <w:r>
               <w:rPr>
                 <w:rFonts w:ascii="Consolas" w:eastAsia="Times New Roman" w:hAnsi="Consolas" w:cs="Times New Roman"/>
@@ -17931,6 +18264,7 @@
               </w:rPr>
               <w:t>file_get_contents</w:t>
             </w:r>
+            <w:proofErr w:type="spellEnd"/>
             <w:r>
               <w:rPr>
                 <w:rFonts w:ascii="Consolas" w:eastAsia="Times New Roman" w:hAnsi="Consolas" w:cs="Times New Roman"/>
@@ -17989,7 +18323,29 @@
                 <w:szCs w:val="21"/>
                 <w:lang w:val="en-GB" w:eastAsia="de-DE"/>
               </w:rPr>
-              <w:t>'tmp_name'</w:t>
+              <w:t>'</w:t>
+            </w:r>
+            <w:proofErr w:type="spellStart"/>
+            <w:r>
+              <w:rPr>
+                <w:rFonts w:ascii="Consolas" w:eastAsia="Times New Roman" w:hAnsi="Consolas" w:cs="Times New Roman"/>
+                <w:color w:val="CE9178"/>
+                <w:sz w:val="21"/>
+                <w:szCs w:val="21"/>
+                <w:lang w:val="en-GB" w:eastAsia="de-DE"/>
+              </w:rPr>
+              <w:t>tmp_name</w:t>
+            </w:r>
+            <w:proofErr w:type="spellEnd"/>
+            <w:r>
+              <w:rPr>
+                <w:rFonts w:ascii="Consolas" w:eastAsia="Times New Roman" w:hAnsi="Consolas" w:cs="Times New Roman"/>
+                <w:color w:val="CE9178"/>
+                <w:sz w:val="21"/>
+                <w:szCs w:val="21"/>
+                <w:lang w:val="en-GB" w:eastAsia="de-DE"/>
+              </w:rPr>
+              <w:t>'</w:t>
             </w:r>
             <w:r>
               <w:rPr>
@@ -18032,8 +18388,20 @@
                 <w:szCs w:val="21"/>
                 <w:lang w:val="en-GB" w:eastAsia="de-DE"/>
               </w:rPr>
-              <w:t>$imageProperties</w:t>
-            </w:r>
+              <w:t>$</w:t>
+            </w:r>
+            <w:proofErr w:type="spellStart"/>
+            <w:r>
+              <w:rPr>
+                <w:rFonts w:ascii="Consolas" w:eastAsia="Times New Roman" w:hAnsi="Consolas" w:cs="Times New Roman"/>
+                <w:color w:val="9CDCFE"/>
+                <w:sz w:val="21"/>
+                <w:szCs w:val="21"/>
+                <w:lang w:val="en-GB" w:eastAsia="de-DE"/>
+              </w:rPr>
+              <w:t>imageProperties</w:t>
+            </w:r>
+            <w:proofErr w:type="spellEnd"/>
             <w:r>
               <w:rPr>
                 <w:rFonts w:ascii="Consolas" w:eastAsia="Times New Roman" w:hAnsi="Consolas" w:cs="Times New Roman"/>
@@ -18044,6 +18412,7 @@
               </w:rPr>
               <w:t xml:space="preserve"> = </w:t>
             </w:r>
+            <w:proofErr w:type="spellStart"/>
             <w:r>
               <w:rPr>
                 <w:rFonts w:ascii="Consolas" w:eastAsia="Times New Roman" w:hAnsi="Consolas" w:cs="Times New Roman"/>
@@ -18054,6 +18423,7 @@
               </w:rPr>
               <w:t>getimageSize</w:t>
             </w:r>
+            <w:proofErr w:type="spellEnd"/>
             <w:r>
               <w:rPr>
                 <w:rFonts w:ascii="Consolas" w:eastAsia="Times New Roman" w:hAnsi="Consolas" w:cs="Times New Roman"/>
@@ -18112,7 +18482,29 @@
                 <w:szCs w:val="21"/>
                 <w:lang w:val="en-GB" w:eastAsia="de-DE"/>
               </w:rPr>
-              <w:t>'tmp_name'</w:t>
+              <w:t>'</w:t>
+            </w:r>
+            <w:proofErr w:type="spellStart"/>
+            <w:r>
+              <w:rPr>
+                <w:rFonts w:ascii="Consolas" w:eastAsia="Times New Roman" w:hAnsi="Consolas" w:cs="Times New Roman"/>
+                <w:color w:val="CE9178"/>
+                <w:sz w:val="21"/>
+                <w:szCs w:val="21"/>
+                <w:lang w:val="en-GB" w:eastAsia="de-DE"/>
+              </w:rPr>
+              <w:t>tmp_name</w:t>
+            </w:r>
+            <w:proofErr w:type="spellEnd"/>
+            <w:r>
+              <w:rPr>
+                <w:rFonts w:ascii="Consolas" w:eastAsia="Times New Roman" w:hAnsi="Consolas" w:cs="Times New Roman"/>
+                <w:color w:val="CE9178"/>
+                <w:sz w:val="21"/>
+                <w:szCs w:val="21"/>
+                <w:lang w:val="en-GB" w:eastAsia="de-DE"/>
+              </w:rPr>
+              <w:t>'</w:t>
             </w:r>
             <w:r>
               <w:rPr>
@@ -18135,7 +18527,21 @@
               <w:rPr>
                 <w:lang w:val="de-DE"/>
               </w:rPr>
-              <w:t>Die “addslashes” Funktion fügt e</w:t>
+              <w:t>Die “</w:t>
+            </w:r>
+            <w:proofErr w:type="spellStart"/>
+            <w:r>
+              <w:rPr>
+                <w:lang w:val="de-DE"/>
+              </w:rPr>
+              <w:t>addslashes</w:t>
+            </w:r>
+            <w:proofErr w:type="spellEnd"/>
+            <w:r>
+              <w:rPr>
+                <w:lang w:val="de-DE"/>
+              </w:rPr>
+              <w:t>” Funktion fügt e</w:t>
             </w:r>
             <w:r>
               <w:rPr>
@@ -18171,8 +18577,20 @@
                 <w:szCs w:val="21"/>
                 <w:lang w:val="en-GB" w:eastAsia="de-DE"/>
               </w:rPr>
-              <w:t>$imgData</w:t>
-            </w:r>
+              <w:t>$</w:t>
+            </w:r>
+            <w:proofErr w:type="spellStart"/>
+            <w:r>
+              <w:rPr>
+                <w:rFonts w:ascii="Consolas" w:eastAsia="Times New Roman" w:hAnsi="Consolas" w:cs="Times New Roman"/>
+                <w:color w:val="9CDCFE"/>
+                <w:sz w:val="21"/>
+                <w:szCs w:val="21"/>
+                <w:lang w:val="en-GB" w:eastAsia="de-DE"/>
+              </w:rPr>
+              <w:t>imgData</w:t>
+            </w:r>
+            <w:proofErr w:type="spellEnd"/>
             <w:r>
               <w:rPr>
                 <w:rFonts w:ascii="Consolas" w:eastAsia="Times New Roman" w:hAnsi="Consolas" w:cs="Times New Roman"/>
@@ -18183,6 +18601,7 @@
               </w:rPr>
               <w:t xml:space="preserve"> = </w:t>
             </w:r>
+            <w:proofErr w:type="spellStart"/>
             <w:r>
               <w:rPr>
                 <w:rFonts w:ascii="Consolas" w:eastAsia="Times New Roman" w:hAnsi="Consolas" w:cs="Times New Roman"/>
@@ -18193,6 +18612,7 @@
               </w:rPr>
               <w:t>file_get_contents</w:t>
             </w:r>
+            <w:proofErr w:type="spellEnd"/>
             <w:r>
               <w:rPr>
                 <w:rFonts w:ascii="Consolas" w:eastAsia="Times New Roman" w:hAnsi="Consolas" w:cs="Times New Roman"/>
@@ -18251,7 +18671,29 @@
                 <w:szCs w:val="21"/>
                 <w:lang w:val="en-GB" w:eastAsia="de-DE"/>
               </w:rPr>
-              <w:t>'tmp_name'</w:t>
+              <w:t>'</w:t>
+            </w:r>
+            <w:proofErr w:type="spellStart"/>
+            <w:r>
+              <w:rPr>
+                <w:rFonts w:ascii="Consolas" w:eastAsia="Times New Roman" w:hAnsi="Consolas" w:cs="Times New Roman"/>
+                <w:color w:val="CE9178"/>
+                <w:sz w:val="21"/>
+                <w:szCs w:val="21"/>
+                <w:lang w:val="en-GB" w:eastAsia="de-DE"/>
+              </w:rPr>
+              <w:t>tmp_name</w:t>
+            </w:r>
+            <w:proofErr w:type="spellEnd"/>
+            <w:r>
+              <w:rPr>
+                <w:rFonts w:ascii="Consolas" w:eastAsia="Times New Roman" w:hAnsi="Consolas" w:cs="Times New Roman"/>
+                <w:color w:val="CE9178"/>
+                <w:sz w:val="21"/>
+                <w:szCs w:val="21"/>
+                <w:lang w:val="en-GB" w:eastAsia="de-DE"/>
+              </w:rPr>
+              <w:t>'</w:t>
             </w:r>
             <w:r>
               <w:rPr>
@@ -18294,8 +18736,20 @@
                 <w:szCs w:val="21"/>
                 <w:lang w:val="en-GB" w:eastAsia="de-DE"/>
               </w:rPr>
-              <w:t>$imageProperties</w:t>
-            </w:r>
+              <w:t>$</w:t>
+            </w:r>
+            <w:proofErr w:type="spellStart"/>
+            <w:r>
+              <w:rPr>
+                <w:rFonts w:ascii="Consolas" w:eastAsia="Times New Roman" w:hAnsi="Consolas" w:cs="Times New Roman"/>
+                <w:color w:val="9CDCFE"/>
+                <w:sz w:val="21"/>
+                <w:szCs w:val="21"/>
+                <w:lang w:val="en-GB" w:eastAsia="de-DE"/>
+              </w:rPr>
+              <w:t>imageProperties</w:t>
+            </w:r>
+            <w:proofErr w:type="spellEnd"/>
             <w:r>
               <w:rPr>
                 <w:rFonts w:ascii="Consolas" w:eastAsia="Times New Roman" w:hAnsi="Consolas" w:cs="Times New Roman"/>
@@ -18306,6 +18760,7 @@
               </w:rPr>
               <w:t xml:space="preserve"> = </w:t>
             </w:r>
+            <w:proofErr w:type="spellStart"/>
             <w:r>
               <w:rPr>
                 <w:rFonts w:ascii="Consolas" w:eastAsia="Times New Roman" w:hAnsi="Consolas" w:cs="Times New Roman"/>
@@ -18316,6 +18771,7 @@
               </w:rPr>
               <w:t>getimageSize</w:t>
             </w:r>
+            <w:proofErr w:type="spellEnd"/>
             <w:r>
               <w:rPr>
                 <w:rFonts w:ascii="Consolas" w:eastAsia="Times New Roman" w:hAnsi="Consolas" w:cs="Times New Roman"/>
@@ -18374,7 +18830,29 @@
                 <w:szCs w:val="21"/>
                 <w:lang w:val="en-GB" w:eastAsia="de-DE"/>
               </w:rPr>
-              <w:t>'tmp_name'</w:t>
+              <w:t>'</w:t>
+            </w:r>
+            <w:proofErr w:type="spellStart"/>
+            <w:r>
+              <w:rPr>
+                <w:rFonts w:ascii="Consolas" w:eastAsia="Times New Roman" w:hAnsi="Consolas" w:cs="Times New Roman"/>
+                <w:color w:val="CE9178"/>
+                <w:sz w:val="21"/>
+                <w:szCs w:val="21"/>
+                <w:lang w:val="en-GB" w:eastAsia="de-DE"/>
+              </w:rPr>
+              <w:t>tmp_name</w:t>
+            </w:r>
+            <w:proofErr w:type="spellEnd"/>
+            <w:r>
+              <w:rPr>
+                <w:rFonts w:ascii="Consolas" w:eastAsia="Times New Roman" w:hAnsi="Consolas" w:cs="Times New Roman"/>
+                <w:color w:val="CE9178"/>
+                <w:sz w:val="21"/>
+                <w:szCs w:val="21"/>
+                <w:lang w:val="en-GB" w:eastAsia="de-DE"/>
+              </w:rPr>
+              <w:t>'</w:t>
             </w:r>
             <w:r>
               <w:rPr>
@@ -18404,7 +18882,21 @@
               <w:rPr>
                 <w:lang w:val="de-DE"/>
               </w:rPr>
-              <w:t>Nachdem man die “addslashes” F</w:t>
+              <w:t>Nachdem man die “</w:t>
+            </w:r>
+            <w:proofErr w:type="spellStart"/>
+            <w:r>
+              <w:rPr>
+                <w:lang w:val="de-DE"/>
+              </w:rPr>
+              <w:t>addslashes</w:t>
+            </w:r>
+            <w:proofErr w:type="spellEnd"/>
+            <w:r>
+              <w:rPr>
+                <w:lang w:val="de-DE"/>
+              </w:rPr>
+              <w:t>” F</w:t>
             </w:r>
             <w:r>
               <w:rPr>
@@ -18589,9 +19081,11 @@
               <w:pStyle w:val="K-Einzug"/>
               <w:ind w:left="0"/>
             </w:pPr>
+            <w:proofErr w:type="spellStart"/>
             <w:r>
               <w:t>Ballwil</w:t>
             </w:r>
+            <w:proofErr w:type="spellEnd"/>
           </w:p>
         </w:tc>
         <w:tc>
@@ -18760,17 +19254,33 @@
       <w:pPr>
         <w:pStyle w:val="K-Einzug"/>
       </w:pPr>
-      <w:fldSimple w:instr=" TOC \h \z \c &quot;Abbildung&quot; ">
-        <w:r>
-          <w:rPr>
-            <w:b/>
-            <w:bCs w:val="0"/>
-            <w:noProof/>
-            <w:lang w:val="de-DE"/>
-          </w:rPr>
-          <w:t>Es konnten keine Einträge für ein Abbildungsverzeichnis gefunden werden.</w:t>
-        </w:r>
-      </w:fldSimple>
+      <w:r>
+        <w:fldChar w:fldCharType="begin"/>
+      </w:r>
+      <w:r>
+        <w:instrText xml:space="preserve"> TOC \h \z \c "Abbildung" </w:instrText>
+      </w:r>
+      <w:r>
+        <w:fldChar w:fldCharType="separate"/>
+      </w:r>
+      <w:r>
+        <w:rPr>
+          <w:b/>
+          <w:bCs w:val="0"/>
+          <w:noProof/>
+          <w:lang w:val="de-DE"/>
+        </w:rPr>
+        <w:t>Es konnten keine Einträge für ein Abbildungsverzeichnis gefunden werden.</w:t>
+      </w:r>
+      <w:r>
+        <w:rPr>
+          <w:b/>
+          <w:bCs w:val="0"/>
+          <w:noProof/>
+          <w:lang w:val="de-DE"/>
+        </w:rPr>
+        <w:fldChar w:fldCharType="end"/>
+      </w:r>
     </w:p>
     <w:p/>
     <w:p>
@@ -19897,15 +20407,36 @@
               <w:sz w:val="18"/>
             </w:rPr>
             <w:br/>
-            <w:t>Luzernstrasse 18</w:t>
+          </w:r>
+          <w:proofErr w:type="spellStart"/>
+          <w:r>
+            <w:rPr>
+              <w:sz w:val="18"/>
+            </w:rPr>
+            <w:t>Luzernstrasse</w:t>
+          </w:r>
+          <w:proofErr w:type="spellEnd"/>
+          <w:r>
+            <w:rPr>
+              <w:sz w:val="18"/>
+            </w:rPr>
+            <w:t xml:space="preserve"> 18</w:t>
           </w:r>
           <w:r>
             <w:rPr>
               <w:sz w:val="18"/>
             </w:rPr>
             <w:br/>
-            <w:t>6275 Ballwil</w:t>
+            <w:t xml:space="preserve">6275 </w:t>
           </w:r>
+          <w:proofErr w:type="spellStart"/>
+          <w:r>
+            <w:rPr>
+              <w:sz w:val="18"/>
+            </w:rPr>
+            <w:t>Ballwil</w:t>
+          </w:r>
+          <w:proofErr w:type="spellEnd"/>
         </w:p>
       </w:tc>
       <w:tc>
@@ -24739,6 +25270,7 @@
     <w:rsid w:val="00D773A4"/>
     <w:rsid w:val="00D95FBC"/>
     <w:rsid w:val="00E16C82"/>
+    <w:rsid w:val="00E41BBD"/>
     <w:rsid w:val="00E44AEE"/>
     <w:rsid w:val="00FF5032"/>
   </w:rsids>

</xml_diff>